<commit_message>
capitulo 2 actualizado con indice
</commit_message>
<xml_diff>
--- a/Tesis_Final.docx
+++ b/Tesis_Final.docx
@@ -1,6 +1,6 @@
 
 <file path=word/document.xml><?xml version="1.0" encoding="utf-8"?>
-<w:document xmlns:wpc="http://schemas.microsoft.com/office/word/2010/wordprocessingCanvas" xmlns:cx="http://schemas.microsoft.com/office/drawing/2014/chartex" xmlns:cx1="http://schemas.microsoft.com/office/drawing/2015/9/8/chartex" xmlns:cx2="http://schemas.microsoft.com/office/drawing/2015/10/21/chartex" xmlns:cx3="http://schemas.microsoft.com/office/drawing/2016/5/9/chartex" xmlns:cx4="http://schemas.microsoft.com/office/drawing/2016/5/10/chartex" xmlns:cx5="http://schemas.microsoft.com/office/drawing/2016/5/11/chartex" xmlns:cx6="http://schemas.microsoft.com/office/drawing/2016/5/12/chartex" xmlns:cx7="http://schemas.microsoft.com/office/drawing/2016/5/13/chartex" xmlns:cx8="http://schemas.microsoft.com/office/drawing/2016/5/14/chartex" xmlns:mc="http://schemas.openxmlformats.org/markup-compatibility/2006" xmlns:aink="http://schemas.microsoft.com/office/drawing/2016/ink" xmlns:am3d="http://schemas.microsoft.com/office/drawing/2017/model3d" xmlns:o="urn:schemas-microsoft-com:office:office" xmlns:oel="http://schemas.microsoft.com/office/2019/extlst" xmlns:r="http://schemas.openxmlformats.org/officeDocument/2006/relationships" xmlns:m="http://schemas.openxmlformats.org/officeDocument/2006/math" xmlns:v="urn:schemas-microsoft-com:vml" xmlns:wp14="http://schemas.microsoft.com/office/word/2010/wordprocessingDrawing" xmlns:wp="http://schemas.openxmlformats.org/drawingml/2006/wordprocessingDrawing" xmlns:w10="urn:schemas-microsoft-com:office:word" xmlns:w="http://schemas.openxmlformats.org/wordprocessingml/2006/main" xmlns:w14="http://schemas.microsoft.com/office/word/2010/wordml" xmlns:w15="http://schemas.microsoft.com/office/word/2012/wordml" xmlns:w16cex="http://schemas.microsoft.com/office/word/2018/wordml/cex" xmlns:w16cid="http://schemas.microsoft.com/office/word/2016/wordml/cid" xmlns:w16="http://schemas.microsoft.com/office/word/2018/wordml" xmlns:w16du="http://schemas.microsoft.com/office/word/2023/wordml/word16du" xmlns:w16sdtdh="http://schemas.microsoft.com/office/word/2020/wordml/sdtdatahash" xmlns:w16sdtfl="http://schemas.microsoft.com/office/word/2024/wordml/sdtformatlock" xmlns:w16se="http://schemas.microsoft.com/office/word/2015/wordml/symex" xmlns:wpg="http://schemas.microsoft.com/office/word/2010/wordprocessingGroup" xmlns:wpi="http://schemas.microsoft.com/office/word/2010/wordprocessingInk" xmlns:wne="http://schemas.microsoft.com/office/word/2006/wordml" xmlns:wps="http://schemas.microsoft.com/office/word/2010/wordprocessingShape" mc:Ignorable="w14 w15 w16se w16cid w16 w16cex w16sdtdh w16sdtfl w16du wp14">
+<w:document xmlns:wpc="http://schemas.microsoft.com/office/word/2010/wordprocessingCanvas" xmlns:cx="http://schemas.microsoft.com/office/drawing/2014/chartex" xmlns:cx1="http://schemas.microsoft.com/office/drawing/2015/9/8/chartex" xmlns:cx2="http://schemas.microsoft.com/office/drawing/2015/10/21/chartex" xmlns:cx3="http://schemas.microsoft.com/office/drawing/2016/5/9/chartex" xmlns:cx4="http://schemas.microsoft.com/office/drawing/2016/5/10/chartex" xmlns:cx5="http://schemas.microsoft.com/office/drawing/2016/5/11/chartex" xmlns:cx6="http://schemas.microsoft.com/office/drawing/2016/5/12/chartex" xmlns:cx7="http://schemas.microsoft.com/office/drawing/2016/5/13/chartex" xmlns:cx8="http://schemas.microsoft.com/office/drawing/2016/5/14/chartex" xmlns:mc="http://schemas.openxmlformats.org/markup-compatibility/2006" xmlns:aink="http://schemas.microsoft.com/office/drawing/2016/ink" xmlns:am3d="http://schemas.microsoft.com/office/drawing/2017/model3d" xmlns:o="urn:schemas-microsoft-com:office:office" xmlns:r="http://schemas.openxmlformats.org/officeDocument/2006/relationships" xmlns:m="http://schemas.openxmlformats.org/officeDocument/2006/math" xmlns:v="urn:schemas-microsoft-com:vml" xmlns:wp14="http://schemas.microsoft.com/office/word/2010/wordprocessingDrawing" xmlns:wp="http://schemas.openxmlformats.org/drawingml/2006/wordprocessingDrawing" xmlns:w10="urn:schemas-microsoft-com:office:word" xmlns:w="http://schemas.openxmlformats.org/wordprocessingml/2006/main" xmlns:w14="http://schemas.microsoft.com/office/word/2010/wordml" xmlns:w15="http://schemas.microsoft.com/office/word/2012/wordml" xmlns:w16cex="http://schemas.microsoft.com/office/word/2018/wordml/cex" xmlns:w16cid="http://schemas.microsoft.com/office/word/2016/wordml/cid" xmlns:w16="http://schemas.microsoft.com/office/word/2018/wordml" xmlns:w16sdtdh="http://schemas.microsoft.com/office/word/2020/wordml/sdtdatahash" xmlns:w16se="http://schemas.microsoft.com/office/word/2015/wordml/symex" xmlns:wpg="http://schemas.microsoft.com/office/word/2010/wordprocessingGroup" xmlns:wpi="http://schemas.microsoft.com/office/word/2010/wordprocessingInk" xmlns:wne="http://schemas.microsoft.com/office/word/2006/wordml" xmlns:wps="http://schemas.microsoft.com/office/word/2010/wordprocessingShape" mc:Ignorable="w14 w15 w16se w16cid w16 w16cex w16sdtdh wp14">
   <w:body>
     <w:p>
       <w:pPr>
@@ -530,7 +530,25 @@
         <w:fldChar w:fldCharType="separate"/>
       </w:r>
       <w:r>
-        <w:pict w14:anchorId="35499D20">
+        <w:fldChar w:fldCharType="begin"/>
+      </w:r>
+      <w:r>
+        <w:instrText xml:space="preserve"> </w:instrText>
+      </w:r>
+      <w:r>
+        <w:instrText>INCLUDEPICTURE  "http://ile.pe/wp-content/uploads/2016/01/logo-</w:instrText>
+      </w:r>
+      <w:r>
+        <w:instrText>upc.jpg" \* MERGEFORMATINET</w:instrText>
+      </w:r>
+      <w:r>
+        <w:instrText xml:space="preserve"> </w:instrText>
+      </w:r>
+      <w:r>
+        <w:fldChar w:fldCharType="separate"/>
+      </w:r>
+      <w:r>
+        <w:pict w14:anchorId="3B30EA8B">
           <v:shapetype id="_x0000_t75" coordsize="21600,21600" o:spt="75" o:preferrelative="t" path="m@4@5l@4@11@9@11@9@5xe" filled="f" stroked="f">
             <v:stroke joinstyle="miter"/>
             <v:formulas>
@@ -550,10 +568,13 @@
             <v:path o:extrusionok="f" gradientshapeok="t" o:connecttype="rect"/>
             <o:lock v:ext="edit" aspectratio="t"/>
           </v:shapetype>
-          <v:shape id="_x0000_i1025" type="#_x0000_t75" alt="Resultado de imagen para LOGO UPC" style="width:72.7pt;height:72.7pt">
+          <v:shape id="_x0000_i1025" type="#_x0000_t75" alt="Resultado de imagen para LOGO UPC" style="width:72.45pt;height:72.45pt">
             <v:imagedata r:id="rId11" r:href="rId12"/>
           </v:shape>
         </w:pict>
+      </w:r>
+      <w:r>
+        <w:fldChar w:fldCharType="end"/>
       </w:r>
       <w:r>
         <w:fldChar w:fldCharType="end"/>
@@ -781,6 +802,7 @@
         <w15:color w:val="000000"/>
         <w:text/>
       </w:sdtPr>
+      <w:sdtEndPr/>
       <w:sdtContent>
         <w:p>
           <w:pPr>
@@ -845,6 +867,7 @@
         <w15:color w:val="000000"/>
         <w:text/>
       </w:sdtPr>
+      <w:sdtEndPr/>
       <w:sdtContent>
         <w:p>
           <w:pPr>
@@ -935,6 +958,7 @@
         <w15:color w:val="000000"/>
         <w:text/>
       </w:sdtPr>
+      <w:sdtEndPr/>
       <w:sdtContent>
         <w:p>
           <w:pPr>
@@ -981,6 +1005,7 @@
         </w:placeholder>
         <w15:appearance w15:val="hidden"/>
       </w:sdtPr>
+      <w:sdtEndPr/>
       <w:sdtContent>
         <w:p>
           <w:pPr>
@@ -1061,14 +1086,12 @@
           <w:lang w:val="es-ES"/>
         </w:rPr>
       </w:pPr>
-      <w:proofErr w:type="spellStart"/>
       <w:r>
         <w:rPr>
           <w:lang w:val="es-ES"/>
         </w:rPr>
         <w:t>Julon</w:t>
       </w:r>
-      <w:proofErr w:type="spellEnd"/>
       <w:r>
         <w:rPr>
           <w:lang w:val="es-ES"/>
@@ -1123,6 +1146,7 @@
         </w:placeholder>
         <w15:appearance w15:val="hidden"/>
       </w:sdtPr>
+      <w:sdtEndPr/>
       <w:sdtContent>
         <w:p>
           <w:pPr>
@@ -1777,21 +1801,7 @@
         <w:rPr>
           <w:lang w:val="es-ES"/>
         </w:rPr>
-        <w:t xml:space="preserve">Los estándares actuales de competitividad de las diversas industrias exigen que se cuente con herramientas de inteligencia artificial que ayuden a reducir la carga de trabajo, agilizando el tiempo que se demora en realizar diversos procesos. En el sector educativo universitario aún se sigue optando por la generación manual de material educativo para cursos virtuales, es decir, varios grupos de profesores se reúnen durante semanas para generar contenido didáctico para los estudiantes. Sin embargo, esto enfrenta un cuello de botella operativo, ya que recae en un docente </w:t>
-      </w:r>
-      <w:proofErr w:type="spellStart"/>
-      <w:r>
-        <w:rPr>
-          <w:lang w:val="es-ES"/>
-        </w:rPr>
-        <w:t>virtualizador</w:t>
-      </w:r>
-      <w:proofErr w:type="spellEnd"/>
-      <w:r>
-        <w:rPr>
-          <w:lang w:val="es-ES"/>
-        </w:rPr>
-        <w:t xml:space="preserve">, quien digita manualmente introducciones, guiones para videos de presentación, entre otras tareas, asegurando que todo quede correcto y tardando mucho tiempo. </w:t>
+        <w:t xml:space="preserve">Los estándares actuales de competitividad de las diversas industrias exigen que se cuente con herramientas de inteligencia artificial que ayuden a reducir la carga de trabajo, agilizando el tiempo que se demora en realizar diversos procesos. En el sector educativo universitario aún se sigue optando por la generación manual de material educativo para cursos virtuales, es decir, varios grupos de profesores se reúnen durante semanas para generar contenido didáctico para los estudiantes. Sin embargo, esto enfrenta un cuello de botella operativo, ya que recae en un docente virtualizador, quien digita manualmente introducciones, guiones para videos de presentación, entre otras tareas, asegurando que todo quede correcto y tardando mucho tiempo. </w:t>
       </w:r>
     </w:p>
     <w:p>
@@ -1979,6 +1989,7 @@
           </w:placeholder>
           <w15:appearance w15:val="hidden"/>
         </w:sdtPr>
+        <w:sdtEndPr/>
         <w:sdtContent>
           <w:r>
             <w:rPr>
@@ -2087,6 +2098,7 @@
           </w:placeholder>
           <w15:appearance w15:val="hidden"/>
         </w:sdtPr>
+        <w:sdtEndPr/>
         <w:sdtContent>
           <w:r>
             <w:rPr>
@@ -2265,6 +2277,7 @@
           </w:placeholder>
           <w15:appearance w15:val="hidden"/>
         </w:sdtPr>
+        <w:sdtEndPr/>
         <w:sdtContent>
           <w:r>
             <w:rPr>
@@ -3511,6 +3524,958 @@
               <w:rPr>
                 <w:noProof/>
                 <w:webHidden/>
+              </w:rPr>
+              <w:fldChar w:fldCharType="end"/>
+            </w:r>
+          </w:hyperlink>
+        </w:p>
+        <w:p>
+          <w:pPr>
+            <w:pStyle w:val="TDC1"/>
+            <w:tabs>
+              <w:tab w:val="right" w:leader="dot" w:pos="8777"/>
+            </w:tabs>
+            <w:rPr>
+              <w:rFonts w:asciiTheme="minorHAnsi" w:eastAsiaTheme="minorEastAsia" w:hAnsiTheme="minorHAnsi" w:cstheme="minorBidi"/>
+              <w:b w:val="0"/>
+              <w:bCs w:val="0"/>
+              <w:noProof/>
+              <w:kern w:val="2"/>
+              <w:szCs w:val="24"/>
+              <w:lang w:val="es-PE" w:eastAsia="es-PE"/>
+              <w14:ligatures w14:val="standardContextual"/>
+            </w:rPr>
+          </w:pPr>
+          <w:hyperlink w:anchor="_Toc_Ch2_00" w:history="1">
+            <w:r>
+              <w:rPr>
+                <w:rStyle w:val="Hipervnculo"/>
+                <w:noProof/>
+              </w:rPr>
+              <w:t>CAPÍTULO 2: MARCO TEÓRICO</w:t>
+            </w:r>
+            <w:r>
+              <w:rPr>
+                <w:webHidden/>
+                <w:noProof/>
+              </w:rPr>
+              <w:tab/>
+            </w:r>
+            <w:r>
+              <w:rPr>
+                <w:webHidden/>
+                <w:noProof/>
+              </w:rPr>
+              <w:fldChar w:fldCharType="begin"/>
+            </w:r>
+            <w:r>
+              <w:rPr>
+                <w:webHidden/>
+                <w:noProof/>
+              </w:rPr>
+              <w:instrText xml:space="preserve"> PAGEREF _Toc_Ch2_00 \h </w:instrText>
+            </w:r>
+            <w:r>
+              <w:rPr>
+                <w:webHidden/>
+                <w:noProof/>
+              </w:rPr>
+            </w:r>
+            <w:r>
+              <w:rPr>
+                <w:webHidden/>
+                <w:noProof/>
+              </w:rPr>
+              <w:fldChar w:fldCharType="separate"/>
+            </w:r>
+            <w:r>
+              <w:rPr>
+                <w:webHidden/>
+                <w:noProof/>
+              </w:rPr>
+              <w:t>XX</w:t>
+            </w:r>
+            <w:r>
+              <w:rPr>
+                <w:webHidden/>
+                <w:noProof/>
+              </w:rPr>
+              <w:fldChar w:fldCharType="end"/>
+            </w:r>
+          </w:hyperlink>
+        </w:p>
+        <w:p>
+          <w:pPr>
+            <w:pStyle w:val="TDC2"/>
+            <w:tabs>
+              <w:tab w:val="left" w:pos="960"/>
+              <w:tab w:val="right" w:leader="dot" w:pos="8777"/>
+            </w:tabs>
+            <w:rPr>
+              <w:rFonts w:asciiTheme="minorHAnsi" w:eastAsiaTheme="minorEastAsia" w:hAnsiTheme="minorHAnsi" w:cstheme="minorBidi"/>
+              <w:noProof/>
+              <w:kern w:val="2"/>
+              <w:szCs w:val="24"/>
+              <w:lang w:val="es-PE" w:eastAsia="es-PE"/>
+              <w14:ligatures w14:val="standardContextual"/>
+            </w:rPr>
+          </w:pPr>
+          <w:hyperlink w:anchor="_Toc_Ch2_01" w:history="1">
+            <w:r>
+              <w:rPr>
+                <w:rStyle w:val="Hipervnculo"/>
+                <w:noProof/>
+              </w:rPr>
+              <w:t>2.1</w:t>
+            </w:r>
+            <w:r>
+              <w:rPr>
+                <w:noProof/>
+              </w:rPr>
+              <w:tab/>
+            </w:r>
+            <w:r>
+              <w:rPr>
+                <w:rStyle w:val="Hipervnculo"/>
+                <w:noProof/>
+              </w:rPr>
+              <w:t>El Proceso de Producción Instruccional</w:t>
+            </w:r>
+            <w:r>
+              <w:rPr>
+                <w:webHidden/>
+                <w:noProof/>
+              </w:rPr>
+              <w:tab/>
+            </w:r>
+            <w:r>
+              <w:rPr>
+                <w:webHidden/>
+                <w:noProof/>
+              </w:rPr>
+              <w:fldChar w:fldCharType="begin"/>
+            </w:r>
+            <w:r>
+              <w:rPr>
+                <w:webHidden/>
+                <w:noProof/>
+              </w:rPr>
+              <w:instrText xml:space="preserve"> PAGEREF _Toc_Ch2_01 \h </w:instrText>
+            </w:r>
+            <w:r>
+              <w:rPr>
+                <w:webHidden/>
+                <w:noProof/>
+              </w:rPr>
+            </w:r>
+            <w:r>
+              <w:rPr>
+                <w:webHidden/>
+                <w:noProof/>
+              </w:rPr>
+              <w:fldChar w:fldCharType="separate"/>
+            </w:r>
+            <w:r>
+              <w:rPr>
+                <w:webHidden/>
+                <w:noProof/>
+              </w:rPr>
+              <w:t>XX</w:t>
+            </w:r>
+            <w:r>
+              <w:rPr>
+                <w:webHidden/>
+                <w:noProof/>
+              </w:rPr>
+              <w:fldChar w:fldCharType="end"/>
+            </w:r>
+          </w:hyperlink>
+        </w:p>
+        <w:p>
+          <w:pPr>
+            <w:pStyle w:val="TDC3"/>
+            <w:tabs>
+              <w:tab w:val="left" w:pos="1440"/>
+              <w:tab w:val="right" w:leader="dot" w:pos="8777"/>
+            </w:tabs>
+            <w:rPr>
+              <w:rFonts w:asciiTheme="minorHAnsi" w:eastAsiaTheme="minorEastAsia" w:hAnsiTheme="minorHAnsi" w:cstheme="minorBidi"/>
+              <w:iCs w:val="0"/>
+              <w:noProof/>
+              <w:kern w:val="2"/>
+              <w:szCs w:val="24"/>
+              <w:lang w:val="es-PE" w:eastAsia="es-PE"/>
+              <w14:ligatures w14:val="standardContextual"/>
+            </w:rPr>
+          </w:pPr>
+          <w:hyperlink w:anchor="_Toc_Ch2_02" w:history="1">
+            <w:r>
+              <w:rPr>
+                <w:rStyle w:val="Hipervnculo"/>
+                <w:noProof/>
+                <w:iCs w:val="0"/>
+              </w:rPr>
+              <w:t>2.1.1</w:t>
+            </w:r>
+            <w:r>
+              <w:rPr>
+                <w:noProof/>
+                <w:iCs w:val="0"/>
+              </w:rPr>
+              <w:tab/>
+            </w:r>
+            <w:r>
+              <w:rPr>
+                <w:rStyle w:val="Hipervnculo"/>
+                <w:noProof/>
+                <w:iCs w:val="0"/>
+              </w:rPr>
+              <w:t>Documentos de entrada y artefactos del proceso</w:t>
+            </w:r>
+            <w:r>
+              <w:rPr>
+                <w:webHidden/>
+                <w:noProof/>
+              </w:rPr>
+              <w:tab/>
+            </w:r>
+            <w:r>
+              <w:rPr>
+                <w:webHidden/>
+                <w:noProof/>
+              </w:rPr>
+              <w:fldChar w:fldCharType="begin"/>
+            </w:r>
+            <w:r>
+              <w:rPr>
+                <w:webHidden/>
+                <w:noProof/>
+              </w:rPr>
+              <w:instrText xml:space="preserve"> PAGEREF _Toc_Ch2_02 \h </w:instrText>
+            </w:r>
+            <w:r>
+              <w:rPr>
+                <w:webHidden/>
+                <w:noProof/>
+              </w:rPr>
+            </w:r>
+            <w:r>
+              <w:rPr>
+                <w:webHidden/>
+                <w:noProof/>
+              </w:rPr>
+              <w:fldChar w:fldCharType="separate"/>
+            </w:r>
+            <w:r>
+              <w:rPr>
+                <w:webHidden/>
+                <w:noProof/>
+              </w:rPr>
+              <w:t>XX</w:t>
+            </w:r>
+            <w:r>
+              <w:rPr>
+                <w:webHidden/>
+                <w:noProof/>
+              </w:rPr>
+              <w:fldChar w:fldCharType="end"/>
+            </w:r>
+          </w:hyperlink>
+        </w:p>
+        <w:p>
+          <w:pPr>
+            <w:pStyle w:val="TDC2"/>
+            <w:tabs>
+              <w:tab w:val="left" w:pos="960"/>
+              <w:tab w:val="right" w:leader="dot" w:pos="8777"/>
+            </w:tabs>
+            <w:rPr>
+              <w:rFonts w:asciiTheme="minorHAnsi" w:eastAsiaTheme="minorEastAsia" w:hAnsiTheme="minorHAnsi" w:cstheme="minorBidi"/>
+              <w:noProof/>
+              <w:kern w:val="2"/>
+              <w:szCs w:val="24"/>
+              <w:lang w:val="es-PE" w:eastAsia="es-PE"/>
+              <w14:ligatures w14:val="standardContextual"/>
+            </w:rPr>
+          </w:pPr>
+          <w:hyperlink w:anchor="_Toc_Ch2_03" w:history="1">
+            <w:r>
+              <w:rPr>
+                <w:rStyle w:val="Hipervnculo"/>
+                <w:noProof/>
+              </w:rPr>
+              <w:t>2.2</w:t>
+            </w:r>
+            <w:r>
+              <w:rPr>
+                <w:noProof/>
+              </w:rPr>
+              <w:tab/>
+            </w:r>
+            <w:r>
+              <w:rPr>
+                <w:rStyle w:val="Hipervnculo"/>
+                <w:noProof/>
+              </w:rPr>
+              <w:t>Fundamentos Pedagógicos</w:t>
+            </w:r>
+            <w:r>
+              <w:rPr>
+                <w:webHidden/>
+                <w:noProof/>
+              </w:rPr>
+              <w:tab/>
+            </w:r>
+            <w:r>
+              <w:rPr>
+                <w:webHidden/>
+                <w:noProof/>
+              </w:rPr>
+              <w:fldChar w:fldCharType="begin"/>
+            </w:r>
+            <w:r>
+              <w:rPr>
+                <w:webHidden/>
+                <w:noProof/>
+              </w:rPr>
+              <w:instrText xml:space="preserve"> PAGEREF _Toc_Ch2_03 \h </w:instrText>
+            </w:r>
+            <w:r>
+              <w:rPr>
+                <w:webHidden/>
+                <w:noProof/>
+              </w:rPr>
+            </w:r>
+            <w:r>
+              <w:rPr>
+                <w:webHidden/>
+                <w:noProof/>
+              </w:rPr>
+              <w:fldChar w:fldCharType="separate"/>
+            </w:r>
+            <w:r>
+              <w:rPr>
+                <w:webHidden/>
+                <w:noProof/>
+              </w:rPr>
+              <w:t>XX</w:t>
+            </w:r>
+            <w:r>
+              <w:rPr>
+                <w:webHidden/>
+                <w:noProof/>
+              </w:rPr>
+              <w:fldChar w:fldCharType="end"/>
+            </w:r>
+          </w:hyperlink>
+        </w:p>
+        <w:p>
+          <w:pPr>
+            <w:pStyle w:val="TDC3"/>
+            <w:tabs>
+              <w:tab w:val="left" w:pos="1440"/>
+              <w:tab w:val="right" w:leader="dot" w:pos="8777"/>
+            </w:tabs>
+            <w:rPr>
+              <w:rFonts w:asciiTheme="minorHAnsi" w:eastAsiaTheme="minorEastAsia" w:hAnsiTheme="minorHAnsi" w:cstheme="minorBidi"/>
+              <w:iCs w:val="0"/>
+              <w:noProof/>
+              <w:kern w:val="2"/>
+              <w:szCs w:val="24"/>
+              <w:lang w:val="es-PE" w:eastAsia="es-PE"/>
+              <w14:ligatures w14:val="standardContextual"/>
+            </w:rPr>
+          </w:pPr>
+          <w:hyperlink w:anchor="_Toc_Ch2_04" w:history="1">
+            <w:r>
+              <w:rPr>
+                <w:rStyle w:val="Hipervnculo"/>
+                <w:noProof/>
+                <w:iCs w:val="0"/>
+              </w:rPr>
+              <w:t>2.2.1</w:t>
+            </w:r>
+            <w:r>
+              <w:rPr>
+                <w:noProof/>
+                <w:iCs w:val="0"/>
+              </w:rPr>
+              <w:tab/>
+            </w:r>
+            <w:r>
+              <w:rPr>
+                <w:rStyle w:val="Hipervnculo"/>
+                <w:noProof/>
+                <w:iCs w:val="0"/>
+              </w:rPr>
+              <w:t>Taxonomía de Bloom</w:t>
+            </w:r>
+            <w:r>
+              <w:rPr>
+                <w:webHidden/>
+                <w:noProof/>
+              </w:rPr>
+              <w:tab/>
+            </w:r>
+            <w:r>
+              <w:rPr>
+                <w:webHidden/>
+                <w:noProof/>
+              </w:rPr>
+              <w:fldChar w:fldCharType="begin"/>
+            </w:r>
+            <w:r>
+              <w:rPr>
+                <w:webHidden/>
+                <w:noProof/>
+              </w:rPr>
+              <w:instrText xml:space="preserve"> PAGEREF _Toc_Ch2_04 \h </w:instrText>
+            </w:r>
+            <w:r>
+              <w:rPr>
+                <w:webHidden/>
+                <w:noProof/>
+              </w:rPr>
+            </w:r>
+            <w:r>
+              <w:rPr>
+                <w:webHidden/>
+                <w:noProof/>
+              </w:rPr>
+              <w:fldChar w:fldCharType="separate"/>
+            </w:r>
+            <w:r>
+              <w:rPr>
+                <w:webHidden/>
+                <w:noProof/>
+              </w:rPr>
+              <w:t>XX</w:t>
+            </w:r>
+            <w:r>
+              <w:rPr>
+                <w:webHidden/>
+                <w:noProof/>
+              </w:rPr>
+              <w:fldChar w:fldCharType="end"/>
+            </w:r>
+          </w:hyperlink>
+        </w:p>
+        <w:p>
+          <w:pPr>
+            <w:pStyle w:val="TDC2"/>
+            <w:tabs>
+              <w:tab w:val="left" w:pos="960"/>
+              <w:tab w:val="right" w:leader="dot" w:pos="8777"/>
+            </w:tabs>
+            <w:rPr>
+              <w:rFonts w:asciiTheme="minorHAnsi" w:eastAsiaTheme="minorEastAsia" w:hAnsiTheme="minorHAnsi" w:cstheme="minorBidi"/>
+              <w:noProof/>
+              <w:kern w:val="2"/>
+              <w:szCs w:val="24"/>
+              <w:lang w:val="es-PE" w:eastAsia="es-PE"/>
+              <w14:ligatures w14:val="standardContextual"/>
+            </w:rPr>
+          </w:pPr>
+          <w:hyperlink w:anchor="_Toc_Ch2_05" w:history="1">
+            <w:r>
+              <w:rPr>
+                <w:rStyle w:val="Hipervnculo"/>
+                <w:noProof/>
+              </w:rPr>
+              <w:t>2.3</w:t>
+            </w:r>
+            <w:r>
+              <w:rPr>
+                <w:noProof/>
+              </w:rPr>
+              <w:tab/>
+            </w:r>
+            <w:r>
+              <w:rPr>
+                <w:rStyle w:val="Hipervnculo"/>
+                <w:noProof/>
+              </w:rPr>
+              <w:t>Fundamentos Técnicos</w:t>
+            </w:r>
+            <w:r>
+              <w:rPr>
+                <w:webHidden/>
+                <w:noProof/>
+              </w:rPr>
+              <w:tab/>
+            </w:r>
+            <w:r>
+              <w:rPr>
+                <w:webHidden/>
+                <w:noProof/>
+              </w:rPr>
+              <w:fldChar w:fldCharType="begin"/>
+            </w:r>
+            <w:r>
+              <w:rPr>
+                <w:webHidden/>
+                <w:noProof/>
+              </w:rPr>
+              <w:instrText xml:space="preserve"> PAGEREF _Toc_Ch2_05 \h </w:instrText>
+            </w:r>
+            <w:r>
+              <w:rPr>
+                <w:webHidden/>
+                <w:noProof/>
+              </w:rPr>
+            </w:r>
+            <w:r>
+              <w:rPr>
+                <w:webHidden/>
+                <w:noProof/>
+              </w:rPr>
+              <w:fldChar w:fldCharType="separate"/>
+            </w:r>
+            <w:r>
+              <w:rPr>
+                <w:webHidden/>
+                <w:noProof/>
+              </w:rPr>
+              <w:t>XX</w:t>
+            </w:r>
+            <w:r>
+              <w:rPr>
+                <w:webHidden/>
+                <w:noProof/>
+              </w:rPr>
+              <w:fldChar w:fldCharType="end"/>
+            </w:r>
+          </w:hyperlink>
+        </w:p>
+        <w:p>
+          <w:pPr>
+            <w:pStyle w:val="TDC3"/>
+            <w:tabs>
+              <w:tab w:val="left" w:pos="1440"/>
+              <w:tab w:val="right" w:leader="dot" w:pos="8777"/>
+            </w:tabs>
+            <w:rPr>
+              <w:rFonts w:asciiTheme="minorHAnsi" w:eastAsiaTheme="minorEastAsia" w:hAnsiTheme="minorHAnsi" w:cstheme="minorBidi"/>
+              <w:iCs w:val="0"/>
+              <w:noProof/>
+              <w:kern w:val="2"/>
+              <w:szCs w:val="24"/>
+              <w:lang w:val="es-PE" w:eastAsia="es-PE"/>
+              <w14:ligatures w14:val="standardContextual"/>
+            </w:rPr>
+          </w:pPr>
+          <w:hyperlink w:anchor="_Toc_Ch2_06" w:history="1">
+            <w:r>
+              <w:rPr>
+                <w:rStyle w:val="Hipervnculo"/>
+                <w:noProof/>
+                <w:iCs w:val="0"/>
+              </w:rPr>
+              <w:t>2.3.1</w:t>
+            </w:r>
+            <w:r>
+              <w:rPr>
+                <w:noProof/>
+                <w:iCs w:val="0"/>
+              </w:rPr>
+              <w:tab/>
+            </w:r>
+            <w:r>
+              <w:rPr>
+                <w:rStyle w:val="Hipervnculo"/>
+                <w:noProof/>
+                <w:iCs w:val="0"/>
+              </w:rPr>
+              <w:t>Agentes de IA</w:t>
+            </w:r>
+            <w:r>
+              <w:rPr>
+                <w:webHidden/>
+                <w:noProof/>
+              </w:rPr>
+              <w:tab/>
+            </w:r>
+            <w:r>
+              <w:rPr>
+                <w:webHidden/>
+                <w:noProof/>
+              </w:rPr>
+              <w:fldChar w:fldCharType="begin"/>
+            </w:r>
+            <w:r>
+              <w:rPr>
+                <w:webHidden/>
+                <w:noProof/>
+              </w:rPr>
+              <w:instrText xml:space="preserve"> PAGEREF _Toc_Ch2_06 \h </w:instrText>
+            </w:r>
+            <w:r>
+              <w:rPr>
+                <w:webHidden/>
+                <w:noProof/>
+              </w:rPr>
+            </w:r>
+            <w:r>
+              <w:rPr>
+                <w:webHidden/>
+                <w:noProof/>
+              </w:rPr>
+              <w:fldChar w:fldCharType="separate"/>
+            </w:r>
+            <w:r>
+              <w:rPr>
+                <w:webHidden/>
+                <w:noProof/>
+              </w:rPr>
+              <w:t>XX</w:t>
+            </w:r>
+            <w:r>
+              <w:rPr>
+                <w:webHidden/>
+                <w:noProof/>
+              </w:rPr>
+              <w:fldChar w:fldCharType="end"/>
+            </w:r>
+          </w:hyperlink>
+        </w:p>
+        <w:p>
+          <w:pPr>
+            <w:pStyle w:val="TDC3"/>
+            <w:tabs>
+              <w:tab w:val="left" w:pos="1440"/>
+              <w:tab w:val="right" w:leader="dot" w:pos="8777"/>
+            </w:tabs>
+            <w:rPr>
+              <w:rFonts w:asciiTheme="minorHAnsi" w:eastAsiaTheme="minorEastAsia" w:hAnsiTheme="minorHAnsi" w:cstheme="minorBidi"/>
+              <w:iCs w:val="0"/>
+              <w:noProof/>
+              <w:kern w:val="2"/>
+              <w:szCs w:val="24"/>
+              <w:lang w:val="es-PE" w:eastAsia="es-PE"/>
+              <w14:ligatures w14:val="standardContextual"/>
+            </w:rPr>
+          </w:pPr>
+          <w:hyperlink w:anchor="_Toc_Ch2_07" w:history="1">
+            <w:r>
+              <w:rPr>
+                <w:rStyle w:val="Hipervnculo"/>
+                <w:noProof/>
+                <w:iCs w:val="0"/>
+              </w:rPr>
+              <w:t>2.3.2</w:t>
+            </w:r>
+            <w:r>
+              <w:rPr>
+                <w:noProof/>
+                <w:iCs w:val="0"/>
+              </w:rPr>
+              <w:tab/>
+            </w:r>
+            <w:r>
+              <w:rPr>
+                <w:rStyle w:val="Hipervnculo"/>
+                <w:noProof/>
+                <w:iCs w:val="0"/>
+              </w:rPr>
+              <w:t>Infraestructura Backend</w:t>
+            </w:r>
+            <w:r>
+              <w:rPr>
+                <w:webHidden/>
+                <w:noProof/>
+              </w:rPr>
+              <w:tab/>
+            </w:r>
+            <w:r>
+              <w:rPr>
+                <w:webHidden/>
+                <w:noProof/>
+              </w:rPr>
+              <w:fldChar w:fldCharType="begin"/>
+            </w:r>
+            <w:r>
+              <w:rPr>
+                <w:webHidden/>
+                <w:noProof/>
+              </w:rPr>
+              <w:instrText xml:space="preserve"> PAGEREF _Toc_Ch2_07 \h </w:instrText>
+            </w:r>
+            <w:r>
+              <w:rPr>
+                <w:webHidden/>
+                <w:noProof/>
+              </w:rPr>
+            </w:r>
+            <w:r>
+              <w:rPr>
+                <w:webHidden/>
+                <w:noProof/>
+              </w:rPr>
+              <w:fldChar w:fldCharType="separate"/>
+            </w:r>
+            <w:r>
+              <w:rPr>
+                <w:webHidden/>
+                <w:noProof/>
+              </w:rPr>
+              <w:t>XX</w:t>
+            </w:r>
+            <w:r>
+              <w:rPr>
+                <w:webHidden/>
+                <w:noProof/>
+              </w:rPr>
+              <w:fldChar w:fldCharType="end"/>
+            </w:r>
+          </w:hyperlink>
+        </w:p>
+        <w:p>
+          <w:pPr>
+            <w:pStyle w:val="TDC2"/>
+            <w:tabs>
+              <w:tab w:val="left" w:pos="960"/>
+              <w:tab w:val="right" w:leader="dot" w:pos="8777"/>
+            </w:tabs>
+            <w:rPr>
+              <w:rFonts w:asciiTheme="minorHAnsi" w:eastAsiaTheme="minorEastAsia" w:hAnsiTheme="minorHAnsi" w:cstheme="minorBidi"/>
+              <w:noProof/>
+              <w:kern w:val="2"/>
+              <w:szCs w:val="24"/>
+              <w:lang w:val="es-PE" w:eastAsia="es-PE"/>
+              <w14:ligatures w14:val="standardContextual"/>
+            </w:rPr>
+          </w:pPr>
+          <w:hyperlink w:anchor="_Toc_Ch2_08" w:history="1">
+            <w:r>
+              <w:rPr>
+                <w:rStyle w:val="Hipervnculo"/>
+                <w:noProof/>
+              </w:rPr>
+              <w:t>2.4</w:t>
+            </w:r>
+            <w:r>
+              <w:rPr>
+                <w:noProof/>
+              </w:rPr>
+              <w:tab/>
+            </w:r>
+            <w:r>
+              <w:rPr>
+                <w:rStyle w:val="Hipervnculo"/>
+                <w:noProof/>
+              </w:rPr>
+              <w:t>Metodología de Desarrollo</w:t>
+            </w:r>
+            <w:r>
+              <w:rPr>
+                <w:webHidden/>
+                <w:noProof/>
+              </w:rPr>
+              <w:tab/>
+            </w:r>
+            <w:r>
+              <w:rPr>
+                <w:webHidden/>
+                <w:noProof/>
+              </w:rPr>
+              <w:fldChar w:fldCharType="begin"/>
+            </w:r>
+            <w:r>
+              <w:rPr>
+                <w:webHidden/>
+                <w:noProof/>
+              </w:rPr>
+              <w:instrText xml:space="preserve"> PAGEREF _Toc_Ch2_08 \h </w:instrText>
+            </w:r>
+            <w:r>
+              <w:rPr>
+                <w:webHidden/>
+                <w:noProof/>
+              </w:rPr>
+            </w:r>
+            <w:r>
+              <w:rPr>
+                <w:webHidden/>
+                <w:noProof/>
+              </w:rPr>
+              <w:fldChar w:fldCharType="separate"/>
+            </w:r>
+            <w:r>
+              <w:rPr>
+                <w:webHidden/>
+                <w:noProof/>
+              </w:rPr>
+              <w:t>XX</w:t>
+            </w:r>
+            <w:r>
+              <w:rPr>
+                <w:webHidden/>
+                <w:noProof/>
+              </w:rPr>
+              <w:fldChar w:fldCharType="end"/>
+            </w:r>
+          </w:hyperlink>
+        </w:p>
+        <w:p>
+          <w:pPr>
+            <w:pStyle w:val="TDC3"/>
+            <w:tabs>
+              <w:tab w:val="left" w:pos="1440"/>
+              <w:tab w:val="right" w:leader="dot" w:pos="8777"/>
+            </w:tabs>
+            <w:rPr>
+              <w:rFonts w:asciiTheme="minorHAnsi" w:eastAsiaTheme="minorEastAsia" w:hAnsiTheme="minorHAnsi" w:cstheme="minorBidi"/>
+              <w:iCs w:val="0"/>
+              <w:noProof/>
+              <w:kern w:val="2"/>
+              <w:szCs w:val="24"/>
+              <w:lang w:val="es-PE" w:eastAsia="es-PE"/>
+              <w14:ligatures w14:val="standardContextual"/>
+            </w:rPr>
+          </w:pPr>
+          <w:hyperlink w:anchor="_Toc_Ch2_09" w:history="1">
+            <w:r>
+              <w:rPr>
+                <w:rStyle w:val="Hipervnculo"/>
+                <w:noProof/>
+                <w:iCs w:val="0"/>
+              </w:rPr>
+              <w:t>2.4.1</w:t>
+            </w:r>
+            <w:r>
+              <w:rPr>
+                <w:noProof/>
+                <w:iCs w:val="0"/>
+              </w:rPr>
+              <w:tab/>
+            </w:r>
+            <w:r>
+              <w:rPr>
+                <w:rStyle w:val="Hipervnculo"/>
+                <w:noProof/>
+                <w:iCs w:val="0"/>
+              </w:rPr>
+              <w:t>SCRUM en equipos multidisciplinarios</w:t>
+            </w:r>
+            <w:r>
+              <w:rPr>
+                <w:webHidden/>
+                <w:noProof/>
+              </w:rPr>
+              <w:tab/>
+            </w:r>
+            <w:r>
+              <w:rPr>
+                <w:webHidden/>
+                <w:noProof/>
+              </w:rPr>
+              <w:fldChar w:fldCharType="begin"/>
+            </w:r>
+            <w:r>
+              <w:rPr>
+                <w:webHidden/>
+                <w:noProof/>
+              </w:rPr>
+              <w:instrText xml:space="preserve"> PAGEREF _Toc_Ch2_09 \h </w:instrText>
+            </w:r>
+            <w:r>
+              <w:rPr>
+                <w:webHidden/>
+                <w:noProof/>
+              </w:rPr>
+            </w:r>
+            <w:r>
+              <w:rPr>
+                <w:webHidden/>
+                <w:noProof/>
+              </w:rPr>
+              <w:fldChar w:fldCharType="separate"/>
+            </w:r>
+            <w:r>
+              <w:rPr>
+                <w:webHidden/>
+                <w:noProof/>
+              </w:rPr>
+              <w:t>XX</w:t>
+            </w:r>
+            <w:r>
+              <w:rPr>
+                <w:webHidden/>
+                <w:noProof/>
+              </w:rPr>
+              <w:fldChar w:fldCharType="end"/>
+            </w:r>
+          </w:hyperlink>
+        </w:p>
+        <w:p>
+          <w:pPr>
+            <w:pStyle w:val="TDC2"/>
+            <w:tabs>
+              <w:tab w:val="left" w:pos="960"/>
+              <w:tab w:val="right" w:leader="dot" w:pos="8777"/>
+            </w:tabs>
+            <w:rPr>
+              <w:rFonts w:asciiTheme="minorHAnsi" w:eastAsiaTheme="minorEastAsia" w:hAnsiTheme="minorHAnsi" w:cstheme="minorBidi"/>
+              <w:noProof/>
+              <w:kern w:val="2"/>
+              <w:szCs w:val="24"/>
+              <w:lang w:val="es-PE" w:eastAsia="es-PE"/>
+              <w14:ligatures w14:val="standardContextual"/>
+            </w:rPr>
+          </w:pPr>
+          <w:hyperlink w:anchor="_Toc_Ch2_10" w:history="1">
+            <w:r>
+              <w:rPr>
+                <w:rStyle w:val="Hipervnculo"/>
+                <w:noProof/>
+              </w:rPr>
+              <w:t>Referencias del Capítulo</w:t>
+            </w:r>
+            <w:r>
+              <w:rPr>
+                <w:webHidden/>
+                <w:noProof/>
+              </w:rPr>
+              <w:tab/>
+            </w:r>
+            <w:r>
+              <w:rPr>
+                <w:webHidden/>
+                <w:noProof/>
+              </w:rPr>
+              <w:fldChar w:fldCharType="begin"/>
+            </w:r>
+            <w:r>
+              <w:rPr>
+                <w:webHidden/>
+                <w:noProof/>
+              </w:rPr>
+              <w:instrText xml:space="preserve"> PAGEREF _Toc_Ch2_10 \h </w:instrText>
+            </w:r>
+            <w:r>
+              <w:rPr>
+                <w:webHidden/>
+                <w:noProof/>
+              </w:rPr>
+            </w:r>
+            <w:r>
+              <w:rPr>
+                <w:webHidden/>
+                <w:noProof/>
+              </w:rPr>
+              <w:fldChar w:fldCharType="separate"/>
+            </w:r>
+            <w:r>
+              <w:rPr>
+                <w:webHidden/>
+                <w:noProof/>
+              </w:rPr>
+              <w:t>XX</w:t>
+            </w:r>
+            <w:r>
+              <w:rPr>
+                <w:webHidden/>
+                <w:noProof/>
               </w:rPr>
               <w:fldChar w:fldCharType="end"/>
             </w:r>
@@ -4968,21 +5933,7 @@
         <w:rPr>
           <w:lang w:val="es-PE"/>
         </w:rPr>
-        <w:t xml:space="preserve">En el ámbito de la educación virtual, la institución cuenta con un proceso estructurado de producción de cursos denominado virtualización, que comprende la definición del diseño instruccional, la redacción del contenido textual por semana académica y la posterior producción de los recursos multimedia. Dentro de este proceso, el docente </w:t>
-      </w:r>
-      <w:proofErr w:type="spellStart"/>
-      <w:r>
-        <w:rPr>
-          <w:lang w:val="es-PE"/>
-        </w:rPr>
-        <w:t>virtualizador</w:t>
-      </w:r>
-      <w:proofErr w:type="spellEnd"/>
-      <w:r>
-        <w:rPr>
-          <w:lang w:val="es-PE"/>
-        </w:rPr>
-        <w:t xml:space="preserve"> es el profesional encargado de redactar los materiales instruccionales denominados IPES (Introducción, Presentaciones y Ejercicios), que constituyen el contenido textual base de cada semana del curso.</w:t>
+        <w:t>En el ámbito de la educación virtual, la institución cuenta con un proceso estructurado de producción de cursos denominado virtualización, que comprende la definición del diseño instruccional, la redacción del contenido textual por semana académica y la posterior producción de los recursos multimedia. Dentro de este proceso, el docente virtualizador es el profesional encargado de redactar los materiales instruccionales denominados IPES (Introducción, Presentaciones y Ejercicios), que constituyen el contenido textual base de cada semana del curso.</w:t>
       </w:r>
     </w:p>
     <w:p>
@@ -4996,21 +5947,7 @@
         <w:rPr>
           <w:lang w:val="es-PE"/>
         </w:rPr>
-        <w:t xml:space="preserve">El proceso de producción de un curso completo de 18 semanas toma en promedio entre dos y tres semanas de trabajo, durante las cuales el docente </w:t>
-      </w:r>
-      <w:proofErr w:type="spellStart"/>
-      <w:r>
-        <w:rPr>
-          <w:lang w:val="es-PE"/>
-        </w:rPr>
-        <w:t>virtualizador</w:t>
-      </w:r>
-      <w:proofErr w:type="spellEnd"/>
-      <w:r>
-        <w:rPr>
-          <w:lang w:val="es-PE"/>
-        </w:rPr>
-        <w:t xml:space="preserve"> genera los guiones de narración para los recursos de video, las introducciones a cada semana y las consignas de los ejercicios y actividades, tanto calificadas como no calificadas. La institución establece criterios pedagógicos precisos para este contenido, incluyendo la alineación con los logros </w:t>
+        <w:t xml:space="preserve">El proceso de producción de un curso completo de 18 semanas toma en promedio entre dos y tres semanas de trabajo, durante las cuales el docente virtualizador genera los guiones de narración para los recursos de video, las introducciones a cada semana y las consignas de los ejercicios y actividades, tanto calificadas como no calificadas. La institución establece criterios pedagógicos precisos para este contenido, incluyendo la alineación con los logros </w:t>
       </w:r>
       <w:r>
         <w:rPr>
@@ -5041,21 +5978,7 @@
         <w:rPr>
           <w:lang w:val="es-PE"/>
         </w:rPr>
-        <w:t xml:space="preserve">La demora en la gestión de contenido y materiales de los cursos virtuales en la institución constituye el problema central identificado. La producción de material educativo para los cursos virtuales enfrenta un cuello de botella operativo: la redacción de los materiales instruccionales de cada semana académica recae sobre el docente </w:t>
-      </w:r>
-      <w:proofErr w:type="spellStart"/>
-      <w:r>
-        <w:rPr>
-          <w:lang w:val="es-PE"/>
-        </w:rPr>
-        <w:t>virtualizador</w:t>
-      </w:r>
-      <w:proofErr w:type="spellEnd"/>
-      <w:r>
-        <w:rPr>
-          <w:lang w:val="es-PE"/>
-        </w:rPr>
-        <w:t>, un profesional especializado que escribe manualmente las introducciones, guiones de narración para videos de presentación y consignas de actividades, asegurando que cada pieza esté alineada a los logros de aprendizaje del curso. Esta situación se origina en las siguientes causas:</w:t>
+        <w:t>La demora en la gestión de contenido y materiales de los cursos virtuales en la institución constituye el problema central identificado. La producción de material educativo para los cursos virtuales enfrenta un cuello de botella operativo: la redacción de los materiales instruccionales de cada semana académica recae sobre el docente virtualizador, un profesional especializado que escribe manualmente las introducciones, guiones de narración para videos de presentación y consignas de actividades, asegurando que cada pieza esté alineada a los logros de aprendizaje del curso. Esta situación se origina en las siguientes causas:</w:t>
       </w:r>
     </w:p>
     <w:p>
@@ -5076,21 +5999,7 @@
         <w:rPr>
           <w:lang w:val="es-PE"/>
         </w:rPr>
-        <w:t xml:space="preserve">El proceso depende exclusivamente de la disponibilidad y capacidad del docente </w:t>
-      </w:r>
-      <w:proofErr w:type="spellStart"/>
-      <w:r>
-        <w:rPr>
-          <w:lang w:val="es-PE"/>
-        </w:rPr>
-        <w:t>virtualizador</w:t>
-      </w:r>
-      <w:proofErr w:type="spellEnd"/>
-      <w:r>
-        <w:rPr>
-          <w:lang w:val="es-PE"/>
-        </w:rPr>
-        <w:t>, lo que hace que la producción de un curso completo tome en promedio entre dos y tres semanas. Esto limita la capacidad institucional de escalar la oferta académica virtual frente a una demanda creciente</w:t>
+        <w:t>El proceso depende exclusivamente de la disponibilidad y capacidad del docente virtualizador, lo que hace que la producción de un curso completo tome en promedio entre dos y tres semanas. Esto limita la capacidad institucional de escalar la oferta académica virtual frente a una demanda creciente</w:t>
       </w:r>
       <w:r>
         <w:rPr>
@@ -5111,6 +6020,7 @@
             <w:docPart w:val="DefaultPlaceholder_-1854013440"/>
           </w:placeholder>
         </w:sdtPr>
+        <w:sdtEndPr/>
         <w:sdtContent>
           <w:r>
             <w:rPr>
@@ -5147,21 +6057,7 @@
         <w:rPr>
           <w:lang w:val="es-PE"/>
         </w:rPr>
-        <w:t xml:space="preserve">Al remunerar al docente </w:t>
-      </w:r>
-      <w:proofErr w:type="spellStart"/>
-      <w:r>
-        <w:rPr>
-          <w:lang w:val="es-PE"/>
-        </w:rPr>
-        <w:t>virtualizador</w:t>
-      </w:r>
-      <w:proofErr w:type="spellEnd"/>
-      <w:r>
-        <w:rPr>
-          <w:lang w:val="es-PE"/>
-        </w:rPr>
-        <w:t xml:space="preserve"> por horas trabajadas, el gasto de producción aumenta proporcionalmente con la cantidad de cursos, sin que exista actualmente un mecanismo que permita reducir esa carga sin comprometer la calidad del contenido</w:t>
+        <w:t>Al remunerar al docente virtualizador por horas trabajadas, el gasto de producción aumenta proporcionalmente con la cantidad de cursos, sin que exista actualmente un mecanismo que permita reducir esa carga sin comprometer la calidad del contenido</w:t>
       </w:r>
       <w:r>
         <w:rPr>
@@ -5182,6 +6078,7 @@
             <w:docPart w:val="DefaultPlaceholder_-1854013440"/>
           </w:placeholder>
         </w:sdtPr>
+        <w:sdtEndPr/>
         <w:sdtContent>
           <w:r>
             <w:rPr>
@@ -5307,12 +6204,37 @@
             <w:shd w:val="clear" w:color="auto" w:fill="1F3864"/>
           </w:tcPr>
           <w:p>
+            <w:proofErr w:type="spellStart"/>
             <w:r>
               <w:rPr>
                 <w:b/>
                 <w:color w:val="FFFFFF"/>
               </w:rPr>
-              <w:t xml:space="preserve">Tiempo / Costo </w:t>
+              <w:t>Tiempo</w:t>
+            </w:r>
+            <w:proofErr w:type="spellEnd"/>
+            <w:r>
+              <w:rPr>
+                <w:b/>
+                <w:color w:val="FFFFFF"/>
+              </w:rPr>
+              <w:t xml:space="preserve"> / </w:t>
+            </w:r>
+            <w:proofErr w:type="spellStart"/>
+            <w:r>
+              <w:rPr>
+                <w:b/>
+                <w:color w:val="FFFFFF"/>
+              </w:rPr>
+              <w:t>Costo</w:t>
+            </w:r>
+            <w:proofErr w:type="spellEnd"/>
+            <w:r>
+              <w:rPr>
+                <w:b/>
+                <w:color w:val="FFFFFF"/>
+              </w:rPr>
+              <w:t xml:space="preserve"> </w:t>
             </w:r>
             <w:proofErr w:type="spellStart"/>
             <w:r>
@@ -5358,15 +6280,7 @@
             </w:r>
             <w:proofErr w:type="spellEnd"/>
             <w:r>
-              <w:t xml:space="preserve"> </w:t>
-            </w:r>
-            <w:proofErr w:type="spellStart"/>
-            <w:r>
-              <w:t>virtualizador</w:t>
-            </w:r>
-            <w:proofErr w:type="spellEnd"/>
-            <w:r>
-              <w:t>)</w:t>
+              <w:t xml:space="preserve"> virtualizador)</w:t>
             </w:r>
           </w:p>
         </w:tc>
@@ -5497,6 +6411,7 @@
         <w:rPr>
           <w:lang w:val="es-PE"/>
         </w:rPr>
+        <w:lastRenderedPageBreak/>
         <w:t xml:space="preserve">Los costos presentados se basan en datos reales obtenidos del registro de tokens del sistema, </w:t>
       </w:r>
       <w:proofErr w:type="spellStart"/>
@@ -5575,6 +6490,7 @@
             <w:docPart w:val="DefaultPlaceholder_-1854013440"/>
           </w:placeholder>
         </w:sdtPr>
+        <w:sdtEndPr/>
         <w:sdtContent>
           <w:r>
             <w:rPr>
@@ -5633,6 +6549,7 @@
             <w:docPart w:val="DefaultPlaceholder_-1854013440"/>
           </w:placeholder>
         </w:sdtPr>
+        <w:sdtEndPr/>
         <w:sdtContent>
           <w:r>
             <w:rPr>
@@ -5841,21 +6758,7 @@
               <w:rPr>
                 <w:lang w:val="es-PE"/>
               </w:rPr>
-              <w:t xml:space="preserve">• Dependencia exclusiva del docente </w:t>
-            </w:r>
-            <w:proofErr w:type="spellStart"/>
-            <w:r>
-              <w:rPr>
-                <w:lang w:val="es-PE"/>
-              </w:rPr>
-              <w:t>virtualizador</w:t>
-            </w:r>
-            <w:proofErr w:type="spellEnd"/>
-            <w:r>
-              <w:rPr>
-                <w:lang w:val="es-PE"/>
-              </w:rPr>
-              <w:t xml:space="preserve"> para producir el contenido semanal</w:t>
+              <w:t>• Dependencia exclusiva del docente virtualizador para producir el contenido semanal</w:t>
             </w:r>
             <w:r>
               <w:rPr>
@@ -5876,6 +6779,7 @@
                   <w:docPart w:val="DefaultPlaceholder_-1854013440"/>
                 </w:placeholder>
               </w:sdtPr>
+              <w:sdtEndPr/>
               <w:sdtContent>
                 <w:r>
                   <w:rPr>
@@ -5919,6 +6823,7 @@
                   <w:docPart w:val="DefaultPlaceholder_-1854013440"/>
                 </w:placeholder>
               </w:sdtPr>
+              <w:sdtEndPr/>
               <w:sdtContent>
                 <w:r>
                   <w:rPr>
@@ -5968,6 +6873,7 @@
                   <w:docPart w:val="DefaultPlaceholder_-1854013440"/>
                 </w:placeholder>
               </w:sdtPr>
+              <w:sdtEndPr/>
               <w:sdtContent>
                 <w:r>
                   <w:rPr>
@@ -6024,6 +6930,7 @@
                   <w:docPart w:val="DefaultPlaceholder_-1854013440"/>
                 </w:placeholder>
               </w:sdtPr>
+              <w:sdtEndPr/>
               <w:sdtContent>
                 <w:r>
                   <w:rPr>
@@ -7328,7 +8235,13 @@
         <w:rPr>
           <w:lang w:val="es-PE"/>
         </w:rPr>
-        <w:t xml:space="preserve"> mensuales que reflejan el trabajo efectivamente realizado.</w:t>
+        <w:t xml:space="preserve"> mensuales que reflejan el t</w:t>
+      </w:r>
+      <w:r>
+        <w:rPr>
+          <w:lang w:val="es-PE"/>
+        </w:rPr>
+        <w:t>rabajo efectivamente realizado.</w:t>
       </w:r>
     </w:p>
     <w:p>
@@ -7610,7 +8523,21 @@
               <w:rPr>
                 <w:lang w:val="es-PE"/>
               </w:rPr>
-              <w:t xml:space="preserve">- Recepción del repositorio del Tech Leader y </w:t>
+              <w:t xml:space="preserve">- Recepción del repositorio del </w:t>
+            </w:r>
+            <w:proofErr w:type="spellStart"/>
+            <w:r>
+              <w:rPr>
+                <w:lang w:val="es-PE"/>
+              </w:rPr>
+              <w:t>Tech</w:t>
+            </w:r>
+            <w:proofErr w:type="spellEnd"/>
+            <w:r>
+              <w:rPr>
+                <w:lang w:val="es-PE"/>
+              </w:rPr>
+              <w:t xml:space="preserve"> Leader y </w:t>
             </w:r>
             <w:proofErr w:type="spellStart"/>
             <w:r>
@@ -7664,7 +8591,13 @@
               <w:rPr>
                 <w:lang w:val="es-PE"/>
               </w:rPr>
-              <w:t xml:space="preserve">- Diseño inicial del </w:t>
+              <w:t>- Diseñ</w:t>
+            </w:r>
+            <w:r>
+              <w:rPr>
+                <w:lang w:val="es-PE"/>
+              </w:rPr>
+              <w:t xml:space="preserve">o inicial del </w:t>
             </w:r>
             <w:proofErr w:type="spellStart"/>
             <w:r>
@@ -7761,7 +8694,21 @@
               <w:rPr>
                 <w:lang w:val="es-PE"/>
               </w:rPr>
-              <w:t xml:space="preserve"> del Tech Leader: priorizar implementación de agentes antes del </w:t>
+              <w:t xml:space="preserve"> del </w:t>
+            </w:r>
+            <w:proofErr w:type="spellStart"/>
+            <w:r>
+              <w:rPr>
+                <w:lang w:val="es-PE"/>
+              </w:rPr>
+              <w:t>Tech</w:t>
+            </w:r>
+            <w:proofErr w:type="spellEnd"/>
+            <w:r>
+              <w:rPr>
+                <w:lang w:val="es-PE"/>
+              </w:rPr>
+              <w:t xml:space="preserve"> Leader: priorizar implementación de agentes antes del </w:t>
             </w:r>
             <w:proofErr w:type="spellStart"/>
             <w:r>
@@ -7897,7 +8844,13 @@
               <w:rPr>
                 <w:lang w:val="es-PE"/>
               </w:rPr>
-              <w:t xml:space="preserve"> de documentos → estructura JSON.</w:t>
+              <w:t xml:space="preserve"> de documentos → estructura JSO</w:t>
+            </w:r>
+            <w:r>
+              <w:rPr>
+                <w:lang w:val="es-PE"/>
+              </w:rPr>
+              <w:t>N.</w:t>
             </w:r>
           </w:p>
           <w:p>
@@ -8019,7 +8972,13 @@
               <w:rPr>
                 <w:lang w:val="es-PE"/>
               </w:rPr>
-              <w:t xml:space="preserve"> generado como primer output del sistema</w:t>
+              <w:t xml:space="preserve"> generad</w:t>
+            </w:r>
+            <w:r>
+              <w:rPr>
+                <w:lang w:val="es-PE"/>
+              </w:rPr>
+              <w:t>o como primer output del sistema</w:t>
             </w:r>
           </w:p>
         </w:tc>
@@ -8109,7 +9068,13 @@
                 <w:lang w:val="es-PE"/>
               </w:rPr>
               <w:lastRenderedPageBreak/>
-              <w:t>- Integración del pipeline completo: Diseño → Generación IPES.</w:t>
+              <w:t>- Integración del pipeline completo: Diseño → Generación IP</w:t>
+            </w:r>
+            <w:r>
+              <w:rPr>
+                <w:lang w:val="es-PE"/>
+              </w:rPr>
+              <w:t>ES.</w:t>
             </w:r>
           </w:p>
           <w:p>
@@ -8232,7 +9197,10 @@
           </w:tcPr>
           <w:p>
             <w:r>
-              <w:t>Dic 1 – Dic 31, 2025</w:t>
+              <w:t xml:space="preserve">Dic 1 – Dic 31, </w:t>
+            </w:r>
+            <w:r>
+              <w:t>2025</w:t>
             </w:r>
           </w:p>
         </w:tc>
@@ -8335,7 +9303,13 @@
               <w:rPr>
                 <w:lang w:val="es-PE"/>
               </w:rPr>
-              <w:t xml:space="preserve">- 15 dic: Demo con coordinadora DAV (Dirección Académica Virtual): presentó interés en la generación IPES y en el flujo paso a paso de la plataforma; solicitó </w:t>
+              <w:t>- 15 dic: Demo con coordinadora DAV (Dirección Ac</w:t>
+            </w:r>
+            <w:r>
+              <w:rPr>
+                <w:lang w:val="es-PE"/>
+              </w:rPr>
+              <w:t xml:space="preserve">adémica Virtual): presentó interés en la generación IPES y en el flujo paso a paso de la plataforma; solicitó </w:t>
             </w:r>
             <w:proofErr w:type="spellStart"/>
             <w:r>
@@ -8402,7 +9376,13 @@
               <w:rPr>
                 <w:lang w:val="es-PE"/>
               </w:rPr>
-              <w:t>stakeholder</w:t>
+              <w:t>stakehol</w:t>
+            </w:r>
+            <w:r>
+              <w:rPr>
+                <w:lang w:val="es-PE"/>
+              </w:rPr>
+              <w:t>der</w:t>
             </w:r>
             <w:proofErr w:type="spellEnd"/>
             <w:r>
@@ -8589,7 +9569,13 @@
               <w:rPr>
                 <w:lang w:val="es-PE"/>
               </w:rPr>
-              <w:t>-feb: jefe directo indica preparar paquete del proyecto para presentación a gerencia; proyecto queda en espera.</w:t>
+              <w:t>-feb: jefe directo indica preparar paquete del proyecto para presentación a gerencia; proyecto queda</w:t>
+            </w:r>
+            <w:r>
+              <w:rPr>
+                <w:lang w:val="es-PE"/>
+              </w:rPr>
+              <w:t xml:space="preserve"> en espera.</w:t>
             </w:r>
           </w:p>
         </w:tc>
@@ -8724,7 +9710,13 @@
               <w:rPr>
                 <w:lang w:val="es-PE"/>
               </w:rPr>
-              <w:t xml:space="preserve">-mar: reunión con jefe: revisión del estado del proyecto; IPES validado, plataforma </w:t>
+              <w:t xml:space="preserve">-mar: reunión con jefe: revisión del estado del proyecto; IPES </w:t>
+            </w:r>
+            <w:r>
+              <w:rPr>
+                <w:lang w:val="es-PE"/>
+              </w:rPr>
+              <w:t xml:space="preserve">validado, plataforma </w:t>
             </w:r>
             <w:r>
               <w:rPr>
@@ -8757,7 +9749,13 @@
               <w:rPr>
                 <w:lang w:val="es-PE"/>
               </w:rPr>
-              <w:t>- Segunda quincena: validación con docentes revisores — contenido valorado como interesante con observaciones menores.</w:t>
+              <w:t>- Segunda quincena: validación con docentes revisores — contenido valorado como interesante con ob</w:t>
+            </w:r>
+            <w:r>
+              <w:rPr>
+                <w:lang w:val="es-PE"/>
+              </w:rPr>
+              <w:t>servaciones menores.</w:t>
             </w:r>
           </w:p>
           <w:p>
@@ -8930,7 +9928,13 @@
               <w:rPr>
                 <w:lang w:val="es-PE"/>
               </w:rPr>
-              <w:t>- Pulido continuo de IPES y generación de contenido.</w:t>
+              <w:t xml:space="preserve">- Pulido </w:t>
+            </w:r>
+            <w:r>
+              <w:rPr>
+                <w:lang w:val="es-PE"/>
+              </w:rPr>
+              <w:t>continuo de IPES y generación de contenido.</w:t>
             </w:r>
           </w:p>
           <w:p>
@@ -8976,7 +9980,13 @@
                 <w:lang w:val="es-PE"/>
               </w:rPr>
               <w:lastRenderedPageBreak/>
-              <w:t>Referencias al contenido) y CU7 (Generación de Consignas).</w:t>
+              <w:t>Referencias al conte</w:t>
+            </w:r>
+            <w:r>
+              <w:rPr>
+                <w:lang w:val="es-PE"/>
+              </w:rPr>
+              <w:t>nido) y CU7 (Generación de Consignas).</w:t>
             </w:r>
           </w:p>
           <w:p>
@@ -9617,12 +10627,21 @@
             <w:shd w:val="clear" w:color="auto" w:fill="1F3864"/>
           </w:tcPr>
           <w:p>
+            <w:proofErr w:type="spellStart"/>
             <w:r>
               <w:rPr>
                 <w:b/>
                 <w:color w:val="FFFFFF"/>
               </w:rPr>
-              <w:t xml:space="preserve">Costo </w:t>
+              <w:t>Costo</w:t>
+            </w:r>
+            <w:proofErr w:type="spellEnd"/>
+            <w:r>
+              <w:rPr>
+                <w:b/>
+                <w:color w:val="FFFFFF"/>
+              </w:rPr>
+              <w:t xml:space="preserve"> </w:t>
             </w:r>
             <w:proofErr w:type="spellStart"/>
             <w:r>
@@ -9820,15 +10839,7 @@
             </w:r>
             <w:proofErr w:type="spellEnd"/>
             <w:r>
-              <w:t xml:space="preserve"> </w:t>
-            </w:r>
-            <w:proofErr w:type="spellStart"/>
-            <w:r>
-              <w:t>por</w:t>
-            </w:r>
-            <w:proofErr w:type="spellEnd"/>
-            <w:r>
-              <w:t xml:space="preserve"> </w:t>
+              <w:t xml:space="preserve"> por </w:t>
             </w:r>
             <w:proofErr w:type="spellStart"/>
             <w:r>
@@ -12009,2068 +13020,947 @@
     <w:p>
       <w:pPr>
         <w:pStyle w:val="Ttulo2"/>
-      </w:pPr>
-      <w:r>
-        <w:t>2.1  El Proceso de Producción Instruccional</w:t>
+        <w:numPr>
+          <w:ilvl w:val="0"/>
+          <w:numId w:val="0"/>
+        </w:numPr>
+        <w:ind w:left="576" w:hanging="576"/>
+      </w:pPr>
+      <w:r>
+        <w:t>2.1 El</w:t>
+      </w:r>
+      <w:r>
+        <w:t xml:space="preserve"> Proceso de Producción Instruccional</w:t>
       </w:r>
     </w:p>
     <w:p>
-      <w:pPr>
-        <w:spacing w:after="120"/>
-      </w:pPr>
-      <w:r>
-        <w:rPr>
-          <w:b/>
-        </w:rPr>
-        <w:t>En esta sección se describen los elementos que componen el proceso de producción de cursos virtuales en una institución de educación superior: los roles del equipo, los documentos de entrada que definen el curso</w:t>
-      </w:r>
-      <w:r>
-        <w:t>, los artefactos que se producen y el catálogo de tipos de recursos educativos.</w:t>
+      <w:r>
+        <w:t xml:space="preserve">En esta sección se describen los elementos que componen el proceso de </w:t>
+      </w:r>
+      <w:r>
+        <w:t>producción de cursos virtuales en una institución de educación superior: los documentos de entrada que definen el curso y los artefactos que se producen a lo largo del proceso.</w:t>
       </w:r>
     </w:p>
     <w:p>
       <w:pPr>
         <w:pStyle w:val="Ttulo3"/>
-      </w:pPr>
-      <w:r>
-        <w:t>2.1.1  Roles del equipo de producción</w:t>
+        <w:numPr>
+          <w:ilvl w:val="0"/>
+          <w:numId w:val="0"/>
+        </w:numPr>
+        <w:ind w:left="720" w:hanging="720"/>
+      </w:pPr>
+      <w:r>
+        <w:t>2.1.1 Documentos</w:t>
+      </w:r>
+      <w:r>
+        <w:t xml:space="preserve"> de entrada y artefactos del proceso</w:t>
       </w:r>
     </w:p>
     <w:p>
-      <w:pPr>
-        <w:spacing w:after="120"/>
-      </w:pPr>
-      <w:r>
-        <w:t>Se explicará cada uno de los perfiles que intervienen en el proceso de virtualización de cursos, su responsabilidad específica dentro del flujo de producción y la relación entre ellos. Los roles a desarrollar son:</w:t>
+      <w:r>
+        <w:t>Se describen los document</w:t>
+      </w:r>
+      <w:r>
+        <w:t xml:space="preserve">os e insumos que intervienen en el proceso de producción instruccional. El proceso parte de dos documentos de entrada: el </w:t>
+      </w:r>
+      <w:r>
+        <w:rPr>
+          <w:b/>
+        </w:rPr>
+        <w:t>sílabo</w:t>
+      </w:r>
+      <w:r>
+        <w:t xml:space="preserve">, documento oficial del curso que establece su estructura académica (unidades, semanas, temas y logros de aprendizaje), y el </w:t>
+      </w:r>
+      <w:r>
+        <w:rPr>
+          <w:b/>
+        </w:rPr>
+        <w:t>kic</w:t>
+      </w:r>
+      <w:r>
+        <w:rPr>
+          <w:b/>
+        </w:rPr>
+        <w:t>koff</w:t>
+      </w:r>
+      <w:r>
+        <w:t xml:space="preserve"> o acta de reunión de inicio, que recoge los acuerdos pedagógicos previos a la producción (perfil del estudiante, enfoque didáctico y criterios específicos del curso). A partir de estos insumos, el proceso genera tres artefactos de forma secuencial: el</w:t>
+      </w:r>
+      <w:r>
+        <w:t xml:space="preserve"> </w:t>
+      </w:r>
+      <w:r>
+        <w:rPr>
+          <w:b/>
+        </w:rPr>
+        <w:t>IPES</w:t>
+      </w:r>
+      <w:r>
+        <w:t xml:space="preserve"> (Introducción, Presentaciones y Ejercicios), documento de planificación instruccional semanal que actúa como hoja de ruta del contenido a producir; el </w:t>
+      </w:r>
+      <w:r>
+        <w:rPr>
+          <w:b/>
+        </w:rPr>
+        <w:t>Material Base</w:t>
+      </w:r>
+      <w:r>
+        <w:t>, que constituye el contenido final que consumen los estudiantes (guiones de video, se</w:t>
+      </w:r>
+      <w:r>
+        <w:t xml:space="preserve">paratas, recursos interactivos); y las </w:t>
+      </w:r>
+      <w:r>
+        <w:rPr>
+          <w:b/>
+        </w:rPr>
+        <w:t>Consignas</w:t>
+      </w:r>
+      <w:r>
+        <w:t>, instrumentos formales de evaluación que definen cómo se valorará el desempeño del estudiante en las actividades calificadas.</w:t>
       </w:r>
     </w:p>
     <w:p>
       <w:pPr>
-        <w:pStyle w:val="Listaconvietas"/>
-        <w:spacing w:after="60"/>
-      </w:pPr>
-      <w:r>
-        <w:rPr>
-          <w:b/>
-        </w:rPr>
-        <w:t xml:space="preserve">DDA (Dirección de Diseño Académico): </w:t>
-      </w:r>
-      <w:r>
-        <w:t>Rol con visión macro del proceso de producción. Puede intervenir y tomar decisiones sobre cualquier curso en cualquier momento. No necesariamente es experto en el contenido de cada asignatura.</w:t>
+        <w:pStyle w:val="Ttulo2"/>
+        <w:numPr>
+          <w:ilvl w:val="0"/>
+          <w:numId w:val="0"/>
+        </w:numPr>
+        <w:ind w:left="576" w:hanging="576"/>
+      </w:pPr>
+      <w:r>
+        <w:t>2.2 Fundamentos</w:t>
+      </w:r>
+      <w:r>
+        <w:t xml:space="preserve"> Pedagógicos</w:t>
       </w:r>
     </w:p>
     <w:p>
-      <w:pPr>
-        <w:pStyle w:val="Listaconvietas"/>
-        <w:spacing w:after="60"/>
-      </w:pPr>
-      <w:r>
-        <w:rPr>
-          <w:b/>
-        </w:rPr>
-        <w:t xml:space="preserve">LxD (Learning Designer / Diseñador Instruccional): </w:t>
-      </w:r>
-      <w:r>
-        <w:t>Profesional que diseña la estructura instruccional del curso. Conoce cómo debe estructurarse un curso pero no es el experto en la materia. Es quien genera el IPES.</w:t>
+      <w:r>
+        <w:t>En esta sección se presenta el marco teórico del apr</w:t>
+      </w:r>
+      <w:r>
+        <w:t>endizaje que sustenta las reglas pedagógicas codificadas en el sistema.</w:t>
       </w:r>
     </w:p>
     <w:p>
       <w:pPr>
-        <w:pStyle w:val="Listaconvietas"/>
-        <w:spacing w:after="60"/>
-      </w:pPr>
-      <w:r>
-        <w:rPr>
-          <w:b/>
-        </w:rPr>
-        <w:t xml:space="preserve">Docente Virtualizador / Experto Temático: </w:t>
-      </w:r>
-      <w:r>
-        <w:t>Experto en el contenido de la asignatura y responsable de crear los materiales instruccionales. Es el rol que el sistema replica mediante IA.</w:t>
+        <w:pStyle w:val="Ttulo3"/>
+        <w:numPr>
+          <w:ilvl w:val="0"/>
+          <w:numId w:val="0"/>
+        </w:numPr>
+        <w:ind w:left="720" w:hanging="720"/>
+      </w:pPr>
+      <w:proofErr w:type="gramStart"/>
+      <w:r>
+        <w:t>2.2.1  Taxonomía</w:t>
+      </w:r>
+      <w:proofErr w:type="gramEnd"/>
+      <w:r>
+        <w:t xml:space="preserve"> de Bloom</w:t>
       </w:r>
     </w:p>
     <w:p>
-      <w:pPr>
-        <w:pStyle w:val="Listaconvietas"/>
-        <w:spacing w:after="60"/>
-      </w:pPr>
-      <w:r>
-        <w:rPr>
-          <w:b/>
-        </w:rPr>
-        <w:t xml:space="preserve">Docente Revisor: </w:t>
-      </w:r>
-      <w:r>
-        <w:t>Experto que revisa y valida los materiales generados —ya sea por humanos o por IA— antes de que pasen a producción. Es el validador final de calidad.</w:t>
+      <w:r>
+        <w:t>La Taxonomía de Bloom, en su revisión de Anderson &amp; Krathwohl (2001), constituye el marco central de clasificación de objetivos de aprendizaje sobre el que el</w:t>
+      </w:r>
+      <w:r>
+        <w:t xml:space="preserve"> sistema fundamenta sus decisiones de selección de recursos. Se explicará en detalle dado su rol estructural en la lógica del sistema. Los puntos a cubrir son:</w:t>
       </w:r>
     </w:p>
     <w:p>
       <w:pPr>
         <w:pStyle w:val="Listaconvietas"/>
-        <w:spacing w:after="60"/>
-      </w:pPr>
-      <w:r>
-        <w:rPr>
-          <w:b/>
-        </w:rPr>
-        <w:t xml:space="preserve">Área de Evaluación: </w:t>
-      </w:r>
-      <w:r>
-        <w:t>Equipo especializado en la construcción de instrumentos de evaluación (consignas, rúbricas, listas de cotejo). Verifica que las actividades calificadas estén bien construidas pedagógicamente.</w:t>
-      </w:r>
-    </w:p>
-    <w:p/>
-    <w:p>
-      <w:pPr>
-        <w:pStyle w:val="Ttulo3"/>
-      </w:pPr>
-      <w:r>
-        <w:t>2.1.2  Documentos de entrada: Sílabo y Kickoff</w:t>
+      </w:pPr>
+      <w:r>
+        <w:t>Los seis niveles cognitivos y sus verbos asociados (Recordar, Comprender, Aplicar, Analizar, Eva</w:t>
+      </w:r>
+      <w:r>
+        <w:t>luar, Crear), según la revisión de Anderson &amp; Krathwohl (2001) sobre la taxonomía original de Bloom et al. (1956).</w:t>
       </w:r>
     </w:p>
     <w:p>
       <w:pPr>
-        <w:spacing w:after="120"/>
-      </w:pPr>
-      <w:r>
-        <w:t>Se describirán los dos documentos que el sistema recibe como entrada y que concentran toda la información necesaria para producir el contenido de un curso:</w:t>
+        <w:pStyle w:val="Listaconvietas"/>
+      </w:pPr>
+      <w:r>
+        <w:t>Cómo el verbo del logro de aprendizaje semanal determina el tipo de recurso a utilizar: la tabla verbo × densidad de contenido → tipo de recu</w:t>
+      </w:r>
+      <w:r>
+        <w:t>rso que el sistema aplica en cada semana del curso.</w:t>
       </w:r>
     </w:p>
     <w:p>
       <w:pPr>
         <w:pStyle w:val="Listaconvietas"/>
-        <w:spacing w:after="60"/>
-      </w:pPr>
-      <w:r>
-        <w:rPr>
-          <w:b/>
-        </w:rPr>
-        <w:t xml:space="preserve">Sílabo: </w:t>
-      </w:r>
-      <w:r>
-        <w:t>Documento oficial del curso (formato Excel) que contiene la estructura académica: unidades, semanas, temas, logros de aprendizaje y actividades calificadas. Es la fuente de verdad estructural del curso.</w:t>
+      </w:pPr>
+      <w:r>
+        <w:lastRenderedPageBreak/>
+        <w:t>La jerarquía de logros: Logro del Curso → Logro de Unidad → Logro de Semana → Propósito del Recurso, y por qué cada nivel debe ser consistente con el superior (principio de alineación vertical).</w:t>
       </w:r>
     </w:p>
     <w:p>
       <w:pPr>
         <w:pStyle w:val="Listaconvietas"/>
-        <w:spacing w:after="60"/>
-      </w:pPr>
-      <w:r>
-        <w:rPr>
-          <w:b/>
-        </w:rPr>
-        <w:lastRenderedPageBreak/>
-        <w:t xml:space="preserve">Kickoff / Acta de Reunión de Inicio: </w:t>
-      </w:r>
-      <w:r>
-        <w:t>Documento que recoge los acuerdos tomados entre el equipo académico y el experto antes de iniciar la producción. Incluye: perfil del estudiante, enfoque de diseño (teórico / práctico / mixto), temas complejos, fórmula de evaluación y criterios específicos del curso. Contiene información que el sílabo no recoge y que condiciona decisiones de diseño.</w:t>
-      </w:r>
-    </w:p>
-    <w:p/>
-    <w:p>
-      <w:pPr>
-        <w:pStyle w:val="Ttulo3"/>
-      </w:pPr>
-      <w:r>
-        <w:t>2.1.3  Artefactos producidos: IPES, Material Base y Consignas</w:t>
+      </w:pPr>
+      <w:r>
+        <w:t>La distin</w:t>
+      </w:r>
+      <w:r>
+        <w:t>ción entre contenido procedimental (requiere recurso demostrativo), teórico (requiere recurso expositivo) y básico (flexible), y cómo el verbo del logro permite identificar cada tipo.</w:t>
       </w:r>
     </w:p>
     <w:p>
       <w:pPr>
-        <w:spacing w:after="120"/>
-      </w:pPr>
-      <w:r>
-        <w:t>Se explicarán los tres artefactos principales que produce el proceso de virtualización, con énfasis en la relación secuencial entre ellos:</w:t>
+        <w:pStyle w:val="Ttulo2"/>
+        <w:numPr>
+          <w:ilvl w:val="0"/>
+          <w:numId w:val="0"/>
+        </w:numPr>
+        <w:ind w:left="576" w:hanging="576"/>
+      </w:pPr>
+      <w:r>
+        <w:t>2.3 Fundamentos</w:t>
+      </w:r>
+      <w:r>
+        <w:t xml:space="preserve"> Técnicos</w:t>
       </w:r>
     </w:p>
     <w:p>
-      <w:pPr>
-        <w:pStyle w:val="Listaconvietas"/>
-        <w:spacing w:after="60"/>
-      </w:pPr>
-      <w:r>
-        <w:rPr>
-          <w:b/>
-        </w:rPr>
-        <w:t xml:space="preserve">IPES (Introducción, Presentaciones y Ejercicios): </w:t>
-      </w:r>
-      <w:r>
-        <w:t>Primer output del sistema. Documento de planificación instruccional por semana que define la situación de apertura, los recursos de presentación con su tipo y propósito, y el ejercicio de la semana (calificado o no calificado). El IPES no es el contenido final; es la hoja de ruta que indica qué producir.</w:t>
+      <w:r>
+        <w:t xml:space="preserve">En esta sección se presentan los conceptos de </w:t>
+      </w:r>
+      <w:r>
+        <w:t>inteligencia artificial e ingeniería de software sobre los que se construyó el sistema, organizados en dos capas: los componentes de la capa de agentes de IA y los componentes de la infraestructura backend.</w:t>
       </w:r>
     </w:p>
     <w:p>
       <w:pPr>
-        <w:pStyle w:val="Listaconvietas"/>
-        <w:spacing w:after="60"/>
-      </w:pPr>
-      <w:r>
-        <w:rPr>
-          <w:b/>
-        </w:rPr>
-        <w:t xml:space="preserve">Material Base / Base Content: </w:t>
-      </w:r>
-      <w:r>
-        <w:t>Último output del proceso. Usando el IPES como entrada, se genera el contenido real que consumirán los estudiantes: guiones de narración para videos, texto de separatas y manuales, pantallas para recursos interactivos, instrucciones y resoluciones de ejercicios. Es el artefacto final de la cadena de producción.</w:t>
+        <w:pStyle w:val="Ttulo3"/>
+        <w:numPr>
+          <w:ilvl w:val="0"/>
+          <w:numId w:val="0"/>
+        </w:numPr>
+        <w:ind w:left="720" w:hanging="720"/>
+      </w:pPr>
+      <w:r>
+        <w:t>2.3.1 Agentes</w:t>
+      </w:r>
+      <w:r>
+        <w:t xml:space="preserve"> de IA</w:t>
       </w:r>
     </w:p>
     <w:p>
-      <w:pPr>
-        <w:pStyle w:val="Listaconvietas"/>
-        <w:spacing w:after="60"/>
-      </w:pPr>
-      <w:r>
-        <w:rPr>
-          <w:b/>
-        </w:rPr>
-        <w:t xml:space="preserve">Consignas: </w:t>
-      </w:r>
-      <w:r>
-        <w:t>Instrumentos de evaluación formales: rúbricas, listas de cotejo y escalas de valoración. Definen cómo se evaluará el desempeño del estudiante en las actividades calificadas. Son revisados por el Área de Evaluación.</w:t>
-      </w:r>
-    </w:p>
-    <w:p/>
-    <w:p>
-      <w:pPr>
-        <w:pStyle w:val="Ttulo3"/>
-      </w:pPr>
-      <w:r>
-        <w:t>2.1.4  Catálogo de recursos educativos</w:t>
+      <w:r>
+        <w:t>Se presentan los conceptos q</w:t>
+      </w:r>
+      <w:r>
+        <w:t>ue conforman la capa de inteligencia artificial del sistema: el mecanismo de instrucción de los modelos, la estructura de sus salidas, la especialización por agente, el control de flujo y el framework de orquestación.</w:t>
       </w:r>
     </w:p>
     <w:p>
       <w:pPr>
-        <w:spacing w:after="120"/>
-      </w:pPr>
-      <w:r>
-        <w:t>Se presentará el conjunto de tipos de recursos educativos que el sistema maneja. La clasificación de recursos es institucional: cada universidad puede definir su propio catálogo; el sistema utiliza el de la institución donde se validó el proyecto.</w:t>
-      </w:r>
-    </w:p>
-    <w:tbl>
-      <w:tblPr>
-        <w:tblStyle w:val="Tablaconcuadrcula"/>
-        <w:tblW w:w="0" w:type="auto"/>
-        <w:tblLook w:val="04A0" w:firstRow="1" w:lastRow="0" w:firstColumn="1" w:lastColumn="0" w:noHBand="0" w:noVBand="1"/>
-      </w:tblPr>
-      <w:tblGrid>
-        <w:gridCol w:w="4401"/>
-        <w:gridCol w:w="4376"/>
-      </w:tblGrid>
-      <w:tr>
-        <w:tc>
-          <w:tcPr>
-            <w:tcW w:w="4561" w:type="dxa"/>
-            <w:shd w:val="clear" w:color="auto" w:fill="1F3864"/>
-          </w:tcPr>
-          <w:p>
-            <w:r>
-              <w:rPr>
-                <w:b/>
-                <w:color w:val="FFFFFF"/>
-              </w:rPr>
-              <w:t>Tipo de Recurso</w:t>
-            </w:r>
-          </w:p>
-        </w:tc>
-        <w:tc>
-          <w:tcPr>
-            <w:tcW w:w="4561" w:type="dxa"/>
-            <w:shd w:val="clear" w:color="auto" w:fill="1F3864"/>
-          </w:tcPr>
-          <w:p>
-            <w:r>
-              <w:rPr>
-                <w:b/>
-                <w:color w:val="FFFFFF"/>
-              </w:rPr>
-              <w:t>Categoría</w:t>
-            </w:r>
-          </w:p>
-        </w:tc>
-      </w:tr>
-      <w:tr>
-        <w:tc>
-          <w:tcPr>
-            <w:tcW w:w="4561" w:type="dxa"/>
-          </w:tcPr>
-          <w:p>
-            <w:r>
-              <w:t>H5P</w:t>
-            </w:r>
-          </w:p>
-        </w:tc>
-        <w:tc>
-          <w:tcPr>
-            <w:tcW w:w="4561" w:type="dxa"/>
-          </w:tcPr>
-          <w:p>
-            <w:r>
-              <w:t>Contenido interactivo</w:t>
-            </w:r>
-          </w:p>
-        </w:tc>
-      </w:tr>
-      <w:tr>
-        <w:tc>
-          <w:tcPr>
-            <w:tcW w:w="4561" w:type="dxa"/>
-          </w:tcPr>
-          <w:p>
-            <w:r>
-              <w:t>HTML</w:t>
-            </w:r>
-          </w:p>
-        </w:tc>
-        <w:tc>
-          <w:tcPr>
-            <w:tcW w:w="4561" w:type="dxa"/>
-          </w:tcPr>
-          <w:p>
-            <w:r>
-              <w:t>Contenido interactivo</w:t>
-            </w:r>
-          </w:p>
-        </w:tc>
-      </w:tr>
-      <w:tr>
-        <w:tc>
-          <w:tcPr>
-            <w:tcW w:w="4561" w:type="dxa"/>
-          </w:tcPr>
-          <w:p>
-            <w:r>
-              <w:t>Rise</w:t>
-            </w:r>
-          </w:p>
-        </w:tc>
-        <w:tc>
-          <w:tcPr>
-            <w:tcW w:w="4561" w:type="dxa"/>
-          </w:tcPr>
-          <w:p>
-            <w:r>
-              <w:t>Contenido interactivo</w:t>
-            </w:r>
-          </w:p>
-        </w:tc>
-      </w:tr>
-      <w:tr>
-        <w:tc>
-          <w:tcPr>
-            <w:tcW w:w="4561" w:type="dxa"/>
-          </w:tcPr>
-          <w:p>
-            <w:r>
-              <w:lastRenderedPageBreak/>
-              <w:t>Storyline</w:t>
-            </w:r>
-          </w:p>
-        </w:tc>
-        <w:tc>
-          <w:tcPr>
-            <w:tcW w:w="4561" w:type="dxa"/>
-          </w:tcPr>
-          <w:p>
-            <w:r>
-              <w:t>Contenido interactivo</w:t>
-            </w:r>
-          </w:p>
-        </w:tc>
-      </w:tr>
-      <w:tr>
-        <w:tc>
-          <w:tcPr>
-            <w:tcW w:w="4561" w:type="dxa"/>
-          </w:tcPr>
-          <w:p>
-            <w:r>
-              <w:t>Video Explicativo</w:t>
-            </w:r>
-          </w:p>
-        </w:tc>
-        <w:tc>
-          <w:tcPr>
-            <w:tcW w:w="4561" w:type="dxa"/>
-          </w:tcPr>
-          <w:p>
-            <w:r>
-              <w:t>Audiovisual</w:t>
-            </w:r>
-          </w:p>
-        </w:tc>
-      </w:tr>
-      <w:tr>
-        <w:tc>
-          <w:tcPr>
-            <w:tcW w:w="4561" w:type="dxa"/>
-          </w:tcPr>
-          <w:p>
-            <w:r>
-              <w:t>Video Demo</w:t>
-            </w:r>
-          </w:p>
-        </w:tc>
-        <w:tc>
-          <w:tcPr>
-            <w:tcW w:w="4561" w:type="dxa"/>
-          </w:tcPr>
-          <w:p>
-            <w:r>
-              <w:t>Audiovisual</w:t>
-            </w:r>
-          </w:p>
-        </w:tc>
-      </w:tr>
-      <w:tr>
-        <w:tc>
-          <w:tcPr>
-            <w:tcW w:w="4561" w:type="dxa"/>
-          </w:tcPr>
-          <w:p>
-            <w:r>
-              <w:t>Video Interactivo</w:t>
-            </w:r>
-          </w:p>
-        </w:tc>
-        <w:tc>
-          <w:tcPr>
-            <w:tcW w:w="4561" w:type="dxa"/>
-          </w:tcPr>
-          <w:p>
-            <w:r>
-              <w:t>Audiovisual</w:t>
-            </w:r>
-          </w:p>
-        </w:tc>
-      </w:tr>
-      <w:tr>
-        <w:tc>
-          <w:tcPr>
-            <w:tcW w:w="4561" w:type="dxa"/>
-          </w:tcPr>
-          <w:p>
-            <w:r>
-              <w:t>Podcast</w:t>
-            </w:r>
-          </w:p>
-        </w:tc>
-        <w:tc>
-          <w:tcPr>
-            <w:tcW w:w="4561" w:type="dxa"/>
-          </w:tcPr>
-          <w:p>
-            <w:r>
-              <w:t>Audiovisual</w:t>
-            </w:r>
-          </w:p>
-        </w:tc>
-      </w:tr>
-      <w:tr>
-        <w:tc>
-          <w:tcPr>
-            <w:tcW w:w="4561" w:type="dxa"/>
-          </w:tcPr>
-          <w:p>
-            <w:r>
-              <w:t>Separata</w:t>
-            </w:r>
-          </w:p>
-        </w:tc>
-        <w:tc>
-          <w:tcPr>
-            <w:tcW w:w="4561" w:type="dxa"/>
-          </w:tcPr>
-          <w:p>
-            <w:r>
-              <w:t>Lectura</w:t>
-            </w:r>
-          </w:p>
-        </w:tc>
-      </w:tr>
-      <w:tr>
-        <w:tc>
-          <w:tcPr>
-            <w:tcW w:w="4561" w:type="dxa"/>
-          </w:tcPr>
-          <w:p>
-            <w:r>
-              <w:t>Manual</w:t>
-            </w:r>
-          </w:p>
-        </w:tc>
-        <w:tc>
-          <w:tcPr>
-            <w:tcW w:w="4561" w:type="dxa"/>
-          </w:tcPr>
-          <w:p>
-            <w:r>
-              <w:t>Lectura</w:t>
-            </w:r>
-          </w:p>
-        </w:tc>
-      </w:tr>
-      <w:tr>
-        <w:tc>
-          <w:tcPr>
-            <w:tcW w:w="4561" w:type="dxa"/>
-          </w:tcPr>
-          <w:p>
-            <w:r>
-              <w:t>Lectura</w:t>
-            </w:r>
-          </w:p>
-        </w:tc>
-        <w:tc>
-          <w:tcPr>
-            <w:tcW w:w="4561" w:type="dxa"/>
-          </w:tcPr>
-          <w:p>
-            <w:r>
-              <w:t>Lectura</w:t>
-            </w:r>
-          </w:p>
-        </w:tc>
-      </w:tr>
-      <w:tr>
-        <w:tc>
-          <w:tcPr>
-            <w:tcW w:w="4561" w:type="dxa"/>
-          </w:tcPr>
-          <w:p>
-            <w:r>
-              <w:t>Organizador Visual</w:t>
-            </w:r>
-          </w:p>
-        </w:tc>
-        <w:tc>
-          <w:tcPr>
-            <w:tcW w:w="4561" w:type="dxa"/>
-          </w:tcPr>
-          <w:p>
-            <w:r>
-              <w:t>Visual / gráfico</w:t>
-            </w:r>
-          </w:p>
-        </w:tc>
-      </w:tr>
-      <w:tr>
-        <w:tc>
-          <w:tcPr>
-            <w:tcW w:w="4561" w:type="dxa"/>
-          </w:tcPr>
-          <w:p>
-            <w:r>
-              <w:t>Lectura Complementaria</w:t>
-            </w:r>
-          </w:p>
-        </w:tc>
-        <w:tc>
-          <w:tcPr>
-            <w:tcW w:w="4561" w:type="dxa"/>
-          </w:tcPr>
-          <w:p>
-            <w:r>
-              <w:t>Lectura opcional</w:t>
-            </w:r>
-          </w:p>
-        </w:tc>
-      </w:tr>
-    </w:tbl>
-    <w:p/>
-    <w:p>
-      <w:pPr>
-        <w:pStyle w:val="Ttulo2"/>
-      </w:pPr>
-      <w:r>
-        <w:t>2.2  Fundamentos Pedagógicos</w:t>
-      </w:r>
+        <w:pStyle w:val="Ttulo4"/>
+        <w:numPr>
+          <w:ilvl w:val="0"/>
+          <w:numId w:val="0"/>
+        </w:numPr>
+        <w:ind w:left="864" w:hanging="864"/>
+      </w:pPr>
+      <w:r>
+        <w:t>2.3.</w:t>
+      </w:r>
+      <w:r>
+        <w:t xml:space="preserve">2 </w:t>
+      </w:r>
+      <w:proofErr w:type="spellStart"/>
+      <w:r>
+        <w:t>Prompt</w:t>
+      </w:r>
+      <w:proofErr w:type="spellEnd"/>
+      <w:r>
+        <w:t xml:space="preserve"> </w:t>
+      </w:r>
+      <w:proofErr w:type="spellStart"/>
+      <w:r>
+        <w:t>Engineering</w:t>
+      </w:r>
+      <w:proofErr w:type="spellEnd"/>
     </w:p>
     <w:p>
-      <w:pPr>
-        <w:spacing w:after="120"/>
-      </w:pPr>
-      <w:r>
-        <w:t>En esta sección se presenta el marco teórico del aprendizaje que sustenta las reglas pedagógicas codificadas en el sistema.</w:t>
+      <w:r>
+        <w:t>El diseño de prompt</w:t>
+      </w:r>
+      <w:r>
+        <w:t>s es la principal interfaz de programación con los modelos de lenguaje grandes. En este trabajo, cada agente del sistema está definido por un prompt que especifica su rol, sus reglas obligatorias y sus lineamientos de criterio. Se explicará por qué es rele</w:t>
+      </w:r>
+      <w:r>
+        <w:t>vante para esta tesis:</w:t>
       </w:r>
     </w:p>
     <w:p>
       <w:pPr>
-        <w:pStyle w:val="Ttulo3"/>
-      </w:pPr>
-      <w:r>
-        <w:t>2.2.1  Taxonomía de Bloom</w:t>
+        <w:pStyle w:val="Listaconvietas"/>
+      </w:pPr>
+      <w:r>
+        <w:t>Qué es un prompt y la separación entre system prompt (instrucciones permanentes de rol y reglas) y user prompt (contexto variable de cada ejecución).</w:t>
       </w:r>
     </w:p>
     <w:p>
       <w:pPr>
-        <w:spacing w:after="120"/>
-      </w:pPr>
-      <w:r>
-        <w:t>La Taxonomía de Bloom, en su revisión de Anderson &amp; Krathwohl (2001), constituye el marco central de clasificación de objetivos de aprendizaje sobre el que el sistema fundamenta sus decisiones de selección de recursos. Se explicará en detalle dado su rol estructural en la lógica del sistema. Los puntos a cubrir son:</w:t>
+        <w:pStyle w:val="Listaconvietas"/>
+      </w:pPr>
+      <w:r>
+        <w:t>El patrón de hard rules vs. soft guidelines: reglas no negociables que el agente de</w:t>
+      </w:r>
+      <w:r>
+        <w:t>be respetar siempre, versus lineamientos donde aplica criterio propio. Este patrón gobierna todos los agentes del sistema.</w:t>
       </w:r>
     </w:p>
     <w:p>
       <w:pPr>
         <w:pStyle w:val="Listaconvietas"/>
-        <w:spacing w:after="60"/>
-      </w:pPr>
-      <w:r>
-        <w:t>Los seis niveles cognitivos y sus verbos asociados (Recordar, Comprender, Aplicar, Analizar, Evaluar, Crear), según la revisión de Anderson &amp; Krathwohl (2001) sobre la taxonomía original de Bloom et al. (1956).</w:t>
+      </w:pPr>
+      <w:r>
+        <w:t>El proceso iterativo de refinamiento de prompts con validación por expertos como metodología de desarrollo de la capa de IA (Wei et a</w:t>
+      </w:r>
+      <w:r>
+        <w:t>l., 2022).</w:t>
       </w:r>
     </w:p>
     <w:p>
       <w:pPr>
-        <w:pStyle w:val="Listaconvietas"/>
-        <w:spacing w:after="60"/>
-      </w:pPr>
-      <w:r>
-        <w:t>Cómo el verbo del logro de aprendizaje semanal determina el tipo de recurso a utilizar: la tabla verbo × densidad de contenido → tipo de recurso que el sistema aplica en cada semana del curso.</w:t>
+        <w:pStyle w:val="Ttulo4"/>
+        <w:numPr>
+          <w:ilvl w:val="0"/>
+          <w:numId w:val="0"/>
+        </w:numPr>
+        <w:ind w:left="864" w:hanging="864"/>
+      </w:pPr>
+      <w:r>
+        <w:t xml:space="preserve">2.3.3 </w:t>
+      </w:r>
+      <w:proofErr w:type="spellStart"/>
+      <w:r>
+        <w:t>Structured</w:t>
+      </w:r>
+      <w:proofErr w:type="spellEnd"/>
+      <w:r>
+        <w:t xml:space="preserve"> Outputs (Salidas Estructuradas)</w:t>
       </w:r>
     </w:p>
     <w:p>
-      <w:pPr>
-        <w:pStyle w:val="Listaconvietas"/>
-        <w:spacing w:after="60"/>
-      </w:pPr>
-      <w:r>
-        <w:t>La jerarquía de logros: Logro del Curso → Logro de Unidad → Logro de Semana → Propósito del Recurso, y por qué cada nivel debe ser consistente con el superior (principio de alineación vertical).</w:t>
+      <w:r>
+        <w:t>Para que la solución funcione como pipeline encadenado, cada agente debe producir datos en formato JSON validado, no texto libre. Se explicará por qué es fundamental en esta tesis:</w:t>
       </w:r>
     </w:p>
     <w:p>
       <w:pPr>
         <w:pStyle w:val="Listaconvietas"/>
-        <w:spacing w:after="60"/>
-      </w:pPr>
-      <w:r>
-        <w:t>La distinción entre contenido procedimental (requiere recurso demostrativo), teórico (requiere recurso expositivo) y básico (flexible), y cómo el verbo del logro permite identificar cada tipo.</w:t>
+      </w:pPr>
+      <w:r>
+        <w:lastRenderedPageBreak/>
+        <w:t>JSON mode / structure</w:t>
+      </w:r>
+      <w:r>
+        <w:t>d output: el modelo es forzado a producir un JSON que cumple un esquema predefinido (OpenAI, 2024; Google DeepMind, 2024). Permite que el output de un agente sea el input directo del siguiente.</w:t>
       </w:r>
     </w:p>
     <w:p>
       <w:pPr>
-        <w:spacing w:after="80"/>
-      </w:pPr>
-      <w:r>
-        <w:rPr>
-          <w:i/>
-          <w:sz w:val="18"/>
-        </w:rPr>
-        <w:lastRenderedPageBreak/>
-        <w:t>Referencias clave: Bloom, B. S., Engelhart, M. D., Furst, E. J., Hill, W. H., &amp; Krathwohl, D. R. (1956). Taxonomy of Educational Objectives: The Classification of Educational Goals. David McKay. | Anderson, L. W., &amp; Krathwohl, D. R. (2001). A Taxonomy for Learning, Teaching, and Assessing: A Revision of Bloom's Taxonomy of Educational Objectives. Longman.</w:t>
-      </w:r>
-    </w:p>
-    <w:p/>
-    <w:p>
-      <w:pPr>
-        <w:pStyle w:val="Ttulo3"/>
-      </w:pPr>
-      <w:r>
-        <w:t>2.2.2  Rúbrica de evaluación de calidad del contenido generado</w:t>
+        <w:pStyle w:val="Listaconvietas"/>
+      </w:pPr>
+      <w:r>
+        <w:t xml:space="preserve">Pydantic como contrato de datos: cada agente define su modelo </w:t>
+      </w:r>
+      <w:r>
+        <w:t>de entrada y salida mediante clases Pydantic, garantizando tipos y campos correctos en toda la cadena de producción.</w:t>
       </w:r>
     </w:p>
     <w:p>
       <w:pPr>
-        <w:spacing w:after="120"/>
-      </w:pPr>
-      <w:r>
-        <w:t>Se describirá el instrumento de evaluación construido para que los Docentes Revisores valoren la calidad pedagógica del contenido generado por el sistema. A diferencia de las métricas técnicas, este instrumento mide la calidad percibida por expertos a través de seis criterios que cubren alineación, exactitud, rigor, adecuación al nivel del alumno, calidad de ejemplos y capacidad motivadora del material.</w:t>
-      </w:r>
-    </w:p>
-    <w:tbl>
-      <w:tblPr>
-        <w:tblStyle w:val="Tablaconcuadrcula"/>
-        <w:tblW w:w="0" w:type="auto"/>
-        <w:tblLook w:val="04A0" w:firstRow="1" w:lastRow="0" w:firstColumn="1" w:lastColumn="0" w:noHBand="0" w:noVBand="1"/>
-      </w:tblPr>
-      <w:tblGrid>
-        <w:gridCol w:w="2151"/>
-        <w:gridCol w:w="2212"/>
-        <w:gridCol w:w="2205"/>
-        <w:gridCol w:w="2209"/>
-      </w:tblGrid>
-      <w:tr>
-        <w:tc>
-          <w:tcPr>
-            <w:tcW w:w="2280" w:type="dxa"/>
-            <w:shd w:val="clear" w:color="auto" w:fill="1F3864"/>
-          </w:tcPr>
-          <w:p>
-            <w:r>
-              <w:rPr>
-                <w:b/>
-                <w:color w:val="FFFFFF"/>
-              </w:rPr>
-              <w:t>Criterio</w:t>
-            </w:r>
-          </w:p>
-        </w:tc>
-        <w:tc>
-          <w:tcPr>
-            <w:tcW w:w="2280" w:type="dxa"/>
-            <w:shd w:val="clear" w:color="auto" w:fill="1F3864"/>
-          </w:tcPr>
-          <w:p>
-            <w:r>
-              <w:rPr>
-                <w:b/>
-                <w:color w:val="FFFFFF"/>
-              </w:rPr>
-              <w:t xml:space="preserve">Estándar </w:t>
-            </w:r>
-            <w:r>
-              <w:rPr>
-                <w:b/>
-                <w:color w:val="FFFFFF"/>
-              </w:rPr>
-              <w:t>Maximo</w:t>
-            </w:r>
-            <w:r>
-              <w:rPr>
-                <w:b/>
-                <w:color w:val="FFFFFF"/>
-              </w:rPr>
-              <w:t xml:space="preserve"> (5 pts)</w:t>
-            </w:r>
-          </w:p>
-        </w:tc>
-        <w:tc>
-          <w:tcPr>
-            <w:tcW w:w="2280" w:type="dxa"/>
-            <w:shd w:val="clear" w:color="auto" w:fill="1F3864"/>
-          </w:tcPr>
-          <w:p>
-            <w:r>
-              <w:rPr>
-                <w:b/>
-                <w:color w:val="FFFFFF"/>
-              </w:rPr>
-              <w:t>Estandar Medio</w:t>
-            </w:r>
-            <w:r>
-              <w:rPr>
-                <w:b/>
-                <w:color w:val="FFFFFF"/>
-              </w:rPr>
-              <w:t xml:space="preserve"> (3 pts)</w:t>
-            </w:r>
-          </w:p>
-        </w:tc>
-        <w:tc>
-          <w:tcPr>
-            <w:tcW w:w="2280" w:type="dxa"/>
-            <w:shd w:val="clear" w:color="auto" w:fill="1F3864"/>
-          </w:tcPr>
-          <w:p>
-            <w:r>
-              <w:rPr>
-                <w:b/>
-                <w:color w:val="FFFFFF"/>
-              </w:rPr>
-              <w:t>Estandar Inicial</w:t>
-            </w:r>
-            <w:r>
-              <w:rPr>
-                <w:b/>
-                <w:color w:val="FFFFFF"/>
-              </w:rPr>
-              <w:t xml:space="preserve"> (1 pt)</w:t>
-            </w:r>
-          </w:p>
-        </w:tc>
-      </w:tr>
-      <w:tr>
-        <w:tc>
-          <w:tcPr>
-            <w:tcW w:w="2280" w:type="dxa"/>
-          </w:tcPr>
-          <w:p>
-            <w:r>
-              <w:t>Alineación del contenido</w:t>
-            </w:r>
-          </w:p>
-        </w:tc>
-        <w:tc>
-          <w:tcPr>
-            <w:tcW w:w="2280" w:type="dxa"/>
-          </w:tcPr>
-          <w:p>
-            <w:r>
-              <w:t>El contenido tiene una conexión clara con el logro de la unidad y cubre el tema con un alcance completo, sin dejar vacíos de información.</w:t>
-            </w:r>
-          </w:p>
-        </w:tc>
-        <w:tc>
-          <w:tcPr>
-            <w:tcW w:w="2280" w:type="dxa"/>
-          </w:tcPr>
-          <w:p>
-            <w:r>
-              <w:t>El contenido está relacionado con el logro de la unidad pero incluye material solo tangencialmente relacionado o que divaga.</w:t>
-            </w:r>
-          </w:p>
-        </w:tc>
-        <w:tc>
-          <w:tcPr>
-            <w:tcW w:w="2280" w:type="dxa"/>
-          </w:tcPr>
-          <w:p>
-            <w:r>
-              <w:t>El contenido no está relacionado con sus logros y/o tiene material con un alcance insuficiente.</w:t>
-            </w:r>
-          </w:p>
-        </w:tc>
-      </w:tr>
-      <w:tr>
-        <w:tc>
-          <w:tcPr>
-            <w:tcW w:w="2280" w:type="dxa"/>
-          </w:tcPr>
-          <w:p>
-            <w:r>
-              <w:t>Exactitud del contenido</w:t>
-            </w:r>
-          </w:p>
-        </w:tc>
-        <w:tc>
-          <w:tcPr>
-            <w:tcW w:w="2280" w:type="dxa"/>
-          </w:tcPr>
-          <w:p>
-            <w:r>
-              <w:t>El contenido del material es completamente factualmente correcto y tiene suficientes matices para el tema.</w:t>
-            </w:r>
-          </w:p>
-        </w:tc>
-        <w:tc>
-          <w:tcPr>
-            <w:tcW w:w="2280" w:type="dxa"/>
-          </w:tcPr>
-          <w:p>
-            <w:r>
-              <w:t>El contenido del material tiene errores factuales superficiales como terminología equivocada, simplificaciones o imprecisiones, pero encaja con el tema.</w:t>
-            </w:r>
-          </w:p>
-        </w:tc>
-        <w:tc>
-          <w:tcPr>
-            <w:tcW w:w="2280" w:type="dxa"/>
-          </w:tcPr>
-          <w:p>
-            <w:r>
-              <w:t>El contenido del material tiene errores factuales profundos o no encaja con el tema.</w:t>
-            </w:r>
-          </w:p>
-        </w:tc>
-      </w:tr>
-      <w:tr>
-        <w:tc>
-          <w:tcPr>
-            <w:tcW w:w="2280" w:type="dxa"/>
-          </w:tcPr>
-          <w:p>
-            <w:r>
-              <w:t>Rigor académico</w:t>
-            </w:r>
-          </w:p>
-        </w:tc>
-        <w:tc>
-          <w:tcPr>
-            <w:tcW w:w="2280" w:type="dxa"/>
-          </w:tcPr>
-          <w:p>
-            <w:r>
-              <w:t xml:space="preserve">El contenido del material es profundo, creíble y </w:t>
-            </w:r>
-            <w:r>
-              <w:lastRenderedPageBreak/>
-              <w:t>cita / se basa en fuentes confiables.</w:t>
-            </w:r>
-          </w:p>
-        </w:tc>
-        <w:tc>
-          <w:tcPr>
-            <w:tcW w:w="2280" w:type="dxa"/>
-          </w:tcPr>
-          <w:p>
-            <w:r>
-              <w:lastRenderedPageBreak/>
-              <w:t xml:space="preserve">El contenido es superficial o hace afirmaciones </w:t>
-            </w:r>
-            <w:r>
-              <w:lastRenderedPageBreak/>
-              <w:t>cuestionables / poco creíbles.</w:t>
-            </w:r>
-          </w:p>
-        </w:tc>
-        <w:tc>
-          <w:tcPr>
-            <w:tcW w:w="2280" w:type="dxa"/>
-          </w:tcPr>
-          <w:p>
-            <w:r>
-              <w:lastRenderedPageBreak/>
-              <w:t xml:space="preserve">El contenido no tiene sustento o hace </w:t>
-            </w:r>
-            <w:r>
-              <w:lastRenderedPageBreak/>
-              <w:t>afirmaciones sin soporte.</w:t>
-            </w:r>
-          </w:p>
-        </w:tc>
-      </w:tr>
-      <w:tr>
-        <w:tc>
-          <w:tcPr>
-            <w:tcW w:w="2280" w:type="dxa"/>
-          </w:tcPr>
-          <w:p>
-            <w:r>
-              <w:lastRenderedPageBreak/>
-              <w:t>Propiedad para el nivel del alumno</w:t>
-            </w:r>
-          </w:p>
-        </w:tc>
-        <w:tc>
-          <w:tcPr>
-            <w:tcW w:w="2280" w:type="dxa"/>
-          </w:tcPr>
-          <w:p>
-            <w:r>
-              <w:t>El vocabulario, el nivel de dificultad y complejidad del material son los adecuados para el nivel del alumno.</w:t>
-            </w:r>
-          </w:p>
-        </w:tc>
-        <w:tc>
-          <w:tcPr>
-            <w:tcW w:w="2280" w:type="dxa"/>
-          </w:tcPr>
-          <w:p>
-            <w:r>
-              <w:t>El vocabulario, nivel de dificultad y complejidad son ligeramente muy avanzados o muy simples para el nivel del alumno.</w:t>
-            </w:r>
-          </w:p>
-        </w:tc>
-        <w:tc>
-          <w:tcPr>
-            <w:tcW w:w="2280" w:type="dxa"/>
-          </w:tcPr>
-          <w:p>
-            <w:r>
-              <w:t>El vocabulario, nivel de dificultad y complejidad no tienen conexión con el nivel del alumno.</w:t>
-            </w:r>
-          </w:p>
-        </w:tc>
-      </w:tr>
-      <w:tr>
-        <w:tc>
-          <w:tcPr>
-            <w:tcW w:w="2280" w:type="dxa"/>
-          </w:tcPr>
-          <w:p>
-            <w:r>
-              <w:t>Calidad de ejemplos</w:t>
-            </w:r>
-          </w:p>
-        </w:tc>
-        <w:tc>
-          <w:tcPr>
-            <w:tcW w:w="2280" w:type="dxa"/>
-          </w:tcPr>
-          <w:p>
-            <w:r>
-              <w:t>El contenido tiene ejemplos relevantes y concretos que suplementan los conceptos explicados.</w:t>
-            </w:r>
-          </w:p>
-        </w:tc>
-        <w:tc>
-          <w:tcPr>
-            <w:tcW w:w="2280" w:type="dxa"/>
-          </w:tcPr>
-          <w:p>
-            <w:r>
-              <w:t>El contenido tiene ejemplos genéricos o solo parcialmente relevantes a los conceptos explicados.</w:t>
-            </w:r>
-          </w:p>
-        </w:tc>
-        <w:tc>
-          <w:tcPr>
-            <w:tcW w:w="2280" w:type="dxa"/>
-          </w:tcPr>
-          <w:p>
-            <w:r>
-              <w:t>El contenido tiene ejemplos confusos, pobres o no existentes.</w:t>
-            </w:r>
-          </w:p>
-        </w:tc>
-      </w:tr>
-      <w:tr>
-        <w:tc>
-          <w:tcPr>
-            <w:tcW w:w="2280" w:type="dxa"/>
-          </w:tcPr>
-          <w:p>
-            <w:r>
-              <w:t>Probabilidad de que el alumno complete el material</w:t>
-            </w:r>
-          </w:p>
-        </w:tc>
-        <w:tc>
-          <w:tcPr>
-            <w:tcW w:w="2280" w:type="dxa"/>
-          </w:tcPr>
-          <w:p>
-            <w:r>
-              <w:t>El contenido puede generar interés intrínsecamente y haría que los alumnos lo revisen voluntariamente.</w:t>
-            </w:r>
-          </w:p>
-        </w:tc>
-        <w:tc>
-          <w:tcPr>
-            <w:tcW w:w="2280" w:type="dxa"/>
-          </w:tcPr>
-          <w:p>
-            <w:r>
-              <w:t>El contenido se presta a que los alumnos lo lean si es requerido pero no es motivador.</w:t>
-            </w:r>
-          </w:p>
-        </w:tc>
-        <w:tc>
-          <w:tcPr>
-            <w:tcW w:w="2280" w:type="dxa"/>
-          </w:tcPr>
-          <w:p>
-            <w:r>
-              <w:t>El contenido se presta a que los alumnos lo revisen superficialmente o lo salten aunque sea requerido.</w:t>
-            </w:r>
-          </w:p>
-        </w:tc>
-      </w:tr>
-    </w:tbl>
-    <w:p/>
-    <w:p>
-      <w:pPr>
-        <w:spacing w:after="120"/>
-      </w:pPr>
-      <w:r>
-        <w:t>Se explicará cada criterio en relación con el tipo de contenido que el sistema genera, y por qué estos seis aspectos son los relevantes para juzgar la calidad de un material instruccional generado por IA en el contexto universitario.</w:t>
+        <w:pStyle w:val="Ttulo4"/>
+        <w:numPr>
+          <w:ilvl w:val="0"/>
+          <w:numId w:val="0"/>
+        </w:numPr>
+        <w:ind w:left="864" w:hanging="864"/>
+      </w:pPr>
+      <w:r>
+        <w:t>2.3.</w:t>
+      </w:r>
+      <w:r>
+        <w:t>4</w:t>
+      </w:r>
+      <w:r>
+        <w:t xml:space="preserve"> </w:t>
+      </w:r>
+      <w:r>
+        <w:t>Sistemas Multi-Agente</w:t>
       </w:r>
     </w:p>
     <w:p>
-      <w:pPr>
-        <w:spacing w:after="80"/>
-      </w:pPr>
-      <w:r>
-        <w:rPr>
-          <w:i/>
-          <w:sz w:val="18"/>
-        </w:rPr>
-        <w:t>Referencias clave: Wiggins, G., &amp; McTighe, J. (2005). Understanding by Design (2nd ed.). ASCD. | Kasneci, E., Sessler, K., Küchemann, S., Bannert, M., Dementieva, D., Fischer, F., &amp; Kasneci, G. (2023). ChatGPT for good? On opportunities and challenges of large language models for education. Learning and Individual Differences, 103, 102274.</w:t>
-      </w:r>
-    </w:p>
-    <w:p/>
-    <w:p>
-      <w:pPr>
-        <w:pStyle w:val="Ttulo2"/>
-      </w:pPr>
-      <w:r>
-        <w:lastRenderedPageBreak/>
-        <w:t>2.3  Fundamentos Técnicos</w:t>
+      <w:r>
+        <w:t>El sistema distribuye la generación de contenido entre múltiples agentes especializados en lugar de un único agente g</w:t>
+      </w:r>
+      <w:r>
+        <w:t>eneralista. Se explicará por qué este enfoque es relevante para esta tesis:</w:t>
       </w:r>
     </w:p>
     <w:p>
       <w:pPr>
-        <w:spacing w:after="120"/>
-      </w:pPr>
-      <w:r>
-        <w:t>En esta sección se presentan los conceptos de inteligencia artificial e ingeniería de software sobre los que se construyó el sistema, organizados en dos capas: los componentes de la capa de agentes de IA y los componentes de la infraestructura backend.</w:t>
+        <w:pStyle w:val="Listaconvietas"/>
+      </w:pPr>
+      <w:r>
+        <w:t>Qué es un agente de IA: una instancia de un modelo de lenguaje con un rol, instrucciones y responsabilidad específica.</w:t>
       </w:r>
     </w:p>
     <w:p>
       <w:pPr>
-        <w:pStyle w:val="Ttulo3"/>
-      </w:pPr>
-      <w:r>
-        <w:t>2.3.1  Agentes de IA</w:t>
+        <w:pStyle w:val="Listaconvietas"/>
+      </w:pPr>
+      <w:r>
+        <w:t xml:space="preserve">Por qué especializar: un agente con una sola </w:t>
+      </w:r>
+      <w:r>
+        <w:t>responsabilidad bien definida produce resultados más precisos y confiables. En este sistema, agentes distintos manejan el parseo, el esquema curricular, la generación de contenido y la validación de calidad (Park et al., 2023).</w:t>
       </w:r>
     </w:p>
     <w:p>
       <w:pPr>
-        <w:spacing w:after="120"/>
-      </w:pPr>
-      <w:r>
-        <w:t>Se presentan los conceptos que conforman la capa de inteligencia artificial del sistema: el mecanismo de instrucción de los modelos, la estructura de sus salidas, la especialización por agente, el control de flujo y el framework de orquestación.</w:t>
+        <w:pStyle w:val="Ttulo4"/>
+        <w:numPr>
+          <w:ilvl w:val="0"/>
+          <w:numId w:val="0"/>
+        </w:numPr>
+        <w:ind w:left="864" w:hanging="864"/>
+      </w:pPr>
+      <w:r>
+        <w:t>2.3.</w:t>
+      </w:r>
+      <w:r>
+        <w:t>5</w:t>
+      </w:r>
+      <w:r>
+        <w:t xml:space="preserve"> </w:t>
+      </w:r>
+      <w:r>
+        <w:t xml:space="preserve">Nodos y Grafos de </w:t>
+      </w:r>
+      <w:r>
+        <w:t>Estado</w:t>
       </w:r>
     </w:p>
     <w:p>
-      <w:pPr>
-        <w:pStyle w:val="Ttulo4"/>
-      </w:pPr>
-      <w:r>
-        <w:t>Prompt Engineering</w:t>
+      <w:r>
+        <w:t>La orquestación de agentes en el sistema se implementa como un grafo de estado dirigido, donde cada nodo representa un paso de procesamiento. Se explicará por qué es relevante para esta tesis:</w:t>
       </w:r>
     </w:p>
     <w:p>
       <w:pPr>
-        <w:spacing w:after="120"/>
-      </w:pPr>
-      <w:r>
-        <w:t>El diseño de prompts es la principal interfaz de programación con los modelos de lenguaje grandes. En este trabajo, cada agente del sistema está definido por un prompt que especifica su rol, sus reglas obligatorias y sus lineamientos de criterio. Se explicará por qué es relevante para esta tesis:</w:t>
+        <w:pStyle w:val="Listaconvietas"/>
+      </w:pPr>
+      <w:r>
+        <w:t>Un nodo como unidad de procesamiento: puede invocar un L</w:t>
+      </w:r>
+      <w:r>
+        <w:t>LM, ejecutar código determinístico o tomar una decisión condicional. El estado es compartido entre todos los nodos del grafo.</w:t>
       </w:r>
     </w:p>
     <w:p>
       <w:pPr>
         <w:pStyle w:val="Listaconvietas"/>
-        <w:spacing w:after="60"/>
-      </w:pPr>
-      <w:r>
-        <w:t>Qué es un prompt y la separación entre system prompt (instrucciones permanentes de rol y reglas) y user prompt (contexto variable de cada ejecución).</w:t>
+      </w:pPr>
+      <w:r>
+        <w:t>Aristas condicionales y ciclos de reintento: el flujo puede bifurcarse según el resultado de un nodo (validación pasa → continuar,</w:t>
+      </w:r>
+      <w:r>
+        <w:t xml:space="preserve"> validación falla → reintentar con feedback). Este mecanismo es el que garantiza el cumplimiento de restricciones pedagógicas.</w:t>
       </w:r>
     </w:p>
     <w:p>
       <w:pPr>
-        <w:pStyle w:val="Listaconvietas"/>
-        <w:spacing w:after="60"/>
-      </w:pPr>
-      <w:r>
-        <w:t>El patrón de hard rules vs. soft guidelines: reglas no negociables que el agente debe respetar siempre, versus lineamientos donde aplica criterio propio. Este patrón gobierna todos los agentes del sistema.</w:t>
+        <w:pStyle w:val="Ttulo4"/>
+        <w:numPr>
+          <w:ilvl w:val="0"/>
+          <w:numId w:val="0"/>
+        </w:numPr>
+        <w:ind w:left="864" w:hanging="864"/>
+      </w:pPr>
+      <w:r>
+        <w:t>2.3.</w:t>
+      </w:r>
+      <w:r>
+        <w:t>6</w:t>
+      </w:r>
+      <w:r>
+        <w:t xml:space="preserve"> </w:t>
+      </w:r>
+      <w:proofErr w:type="spellStart"/>
+      <w:r>
+        <w:t>Agent</w:t>
+      </w:r>
+      <w:proofErr w:type="spellEnd"/>
+      <w:r>
+        <w:t xml:space="preserve"> Framework: LangChain y LangGraph</w:t>
       </w:r>
     </w:p>
     <w:p>
-      <w:pPr>
-        <w:pStyle w:val="Listaconvietas"/>
-        <w:spacing w:after="60"/>
-      </w:pPr>
-      <w:r>
-        <w:t>El proceso iterativo de refinamiento de prompts con validación por expertos como metodología de desarrollo de la capa de IA (Wei et al., 2022).</w:t>
+      <w:r>
+        <w:t xml:space="preserve">LangChain y LangGraph son las herramientas de orquestación sobre las que se implementó el </w:t>
+      </w:r>
+      <w:r>
+        <w:t>sistema. Se explicará por qué son relevantes para esta tesis:</w:t>
       </w:r>
     </w:p>
     <w:p>
       <w:pPr>
-        <w:spacing w:after="80"/>
-      </w:pPr>
-      <w:r>
-        <w:rPr>
-          <w:i/>
-          <w:sz w:val="18"/>
-        </w:rPr>
-        <w:t>Referencias: Brown, T. B., et al. (2020). Language models are few-shot learners. NeurIPS, 33, 1877-1901. | Liu, P., et al. (2023). Pre-train, prompt, and predict. ACM Computing Surveys, 55(9), 1-35. | Wei, J., et al. (2022). Chain-of-thought prompting elicits reasoning in large language models. NeurIPS, 35.</w:t>
-      </w:r>
-    </w:p>
-    <w:p/>
-    <w:p>
-      <w:pPr>
-        <w:pStyle w:val="Ttulo4"/>
-      </w:pPr>
-      <w:r>
-        <w:t>Structured Outputs (Salidas Estructuradas)</w:t>
+        <w:pStyle w:val="Listaconvietas"/>
+      </w:pPr>
+      <w:r>
+        <w:lastRenderedPageBreak/>
+        <w:t>LangChain: capa de abstracción sobre múltiples proveedores de LLM (OpenAI, Google Gemini) que estandariza la invocación de modelos, el manejo de prompts y el procesamiento de outputs.</w:t>
       </w:r>
     </w:p>
     <w:p>
       <w:pPr>
-        <w:spacing w:after="120"/>
-      </w:pPr>
-      <w:r>
-        <w:t>Para que la solución funcione como pipeline encadenado, cada agente debe producir datos en formato JSON validado, no texto libre. Se explicará por qué es fundamental en esta tesis:</w:t>
+        <w:pStyle w:val="Listaconvietas"/>
+      </w:pPr>
+      <w:r>
+        <w:t>LangGraph:</w:t>
+      </w:r>
+      <w:r>
+        <w:t xml:space="preserve"> extensión de LangChain que implementa grafos de estado dirigidos, habilitando flujos condicionales, ciclos de reintento y estado compartido entre nodos. Supera al prompt chaining simple al permitir lógica de control real sobre el flujo de generación (Chas</w:t>
+      </w:r>
+      <w:r>
+        <w:t>e, 2024).</w:t>
       </w:r>
     </w:p>
     <w:p>
       <w:pPr>
-        <w:pStyle w:val="Listaconvietas"/>
-        <w:spacing w:after="60"/>
-      </w:pPr>
-      <w:r>
-        <w:t>JSON mode / structured output: el modelo es forzado a producir un JSON que cumple un esquema predefinido (OpenAI, 2024; Google DeepMind, 2024). Permite que el output de un agente sea el input directo del siguiente.</w:t>
+        <w:pStyle w:val="Ttulo4"/>
+        <w:numPr>
+          <w:ilvl w:val="0"/>
+          <w:numId w:val="0"/>
+        </w:numPr>
+        <w:ind w:left="864" w:hanging="864"/>
+      </w:pPr>
+      <w:r>
+        <w:t>2.3.</w:t>
+      </w:r>
+      <w:r>
+        <w:t xml:space="preserve">7 </w:t>
+      </w:r>
+      <w:r>
+        <w:t>Python como ecosistema de desarrollo de IA</w:t>
       </w:r>
     </w:p>
     <w:p>
-      <w:pPr>
-        <w:pStyle w:val="Listaconvietas"/>
-        <w:spacing w:after="60"/>
-      </w:pPr>
-      <w:r>
-        <w:lastRenderedPageBreak/>
-        <w:t>Pydantic como contrato de datos: cada agente define su modelo de entrada y salida mediante clases Pydantic, garantizando tipos y campos correctos en toda la cadena de producción.</w:t>
+      <w:r>
+        <w:t>Python es el lenguaje de implementación del backend. Ya que nos permite tener lo siguiente:</w:t>
       </w:r>
     </w:p>
     <w:p>
       <w:pPr>
-        <w:spacing w:after="80"/>
-      </w:pPr>
-      <w:r>
-        <w:rPr>
-          <w:i/>
-          <w:sz w:val="18"/>
-        </w:rPr>
-        <w:t>Referencias: OpenAI. (2024). Structured outputs. OpenAI Platform Documentation. https://platform.openai.com/docs/guides/structured-outputs</w:t>
-      </w:r>
-    </w:p>
-    <w:p/>
-    <w:p>
-      <w:pPr>
-        <w:pStyle w:val="Ttulo4"/>
-      </w:pPr>
-      <w:r>
-        <w:t>Sistemas Multi-Agente</w:t>
+        <w:pStyle w:val="Listaconvietas"/>
+      </w:pPr>
+      <w:r>
+        <w:t>Ecosistema: concentra las bibliotecas más utilizadas para modelos de lenguaje (LangChain, LangGraph), procesami</w:t>
+      </w:r>
+      <w:r>
+        <w:t>ento documental (pdfplumber, python-docx, pandas) y exposición de APIs (FastAPI).</w:t>
       </w:r>
     </w:p>
     <w:p>
       <w:pPr>
-        <w:spacing w:after="120"/>
-      </w:pPr>
-      <w:r>
-        <w:t>El sistema distribuye la generación de contenido entre múltiples agentes especializados en lugar de un único agente generalista. Se explicará por qué este enfoque es relevante para esta tesis:</w:t>
+        <w:pStyle w:val="Listaconvietas"/>
+      </w:pPr>
+      <w:r>
+        <w:t>FastAPI y Pydantic: FastAPI expone los agentes como endpoints HTTP; Pydantic valida los modelos de datos y hace cumplir los structured outputs en toda la cadena de agentes.</w:t>
       </w:r>
     </w:p>
     <w:p>
       <w:pPr>
-        <w:pStyle w:val="Listaconvietas"/>
-        <w:spacing w:after="60"/>
-      </w:pPr>
-      <w:r>
-        <w:t>Qué es un agente de IA: una instancia de un modelo de lenguaje con un rol, instrucciones y responsabilidad específica.</w:t>
+        <w:pStyle w:val="Ttulo3"/>
+        <w:numPr>
+          <w:ilvl w:val="0"/>
+          <w:numId w:val="0"/>
+        </w:numPr>
+        <w:ind w:left="720" w:hanging="720"/>
+      </w:pPr>
+      <w:r>
+        <w:t>2.3.8 Infraestructura</w:t>
+      </w:r>
+      <w:r>
+        <w:t xml:space="preserve"> Backend</w:t>
       </w:r>
     </w:p>
     <w:p>
-      <w:pPr>
-        <w:pStyle w:val="Listaconvietas"/>
-        <w:spacing w:after="60"/>
-      </w:pPr>
-      <w:r>
-        <w:t>Por qué especializar: un agente con una sola responsabilidad bien definida produce resultados más precisos y confiables. En este sistema, agentes distintos manejan el parseo, el esquema curricular, la generación de contenido y la validación de calidad (Park et al., 2023).</w:t>
+      <w:r>
+        <w:t>Se presentan los conceptos de arquitectura de software y servicios cloud que soportan la ejecución del sistema en producción.</w:t>
       </w:r>
     </w:p>
     <w:p>
       <w:pPr>
-        <w:spacing w:after="80"/>
-      </w:pPr>
-      <w:r>
-        <w:rPr>
-          <w:i/>
-          <w:sz w:val="18"/>
-        </w:rPr>
-        <w:t>Referencias: Park, J. S., et al. (2023). Generative agents: Interactive simulacra of human behavior. UIST. | Wu, Q., et al. (2023). AutoGen: Enabling next-gen LLM applications via multi-agent conversation. arXiv:2308.08155.</w:t>
-      </w:r>
-    </w:p>
-    <w:p/>
-    <w:p>
-      <w:pPr>
         <w:pStyle w:val="Ttulo4"/>
-      </w:pPr>
-      <w:r>
-        <w:t>Nodos y Grafos de Estado</w:t>
+        <w:numPr>
+          <w:ilvl w:val="0"/>
+          <w:numId w:val="0"/>
+        </w:numPr>
+        <w:ind w:left="864" w:hanging="864"/>
+      </w:pPr>
+      <w:r>
+        <w:t>2.3.</w:t>
+      </w:r>
+      <w:r>
+        <w:t xml:space="preserve">9 </w:t>
+      </w:r>
+      <w:r>
+        <w:t>Backend</w:t>
       </w:r>
     </w:p>
     <w:p>
-      <w:pPr>
-        <w:spacing w:after="120"/>
-      </w:pPr>
-      <w:r>
-        <w:t>La orquestación de agentes en el sistema se implementa como un grafo de estado dirigido, donde cada nodo representa un paso de procesamiento. Se explicará por qué es relevante para esta tesis:</w:t>
+      <w:r>
+        <w:t>El backend de una aplicación es la capa de software responsable de procesar la lógica de neg</w:t>
+      </w:r>
+      <w:r>
+        <w:t>ocio, gestionar el acceso a datos y exponer servicios a los clientes mediante interfaces de red —típicamente APIs HTTP—. A diferencia del frontend, que gestiona la presentación e interacción con el usuario, el backend concentra el procesamiento, la persist</w:t>
+      </w:r>
+      <w:r>
+        <w:t>encia y la seguridad del sistema (Richardson, 2018).</w:t>
       </w:r>
     </w:p>
     <w:p>
       <w:pPr>
-        <w:pStyle w:val="Listaconvietas"/>
-        <w:spacing w:after="60"/>
-      </w:pPr>
-      <w:r>
-        <w:t>Un nodo como unidad de procesamiento: puede invocar un LLM, ejecutar código determinístico o tomar una decisión condicional. El estado es compartido entre todos los nodos del grafo.</w:t>
+        <w:pStyle w:val="Ttulo4"/>
+        <w:numPr>
+          <w:ilvl w:val="0"/>
+          <w:numId w:val="0"/>
+        </w:numPr>
+        <w:ind w:left="864" w:hanging="864"/>
+      </w:pPr>
+      <w:r>
+        <w:t>2.3.</w:t>
+      </w:r>
+      <w:r>
+        <w:t>10</w:t>
+      </w:r>
+      <w:r>
+        <w:t xml:space="preserve"> </w:t>
+      </w:r>
+      <w:r>
+        <w:t>Arquitectura del Sistema</w:t>
       </w:r>
     </w:p>
     <w:p>
-      <w:pPr>
-        <w:pStyle w:val="Listaconvietas"/>
-        <w:spacing w:after="60"/>
-      </w:pPr>
-      <w:r>
-        <w:t>Aristas condicionales y ciclos de reintento: el flujo puede bifurcarse según el resultado de un nodo (validación pasa → continuar, validación falla → reintentar con feedback). Este mecanismo es el que garantiza el cumplimiento de restricciones pedagógicas.</w:t>
-      </w:r>
-    </w:p>
-    <w:p/>
-    <w:p>
-      <w:pPr>
-        <w:pStyle w:val="Ttulo4"/>
-      </w:pPr>
-      <w:r>
-        <w:lastRenderedPageBreak/>
-        <w:t>Agent Framework: LangChain y LangGraph</w:t>
+      <w:r>
+        <w:t xml:space="preserve">La arquitectura de software </w:t>
+      </w:r>
+      <w:proofErr w:type="gramStart"/>
+      <w:r>
+        <w:t>define</w:t>
+      </w:r>
+      <w:proofErr w:type="gramEnd"/>
+      <w:r>
+        <w:t xml:space="preserve"> cómo los componentes de un sistema se organizan, comunican y escalan para cumplir los requisitos funcionales y no funcionales (Richardson, 2018</w:t>
+      </w:r>
+      <w:r>
+        <w:t>). En sistemas que procesan tareas de duración media o prolongada, la arquitectura incorpora capas especializadas: un punto de entrada que gestiona las solicitudes, un motor de cómputo que ejecuta el procesamiento, y componentes de mensajería que desacopla</w:t>
+      </w:r>
+      <w:r>
+        <w:t>n la recepción de una solicitud de su ejecución efectiva.</w:t>
       </w:r>
     </w:p>
     <w:p>
       <w:pPr>
-        <w:spacing w:after="120"/>
-      </w:pPr>
-      <w:r>
-        <w:t>LangChain y LangGraph son las herramientas de orquestación sobre las que se implementó el sistema. Se explicará por qué son relevantes para esta tesis:</w:t>
+        <w:pStyle w:val="Ttulo4"/>
+        <w:numPr>
+          <w:ilvl w:val="0"/>
+          <w:numId w:val="0"/>
+        </w:numPr>
+        <w:ind w:left="864" w:hanging="864"/>
+      </w:pPr>
+      <w:r>
+        <w:lastRenderedPageBreak/>
+        <w:t>2.3.</w:t>
+      </w:r>
+      <w:r>
+        <w:t xml:space="preserve">11 </w:t>
+      </w:r>
+      <w:r>
+        <w:t>Procesamiento Asíncrono</w:t>
       </w:r>
     </w:p>
     <w:p>
-      <w:pPr>
-        <w:pStyle w:val="Listaconvietas"/>
-        <w:spacing w:after="60"/>
-      </w:pPr>
-      <w:r>
-        <w:t>LangChain: capa de abstracción sobre múltiples proveedores de LLM (OpenAI, Google Gemini) que estandariza la invocación de modelos, el manejo de prompts y el procesamiento de outputs.</w:t>
+      <w:r>
+        <w:t>El procesamiento asíncrono es el patrón arquitectónico que desacopla la recepción de una solicitud de su ejecución. En un modelo síncrono, el cliente espera bloqueado hasta r</w:t>
+      </w:r>
+      <w:r>
+        <w:t>ecibir respuesta; para tareas de duración prolongada esto genera timeouts inaceptables (Kleppmann, 2017). En el modelo asíncrono, el cliente recibe una confirmación inmediata y el trabajo se ejecuta en segundo plano; al finalizar, el sistema notifica al cl</w:t>
+      </w:r>
+      <w:r>
+        <w:t>iente a través de un webhook o servicio de mensajería. Este patrón sigue el modelo productor-consumidor: una cola de mensajes actúa como intermediario entre quien solicita el trabajo y quien lo ejecuta (Richardson, 2018).</w:t>
       </w:r>
     </w:p>
     <w:p>
       <w:pPr>
-        <w:pStyle w:val="Listaconvietas"/>
-        <w:spacing w:after="60"/>
-      </w:pPr>
-      <w:r>
-        <w:t>LangGraph: extensión de LangChain que implementa grafos de estado dirigidos, habilitando flujos condicionales, ciclos de reintento y estado compartido entre nodos. Supera al prompt chaining simple al permitir lógica de control real sobre el flujo de generación (Chase, 2024).</w:t>
+        <w:pStyle w:val="Ttulo4"/>
+        <w:numPr>
+          <w:ilvl w:val="0"/>
+          <w:numId w:val="0"/>
+        </w:numPr>
+        <w:ind w:left="864" w:hanging="864"/>
+      </w:pPr>
+      <w:r>
+        <w:t>2.3.</w:t>
+      </w:r>
+      <w:r>
+        <w:t xml:space="preserve">12 </w:t>
+      </w:r>
+      <w:r>
+        <w:t xml:space="preserve">Amazon Web </w:t>
+      </w:r>
+      <w:proofErr w:type="spellStart"/>
+      <w:r>
+        <w:t>Services</w:t>
+      </w:r>
+      <w:proofErr w:type="spellEnd"/>
+      <w:r>
+        <w:t xml:space="preserve"> (AWS)</w:t>
       </w:r>
     </w:p>
     <w:p>
-      <w:pPr>
-        <w:spacing w:after="80"/>
-      </w:pPr>
-      <w:r>
-        <w:rPr>
-          <w:i/>
-          <w:sz w:val="18"/>
-        </w:rPr>
-        <w:t>Referencias: Chase, H. (2024). LangGraph: Building stateful, multi-actor applications with LLMs. LangChain, Inc. https://langchain-ai.github.io/langgraph/ | Yao, S., et al. (2023). ReAct: Synergizing reasoning and acting in language models. ICLR.</w:t>
-      </w:r>
-    </w:p>
-    <w:p/>
-    <w:p>
-      <w:pPr>
-        <w:pStyle w:val="Ttulo4"/>
-      </w:pPr>
-      <w:r>
-        <w:t>Python como ecosistema de desarrollo de IA</w:t>
+      <w:r>
+        <w:t>Amazon W</w:t>
+      </w:r>
+      <w:r>
+        <w:t>eb Services (AWS) es la plataforma cloud seleccionada para el despliegue de la infraestructura backend del sistema. AWS ofrece un ecosistema de servicios gestionados bajo un modelo de pago por uso que abarca cómputo serverless, mensajería, almacenamiento y</w:t>
+      </w:r>
+      <w:r>
+        <w:t xml:space="preserve"> gestión de APIs, lo que reduce la complejidad operativa frente a infraestructura autogestionada (Wittig &amp; Wittig, 2018). Para implementar la arquitectura asíncrona descrita, el sistema utiliza cuatro servicios de AWS: un servicio de gestión y exposición d</w:t>
+      </w:r>
+      <w:r>
+        <w:t>e APIs HTTP (Amazon API Gateway), un motor de cómputo serverless que ejecuta el pipeline de agentes (AWS Lambda), un servicio de cola de mensajes que actúa como buffer de trabajos (Amazon SQS) y un sistema de notificaciones pub/sub que comunica la finaliza</w:t>
+      </w:r>
+      <w:r>
+        <w:t>ción del procesamiento (Amazon SNS). La configuración e integración específica de cada uno de estos servicios se describe en el Capítulo 3.</w:t>
       </w:r>
     </w:p>
     <w:p>
       <w:pPr>
-        <w:spacing w:after="120"/>
-      </w:pPr>
-      <w:r>
-        <w:t>Python es el lenguaje de implementación del backend. Ya que nos permite tener lo siguiente:</w:t>
+        <w:pStyle w:val="Ttulo2"/>
+        <w:numPr>
+          <w:ilvl w:val="0"/>
+          <w:numId w:val="0"/>
+        </w:numPr>
+        <w:ind w:left="576" w:hanging="576"/>
+      </w:pPr>
+      <w:r>
+        <w:t>2.4 Metodología</w:t>
+      </w:r>
+      <w:r>
+        <w:t xml:space="preserve"> de Desarrollo</w:t>
       </w:r>
     </w:p>
     <w:p>
-      <w:pPr>
-        <w:pStyle w:val="Listaconvietas"/>
-        <w:spacing w:after="60"/>
-      </w:pPr>
-      <w:r>
-        <w:t>Ecosistema: concentra las bibliotecas más utilizadas para modelos de lenguaje (LangChain, LangGraph), procesamiento documental (pdfplumber, python-docx, pandas) y exposición de APIs (FastAPI).</w:t>
+      <w:r>
+        <w:t xml:space="preserve">En esta sección se describe el marco metodológico que guió el desarrollo del sistema </w:t>
+      </w:r>
+      <w:r>
+        <w:t>a lo largo del proyecto.</w:t>
       </w:r>
     </w:p>
     <w:p>
       <w:pPr>
-        <w:pStyle w:val="Listaconvietas"/>
-        <w:spacing w:after="60"/>
-      </w:pPr>
-      <w:r>
-        <w:t>FastAPI y Pydantic: FastAPI expone los agentes como endpoints HTTP; Pydantic valida los modelos de datos y hace cumplir los structured outputs en toda la cadena de agentes.</w:t>
+        <w:pStyle w:val="Ttulo3"/>
+        <w:numPr>
+          <w:ilvl w:val="0"/>
+          <w:numId w:val="0"/>
+        </w:numPr>
+        <w:ind w:left="720" w:hanging="720"/>
+      </w:pPr>
+      <w:r>
+        <w:t>2.4.1 SCRUM</w:t>
+      </w:r>
+      <w:r>
+        <w:t xml:space="preserve"> en equipos multidisciplinarios</w:t>
       </w:r>
     </w:p>
     <w:p>
-      <w:pPr>
-        <w:spacing w:after="80"/>
-      </w:pPr>
-      <w:r>
-        <w:rPr>
-          <w:i/>
-          <w:sz w:val="18"/>
-        </w:rPr>
-        <w:t>Referencias: Raschka, S., Patterson, J., &amp; Nolet, C. (2020). Machine learning in Python: Main developments and technology trends. Information, 11(4), 193.</w:t>
-      </w:r>
-    </w:p>
-    <w:p/>
-    <w:p>
-      <w:pPr>
-        <w:pStyle w:val="Ttulo3"/>
-      </w:pPr>
-      <w:r>
-        <w:t>2.3.2  Infraestructura Backend</w:t>
+      <w:r>
+        <w:t>Se explicará el framework SCRUM (Schwaber &amp; Sutherland, 2020) y su aplicación en un equipo compuesto por perfiles de distintas disciplinas (ingeniería de software, diseño instruccional, e</w:t>
+      </w:r>
+      <w:r>
+        <w:t>xpertos temáticos). Los puntos a cubrir son:</w:t>
       </w:r>
     </w:p>
     <w:p>
       <w:pPr>
-        <w:spacing w:after="120"/>
-      </w:pPr>
-      <w:r>
-        <w:t>Se presentan los conceptos de arquitectura de software y servicios cloud que soportan la ejecución del sistema en producción. Dado que la generación de contenido con agentes LLM es un proceso de varios minutos, el backend requiere un modelo asíncrono basado en colas y cómputo serverless.</w:t>
+        <w:pStyle w:val="Listaconvietas"/>
+      </w:pPr>
+      <w:r>
+        <w:t>Qué es SCRUM: framework ágil de desarrollo iterativo e incremental basado en sprints de duración fija, revisiones constantes y adaptación continua (Schwaber &amp; Sutherland, 2020).</w:t>
       </w:r>
     </w:p>
     <w:p>
       <w:pPr>
-        <w:pStyle w:val="Ttulo4"/>
-      </w:pPr>
-      <w:r>
-        <w:t>Procesamiento Asíncrono</w:t>
+        <w:pStyle w:val="Listaconvietas"/>
+      </w:pPr>
+      <w:r>
+        <w:lastRenderedPageBreak/>
+        <w:t xml:space="preserve">Por qué SCRUM es adecuado </w:t>
+      </w:r>
+      <w:r>
+        <w:t>para proyectos de IA: la calidad del output de un sistema LLM es desconocida hasta que se prueba con datos reales; los ciclos cortos permiten detectar y corregir problemas de prompt y arquitectura rápidamente.</w:t>
       </w:r>
     </w:p>
     <w:p>
       <w:pPr>
-        <w:spacing w:after="120"/>
-      </w:pPr>
-      <w:r>
-        <w:t xml:space="preserve">El procesamiento asíncrono es el patrón arquitectónico que permite desacoplar la recepción de una solicitud de su ejecución. En un modelo síncrono, el cliente espera bloqueado hasta </w:t>
-      </w:r>
-      <w:r>
-        <w:lastRenderedPageBreak/>
-        <w:t>que el servidor responde; para procesos de varios minutos —como la generación completa de un curso— esto genera timeouts inaceptables (Kleppmann, 2017). En el modelo asíncrono adoptado, el cliente envía la solicitud y recibe inmediatamente un identificador de trabajo (job_id); el procesamiento ocurre en segundo plano y, al finalizar, el sistema notifica al cliente mediante webhook. Este patrón sigue el modelo productor-consumidor: el componente que recibe la solicitud deposita un mensaje en una cola y el wo</w:t>
-      </w:r>
-      <w:r>
-        <w:t>rker lo toma y ejecuta el pipeline de agentes de forma independiente (Richardson, 2018).</w:t>
+        <w:pStyle w:val="Listaconvietas"/>
+      </w:pPr>
+      <w:r>
+        <w:t>La dimensión multidisciplinaria: el equipo int</w:t>
+      </w:r>
+      <w:r>
+        <w:t>egró roles de desarrollo (backend, frontend) con roles instruccionales (LxD, Docente Revisor), lo que exige una coordinación explícita y roles bien definidos dentro del sprint.</w:t>
       </w:r>
     </w:p>
     <w:p>
       <w:pPr>
-        <w:spacing w:after="80"/>
-      </w:pPr>
-      <w:r>
-        <w:rPr>
-          <w:i/>
-          <w:sz w:val="18"/>
-        </w:rPr>
-        <w:t>Referencias: Kleppmann, M. (2017). Designing Data-Intensive Applications. O'Reilly Media. | Richardson, C. (2018). Microservices Patterns. Manning Publications.</w:t>
-      </w:r>
-    </w:p>
-    <w:p/>
-    <w:p>
-      <w:pPr>
-        <w:pStyle w:val="Ttulo4"/>
-      </w:pPr>
-      <w:r>
-        <w:t>Amazon Web Services (AWS)</w:t>
+        <w:pStyle w:val="Listaconvietas"/>
+      </w:pPr>
+      <w:r>
+        <w:t>El rol del Docente Revisor como validador en cada sprint: cada iteración de pro</w:t>
+      </w:r>
+      <w:r>
+        <w:t>mpts se valida con expertos reales, no solo con métricas automáticas.</w:t>
       </w:r>
     </w:p>
     <w:p>
       <w:pPr>
-        <w:spacing w:after="120"/>
-      </w:pPr>
-      <w:r>
-        <w:t xml:space="preserve">Amazon Web Services (AWS) es la plataforma cloud elegida para el despliegue del backend. Ofrece un ecosistema de servicios gestionados con modelo de pago por uso e integración nativa entre mensajería (SQS, SNS) y cómputo serverless (Lambda), lo que reduce la complejidad operativa frente a infraestructura autogestionada (Wittig &amp; Wittig, 2018). En el sistema se utilizan cuatro servicios de AWS: API Gateway como punto de entrada HTTP, Lambda como motor de ejecución de los agentes, SQS como cola de trabajos y </w:t>
-      </w:r>
-      <w:r>
-        <w:t>SNS como capa de notificaciones. Cada uno se describe a continuación.</w:t>
+        <w:pStyle w:val="Ttulo2"/>
+      </w:pPr>
+      <w:r>
+        <w:t>Referencias del Capítulo</w:t>
       </w:r>
     </w:p>
     <w:p>
-      <w:pPr>
-        <w:spacing w:after="80"/>
-      </w:pPr>
-      <w:r>
-        <w:rPr>
-          <w:i/>
-          <w:sz w:val="18"/>
-        </w:rPr>
-        <w:t>Referencias: Wittig, M., &amp; Wittig, A. (2018). Amazon Web Services in Action (2nd ed.). Manning Publications. | Amazon Web Services. (2024). AWS Documentation. https://docs.aws.amazon.com</w:t>
-      </w:r>
-    </w:p>
-    <w:p/>
-    <w:p>
-      <w:pPr>
-        <w:pStyle w:val="Ttulo4"/>
-      </w:pPr>
-      <w:r>
-        <w:t>Amazon SQS (Simple Queue Service)</w:t>
+      <w:r>
+        <w:t>Anderson, L. W., &amp; Krathwohl, D. R. (2001). A Taxonomy for Learning, Teaching, and Assessing: A Revision of Bloom's Taxonomy of Educational Objectives. Longman.</w:t>
       </w:r>
     </w:p>
     <w:p>
-      <w:pPr>
-        <w:spacing w:after="120"/>
-      </w:pPr>
-      <w:r>
-        <w:t>Amazon SQS es el servicio de cola de mensajes completamente gestionado que administra los trabajos de generación de contenido del sistema. Cada solicitud de generación de curso se encola como un mensaje; SQS actúa como buffer ante múltiples solicitudes simultáneas y garantiza que ningún trabajo se pierda ante fallos del worker, dado que el mensaje permanece en la cola hasta ser procesado exitosamente. La integración nativa con Lambda permite que SQS dispare la función de procesamiento automáticamente cuando</w:t>
-      </w:r>
-      <w:r>
-        <w:t xml:space="preserve"> hay mensajes disponibles, sin necesidad de polling activo por parte del sistema.</w:t>
+      <w:r>
+        <w:t>Amazon Web Services. (2024). AWS Documentation. https://docs.aws.amazon.com</w:t>
       </w:r>
     </w:p>
     <w:p>
-      <w:pPr>
-        <w:spacing w:after="80"/>
-      </w:pPr>
-      <w:r>
-        <w:rPr>
-          <w:i/>
-          <w:sz w:val="18"/>
-        </w:rPr>
-        <w:t>Referencias: Amazon Web Services. (2024). Amazon SQS Developer Guide. https://docs.aws.amazon.com/sqs/</w:t>
-      </w:r>
-    </w:p>
-    <w:p/>
-    <w:p>
-      <w:pPr>
-        <w:pStyle w:val="Ttulo4"/>
-      </w:pPr>
-      <w:r>
-        <w:lastRenderedPageBreak/>
-        <w:t>Amazon SNS (Simple Notification Service)</w:t>
+      <w:r>
+        <w:t>Bloom, B. S., Engelhart, M. D., Furst, E. J., Hill, W. H., &amp; Krathwohl, D. R. (1956). Taxonomy of Educational Objectives: The Classification of Educational Goals. David McKay.</w:t>
       </w:r>
     </w:p>
     <w:p>
-      <w:pPr>
-        <w:spacing w:after="120"/>
-      </w:pPr>
-      <w:r>
-        <w:t>Amazon SNS es el servicio de mensajería de publicación/suscripción (pub/sub) que comunica la finalización de un trabajo de generación a los sistemas interesados. Cuando el worker concluye el procesamiento, publica un evento en un SNS topic; los suscriptores registrados —otros servicios o webhooks— reaccionan a ese evento sin que el worker necesite conocerlos directamente. Esta arquitectura permite aplicar el patrón fanout: SNS distribuye el evento de finalización a múltiples destinos en paralelo, desacoplan</w:t>
-      </w:r>
-      <w:r>
-        <w:t>do la lógica de notificación del código de generación.</w:t>
+      <w:r>
+        <w:t>Brow</w:t>
+      </w:r>
+      <w:r>
+        <w:t>n, T. B., Mann, B., Ryder, N., Subbiah, M., Kaplan, J., Dhariwal, P., &amp; Amodei, D. (2020). Language models are few-shot learners. Advances in Neural Information Processing Systems, 33, 1877–1901.</w:t>
       </w:r>
     </w:p>
     <w:p>
-      <w:pPr>
-        <w:spacing w:after="80"/>
-      </w:pPr>
-      <w:r>
-        <w:rPr>
-          <w:i/>
-          <w:sz w:val="18"/>
-        </w:rPr>
-        <w:t>Referencias: Amazon Web Services. (2024). Amazon SNS Developer Guide. https://docs.aws.amazon.com/sns/</w:t>
-      </w:r>
-    </w:p>
-    <w:p/>
-    <w:p>
-      <w:pPr>
-        <w:pStyle w:val="Ttulo4"/>
-      </w:pPr>
-      <w:r>
-        <w:t>Webhooks</w:t>
+      <w:r>
+        <w:t xml:space="preserve">Chase, H. (2024). LangGraph: Building stateful, multi-actor </w:t>
+      </w:r>
+      <w:r>
+        <w:t>applications with LLMs. LangChain, Inc. https://langchain-ai.github.io/langgraph/</w:t>
       </w:r>
     </w:p>
     <w:p>
-      <w:pPr>
-        <w:spacing w:after="120"/>
-      </w:pPr>
-      <w:r>
-        <w:t>Un webhook es una llamada HTTP que el servidor realiza automáticamente a una URL predefinida por el cliente cuando un evento específico ocurre. A diferencia del polling —donde el cliente consulta repetidamente el estado del trabajo—, el webhook empuja la notificación en el momento exacto en que el resultado está listo, eliminando el tráfico innecesario durante el procesamiento. En el sistema, al enviar la solicitud de generación el cliente registra una URL de callback; cuando el worker finaliza, SNS dispara</w:t>
-      </w:r>
-      <w:r>
-        <w:t xml:space="preserve"> el webhook hacia esa URL con el resultado del trabajo (Fielding &amp; Taylor, 2002).</w:t>
+      <w:r>
+        <w:t>Kleppmann, M. (2017). Designing Data-Intensive Applications: The Big Ideas Behind Reliable, Scalable, and Maintainable Systems. O'Reilly Media.</w:t>
       </w:r>
     </w:p>
     <w:p>
-      <w:pPr>
-        <w:spacing w:after="80"/>
-      </w:pPr>
-      <w:r>
-        <w:rPr>
-          <w:i/>
-          <w:sz w:val="18"/>
-        </w:rPr>
-        <w:t>Referencias: Fielding, R. T., &amp; Taylor, R. N. (2002). Principled design of the modern web architecture. ACM TOIT, 2(2), 115-150.</w:t>
-      </w:r>
-    </w:p>
-    <w:p/>
-    <w:p>
-      <w:pPr>
-        <w:pStyle w:val="Ttulo4"/>
-      </w:pPr>
-      <w:r>
-        <w:t>AWS Lambda (Cómputo Serverless)</w:t>
+      <w:r>
+        <w:t>Liu, P., Yuan, W., Fu, J., Jia</w:t>
+      </w:r>
+      <w:r>
+        <w:t>ng, Z., Hayashi, H., &amp; Neubig, G. (2023). Pre-train, prompt, and predict: A systematic survey of prompting methods in natural language processing. ACM Computing Surveys, 55(9), 1–35.</w:t>
       </w:r>
     </w:p>
     <w:p>
-      <w:pPr>
-        <w:spacing w:after="120"/>
-      </w:pPr>
-      <w:r>
-        <w:t>AWS Lambda es el servicio de cómputo serverless que ejecuta el pipeline de agentes LLM en el backend. El desarrollador despliega el código como una función y AWS gestiona el provisionamiento, el escalado y la ejecución en respuesta a eventos, sin necesidad de administrar servidores. Lambda admite un timeout máximo de 15 minutos por ejecución, límite que ninguna generación del sistema supera —ni siquiera el pipeline multi-agente completo—, lo que hace que el servicio cubra el caso de uso sin requerir instanc</w:t>
-      </w:r>
-      <w:r>
-        <w:t>ias de larga ejecución. Además, Lambda escala horizontalmente de forma automática y cobra únicamente por el tiempo de cómputo consumido durante la ejecución, lo que reduce el costo operativo para un sistema de uso no continuo (Sbarski &amp; Kroonenburg, 2017).</w:t>
+      <w:r>
+        <w:t>OpenAI. (2024). Structured outputs. OpenAI Platform Documentation. https:</w:t>
+      </w:r>
+      <w:r>
+        <w:t>//platform.openai.com/docs/guides/structured-outputs</w:t>
       </w:r>
     </w:p>
     <w:p>
-      <w:pPr>
-        <w:spacing w:after="80"/>
-      </w:pPr>
-      <w:r>
-        <w:rPr>
-          <w:i/>
-          <w:sz w:val="18"/>
-        </w:rPr>
+      <w:r>
         <w:lastRenderedPageBreak/>
-        <w:t>Referencias: Amazon Web Services. (2024). AWS Lambda Developer Guide. https://docs.aws.amazon.com/lambda/ | Sbarski, P., &amp; Kroonenburg, S. (2017). Serverless Architectures on AWS. Manning Publications.</w:t>
-      </w:r>
-    </w:p>
-    <w:p/>
-    <w:p>
-      <w:pPr>
-        <w:pStyle w:val="Ttulo4"/>
-      </w:pPr>
-      <w:r>
-        <w:t>Amazon API Gateway</w:t>
+        <w:t>Park, J. S., O'Brien, J. C., Cai, C. J., Morris, M. R., Liang, P., &amp; Bernstein, M. S. (2023). Generative agents: Interactive simulacra of human behavior. Proceedings of the 36th Annual ACM Symposium on U</w:t>
+      </w:r>
+      <w:r>
+        <w:t>ser Interface Software and Technology (UIST).</w:t>
       </w:r>
     </w:p>
     <w:p>
-      <w:pPr>
-        <w:spacing w:after="120"/>
-      </w:pPr>
-      <w:r>
-        <w:t>Amazon API Gateway es el único punto de entrada HTTP del backend. Gestiona y expone las rutas del sistema, enrutando cada solicitud a la función Lambda correspondiente y centralizando autenticación, rate limiting y logging sin requerir servidores de API propios. Esta separación de responsabilidades —API Gateway maneja la capa de transporte mientras Lambda maneja la lógica de negocio— sigue el principio de diseño de sistemas distribuidos que desacopla las preocupaciones de red de las de procesamiento (Richar</w:t>
-      </w:r>
-      <w:r>
-        <w:t>dson, 2018).</w:t>
+      <w:r>
+        <w:t>Raschka, S., Patterson, J., &amp; Nolet, C. (2020). Machine learning in Python: Main developments and technology trends in data science, machine learning, and artificial intelligence. Information, 11(4), 193.</w:t>
       </w:r>
     </w:p>
     <w:p>
-      <w:pPr>
-        <w:spacing w:after="80"/>
-      </w:pPr>
-      <w:r>
-        <w:rPr>
-          <w:i/>
-          <w:sz w:val="18"/>
-        </w:rPr>
-        <w:t>Referencias: Amazon Web Services. (2024). Amazon API Gateway Developer Guide. https://docs.aws.amazon.com/apigateway/</w:t>
-      </w:r>
-    </w:p>
-    <w:p/>
-    <w:p>
-      <w:pPr>
-        <w:pStyle w:val="Ttulo2"/>
-      </w:pPr>
-      <w:r>
-        <w:t>2.4  Metodología de Desarrollo</w:t>
+      <w:r>
+        <w:t>Richa</w:t>
+      </w:r>
+      <w:r>
+        <w:t>rdson, C. (2018). Microservices Patterns: With Examples in Java. Manning Publications.</w:t>
       </w:r>
     </w:p>
     <w:p>
-      <w:pPr>
-        <w:spacing w:after="120"/>
-      </w:pPr>
-      <w:r>
-        <w:t>En esta sección se describe el marco metodológico que guió el desarrollo del sistema a lo largo del proyecto.</w:t>
+      <w:r>
+        <w:t>Rigby, D. K., Sutherland, J., &amp; Takeuchi, H. (2016). Embracing agile. Harvard Business Review, 94(5), 40–50.</w:t>
       </w:r>
     </w:p>
     <w:p>
-      <w:pPr>
-        <w:pStyle w:val="Ttulo3"/>
-      </w:pPr>
-      <w:r>
-        <w:t>2.4.1  SCRUM en equipos multidisciplinarios</w:t>
+      <w:r>
+        <w:t>Schwaber, K., &amp; Sutherland, J. (2020). The Scrum Guide. Scru</w:t>
+      </w:r>
+      <w:r>
+        <w:t>m.org. https://scrumguides.org/scrum-guide.html</w:t>
       </w:r>
     </w:p>
     <w:p>
-      <w:pPr>
-        <w:spacing w:after="120"/>
-      </w:pPr>
-      <w:r>
-        <w:t>Se explicará el framework SCRUM (Schwaber &amp; Sutherland, 2020) y su aplicación en un equipo compuesto por perfiles de distintas disciplinas (ingeniería de software, diseño instruccional, expertos temáticos). Los puntos a cubrir son:</w:t>
+      <w:r>
+        <w:t>Wei, J., Wang, X., Schuurmans, D., Bosma, M., Xia, F., Chi, E., &amp; Zhou, D. (2022). Chain-of-thought prompting elicits reasoning in large language models. Advances in Neural Information Processing Systems, 35,</w:t>
+      </w:r>
+      <w:r>
+        <w:t xml:space="preserve"> 24824–24837.</w:t>
       </w:r>
     </w:p>
     <w:p>
-      <w:pPr>
-        <w:pStyle w:val="Listaconvietas"/>
-        <w:spacing w:after="60"/>
-      </w:pPr>
-      <w:r>
-        <w:t>Qué es SCRUM: framework ágil de desarrollo iterativo e incremental basado en sprints de duración fija, revisiones constantes y adaptación continua (Schwaber &amp; Sutherland, 2020).</w:t>
+      <w:r>
+        <w:t>Wittig, M., &amp; Wittig, A. (2018). Amazon Web Services in Action (2nd ed.). Manning Publications.</w:t>
       </w:r>
     </w:p>
     <w:p>
-      <w:pPr>
-        <w:pStyle w:val="Listaconvietas"/>
-        <w:spacing w:after="60"/>
-      </w:pPr>
-      <w:r>
-        <w:t>Por qué SCRUM es adecuado para proyectos de IA: la calidad del output de un sistema LLM es desconocida hasta que se prueba con datos reales; los ciclos cortos permiten detectar y corregir problemas de prompt y arquitectura rápidamente.</w:t>
+      <w:r>
+        <w:t>Wu, Q., Bansal, G., Zhang, J., Wu, Y., Li, B., Zhu, E., &amp; Wang, C. (2023). AutoGen: Enabling next-gen LLM applications via multi-agent conversatio</w:t>
+      </w:r>
+      <w:r>
+        <w:t>n. arXiv preprint arXiv:2308.08155.</w:t>
       </w:r>
     </w:p>
     <w:p>
-      <w:pPr>
-        <w:pStyle w:val="Listaconvietas"/>
-        <w:spacing w:after="60"/>
-      </w:pPr>
-      <w:r>
-        <w:t>La dimensión multidisciplinaria: el equipo integró roles de desarrollo (backend, frontend) con roles instruccionales (LxD, Docente Revisor), lo que exige una coordinación explícita y roles bien definidos dentro del sprint.</w:t>
+      <w:r>
+        <w:t>Yao, S., Zhao, J., Yu, D., Du, N., Shafran, I., Narasimhan, K., &amp; Cao, Y. (2023). ReAct: Synergizing reasoning and acting in language models. International Conference on Learning Representations (ICLR).</w:t>
       </w:r>
     </w:p>
-    <w:p>
-      <w:pPr>
-        <w:pStyle w:val="Listaconvietas"/>
-        <w:spacing w:after="60"/>
-      </w:pPr>
-      <w:r>
-        <w:t>El rol del Docente Revisor como validador en cada sprint: cada iteración de prompts se valida con expertos reales, no solo con métricas automáticas.</w:t>
-      </w:r>
-    </w:p>
-    <w:p>
-      <w:pPr>
-        <w:spacing w:after="80"/>
-      </w:pPr>
-      <w:r>
-        <w:rPr>
-          <w:i/>
-          <w:sz w:val="18"/>
-        </w:rPr>
-        <w:lastRenderedPageBreak/>
-        <w:t>Referencias clave: Schwaber, K., &amp; Sutherland, J. (2020). The Scrum Guide. Scrum.org. https://scrumguides.org/scrum-guide.html | Rigby, D. K., Sutherland, J., &amp; Takeuchi, H. (2016). Embracing agile. Harvard Business Review, 94(5), 40-50.</w:t>
-      </w:r>
-    </w:p>
-    <w:p/>
-    <w:p>
-      <w:pPr>
-        <w:pStyle w:val="Ttulo2"/>
-      </w:pPr>
-      <w:r>
-        <w:t>Referencias del Capítulo</w:t>
-      </w:r>
-    </w:p>
-    <w:p>
-      <w:pPr>
-        <w:pStyle w:val="Listaconvietas"/>
-        <w:spacing w:after="60"/>
-      </w:pPr>
-      <w:r>
-        <w:t>Anderson, L. W., &amp; Krathwohl, D. R. (2001). A Taxonomy for Learning, Teaching, and Assessing: A Revision of Bloom's Taxonomy of Educational Objectives. Longman.</w:t>
-      </w:r>
-    </w:p>
-    <w:p>
-      <w:pPr>
-        <w:pStyle w:val="Listaconvietas"/>
-        <w:spacing w:after="60"/>
-      </w:pPr>
-      <w:r>
-        <w:t>Amazon Web Services. (2024). Amazon API Gateway Developer Guide. https://docs.aws.amazon.com/apigateway/</w:t>
-      </w:r>
-    </w:p>
-    <w:p>
-      <w:pPr>
-        <w:pStyle w:val="Listaconvietas"/>
-        <w:spacing w:after="60"/>
-      </w:pPr>
-      <w:r>
-        <w:t>Amazon Web Services. (2024). Amazon SQS Developer Guide. https://docs.aws.amazon.com/sqs/</w:t>
-      </w:r>
-    </w:p>
-    <w:p>
-      <w:pPr>
-        <w:pStyle w:val="Listaconvietas"/>
-        <w:spacing w:after="60"/>
-      </w:pPr>
-      <w:r>
-        <w:t>Amazon Web Services. (2024). Amazon SNS Developer Guide. https://docs.aws.amazon.com/sns/</w:t>
-      </w:r>
-    </w:p>
-    <w:p>
-      <w:pPr>
-        <w:pStyle w:val="Listaconvietas"/>
-        <w:spacing w:after="60"/>
-      </w:pPr>
-      <w:r>
-        <w:t>Amazon Web Services. (2024). AWS Lambda Developer Guide. https://docs.aws.amazon.com/lambda/</w:t>
-      </w:r>
-    </w:p>
-    <w:p>
-      <w:pPr>
-        <w:pStyle w:val="Listaconvietas"/>
-        <w:spacing w:after="60"/>
-      </w:pPr>
-      <w:r>
-        <w:t>Bloom, B. S., Engelhart, M. D., Furst, E. J., Hill, W. H., &amp; Krathwohl, D. R. (1956). Taxonomy of Educational Objectives: The Classification of Educational Goals. David McKay.</w:t>
-      </w:r>
-    </w:p>
-    <w:p>
-      <w:pPr>
-        <w:pStyle w:val="Listaconvietas"/>
-        <w:spacing w:after="60"/>
-      </w:pPr>
-      <w:r>
-        <w:t>Brown, T. B., Mann, B., Ryder, N., Subbiah, M., Kaplan, J., Dhariwal, P., &amp; Amodei, D. (2020). Language models are few-shot learners. Advances in Neural Information Processing Systems, 33, 1877-1901.</w:t>
-      </w:r>
-    </w:p>
-    <w:p>
-      <w:pPr>
-        <w:pStyle w:val="Listaconvietas"/>
-        <w:spacing w:after="60"/>
-      </w:pPr>
-      <w:r>
-        <w:t>Chase, H. (2024). LangGraph: Building stateful, multi-actor applications with LLMs. LangChain, Inc. https://langchain-ai.github.io/langgraph/</w:t>
-      </w:r>
-    </w:p>
-    <w:p>
-      <w:pPr>
-        <w:pStyle w:val="Listaconvietas"/>
-        <w:spacing w:after="60"/>
-      </w:pPr>
-      <w:r>
-        <w:t>Fielding, R. T., &amp; Taylor, R. N. (2002). Principled design of the modern web architecture. ACM Transactions on Internet Technology, 2(2), 115-150.</w:t>
-      </w:r>
-    </w:p>
-    <w:p>
-      <w:pPr>
-        <w:pStyle w:val="Listaconvietas"/>
-        <w:spacing w:after="60"/>
-      </w:pPr>
-      <w:r>
-        <w:t>Kasneci, E., Sessler, K., Küchemann, S., Bannert, M., Dementieva, D., Fischer, F., &amp; Kasneci, G. (2023). ChatGPT for good? On opportunities and challenges of large language models for education. Learning and Individual Differences, 103, 102274.</w:t>
-      </w:r>
-    </w:p>
-    <w:p>
-      <w:pPr>
-        <w:pStyle w:val="Listaconvietas"/>
-        <w:spacing w:after="60"/>
-      </w:pPr>
-      <w:r>
-        <w:t>Kleppmann, M. (2017). Designing Data-Intensive Applications: The Big Ideas Behind Reliable, Scalable, and Maintainable Systems. O'Reilly Media.</w:t>
-      </w:r>
-    </w:p>
-    <w:p>
-      <w:pPr>
-        <w:pStyle w:val="Listaconvietas"/>
-        <w:spacing w:after="60"/>
-      </w:pPr>
-      <w:r>
-        <w:t>Liu, P., Yuan, W., Fu, J., Jiang, Z., Hayashi, H., &amp; Neubig, G. (2023). Pre-train, prompt, and predict: A systematic survey of prompting methods in natural language processing. ACM Computing Surveys, 55(9), 1-35.</w:t>
-      </w:r>
-    </w:p>
-    <w:p>
-      <w:pPr>
-        <w:pStyle w:val="Listaconvietas"/>
-        <w:spacing w:after="60"/>
-      </w:pPr>
-      <w:r>
-        <w:lastRenderedPageBreak/>
-        <w:t>OpenAI. (2024). Structured outputs. OpenAI Platform Documentation. https://platform.openai.com/docs/guides/structured-outputs</w:t>
-      </w:r>
-    </w:p>
-    <w:p>
-      <w:pPr>
-        <w:pStyle w:val="Listaconvietas"/>
-        <w:spacing w:after="60"/>
-      </w:pPr>
-      <w:r>
-        <w:t>Park, J. S., O'Brien, J. C., Cai, C. J., Morris, M. R., Liang, P., &amp; Bernstein, M. S. (2023). Generative agents: Interactive simulacra of human behavior. Proceedings of the 36th Annual ACM Symposium on User Interface Software and Technology (UIST).</w:t>
-      </w:r>
-    </w:p>
-    <w:p>
-      <w:pPr>
-        <w:pStyle w:val="Listaconvietas"/>
-        <w:spacing w:after="60"/>
-      </w:pPr>
-      <w:r>
-        <w:t>Raschka, S., Patterson, J., &amp; Nolet, C. (2020). Machine learning in Python: Main developments and technology trends in data science, machine learning, and artificial intelligence. Information, 11(4), 193.</w:t>
-      </w:r>
-    </w:p>
-    <w:p>
-      <w:pPr>
-        <w:pStyle w:val="Listaconvietas"/>
-        <w:spacing w:after="60"/>
-      </w:pPr>
-      <w:r>
-        <w:t>Richardson, C. (2018). Microservices Patterns: With Examples in Java. Manning Publications.</w:t>
-      </w:r>
-    </w:p>
-    <w:p>
-      <w:pPr>
-        <w:pStyle w:val="Listaconvietas"/>
-        <w:spacing w:after="60"/>
-      </w:pPr>
-      <w:r>
-        <w:t>Rigby, D. K., Sutherland, J., &amp; Takeuchi, H. (2016). Embracing agile. Harvard Business Review, 94(5), 40-50.</w:t>
-      </w:r>
-    </w:p>
-    <w:p>
-      <w:pPr>
-        <w:pStyle w:val="Listaconvietas"/>
-        <w:spacing w:after="60"/>
-      </w:pPr>
-      <w:r>
-        <w:t>Sbarski, P., &amp; Kroonenburg, S. (2017). Serverless Architectures on AWS. Manning Publications.</w:t>
-      </w:r>
-    </w:p>
-    <w:p>
-      <w:pPr>
-        <w:pStyle w:val="Listaconvietas"/>
-        <w:spacing w:after="60"/>
-      </w:pPr>
-      <w:r>
-        <w:t>Schwaber, K., &amp; Sutherland, J. (2020). The Scrum Guide. Scrum.org. https://scrumguides.org/scrum-guide.html</w:t>
-      </w:r>
-    </w:p>
-    <w:p>
-      <w:pPr>
-        <w:pStyle w:val="Listaconvietas"/>
-        <w:spacing w:after="60"/>
-      </w:pPr>
-      <w:r>
-        <w:t>Wei, J., Wang, X., Schuurmans, D., Bosma, M., Xia, F., Chi, E., &amp; Zhou, D. (2022). Chain-of-thought prompting elicits reasoning in large language models. Advances in Neural Information Processing Systems, 35, 24824-24837.</w:t>
-      </w:r>
-    </w:p>
-    <w:p>
-      <w:pPr>
-        <w:pStyle w:val="Listaconvietas"/>
-        <w:spacing w:after="60"/>
-      </w:pPr>
-      <w:r>
-        <w:t>Wiggins, G., &amp; McTighe, J. (2005). Understanding by Design (2nd ed.). ASCD.</w:t>
-      </w:r>
-    </w:p>
-    <w:p>
-      <w:pPr>
-        <w:pStyle w:val="Listaconvietas"/>
-        <w:spacing w:after="60"/>
-      </w:pPr>
-      <w:r>
-        <w:t>Wittig, M., &amp; Wittig, A. (2018). Amazon Web Services in Action (2nd ed.). Manning Publications.</w:t>
-      </w:r>
-    </w:p>
-    <w:p>
-      <w:pPr>
-        <w:pStyle w:val="Listaconvietas"/>
-        <w:spacing w:after="60"/>
-      </w:pPr>
-      <w:r>
-        <w:t>Wu, Q., Bansal, G., Zhang, J., Wu, Y., Li, B., Zhu, E., &amp; Wang, C. (2023). AutoGen: Enabling next-gen LLM applications via multi-agent conversation. arXiv preprint arXiv:2308.08155.</w:t>
-      </w:r>
-    </w:p>
-    <w:p>
-      <w:pPr>
-        <w:pStyle w:val="Listaconvietas"/>
-        <w:spacing w:after="60"/>
-      </w:pPr>
-      <w:r>
-        <w:t>Yao, S., Zhao, J., Yu, D., Du, N., Shafran, I., Narasimhan, K., &amp; Cao, Y. (2023). ReAct: Synergizing reasoning and acting in language models. International Conference on Learning Representations (ICLR).</w:t>
-      </w:r>
-    </w:p>
-    <w:sdt>
-      <w:sdtPr>
-        <w:rPr>
-          <w:rFonts w:cs="Times New Roman"/>
-          <w:color w:val="000000"/>
-        </w:rPr>
-        <w:tag w:val="MENDELEY_BIBLIOGRAPHY"/>
-        <w:id w:val="-490329575"/>
-        <w:placeholder>
-          <w:docPart w:val="DefaultPlaceholder_-1854013440"/>
-        </w:placeholder>
-      </w:sdtPr>
-      <w:sdtContent>
-        <w:p>
-          <w:pPr>
-            <w:autoSpaceDE w:val="0"/>
-            <w:autoSpaceDN w:val="0"/>
-            <w:ind w:hanging="480"/>
-            <w:divId w:val="1279295361"/>
-            <w:rPr>
-              <w:rFonts w:eastAsia="Times New Roman" w:cs="Times New Roman"/>
-              <w:color w:val="000000"/>
-              <w:szCs w:val="24"/>
-            </w:rPr>
-          </w:pPr>
-          <w:r>
-            <w:rPr>
-              <w:rFonts w:eastAsia="Times New Roman" w:cs="Times New Roman"/>
-              <w:color w:val="000000"/>
-            </w:rPr>
-            <w:t xml:space="preserve">Carmo, J. E. S., Lacerda, D. P., Klingenberg, C. O., &amp; Piran, F. A. S. (2025). Digital transformation in the management of higher education institutions. In </w:t>
-          </w:r>
-          <w:r>
-            <w:rPr>
-              <w:rFonts w:eastAsia="Times New Roman" w:cs="Times New Roman"/>
-              <w:i/>
-              <w:iCs/>
-              <w:color w:val="000000"/>
-            </w:rPr>
-            <w:t>Sustainable Futures</w:t>
-          </w:r>
-          <w:r>
-            <w:rPr>
-              <w:rFonts w:eastAsia="Times New Roman" w:cs="Times New Roman"/>
-              <w:color w:val="000000"/>
-            </w:rPr>
-            <w:t xml:space="preserve"> (Vol. 9). https://doi.org/10.1016/j.sftr.2025.100692</w:t>
-          </w:r>
-        </w:p>
-        <w:p>
-          <w:pPr>
-            <w:autoSpaceDE w:val="0"/>
-            <w:autoSpaceDN w:val="0"/>
-            <w:ind w:hanging="480"/>
-            <w:divId w:val="1323663188"/>
-            <w:rPr>
-              <w:rFonts w:eastAsia="Times New Roman" w:cs="Times New Roman"/>
-              <w:color w:val="000000"/>
-            </w:rPr>
-          </w:pPr>
-          <w:r>
-            <w:rPr>
-              <w:rFonts w:eastAsia="Times New Roman" w:cs="Times New Roman"/>
-              <w:color w:val="000000"/>
-            </w:rPr>
-            <w:lastRenderedPageBreak/>
-            <w:t xml:space="preserve">Lee, D., Arnold, M., Srivastava, A., Plastow, K., </w:t>
-          </w:r>
-          <w:proofErr w:type="spellStart"/>
-          <w:r>
-            <w:rPr>
-              <w:rFonts w:eastAsia="Times New Roman" w:cs="Times New Roman"/>
-              <w:color w:val="000000"/>
-            </w:rPr>
-            <w:t>Strelan</w:t>
-          </w:r>
-          <w:proofErr w:type="spellEnd"/>
-          <w:r>
-            <w:rPr>
-              <w:rFonts w:eastAsia="Times New Roman" w:cs="Times New Roman"/>
-              <w:color w:val="000000"/>
-            </w:rPr>
-            <w:t xml:space="preserve">, P., Ploeckl, F., Lekkas, D., &amp; Palmer, E. (2024). The impact of generative AI on higher education learning and teaching: A study of educators’ perspectives. </w:t>
-          </w:r>
-          <w:r>
-            <w:rPr>
-              <w:rFonts w:eastAsia="Times New Roman" w:cs="Times New Roman"/>
-              <w:i/>
-              <w:iCs/>
-              <w:color w:val="000000"/>
-            </w:rPr>
-            <w:t>Computers and Education: Artificial Intelligence</w:t>
-          </w:r>
-          <w:r>
-            <w:rPr>
-              <w:rFonts w:eastAsia="Times New Roman" w:cs="Times New Roman"/>
-              <w:color w:val="000000"/>
-            </w:rPr>
-            <w:t xml:space="preserve">, </w:t>
-          </w:r>
-          <w:r>
-            <w:rPr>
-              <w:rFonts w:eastAsia="Times New Roman" w:cs="Times New Roman"/>
-              <w:i/>
-              <w:iCs/>
-              <w:color w:val="000000"/>
-            </w:rPr>
-            <w:t>6</w:t>
-          </w:r>
-          <w:r>
-            <w:rPr>
-              <w:rFonts w:eastAsia="Times New Roman" w:cs="Times New Roman"/>
-              <w:color w:val="000000"/>
-            </w:rPr>
-            <w:t>. https://doi.org/10.1016/j.caeai.2024.100221</w:t>
-          </w:r>
-        </w:p>
-        <w:p>
-          <w:pPr>
-            <w:pStyle w:val="Listaconvietas"/>
-            <w:numPr>
-              <w:ilvl w:val="0"/>
-              <w:numId w:val="0"/>
-            </w:numPr>
-            <w:spacing w:after="60"/>
-            <w:ind w:left="432"/>
-          </w:pPr>
-          <w:r>
-            <w:rPr>
-              <w:rFonts w:eastAsia="Times New Roman" w:cs="Times New Roman"/>
-              <w:color w:val="000000"/>
-            </w:rPr>
-            <w:t> </w:t>
-          </w:r>
-        </w:p>
-      </w:sdtContent>
-    </w:sdt>
     <w:sectPr>
       <w:footerReference w:type="default" r:id="rId15"/>
       <w:pgSz w:w="11906" w:h="16838"/>
@@ -14084,7 +13974,7 @@
 </file>
 
 <file path=word/endnotes.xml><?xml version="1.0" encoding="utf-8"?>
-<w:endnotes xmlns:wpc="http://schemas.microsoft.com/office/word/2010/wordprocessingCanvas" xmlns:cx="http://schemas.microsoft.com/office/drawing/2014/chartex" xmlns:cx1="http://schemas.microsoft.com/office/drawing/2015/9/8/chartex" xmlns:cx2="http://schemas.microsoft.com/office/drawing/2015/10/21/chartex" xmlns:cx3="http://schemas.microsoft.com/office/drawing/2016/5/9/chartex" xmlns:cx4="http://schemas.microsoft.com/office/drawing/2016/5/10/chartex" xmlns:cx5="http://schemas.microsoft.com/office/drawing/2016/5/11/chartex" xmlns:cx6="http://schemas.microsoft.com/office/drawing/2016/5/12/chartex" xmlns:cx7="http://schemas.microsoft.com/office/drawing/2016/5/13/chartex" xmlns:cx8="http://schemas.microsoft.com/office/drawing/2016/5/14/chartex" xmlns:mc="http://schemas.openxmlformats.org/markup-compatibility/2006" xmlns:aink="http://schemas.microsoft.com/office/drawing/2016/ink" xmlns:am3d="http://schemas.microsoft.com/office/drawing/2017/model3d" xmlns:o="urn:schemas-microsoft-com:office:office" xmlns:oel="http://schemas.microsoft.com/office/2019/extlst" xmlns:r="http://schemas.openxmlformats.org/officeDocument/2006/relationships" xmlns:m="http://schemas.openxmlformats.org/officeDocument/2006/math" xmlns:v="urn:schemas-microsoft-com:vml" xmlns:wp14="http://schemas.microsoft.com/office/word/2010/wordprocessingDrawing" xmlns:wp="http://schemas.openxmlformats.org/drawingml/2006/wordprocessingDrawing" xmlns:w10="urn:schemas-microsoft-com:office:word" xmlns:w="http://schemas.openxmlformats.org/wordprocessingml/2006/main" xmlns:w14="http://schemas.microsoft.com/office/word/2010/wordml" xmlns:w15="http://schemas.microsoft.com/office/word/2012/wordml" xmlns:w16cex="http://schemas.microsoft.com/office/word/2018/wordml/cex" xmlns:w16cid="http://schemas.microsoft.com/office/word/2016/wordml/cid" xmlns:w16="http://schemas.microsoft.com/office/word/2018/wordml" xmlns:w16du="http://schemas.microsoft.com/office/word/2023/wordml/word16du" xmlns:w16sdtdh="http://schemas.microsoft.com/office/word/2020/wordml/sdtdatahash" xmlns:w16sdtfl="http://schemas.microsoft.com/office/word/2024/wordml/sdtformatlock" xmlns:w16se="http://schemas.microsoft.com/office/word/2015/wordml/symex" xmlns:wpg="http://schemas.microsoft.com/office/word/2010/wordprocessingGroup" xmlns:wpi="http://schemas.microsoft.com/office/word/2010/wordprocessingInk" xmlns:wne="http://schemas.microsoft.com/office/word/2006/wordml" xmlns:wps="http://schemas.microsoft.com/office/word/2010/wordprocessingShape" mc:Ignorable="w14 w15 w16se w16cid w16 w16cex w16sdtdh w16sdtfl w16du wp14">
+<w:endnotes xmlns:wpc="http://schemas.microsoft.com/office/word/2010/wordprocessingCanvas" xmlns:cx="http://schemas.microsoft.com/office/drawing/2014/chartex" xmlns:cx1="http://schemas.microsoft.com/office/drawing/2015/9/8/chartex" xmlns:cx2="http://schemas.microsoft.com/office/drawing/2015/10/21/chartex" xmlns:cx3="http://schemas.microsoft.com/office/drawing/2016/5/9/chartex" xmlns:cx4="http://schemas.microsoft.com/office/drawing/2016/5/10/chartex" xmlns:cx5="http://schemas.microsoft.com/office/drawing/2016/5/11/chartex" xmlns:cx6="http://schemas.microsoft.com/office/drawing/2016/5/12/chartex" xmlns:cx7="http://schemas.microsoft.com/office/drawing/2016/5/13/chartex" xmlns:cx8="http://schemas.microsoft.com/office/drawing/2016/5/14/chartex" xmlns:mc="http://schemas.openxmlformats.org/markup-compatibility/2006" xmlns:aink="http://schemas.microsoft.com/office/drawing/2016/ink" xmlns:am3d="http://schemas.microsoft.com/office/drawing/2017/model3d" xmlns:o="urn:schemas-microsoft-com:office:office" xmlns:r="http://schemas.openxmlformats.org/officeDocument/2006/relationships" xmlns:m="http://schemas.openxmlformats.org/officeDocument/2006/math" xmlns:v="urn:schemas-microsoft-com:vml" xmlns:wp14="http://schemas.microsoft.com/office/word/2010/wordprocessingDrawing" xmlns:wp="http://schemas.openxmlformats.org/drawingml/2006/wordprocessingDrawing" xmlns:w10="urn:schemas-microsoft-com:office:word" xmlns:w="http://schemas.openxmlformats.org/wordprocessingml/2006/main" xmlns:w14="http://schemas.microsoft.com/office/word/2010/wordml" xmlns:w15="http://schemas.microsoft.com/office/word/2012/wordml" xmlns:w16cex="http://schemas.microsoft.com/office/word/2018/wordml/cex" xmlns:w16cid="http://schemas.microsoft.com/office/word/2016/wordml/cid" xmlns:w16="http://schemas.microsoft.com/office/word/2018/wordml" xmlns:w16sdtdh="http://schemas.microsoft.com/office/word/2020/wordml/sdtdatahash" xmlns:w16se="http://schemas.microsoft.com/office/word/2015/wordml/symex" xmlns:wpg="http://schemas.microsoft.com/office/word/2010/wordprocessingGroup" xmlns:wpi="http://schemas.microsoft.com/office/word/2010/wordprocessingInk" xmlns:wne="http://schemas.microsoft.com/office/word/2006/wordml" xmlns:wps="http://schemas.microsoft.com/office/word/2010/wordprocessingShape" mc:Ignorable="w14 w15 w16se w16cid w16 w16cex w16sdtdh wp14">
   <w:endnote w:type="separator" w:id="-1">
     <w:p>
       <w:pPr>
@@ -14109,7 +13999,7 @@
 </file>
 
 <file path=word/footer1.xml><?xml version="1.0" encoding="utf-8"?>
-<w:ftr xmlns:wpc="http://schemas.microsoft.com/office/word/2010/wordprocessingCanvas" xmlns:cx="http://schemas.microsoft.com/office/drawing/2014/chartex" xmlns:cx1="http://schemas.microsoft.com/office/drawing/2015/9/8/chartex" xmlns:cx2="http://schemas.microsoft.com/office/drawing/2015/10/21/chartex" xmlns:cx3="http://schemas.microsoft.com/office/drawing/2016/5/9/chartex" xmlns:cx4="http://schemas.microsoft.com/office/drawing/2016/5/10/chartex" xmlns:cx5="http://schemas.microsoft.com/office/drawing/2016/5/11/chartex" xmlns:cx6="http://schemas.microsoft.com/office/drawing/2016/5/12/chartex" xmlns:cx7="http://schemas.microsoft.com/office/drawing/2016/5/13/chartex" xmlns:cx8="http://schemas.microsoft.com/office/drawing/2016/5/14/chartex" xmlns:mc="http://schemas.openxmlformats.org/markup-compatibility/2006" xmlns:aink="http://schemas.microsoft.com/office/drawing/2016/ink" xmlns:am3d="http://schemas.microsoft.com/office/drawing/2017/model3d" xmlns:o="urn:schemas-microsoft-com:office:office" xmlns:oel="http://schemas.microsoft.com/office/2019/extlst" xmlns:r="http://schemas.openxmlformats.org/officeDocument/2006/relationships" xmlns:m="http://schemas.openxmlformats.org/officeDocument/2006/math" xmlns:v="urn:schemas-microsoft-com:vml" xmlns:wp14="http://schemas.microsoft.com/office/word/2010/wordprocessingDrawing" xmlns:wp="http://schemas.openxmlformats.org/drawingml/2006/wordprocessingDrawing" xmlns:w10="urn:schemas-microsoft-com:office:word" xmlns:w="http://schemas.openxmlformats.org/wordprocessingml/2006/main" xmlns:w14="http://schemas.microsoft.com/office/word/2010/wordml" xmlns:w15="http://schemas.microsoft.com/office/word/2012/wordml" xmlns:w16cex="http://schemas.microsoft.com/office/word/2018/wordml/cex" xmlns:w16cid="http://schemas.microsoft.com/office/word/2016/wordml/cid" xmlns:w16="http://schemas.microsoft.com/office/word/2018/wordml" xmlns:w16du="http://schemas.microsoft.com/office/word/2023/wordml/word16du" xmlns:w16sdtdh="http://schemas.microsoft.com/office/word/2020/wordml/sdtdatahash" xmlns:w16sdtfl="http://schemas.microsoft.com/office/word/2024/wordml/sdtformatlock" xmlns:w16se="http://schemas.microsoft.com/office/word/2015/wordml/symex" xmlns:wpg="http://schemas.microsoft.com/office/word/2010/wordprocessingGroup" xmlns:wpi="http://schemas.microsoft.com/office/word/2010/wordprocessingInk" xmlns:wne="http://schemas.microsoft.com/office/word/2006/wordml" xmlns:wps="http://schemas.microsoft.com/office/word/2010/wordprocessingShape" mc:Ignorable="w14 w15 w16se w16cid w16 w16cex w16sdtdh w16sdtfl w16du wp14">
+<w:ftr xmlns:wpc="http://schemas.microsoft.com/office/word/2010/wordprocessingCanvas" xmlns:cx="http://schemas.microsoft.com/office/drawing/2014/chartex" xmlns:cx1="http://schemas.microsoft.com/office/drawing/2015/9/8/chartex" xmlns:cx2="http://schemas.microsoft.com/office/drawing/2015/10/21/chartex" xmlns:cx3="http://schemas.microsoft.com/office/drawing/2016/5/9/chartex" xmlns:cx4="http://schemas.microsoft.com/office/drawing/2016/5/10/chartex" xmlns:cx5="http://schemas.microsoft.com/office/drawing/2016/5/11/chartex" xmlns:cx6="http://schemas.microsoft.com/office/drawing/2016/5/12/chartex" xmlns:cx7="http://schemas.microsoft.com/office/drawing/2016/5/13/chartex" xmlns:cx8="http://schemas.microsoft.com/office/drawing/2016/5/14/chartex" xmlns:mc="http://schemas.openxmlformats.org/markup-compatibility/2006" xmlns:aink="http://schemas.microsoft.com/office/drawing/2016/ink" xmlns:am3d="http://schemas.microsoft.com/office/drawing/2017/model3d" xmlns:o="urn:schemas-microsoft-com:office:office" xmlns:r="http://schemas.openxmlformats.org/officeDocument/2006/relationships" xmlns:m="http://schemas.openxmlformats.org/officeDocument/2006/math" xmlns:v="urn:schemas-microsoft-com:vml" xmlns:wp14="http://schemas.microsoft.com/office/word/2010/wordprocessingDrawing" xmlns:wp="http://schemas.openxmlformats.org/drawingml/2006/wordprocessingDrawing" xmlns:w10="urn:schemas-microsoft-com:office:word" xmlns:w="http://schemas.openxmlformats.org/wordprocessingml/2006/main" xmlns:w14="http://schemas.microsoft.com/office/word/2010/wordml" xmlns:w15="http://schemas.microsoft.com/office/word/2012/wordml" xmlns:w16cex="http://schemas.microsoft.com/office/word/2018/wordml/cex" xmlns:w16cid="http://schemas.microsoft.com/office/word/2016/wordml/cid" xmlns:w16="http://schemas.microsoft.com/office/word/2018/wordml" xmlns:w16sdtdh="http://schemas.microsoft.com/office/word/2020/wordml/sdtdatahash" xmlns:w16se="http://schemas.microsoft.com/office/word/2015/wordml/symex" xmlns:wpg="http://schemas.microsoft.com/office/word/2010/wordprocessingGroup" xmlns:wpi="http://schemas.microsoft.com/office/word/2010/wordprocessingInk" xmlns:wne="http://schemas.microsoft.com/office/word/2006/wordml" xmlns:wps="http://schemas.microsoft.com/office/word/2010/wordprocessingShape" mc:Ignorable="w14 w15 w16se w16cid w16 w16cex w16sdtdh wp14">
   <w:sdt>
     <w:sdtPr>
       <w:id w:val="588045748"/>
@@ -14118,6 +14008,7 @@
         <w:docPartUnique/>
       </w:docPartObj>
     </w:sdtPr>
+    <w:sdtEndPr/>
     <w:sdtContent>
       <w:p>
         <w:pPr>
@@ -14154,7 +14045,7 @@
 </file>
 
 <file path=word/footer2.xml><?xml version="1.0" encoding="utf-8"?>
-<w:ftr xmlns:wpc="http://schemas.microsoft.com/office/word/2010/wordprocessingCanvas" xmlns:cx="http://schemas.microsoft.com/office/drawing/2014/chartex" xmlns:cx1="http://schemas.microsoft.com/office/drawing/2015/9/8/chartex" xmlns:cx2="http://schemas.microsoft.com/office/drawing/2015/10/21/chartex" xmlns:cx3="http://schemas.microsoft.com/office/drawing/2016/5/9/chartex" xmlns:cx4="http://schemas.microsoft.com/office/drawing/2016/5/10/chartex" xmlns:cx5="http://schemas.microsoft.com/office/drawing/2016/5/11/chartex" xmlns:cx6="http://schemas.microsoft.com/office/drawing/2016/5/12/chartex" xmlns:cx7="http://schemas.microsoft.com/office/drawing/2016/5/13/chartex" xmlns:cx8="http://schemas.microsoft.com/office/drawing/2016/5/14/chartex" xmlns:mc="http://schemas.openxmlformats.org/markup-compatibility/2006" xmlns:aink="http://schemas.microsoft.com/office/drawing/2016/ink" xmlns:am3d="http://schemas.microsoft.com/office/drawing/2017/model3d" xmlns:o="urn:schemas-microsoft-com:office:office" xmlns:oel="http://schemas.microsoft.com/office/2019/extlst" xmlns:r="http://schemas.openxmlformats.org/officeDocument/2006/relationships" xmlns:m="http://schemas.openxmlformats.org/officeDocument/2006/math" xmlns:v="urn:schemas-microsoft-com:vml" xmlns:wp14="http://schemas.microsoft.com/office/word/2010/wordprocessingDrawing" xmlns:wp="http://schemas.openxmlformats.org/drawingml/2006/wordprocessingDrawing" xmlns:w10="urn:schemas-microsoft-com:office:word" xmlns:w="http://schemas.openxmlformats.org/wordprocessingml/2006/main" xmlns:w14="http://schemas.microsoft.com/office/word/2010/wordml" xmlns:w15="http://schemas.microsoft.com/office/word/2012/wordml" xmlns:w16cex="http://schemas.microsoft.com/office/word/2018/wordml/cex" xmlns:w16cid="http://schemas.microsoft.com/office/word/2016/wordml/cid" xmlns:w16="http://schemas.microsoft.com/office/word/2018/wordml" xmlns:w16du="http://schemas.microsoft.com/office/word/2023/wordml/word16du" xmlns:w16sdtdh="http://schemas.microsoft.com/office/word/2020/wordml/sdtdatahash" xmlns:w16sdtfl="http://schemas.microsoft.com/office/word/2024/wordml/sdtformatlock" xmlns:w16se="http://schemas.microsoft.com/office/word/2015/wordml/symex" xmlns:wpg="http://schemas.microsoft.com/office/word/2010/wordprocessingGroup" xmlns:wpi="http://schemas.microsoft.com/office/word/2010/wordprocessingInk" xmlns:wne="http://schemas.microsoft.com/office/word/2006/wordml" xmlns:wps="http://schemas.microsoft.com/office/word/2010/wordprocessingShape" mc:Ignorable="w14 w15 w16se w16cid w16 w16cex w16sdtdh w16sdtfl w16du wp14">
+<w:ftr xmlns:wpc="http://schemas.microsoft.com/office/word/2010/wordprocessingCanvas" xmlns:cx="http://schemas.microsoft.com/office/drawing/2014/chartex" xmlns:cx1="http://schemas.microsoft.com/office/drawing/2015/9/8/chartex" xmlns:cx2="http://schemas.microsoft.com/office/drawing/2015/10/21/chartex" xmlns:cx3="http://schemas.microsoft.com/office/drawing/2016/5/9/chartex" xmlns:cx4="http://schemas.microsoft.com/office/drawing/2016/5/10/chartex" xmlns:cx5="http://schemas.microsoft.com/office/drawing/2016/5/11/chartex" xmlns:cx6="http://schemas.microsoft.com/office/drawing/2016/5/12/chartex" xmlns:cx7="http://schemas.microsoft.com/office/drawing/2016/5/13/chartex" xmlns:cx8="http://schemas.microsoft.com/office/drawing/2016/5/14/chartex" xmlns:mc="http://schemas.openxmlformats.org/markup-compatibility/2006" xmlns:aink="http://schemas.microsoft.com/office/drawing/2016/ink" xmlns:am3d="http://schemas.microsoft.com/office/drawing/2017/model3d" xmlns:o="urn:schemas-microsoft-com:office:office" xmlns:r="http://schemas.openxmlformats.org/officeDocument/2006/relationships" xmlns:m="http://schemas.openxmlformats.org/officeDocument/2006/math" xmlns:v="urn:schemas-microsoft-com:vml" xmlns:wp14="http://schemas.microsoft.com/office/word/2010/wordprocessingDrawing" xmlns:wp="http://schemas.openxmlformats.org/drawingml/2006/wordprocessingDrawing" xmlns:w10="urn:schemas-microsoft-com:office:word" xmlns:w="http://schemas.openxmlformats.org/wordprocessingml/2006/main" xmlns:w14="http://schemas.microsoft.com/office/word/2010/wordml" xmlns:w15="http://schemas.microsoft.com/office/word/2012/wordml" xmlns:w16cex="http://schemas.microsoft.com/office/word/2018/wordml/cex" xmlns:w16cid="http://schemas.microsoft.com/office/word/2016/wordml/cid" xmlns:w16="http://schemas.microsoft.com/office/word/2018/wordml" xmlns:w16sdtdh="http://schemas.microsoft.com/office/word/2020/wordml/sdtdatahash" xmlns:w16se="http://schemas.microsoft.com/office/word/2015/wordml/symex" xmlns:wpg="http://schemas.microsoft.com/office/word/2010/wordprocessingGroup" xmlns:wpi="http://schemas.microsoft.com/office/word/2010/wordprocessingInk" xmlns:wne="http://schemas.microsoft.com/office/word/2006/wordml" xmlns:wps="http://schemas.microsoft.com/office/word/2010/wordprocessingShape" mc:Ignorable="w14 w15 w16se w16cid w16 w16cex w16sdtdh wp14">
   <w:sdt>
     <w:sdtPr>
       <w:id w:val="1747759635"/>
@@ -14163,6 +14054,7 @@
         <w:docPartUnique/>
       </w:docPartObj>
     </w:sdtPr>
+    <w:sdtEndPr/>
     <w:sdtContent>
       <w:p>
         <w:pPr>
@@ -14199,7 +14091,7 @@
 </file>
 
 <file path=word/footnotes.xml><?xml version="1.0" encoding="utf-8"?>
-<w:footnotes xmlns:wpc="http://schemas.microsoft.com/office/word/2010/wordprocessingCanvas" xmlns:cx="http://schemas.microsoft.com/office/drawing/2014/chartex" xmlns:cx1="http://schemas.microsoft.com/office/drawing/2015/9/8/chartex" xmlns:cx2="http://schemas.microsoft.com/office/drawing/2015/10/21/chartex" xmlns:cx3="http://schemas.microsoft.com/office/drawing/2016/5/9/chartex" xmlns:cx4="http://schemas.microsoft.com/office/drawing/2016/5/10/chartex" xmlns:cx5="http://schemas.microsoft.com/office/drawing/2016/5/11/chartex" xmlns:cx6="http://schemas.microsoft.com/office/drawing/2016/5/12/chartex" xmlns:cx7="http://schemas.microsoft.com/office/drawing/2016/5/13/chartex" xmlns:cx8="http://schemas.microsoft.com/office/drawing/2016/5/14/chartex" xmlns:mc="http://schemas.openxmlformats.org/markup-compatibility/2006" xmlns:aink="http://schemas.microsoft.com/office/drawing/2016/ink" xmlns:am3d="http://schemas.microsoft.com/office/drawing/2017/model3d" xmlns:o="urn:schemas-microsoft-com:office:office" xmlns:oel="http://schemas.microsoft.com/office/2019/extlst" xmlns:r="http://schemas.openxmlformats.org/officeDocument/2006/relationships" xmlns:m="http://schemas.openxmlformats.org/officeDocument/2006/math" xmlns:v="urn:schemas-microsoft-com:vml" xmlns:wp14="http://schemas.microsoft.com/office/word/2010/wordprocessingDrawing" xmlns:wp="http://schemas.openxmlformats.org/drawingml/2006/wordprocessingDrawing" xmlns:w10="urn:schemas-microsoft-com:office:word" xmlns:w="http://schemas.openxmlformats.org/wordprocessingml/2006/main" xmlns:w14="http://schemas.microsoft.com/office/word/2010/wordml" xmlns:w15="http://schemas.microsoft.com/office/word/2012/wordml" xmlns:w16cex="http://schemas.microsoft.com/office/word/2018/wordml/cex" xmlns:w16cid="http://schemas.microsoft.com/office/word/2016/wordml/cid" xmlns:w16="http://schemas.microsoft.com/office/word/2018/wordml" xmlns:w16du="http://schemas.microsoft.com/office/word/2023/wordml/word16du" xmlns:w16sdtdh="http://schemas.microsoft.com/office/word/2020/wordml/sdtdatahash" xmlns:w16sdtfl="http://schemas.microsoft.com/office/word/2024/wordml/sdtformatlock" xmlns:w16se="http://schemas.microsoft.com/office/word/2015/wordml/symex" xmlns:wpg="http://schemas.microsoft.com/office/word/2010/wordprocessingGroup" xmlns:wpi="http://schemas.microsoft.com/office/word/2010/wordprocessingInk" xmlns:wne="http://schemas.microsoft.com/office/word/2006/wordml" xmlns:wps="http://schemas.microsoft.com/office/word/2010/wordprocessingShape" mc:Ignorable="w14 w15 w16se w16cid w16 w16cex w16sdtdh w16sdtfl w16du wp14">
+<w:footnotes xmlns:wpc="http://schemas.microsoft.com/office/word/2010/wordprocessingCanvas" xmlns:cx="http://schemas.microsoft.com/office/drawing/2014/chartex" xmlns:cx1="http://schemas.microsoft.com/office/drawing/2015/9/8/chartex" xmlns:cx2="http://schemas.microsoft.com/office/drawing/2015/10/21/chartex" xmlns:cx3="http://schemas.microsoft.com/office/drawing/2016/5/9/chartex" xmlns:cx4="http://schemas.microsoft.com/office/drawing/2016/5/10/chartex" xmlns:cx5="http://schemas.microsoft.com/office/drawing/2016/5/11/chartex" xmlns:cx6="http://schemas.microsoft.com/office/drawing/2016/5/12/chartex" xmlns:cx7="http://schemas.microsoft.com/office/drawing/2016/5/13/chartex" xmlns:cx8="http://schemas.microsoft.com/office/drawing/2016/5/14/chartex" xmlns:mc="http://schemas.openxmlformats.org/markup-compatibility/2006" xmlns:aink="http://schemas.microsoft.com/office/drawing/2016/ink" xmlns:am3d="http://schemas.microsoft.com/office/drawing/2017/model3d" xmlns:o="urn:schemas-microsoft-com:office:office" xmlns:r="http://schemas.openxmlformats.org/officeDocument/2006/relationships" xmlns:m="http://schemas.openxmlformats.org/officeDocument/2006/math" xmlns:v="urn:schemas-microsoft-com:vml" xmlns:wp14="http://schemas.microsoft.com/office/word/2010/wordprocessingDrawing" xmlns:wp="http://schemas.openxmlformats.org/drawingml/2006/wordprocessingDrawing" xmlns:w10="urn:schemas-microsoft-com:office:word" xmlns:w="http://schemas.openxmlformats.org/wordprocessingml/2006/main" xmlns:w14="http://schemas.microsoft.com/office/word/2010/wordml" xmlns:w15="http://schemas.microsoft.com/office/word/2012/wordml" xmlns:w16cex="http://schemas.microsoft.com/office/word/2018/wordml/cex" xmlns:w16cid="http://schemas.microsoft.com/office/word/2016/wordml/cid" xmlns:w16="http://schemas.microsoft.com/office/word/2018/wordml" xmlns:w16sdtdh="http://schemas.microsoft.com/office/word/2020/wordml/sdtdatahash" xmlns:w16se="http://schemas.microsoft.com/office/word/2015/wordml/symex" xmlns:wpg="http://schemas.microsoft.com/office/word/2010/wordprocessingGroup" xmlns:wpi="http://schemas.microsoft.com/office/word/2010/wordprocessingInk" xmlns:wne="http://schemas.microsoft.com/office/word/2006/wordml" xmlns:wps="http://schemas.microsoft.com/office/word/2010/wordprocessingShape" mc:Ignorable="w14 w15 w16se w16cid w16 w16cex w16sdtdh wp14">
   <w:footnote w:type="separator" w:id="-1">
     <w:p>
       <w:pPr>
@@ -14224,7 +14116,7 @@
 </file>
 
 <file path=word/header1.xml><?xml version="1.0" encoding="utf-8"?>
-<w:hdr xmlns:wpc="http://schemas.microsoft.com/office/word/2010/wordprocessingCanvas" xmlns:cx="http://schemas.microsoft.com/office/drawing/2014/chartex" xmlns:cx1="http://schemas.microsoft.com/office/drawing/2015/9/8/chartex" xmlns:cx2="http://schemas.microsoft.com/office/drawing/2015/10/21/chartex" xmlns:cx3="http://schemas.microsoft.com/office/drawing/2016/5/9/chartex" xmlns:cx4="http://schemas.microsoft.com/office/drawing/2016/5/10/chartex" xmlns:cx5="http://schemas.microsoft.com/office/drawing/2016/5/11/chartex" xmlns:cx6="http://schemas.microsoft.com/office/drawing/2016/5/12/chartex" xmlns:cx7="http://schemas.microsoft.com/office/drawing/2016/5/13/chartex" xmlns:cx8="http://schemas.microsoft.com/office/drawing/2016/5/14/chartex" xmlns:mc="http://schemas.openxmlformats.org/markup-compatibility/2006" xmlns:aink="http://schemas.microsoft.com/office/drawing/2016/ink" xmlns:am3d="http://schemas.microsoft.com/office/drawing/2017/model3d" xmlns:o="urn:schemas-microsoft-com:office:office" xmlns:oel="http://schemas.microsoft.com/office/2019/extlst" xmlns:r="http://schemas.openxmlformats.org/officeDocument/2006/relationships" xmlns:m="http://schemas.openxmlformats.org/officeDocument/2006/math" xmlns:v="urn:schemas-microsoft-com:vml" xmlns:wp14="http://schemas.microsoft.com/office/word/2010/wordprocessingDrawing" xmlns:wp="http://schemas.openxmlformats.org/drawingml/2006/wordprocessingDrawing" xmlns:w10="urn:schemas-microsoft-com:office:word" xmlns:w="http://schemas.openxmlformats.org/wordprocessingml/2006/main" xmlns:w14="http://schemas.microsoft.com/office/word/2010/wordml" xmlns:w15="http://schemas.microsoft.com/office/word/2012/wordml" xmlns:w16cex="http://schemas.microsoft.com/office/word/2018/wordml/cex" xmlns:w16cid="http://schemas.microsoft.com/office/word/2016/wordml/cid" xmlns:w16="http://schemas.microsoft.com/office/word/2018/wordml" xmlns:w16du="http://schemas.microsoft.com/office/word/2023/wordml/word16du" xmlns:w16sdtdh="http://schemas.microsoft.com/office/word/2020/wordml/sdtdatahash" xmlns:w16sdtfl="http://schemas.microsoft.com/office/word/2024/wordml/sdtformatlock" xmlns:w16se="http://schemas.microsoft.com/office/word/2015/wordml/symex" xmlns:wpg="http://schemas.microsoft.com/office/word/2010/wordprocessingGroup" xmlns:wpi="http://schemas.microsoft.com/office/word/2010/wordprocessingInk" xmlns:wne="http://schemas.microsoft.com/office/word/2006/wordml" xmlns:wps="http://schemas.microsoft.com/office/word/2010/wordprocessingShape" mc:Ignorable="w14 w15 w16se w16cid w16 w16cex w16sdtdh w16sdtfl w16du wp14">
+<w:hdr xmlns:wpc="http://schemas.microsoft.com/office/word/2010/wordprocessingCanvas" xmlns:cx="http://schemas.microsoft.com/office/drawing/2014/chartex" xmlns:cx1="http://schemas.microsoft.com/office/drawing/2015/9/8/chartex" xmlns:cx2="http://schemas.microsoft.com/office/drawing/2015/10/21/chartex" xmlns:cx3="http://schemas.microsoft.com/office/drawing/2016/5/9/chartex" xmlns:cx4="http://schemas.microsoft.com/office/drawing/2016/5/10/chartex" xmlns:cx5="http://schemas.microsoft.com/office/drawing/2016/5/11/chartex" xmlns:cx6="http://schemas.microsoft.com/office/drawing/2016/5/12/chartex" xmlns:cx7="http://schemas.microsoft.com/office/drawing/2016/5/13/chartex" xmlns:cx8="http://schemas.microsoft.com/office/drawing/2016/5/14/chartex" xmlns:mc="http://schemas.openxmlformats.org/markup-compatibility/2006" xmlns:aink="http://schemas.microsoft.com/office/drawing/2016/ink" xmlns:am3d="http://schemas.microsoft.com/office/drawing/2017/model3d" xmlns:o="urn:schemas-microsoft-com:office:office" xmlns:r="http://schemas.openxmlformats.org/officeDocument/2006/relationships" xmlns:m="http://schemas.openxmlformats.org/officeDocument/2006/math" xmlns:v="urn:schemas-microsoft-com:vml" xmlns:wp14="http://schemas.microsoft.com/office/word/2010/wordprocessingDrawing" xmlns:wp="http://schemas.openxmlformats.org/drawingml/2006/wordprocessingDrawing" xmlns:w10="urn:schemas-microsoft-com:office:word" xmlns:w="http://schemas.openxmlformats.org/wordprocessingml/2006/main" xmlns:w14="http://schemas.microsoft.com/office/word/2010/wordml" xmlns:w15="http://schemas.microsoft.com/office/word/2012/wordml" xmlns:w16cex="http://schemas.microsoft.com/office/word/2018/wordml/cex" xmlns:w16cid="http://schemas.microsoft.com/office/word/2016/wordml/cid" xmlns:w16="http://schemas.microsoft.com/office/word/2018/wordml" xmlns:w16sdtdh="http://schemas.microsoft.com/office/word/2020/wordml/sdtdatahash" xmlns:w16se="http://schemas.microsoft.com/office/word/2015/wordml/symex" xmlns:wpg="http://schemas.microsoft.com/office/word/2010/wordprocessingGroup" xmlns:wpi="http://schemas.microsoft.com/office/word/2010/wordprocessingInk" xmlns:wne="http://schemas.microsoft.com/office/word/2006/wordml" xmlns:wps="http://schemas.microsoft.com/office/word/2010/wordprocessingShape" mc:Ignorable="w14 w15 w16se w16cid w16 w16cex w16sdtdh wp14">
   <w:p>
     <w:pPr>
       <w:pStyle w:val="Encabezado"/>
@@ -14255,7 +14147,7 @@
 </file>
 
 <file path=word/numbering.xml><?xml version="1.0" encoding="utf-8"?>
-<w:numbering xmlns:wpc="http://schemas.microsoft.com/office/word/2010/wordprocessingCanvas" xmlns:cx="http://schemas.microsoft.com/office/drawing/2014/chartex" xmlns:cx1="http://schemas.microsoft.com/office/drawing/2015/9/8/chartex" xmlns:cx2="http://schemas.microsoft.com/office/drawing/2015/10/21/chartex" xmlns:cx3="http://schemas.microsoft.com/office/drawing/2016/5/9/chartex" xmlns:cx4="http://schemas.microsoft.com/office/drawing/2016/5/10/chartex" xmlns:cx5="http://schemas.microsoft.com/office/drawing/2016/5/11/chartex" xmlns:cx6="http://schemas.microsoft.com/office/drawing/2016/5/12/chartex" xmlns:cx7="http://schemas.microsoft.com/office/drawing/2016/5/13/chartex" xmlns:cx8="http://schemas.microsoft.com/office/drawing/2016/5/14/chartex" xmlns:mc="http://schemas.openxmlformats.org/markup-compatibility/2006" xmlns:aink="http://schemas.microsoft.com/office/drawing/2016/ink" xmlns:am3d="http://schemas.microsoft.com/office/drawing/2017/model3d" xmlns:o="urn:schemas-microsoft-com:office:office" xmlns:oel="http://schemas.microsoft.com/office/2019/extlst" xmlns:r="http://schemas.openxmlformats.org/officeDocument/2006/relationships" xmlns:m="http://schemas.openxmlformats.org/officeDocument/2006/math" xmlns:v="urn:schemas-microsoft-com:vml" xmlns:wp14="http://schemas.microsoft.com/office/word/2010/wordprocessingDrawing" xmlns:wp="http://schemas.openxmlformats.org/drawingml/2006/wordprocessingDrawing" xmlns:w10="urn:schemas-microsoft-com:office:word" xmlns:w="http://schemas.openxmlformats.org/wordprocessingml/2006/main" xmlns:w14="http://schemas.microsoft.com/office/word/2010/wordml" xmlns:w15="http://schemas.microsoft.com/office/word/2012/wordml" xmlns:w16cex="http://schemas.microsoft.com/office/word/2018/wordml/cex" xmlns:w16cid="http://schemas.microsoft.com/office/word/2016/wordml/cid" xmlns:w16="http://schemas.microsoft.com/office/word/2018/wordml" xmlns:w16du="http://schemas.microsoft.com/office/word/2023/wordml/word16du" xmlns:w16sdtdh="http://schemas.microsoft.com/office/word/2020/wordml/sdtdatahash" xmlns:w16sdtfl="http://schemas.microsoft.com/office/word/2024/wordml/sdtformatlock" xmlns:w16se="http://schemas.microsoft.com/office/word/2015/wordml/symex" xmlns:wpg="http://schemas.microsoft.com/office/word/2010/wordprocessingGroup" xmlns:wpi="http://schemas.microsoft.com/office/word/2010/wordprocessingInk" xmlns:wne="http://schemas.microsoft.com/office/word/2006/wordml" xmlns:wps="http://schemas.microsoft.com/office/word/2010/wordprocessingShape" mc:Ignorable="w14 w15 w16se w16cid w16 w16cex w16sdtdh w16sdtfl w16du wp14">
+<w:numbering xmlns:wpc="http://schemas.microsoft.com/office/word/2010/wordprocessingCanvas" xmlns:cx="http://schemas.microsoft.com/office/drawing/2014/chartex" xmlns:cx1="http://schemas.microsoft.com/office/drawing/2015/9/8/chartex" xmlns:cx2="http://schemas.microsoft.com/office/drawing/2015/10/21/chartex" xmlns:cx3="http://schemas.microsoft.com/office/drawing/2016/5/9/chartex" xmlns:cx4="http://schemas.microsoft.com/office/drawing/2016/5/10/chartex" xmlns:cx5="http://schemas.microsoft.com/office/drawing/2016/5/11/chartex" xmlns:cx6="http://schemas.microsoft.com/office/drawing/2016/5/12/chartex" xmlns:cx7="http://schemas.microsoft.com/office/drawing/2016/5/13/chartex" xmlns:cx8="http://schemas.microsoft.com/office/drawing/2016/5/14/chartex" xmlns:mc="http://schemas.openxmlformats.org/markup-compatibility/2006" xmlns:aink="http://schemas.microsoft.com/office/drawing/2016/ink" xmlns:am3d="http://schemas.microsoft.com/office/drawing/2017/model3d" xmlns:o="urn:schemas-microsoft-com:office:office" xmlns:r="http://schemas.openxmlformats.org/officeDocument/2006/relationships" xmlns:m="http://schemas.openxmlformats.org/officeDocument/2006/math" xmlns:v="urn:schemas-microsoft-com:vml" xmlns:wp14="http://schemas.microsoft.com/office/word/2010/wordprocessingDrawing" xmlns:wp="http://schemas.openxmlformats.org/drawingml/2006/wordprocessingDrawing" xmlns:w10="urn:schemas-microsoft-com:office:word" xmlns:w="http://schemas.openxmlformats.org/wordprocessingml/2006/main" xmlns:w14="http://schemas.microsoft.com/office/word/2010/wordml" xmlns:w15="http://schemas.microsoft.com/office/word/2012/wordml" xmlns:w16cex="http://schemas.microsoft.com/office/word/2018/wordml/cex" xmlns:w16cid="http://schemas.microsoft.com/office/word/2016/wordml/cid" xmlns:w16="http://schemas.microsoft.com/office/word/2018/wordml" xmlns:w16sdtdh="http://schemas.microsoft.com/office/word/2020/wordml/sdtdatahash" xmlns:w16se="http://schemas.microsoft.com/office/word/2015/wordml/symex" xmlns:wpg="http://schemas.microsoft.com/office/word/2010/wordprocessingGroup" xmlns:wpi="http://schemas.microsoft.com/office/word/2010/wordprocessingInk" xmlns:wne="http://schemas.microsoft.com/office/word/2006/wordml" xmlns:wps="http://schemas.microsoft.com/office/word/2010/wordprocessingShape" mc:Ignorable="w14 w15 w16se w16cid w16 w16cex w16sdtdh wp14">
   <w:abstractNum w:abstractNumId="0" w15:restartNumberingAfterBreak="0">
     <w:nsid w:val="022E3F1B"/>
     <w:multiLevelType w:val="multilevel"/>
@@ -15820,80 +15712,80 @@
       </w:pPr>
     </w:lvl>
   </w:abstractNum>
-  <w:num w:numId="1" w16cid:durableId="862748417">
+  <w:num w:numId="1">
     <w:abstractNumId w:val="5"/>
   </w:num>
-  <w:num w:numId="2" w16cid:durableId="1336956605">
+  <w:num w:numId="2">
     <w:abstractNumId w:val="14"/>
   </w:num>
-  <w:num w:numId="3" w16cid:durableId="300234910">
+  <w:num w:numId="3">
     <w:abstractNumId w:val="9"/>
   </w:num>
-  <w:num w:numId="4" w16cid:durableId="1914967699">
+  <w:num w:numId="4">
     <w:abstractNumId w:val="6"/>
   </w:num>
-  <w:num w:numId="5" w16cid:durableId="181675058">
+  <w:num w:numId="5">
     <w:abstractNumId w:val="5"/>
   </w:num>
-  <w:num w:numId="6" w16cid:durableId="376703777">
+  <w:num w:numId="6">
     <w:abstractNumId w:val="1"/>
   </w:num>
-  <w:num w:numId="7" w16cid:durableId="548490970">
+  <w:num w:numId="7">
     <w:abstractNumId w:val="12"/>
   </w:num>
-  <w:num w:numId="8" w16cid:durableId="1876310628">
+  <w:num w:numId="8">
     <w:abstractNumId w:val="7"/>
   </w:num>
-  <w:num w:numId="9" w16cid:durableId="1448550281">
+  <w:num w:numId="9">
     <w:abstractNumId w:val="15"/>
   </w:num>
-  <w:num w:numId="10" w16cid:durableId="2091391086">
+  <w:num w:numId="10">
     <w:abstractNumId w:val="0"/>
   </w:num>
-  <w:num w:numId="11" w16cid:durableId="359280011">
+  <w:num w:numId="11">
     <w:abstractNumId w:val="13"/>
   </w:num>
-  <w:num w:numId="12" w16cid:durableId="1143549433">
+  <w:num w:numId="12">
     <w:abstractNumId w:val="16"/>
   </w:num>
-  <w:num w:numId="13" w16cid:durableId="1414204291">
+  <w:num w:numId="13">
     <w:abstractNumId w:val="2"/>
   </w:num>
-  <w:num w:numId="14" w16cid:durableId="512065040">
+  <w:num w:numId="14">
     <w:abstractNumId w:val="11"/>
   </w:num>
-  <w:num w:numId="15" w16cid:durableId="706640038">
+  <w:num w:numId="15">
     <w:abstractNumId w:val="2"/>
   </w:num>
-  <w:num w:numId="16" w16cid:durableId="2023046205">
+  <w:num w:numId="16">
     <w:abstractNumId w:val="2"/>
   </w:num>
-  <w:num w:numId="17" w16cid:durableId="1850607100">
+  <w:num w:numId="17">
     <w:abstractNumId w:val="2"/>
   </w:num>
-  <w:num w:numId="18" w16cid:durableId="1871382884">
+  <w:num w:numId="18">
     <w:abstractNumId w:val="4"/>
   </w:num>
-  <w:num w:numId="19" w16cid:durableId="781655983">
+  <w:num w:numId="19">
     <w:abstractNumId w:val="3"/>
   </w:num>
-  <w:num w:numId="20" w16cid:durableId="88819943">
+  <w:num w:numId="20">
     <w:abstractNumId w:val="10"/>
   </w:num>
-  <w:num w:numId="21" w16cid:durableId="1698895757">
+  <w:num w:numId="21">
     <w:abstractNumId w:val="10"/>
     <w:lvlOverride w:ilvl="0">
       <w:startOverride w:val="1"/>
     </w:lvlOverride>
   </w:num>
-  <w:num w:numId="22" w16cid:durableId="1399473855">
+  <w:num w:numId="22">
     <w:abstractNumId w:val="8"/>
   </w:num>
 </w:numbering>
 </file>
 
 <file path=word/styles.xml><?xml version="1.0" encoding="utf-8"?>
-<w:styles xmlns:mc="http://schemas.openxmlformats.org/markup-compatibility/2006" xmlns:r="http://schemas.openxmlformats.org/officeDocument/2006/relationships" xmlns:w="http://schemas.openxmlformats.org/wordprocessingml/2006/main" xmlns:w14="http://schemas.microsoft.com/office/word/2010/wordml" xmlns:w15="http://schemas.microsoft.com/office/word/2012/wordml" xmlns:w16cex="http://schemas.microsoft.com/office/word/2018/wordml/cex" xmlns:w16cid="http://schemas.microsoft.com/office/word/2016/wordml/cid" xmlns:w16="http://schemas.microsoft.com/office/word/2018/wordml" xmlns:w16du="http://schemas.microsoft.com/office/word/2023/wordml/word16du" xmlns:w16sdtdh="http://schemas.microsoft.com/office/word/2020/wordml/sdtdatahash" xmlns:w16sdtfl="http://schemas.microsoft.com/office/word/2024/wordml/sdtformatlock" xmlns:w16se="http://schemas.microsoft.com/office/word/2015/wordml/symex" mc:Ignorable="w14 w15 w16se w16cid w16 w16cex w16sdtdh w16sdtfl w16du">
+<w:styles xmlns:mc="http://schemas.openxmlformats.org/markup-compatibility/2006" xmlns:r="http://schemas.openxmlformats.org/officeDocument/2006/relationships" xmlns:w="http://schemas.openxmlformats.org/wordprocessingml/2006/main" xmlns:w14="http://schemas.microsoft.com/office/word/2010/wordml" xmlns:w15="http://schemas.microsoft.com/office/word/2012/wordml" xmlns:w16cex="http://schemas.microsoft.com/office/word/2018/wordml/cex" xmlns:w16cid="http://schemas.microsoft.com/office/word/2016/wordml/cid" xmlns:w16="http://schemas.microsoft.com/office/word/2018/wordml" xmlns:w16sdtdh="http://schemas.microsoft.com/office/word/2020/wordml/sdtdatahash" xmlns:w16se="http://schemas.microsoft.com/office/word/2015/wordml/symex" mc:Ignorable="w14 w15 w16se w16cid w16 w16cex w16sdtdh">
   <w:docDefaults>
     <w:rPrDefault>
       <w:rPr>
@@ -17550,7 +17442,7 @@
       <w:color w:val="000000" w:themeColor="text1"/>
     </w:rPr>
   </w:style>
-  <w:style w:type="character" w:styleId="Fuerte">
+  <w:style w:type="character" w:styleId="Textoennegrita">
     <w:name w:val="Strong"/>
     <w:basedOn w:val="Fuentedeprrafopredeter"/>
     <w:uiPriority w:val="22"/>
@@ -27714,7 +27606,7 @@
 </file>
 
 <file path=word/glossary/document.xml><?xml version="1.0" encoding="utf-8"?>
-<w:glossaryDocument xmlns:wpc="http://schemas.microsoft.com/office/word/2010/wordprocessingCanvas" xmlns:cx="http://schemas.microsoft.com/office/drawing/2014/chartex" xmlns:cx1="http://schemas.microsoft.com/office/drawing/2015/9/8/chartex" xmlns:cx2="http://schemas.microsoft.com/office/drawing/2015/10/21/chartex" xmlns:cx3="http://schemas.microsoft.com/office/drawing/2016/5/9/chartex" xmlns:cx4="http://schemas.microsoft.com/office/drawing/2016/5/10/chartex" xmlns:cx5="http://schemas.microsoft.com/office/drawing/2016/5/11/chartex" xmlns:cx6="http://schemas.microsoft.com/office/drawing/2016/5/12/chartex" xmlns:cx7="http://schemas.microsoft.com/office/drawing/2016/5/13/chartex" xmlns:cx8="http://schemas.microsoft.com/office/drawing/2016/5/14/chartex" xmlns:mc="http://schemas.openxmlformats.org/markup-compatibility/2006" xmlns:aink="http://schemas.microsoft.com/office/drawing/2016/ink" xmlns:am3d="http://schemas.microsoft.com/office/drawing/2017/model3d" xmlns:o="urn:schemas-microsoft-com:office:office" xmlns:oel="http://schemas.microsoft.com/office/2019/extlst" xmlns:r="http://schemas.openxmlformats.org/officeDocument/2006/relationships" xmlns:m="http://schemas.openxmlformats.org/officeDocument/2006/math" xmlns:v="urn:schemas-microsoft-com:vml" xmlns:wp14="http://schemas.microsoft.com/office/word/2010/wordprocessingDrawing" xmlns:wp="http://schemas.openxmlformats.org/drawingml/2006/wordprocessingDrawing" xmlns:w10="urn:schemas-microsoft-com:office:word" xmlns:w="http://schemas.openxmlformats.org/wordprocessingml/2006/main" xmlns:w14="http://schemas.microsoft.com/office/word/2010/wordml" xmlns:w15="http://schemas.microsoft.com/office/word/2012/wordml" xmlns:w16cex="http://schemas.microsoft.com/office/word/2018/wordml/cex" xmlns:w16cid="http://schemas.microsoft.com/office/word/2016/wordml/cid" xmlns:w16="http://schemas.microsoft.com/office/word/2018/wordml" xmlns:w16du="http://schemas.microsoft.com/office/word/2023/wordml/word16du" xmlns:w16sdtdh="http://schemas.microsoft.com/office/word/2020/wordml/sdtdatahash" xmlns:w16sdtfl="http://schemas.microsoft.com/office/word/2024/wordml/sdtformatlock" xmlns:w16se="http://schemas.microsoft.com/office/word/2015/wordml/symex" xmlns:wpg="http://schemas.microsoft.com/office/word/2010/wordprocessingGroup" xmlns:wpi="http://schemas.microsoft.com/office/word/2010/wordprocessingInk" xmlns:wne="http://schemas.microsoft.com/office/word/2006/wordml" xmlns:wps="http://schemas.microsoft.com/office/word/2010/wordprocessingShape" mc:Ignorable="w14 w15 w16se w16cid w16 w16cex w16sdtdh w16sdtfl w16du wp14">
+<w:glossaryDocument xmlns:wpc="http://schemas.microsoft.com/office/word/2010/wordprocessingCanvas" xmlns:cx="http://schemas.microsoft.com/office/drawing/2014/chartex" xmlns:cx1="http://schemas.microsoft.com/office/drawing/2015/9/8/chartex" xmlns:cx2="http://schemas.microsoft.com/office/drawing/2015/10/21/chartex" xmlns:cx3="http://schemas.microsoft.com/office/drawing/2016/5/9/chartex" xmlns:cx4="http://schemas.microsoft.com/office/drawing/2016/5/10/chartex" xmlns:cx5="http://schemas.microsoft.com/office/drawing/2016/5/11/chartex" xmlns:cx6="http://schemas.microsoft.com/office/drawing/2016/5/12/chartex" xmlns:cx7="http://schemas.microsoft.com/office/drawing/2016/5/13/chartex" xmlns:cx8="http://schemas.microsoft.com/office/drawing/2016/5/14/chartex" xmlns:mc="http://schemas.openxmlformats.org/markup-compatibility/2006" xmlns:aink="http://schemas.microsoft.com/office/drawing/2016/ink" xmlns:am3d="http://schemas.microsoft.com/office/drawing/2017/model3d" xmlns:o="urn:schemas-microsoft-com:office:office" xmlns:r="http://schemas.openxmlformats.org/officeDocument/2006/relationships" xmlns:m="http://schemas.openxmlformats.org/officeDocument/2006/math" xmlns:v="urn:schemas-microsoft-com:vml" xmlns:wp14="http://schemas.microsoft.com/office/word/2010/wordprocessingDrawing" xmlns:wp="http://schemas.openxmlformats.org/drawingml/2006/wordprocessingDrawing" xmlns:w10="urn:schemas-microsoft-com:office:word" xmlns:w="http://schemas.openxmlformats.org/wordprocessingml/2006/main" xmlns:w14="http://schemas.microsoft.com/office/word/2010/wordml" xmlns:w15="http://schemas.microsoft.com/office/word/2012/wordml" xmlns:w16cex="http://schemas.microsoft.com/office/word/2018/wordml/cex" xmlns:w16cid="http://schemas.microsoft.com/office/word/2016/wordml/cid" xmlns:w16="http://schemas.microsoft.com/office/word/2018/wordml" xmlns:w16sdtdh="http://schemas.microsoft.com/office/word/2020/wordml/sdtdatahash" xmlns:w16se="http://schemas.microsoft.com/office/word/2015/wordml/symex" xmlns:wpg="http://schemas.microsoft.com/office/word/2010/wordprocessingGroup" xmlns:wpi="http://schemas.microsoft.com/office/word/2010/wordprocessingInk" xmlns:wne="http://schemas.microsoft.com/office/word/2006/wordml" xmlns:wps="http://schemas.microsoft.com/office/word/2010/wordprocessingShape" mc:Ignorable="w14 w15 w16se w16cid w16 w16cex w16sdtdh wp14">
   <w:docParts>
     <w:docPart>
       <w:docPartPr>
@@ -27863,7 +27755,7 @@
 </file>
 
 <file path=word/glossary/fontTable.xml><?xml version="1.0" encoding="utf-8"?>
-<w:fonts xmlns:mc="http://schemas.openxmlformats.org/markup-compatibility/2006" xmlns:r="http://schemas.openxmlformats.org/officeDocument/2006/relationships" xmlns:w="http://schemas.openxmlformats.org/wordprocessingml/2006/main" xmlns:w14="http://schemas.microsoft.com/office/word/2010/wordml" xmlns:w15="http://schemas.microsoft.com/office/word/2012/wordml" xmlns:w16cex="http://schemas.microsoft.com/office/word/2018/wordml/cex" xmlns:w16cid="http://schemas.microsoft.com/office/word/2016/wordml/cid" xmlns:w16="http://schemas.microsoft.com/office/word/2018/wordml" xmlns:w16du="http://schemas.microsoft.com/office/word/2023/wordml/word16du" xmlns:w16sdtdh="http://schemas.microsoft.com/office/word/2020/wordml/sdtdatahash" xmlns:w16sdtfl="http://schemas.microsoft.com/office/word/2024/wordml/sdtformatlock" xmlns:w16se="http://schemas.microsoft.com/office/word/2015/wordml/symex" mc:Ignorable="w14 w15 w16se w16cid w16 w16cex w16sdtdh w16sdtfl w16du">
+<w:fonts xmlns:mc="http://schemas.openxmlformats.org/markup-compatibility/2006" xmlns:r="http://schemas.openxmlformats.org/officeDocument/2006/relationships" xmlns:w="http://schemas.openxmlformats.org/wordprocessingml/2006/main" xmlns:w14="http://schemas.microsoft.com/office/word/2010/wordml" xmlns:w15="http://schemas.microsoft.com/office/word/2012/wordml" xmlns:w16cex="http://schemas.microsoft.com/office/word/2018/wordml/cex" xmlns:w16cid="http://schemas.microsoft.com/office/word/2016/wordml/cid" xmlns:w16="http://schemas.microsoft.com/office/word/2018/wordml" xmlns:w16sdtdh="http://schemas.microsoft.com/office/word/2020/wordml/sdtdatahash" xmlns:w16se="http://schemas.microsoft.com/office/word/2015/wordml/symex" mc:Ignorable="w14 w15 w16se w16cid w16 w16cex w16sdtdh">
   <w:font w:name="Times New Roman">
     <w:panose1 w:val="02020603050405020304"/>
     <w:charset w:val="00"/>
@@ -27929,6 +27821,7 @@
     <w:sig w:usb0="E4002EFF" w:usb1="C000E47F" w:usb2="00000009" w:usb3="00000000" w:csb0="000001FF" w:csb1="00000000"/>
   </w:font>
   <w:font w:name="MS Mincho">
+    <w:altName w:val="ＭＳ 明朝"/>
     <w:panose1 w:val="02020609040205080304"/>
     <w:charset w:val="80"/>
     <w:family w:val="modern"/>
@@ -27941,12 +27834,6 @@
     <w:family w:val="modern"/>
     <w:pitch w:val="fixed"/>
     <w:sig w:usb0="00000003" w:usb1="00000000" w:usb2="00000000" w:usb3="00000000" w:csb0="00000001" w:csb1="00000000"/>
-  </w:font>
-  <w:font w:name="Aptos">
-    <w:charset w:val="00"/>
-    <w:family w:val="swiss"/>
-    <w:pitch w:val="variable"/>
-    <w:sig w:usb0="20000287" w:usb1="00000003" w:usb2="00000000" w:usb3="00000000" w:csb0="0000019F" w:csb1="00000000"/>
   </w:font>
   <w:font w:name="Yu Mincho">
     <w:charset w:val="80"/>
@@ -27962,17 +27849,11 @@
     <w:pitch w:val="variable"/>
     <w:sig w:usb0="E00002FF" w:usb1="2AC7FDFF" w:usb2="00000016" w:usb3="00000000" w:csb0="0002009F" w:csb1="00000000"/>
   </w:font>
-  <w:font w:name="Aptos Display">
-    <w:charset w:val="00"/>
-    <w:family w:val="swiss"/>
-    <w:pitch w:val="variable"/>
-    <w:sig w:usb0="20000287" w:usb1="00000003" w:usb2="00000000" w:usb3="00000000" w:csb0="0000019F" w:csb1="00000000"/>
-  </w:font>
 </w:fonts>
 </file>
 
 <file path=word/glossary/settings.xml><?xml version="1.0" encoding="utf-8"?>
-<w:settings xmlns:mc="http://schemas.openxmlformats.org/markup-compatibility/2006" xmlns:o="urn:schemas-microsoft-com:office:office" xmlns:r="http://schemas.openxmlformats.org/officeDocument/2006/relationships" xmlns:m="http://schemas.openxmlformats.org/officeDocument/2006/math" xmlns:v="urn:schemas-microsoft-com:vml" xmlns:w10="urn:schemas-microsoft-com:office:word" xmlns:w="http://schemas.openxmlformats.org/wordprocessingml/2006/main" xmlns:w14="http://schemas.microsoft.com/office/word/2010/wordml" xmlns:w15="http://schemas.microsoft.com/office/word/2012/wordml" xmlns:w16cex="http://schemas.microsoft.com/office/word/2018/wordml/cex" xmlns:w16cid="http://schemas.microsoft.com/office/word/2016/wordml/cid" xmlns:w16="http://schemas.microsoft.com/office/word/2018/wordml" xmlns:w16du="http://schemas.microsoft.com/office/word/2023/wordml/word16du" xmlns:w16sdtdh="http://schemas.microsoft.com/office/word/2020/wordml/sdtdatahash" xmlns:w16sdtfl="http://schemas.microsoft.com/office/word/2024/wordml/sdtformatlock" xmlns:w16se="http://schemas.microsoft.com/office/word/2015/wordml/symex" xmlns:sl="http://schemas.openxmlformats.org/schemaLibrary/2006/main" mc:Ignorable="w14 w15 w16se w16cid w16 w16cex w16sdtdh w16sdtfl w16du">
+<w:settings xmlns:mc="http://schemas.openxmlformats.org/markup-compatibility/2006" xmlns:o="urn:schemas-microsoft-com:office:office" xmlns:r="http://schemas.openxmlformats.org/officeDocument/2006/relationships" xmlns:m="http://schemas.openxmlformats.org/officeDocument/2006/math" xmlns:v="urn:schemas-microsoft-com:vml" xmlns:w10="urn:schemas-microsoft-com:office:word" xmlns:w="http://schemas.openxmlformats.org/wordprocessingml/2006/main" xmlns:w14="http://schemas.microsoft.com/office/word/2010/wordml" xmlns:w15="http://schemas.microsoft.com/office/word/2012/wordml" xmlns:w16cex="http://schemas.microsoft.com/office/word/2018/wordml/cex" xmlns:w16cid="http://schemas.microsoft.com/office/word/2016/wordml/cid" xmlns:w16="http://schemas.microsoft.com/office/word/2018/wordml" xmlns:w16sdtdh="http://schemas.microsoft.com/office/word/2020/wordml/sdtdatahash" xmlns:w16se="http://schemas.microsoft.com/office/word/2015/wordml/symex" xmlns:sl="http://schemas.openxmlformats.org/schemaLibrary/2006/main" mc:Ignorable="w14 w15 w16se w16cid w16 w16cex w16sdtdh">
   <w:view w:val="normal"/>
   <w:defaultTabStop w:val="708"/>
   <w:hyphenationZone w:val="425"/>
@@ -27992,6 +27873,7 @@
     <w:rsid w:val="000D7BC9"/>
     <w:rsid w:val="000E5E93"/>
     <w:rsid w:val="001615CA"/>
+    <w:rsid w:val="001D669B"/>
     <w:rsid w:val="00203D0D"/>
     <w:rsid w:val="004B1736"/>
     <w:rsid w:val="00521E53"/>
@@ -28044,14 +27926,14 @@
   </m:mathPr>
   <w:themeFontLang w:val="es-PE" w:eastAsia="ja-JP" w:bidi="ar-SA"/>
   <w:clrSchemeMapping w:bg1="light1" w:t1="dark1" w:bg2="light2" w:t2="dark2" w:accent1="accent1" w:accent2="accent2" w:accent3="accent3" w:accent4="accent4" w:accent5="accent5" w:accent6="accent6" w:hyperlink="hyperlink" w:followedHyperlink="followedHyperlink"/>
-  <w:decimalSymbol w:val=","/>
+  <w:decimalSymbol w:val="."/>
   <w:listSeparator w:val=";"/>
   <w15:chartTrackingRefBased/>
 </w:settings>
 </file>
 
 <file path=word/glossary/styles.xml><?xml version="1.0" encoding="utf-8"?>
-<w:styles xmlns:mc="http://schemas.openxmlformats.org/markup-compatibility/2006" xmlns:r="http://schemas.openxmlformats.org/officeDocument/2006/relationships" xmlns:w="http://schemas.openxmlformats.org/wordprocessingml/2006/main" xmlns:w14="http://schemas.microsoft.com/office/word/2010/wordml" xmlns:w15="http://schemas.microsoft.com/office/word/2012/wordml" xmlns:w16cex="http://schemas.microsoft.com/office/word/2018/wordml/cex" xmlns:w16cid="http://schemas.microsoft.com/office/word/2016/wordml/cid" xmlns:w16="http://schemas.microsoft.com/office/word/2018/wordml" xmlns:w16du="http://schemas.microsoft.com/office/word/2023/wordml/word16du" xmlns:w16sdtdh="http://schemas.microsoft.com/office/word/2020/wordml/sdtdatahash" xmlns:w16sdtfl="http://schemas.microsoft.com/office/word/2024/wordml/sdtformatlock" xmlns:w16se="http://schemas.microsoft.com/office/word/2015/wordml/symex" mc:Ignorable="w14 w15 w16se w16cid w16 w16cex w16sdtdh w16sdtfl w16du">
+<w:styles xmlns:mc="http://schemas.openxmlformats.org/markup-compatibility/2006" xmlns:r="http://schemas.openxmlformats.org/officeDocument/2006/relationships" xmlns:w="http://schemas.openxmlformats.org/wordprocessingml/2006/main" xmlns:w14="http://schemas.microsoft.com/office/word/2010/wordml" xmlns:w15="http://schemas.microsoft.com/office/word/2012/wordml" xmlns:w16cex="http://schemas.microsoft.com/office/word/2018/wordml/cex" xmlns:w16cid="http://schemas.microsoft.com/office/word/2016/wordml/cid" xmlns:w16="http://schemas.microsoft.com/office/word/2018/wordml" xmlns:w16sdtdh="http://schemas.microsoft.com/office/word/2020/wordml/sdtdatahash" xmlns:w16se="http://schemas.microsoft.com/office/word/2015/wordml/symex" mc:Ignorable="w14 w15 w16se w16cid w16 w16cex w16sdtdh">
   <w:docDefaults>
     <w:rPrDefault>
       <w:rPr>
@@ -28532,7 +28414,7 @@
 </file>
 
 <file path=word/glossary/webSettings.xml><?xml version="1.0" encoding="utf-8"?>
-<w:webSettings xmlns:mc="http://schemas.openxmlformats.org/markup-compatibility/2006" xmlns:r="http://schemas.openxmlformats.org/officeDocument/2006/relationships" xmlns:w="http://schemas.openxmlformats.org/wordprocessingml/2006/main" xmlns:w14="http://schemas.microsoft.com/office/word/2010/wordml" xmlns:w15="http://schemas.microsoft.com/office/word/2012/wordml" xmlns:w16cex="http://schemas.microsoft.com/office/word/2018/wordml/cex" xmlns:w16cid="http://schemas.microsoft.com/office/word/2016/wordml/cid" xmlns:w16="http://schemas.microsoft.com/office/word/2018/wordml" xmlns:w16du="http://schemas.microsoft.com/office/word/2023/wordml/word16du" xmlns:w16sdtdh="http://schemas.microsoft.com/office/word/2020/wordml/sdtdatahash" xmlns:w16sdtfl="http://schemas.microsoft.com/office/word/2024/wordml/sdtformatlock" xmlns:w16se="http://schemas.microsoft.com/office/word/2015/wordml/symex" mc:Ignorable="w14 w15 w16se w16cid w16 w16cex w16sdtdh w16sdtfl w16du">
+<w:webSettings xmlns:mc="http://schemas.openxmlformats.org/markup-compatibility/2006" xmlns:r="http://schemas.openxmlformats.org/officeDocument/2006/relationships" xmlns:w="http://schemas.openxmlformats.org/wordprocessingml/2006/main" xmlns:w14="http://schemas.microsoft.com/office/word/2010/wordml" xmlns:w15="http://schemas.microsoft.com/office/word/2012/wordml" xmlns:w16cex="http://schemas.microsoft.com/office/word/2018/wordml/cex" xmlns:w16cid="http://schemas.microsoft.com/office/word/2016/wordml/cid" xmlns:w16="http://schemas.microsoft.com/office/word/2018/wordml" xmlns:w16sdtdh="http://schemas.microsoft.com/office/word/2020/wordml/sdtdatahash" xmlns:w16se="http://schemas.microsoft.com/office/word/2015/wordml/symex" mc:Ignorable="w14 w15 w16se w16cid w16 w16cex w16sdtdh">
   <w:optimizeForBrowser/>
   <w:allowPNG/>
 </w:webSettings>
@@ -28825,6 +28707,19 @@
 </file>
 
 <file path=customXml/item1.xml><?xml version="1.0" encoding="utf-8"?>
+<?mso-contentType ?>
+<FormTemplates xmlns="http://schemas.microsoft.com/sharepoint/v3/contenttype/forms">
+  <Display>DocumentLibraryForm</Display>
+  <Edit>DocumentLibraryForm</Edit>
+  <New>DocumentLibraryForm</New>
+</FormTemplates>
+</file>
+
+<file path=customXml/item2.xml><?xml version="1.0" encoding="utf-8"?>
+<b:Sources xmlns:b="http://schemas.openxmlformats.org/officeDocument/2006/bibliography" xmlns="http://schemas.openxmlformats.org/officeDocument/2006/bibliography" SelectedStyle="\APASixthEditionOfficeOnline.xsl" StyleName="APA" Version="6"/>
+</file>
+
+<file path=customXml/item3.xml><?xml version="1.0" encoding="utf-8"?>
 <p:properties xmlns:p="http://schemas.microsoft.com/office/2006/metadata/properties" xmlns:xsi="http://www.w3.org/2001/XMLSchema-instance" xmlns:pc="http://schemas.microsoft.com/office/infopath/2007/PartnerControls">
   <documentManagement>
     <MigrationWizId xmlns="d46416e7-6d2c-4f4a-a0c5-4be57ee88241" xsi:nil="true"/>
@@ -28838,19 +28733,6 @@
     <TaxCatchAll xmlns="14756a95-b37b-4efb-8433-c7c61bd362cb" xsi:nil="true"/>
   </documentManagement>
 </p:properties>
-</file>
-
-<file path=customXml/item2.xml><?xml version="1.0" encoding="utf-8"?>
-<b:Sources xmlns:b="http://schemas.openxmlformats.org/officeDocument/2006/bibliography" xmlns="http://schemas.openxmlformats.org/officeDocument/2006/bibliography" SelectedStyle="\APASixthEditionOfficeOnline.xsl" StyleName="APA" Version="6"/>
-</file>
-
-<file path=customXml/item3.xml><?xml version="1.0" encoding="utf-8"?>
-<?mso-contentType ?>
-<FormTemplates xmlns="http://schemas.microsoft.com/sharepoint/v3/contenttype/forms">
-  <Display>DocumentLibraryForm</Display>
-  <Edit>DocumentLibraryForm</Edit>
-  <New>DocumentLibraryForm</New>
-</FormTemplates>
 </file>
 
 <file path=customXml/item4.xml><?xml version="1.0" encoding="utf-8"?>
@@ -29121,12 +29003,9 @@
 </file>
 
 <file path=customXml/itemProps1.xml><?xml version="1.0" encoding="utf-8"?>
-<ds:datastoreItem xmlns:ds="http://schemas.openxmlformats.org/officeDocument/2006/customXml" ds:itemID="{C8D5FA6B-9919-4CF7-992B-01E47542701B}">
+<ds:datastoreItem xmlns:ds="http://schemas.openxmlformats.org/officeDocument/2006/customXml" ds:itemID="{DD53D5E1-A9E6-4974-A55D-57904EA87C5E}">
   <ds:schemaRefs>
-    <ds:schemaRef ds:uri="http://schemas.microsoft.com/office/2006/metadata/properties"/>
-    <ds:schemaRef ds:uri="http://schemas.microsoft.com/office/infopath/2007/PartnerControls"/>
-    <ds:schemaRef ds:uri="d46416e7-6d2c-4f4a-a0c5-4be57ee88241"/>
-    <ds:schemaRef ds:uri="14756a95-b37b-4efb-8433-c7c61bd362cb"/>
+    <ds:schemaRef ds:uri="http://schemas.microsoft.com/sharepoint/v3/contenttype/forms"/>
   </ds:schemaRefs>
 </ds:datastoreItem>
 </file>
@@ -29140,9 +29019,12 @@
 </file>
 
 <file path=customXml/itemProps3.xml><?xml version="1.0" encoding="utf-8"?>
-<ds:datastoreItem xmlns:ds="http://schemas.openxmlformats.org/officeDocument/2006/customXml" ds:itemID="{DD53D5E1-A9E6-4974-A55D-57904EA87C5E}">
+<ds:datastoreItem xmlns:ds="http://schemas.openxmlformats.org/officeDocument/2006/customXml" ds:itemID="{C8D5FA6B-9919-4CF7-992B-01E47542701B}">
   <ds:schemaRefs>
-    <ds:schemaRef ds:uri="http://schemas.microsoft.com/sharepoint/v3/contenttype/forms"/>
+    <ds:schemaRef ds:uri="http://schemas.microsoft.com/office/2006/metadata/properties"/>
+    <ds:schemaRef ds:uri="http://schemas.microsoft.com/office/infopath/2007/PartnerControls"/>
+    <ds:schemaRef ds:uri="d46416e7-6d2c-4f4a-a0c5-4be57ee88241"/>
+    <ds:schemaRef ds:uri="14756a95-b37b-4efb-8433-c7c61bd362cb"/>
   </ds:schemaRefs>
 </ds:datastoreItem>
 </file>

</xml_diff>

<commit_message>
capitulo 2 formateado + indice
</commit_message>
<xml_diff>
--- a/Tesis_Final.docx
+++ b/Tesis_Final.docx
@@ -3531,14 +3531,13 @@
         </w:p>
         <w:p>
           <w:pPr>
-            <w:pStyle w:val="TDC1"/>
+            <w:pStyle w:val="TDC2"/>
             <w:tabs>
+              <w:tab w:val="left" w:pos="960"/>
               <w:tab w:val="right" w:leader="dot" w:pos="8777"/>
             </w:tabs>
             <w:rPr>
               <w:rFonts w:asciiTheme="minorHAnsi" w:eastAsiaTheme="minorEastAsia" w:hAnsiTheme="minorHAnsi" w:cstheme="minorBidi"/>
-              <w:b w:val="0"/>
-              <w:bCs w:val="0"/>
               <w:noProof/>
               <w:kern w:val="2"/>
               <w:szCs w:val="24"/>
@@ -3546,59 +3545,54 @@
               <w14:ligatures w14:val="standardContextual"/>
             </w:rPr>
           </w:pPr>
-          <w:hyperlink w:anchor="_Toc_Ch2_00" w:history="1">
+          <w:hyperlink w:anchor="_Toc_new_ch2_00" w:history="1">
             <w:r>
               <w:rPr>
                 <w:rStyle w:val="Hipervnculo"/>
                 <w:noProof/>
               </w:rPr>
-              <w:t>CAPÍTULO 2: MARCO TEÓRICO</w:t>
-            </w:r>
-            <w:r>
-              <w:rPr>
+              <w:t xml:space="preserve">CAPÍTULO 2: MARCO TEÓRICO</w:t>
+            </w:r>
+            <w:r>
+              <w:rPr>
+                <w:noProof/>
                 <w:webHidden/>
+              </w:rPr>
+              <w:tab/>
+            </w:r>
+            <w:r>
+              <w:rPr>
                 <w:noProof/>
-              </w:rPr>
-              <w:tab/>
-            </w:r>
-            <w:r>
-              <w:rPr>
                 <w:webHidden/>
+              </w:rPr>
+              <w:fldChar w:fldCharType="begin"/>
+            </w:r>
+            <w:r>
+              <w:rPr>
                 <w:noProof/>
-              </w:rPr>
-              <w:fldChar w:fldCharType="begin"/>
-            </w:r>
-            <w:r>
-              <w:rPr>
                 <w:webHidden/>
+              </w:rPr>
+              <w:instrText xml:space="preserve"> PAGEREF _Toc_new_ch2_00 \h </w:instrText>
+            </w:r>
+            <w:r/>
+            <w:r>
+              <w:rPr>
                 <w:noProof/>
-              </w:rPr>
-              <w:instrText xml:space="preserve"> PAGEREF _Toc_Ch2_00 \h </w:instrText>
-            </w:r>
-            <w:r>
-              <w:rPr>
                 <w:webHidden/>
+              </w:rPr>
+              <w:fldChar w:fldCharType="separate"/>
+            </w:r>
+            <w:r>
+              <w:rPr>
                 <w:noProof/>
-              </w:rPr>
-            </w:r>
-            <w:r>
-              <w:rPr>
                 <w:webHidden/>
+              </w:rPr>
+              <w:t xml:space="preserve">XX</w:t>
+            </w:r>
+            <w:r>
+              <w:rPr>
                 <w:noProof/>
-              </w:rPr>
-              <w:fldChar w:fldCharType="separate"/>
-            </w:r>
-            <w:r>
-              <w:rPr>
                 <w:webHidden/>
-                <w:noProof/>
-              </w:rPr>
-              <w:t>XX</w:t>
-            </w:r>
-            <w:r>
-              <w:rPr>
-                <w:webHidden/>
-                <w:noProof/>
               </w:rPr>
               <w:fldChar w:fldCharType="end"/>
             </w:r>
@@ -3620,13 +3614,13 @@
               <w14:ligatures w14:val="standardContextual"/>
             </w:rPr>
           </w:pPr>
-          <w:hyperlink w:anchor="_Toc_Ch2_01" w:history="1">
+          <w:hyperlink w:anchor="_Toc_new_ch2_01" w:history="1">
             <w:r>
               <w:rPr>
                 <w:rStyle w:val="Hipervnculo"/>
                 <w:noProof/>
               </w:rPr>
-              <w:t>2.1</w:t>
+              <w:t xml:space="preserve">2.1</w:t>
             </w:r>
             <w:r>
               <w:rPr>
@@ -3639,53 +3633,48 @@
                 <w:rStyle w:val="Hipervnculo"/>
                 <w:noProof/>
               </w:rPr>
-              <w:t>El Proceso de Producción Instruccional</w:t>
-            </w:r>
-            <w:r>
-              <w:rPr>
+              <w:t xml:space="preserve">Marco Conceptual</w:t>
+            </w:r>
+            <w:r>
+              <w:rPr>
+                <w:noProof/>
                 <w:webHidden/>
+              </w:rPr>
+              <w:tab/>
+            </w:r>
+            <w:r>
+              <w:rPr>
                 <w:noProof/>
-              </w:rPr>
-              <w:tab/>
-            </w:r>
-            <w:r>
-              <w:rPr>
                 <w:webHidden/>
+              </w:rPr>
+              <w:fldChar w:fldCharType="begin"/>
+            </w:r>
+            <w:r>
+              <w:rPr>
                 <w:noProof/>
-              </w:rPr>
-              <w:fldChar w:fldCharType="begin"/>
-            </w:r>
-            <w:r>
-              <w:rPr>
                 <w:webHidden/>
+              </w:rPr>
+              <w:instrText xml:space="preserve"> PAGEREF _Toc_new_ch2_01 \h </w:instrText>
+            </w:r>
+            <w:r/>
+            <w:r>
+              <w:rPr>
                 <w:noProof/>
-              </w:rPr>
-              <w:instrText xml:space="preserve"> PAGEREF _Toc_Ch2_01 \h </w:instrText>
-            </w:r>
-            <w:r>
-              <w:rPr>
                 <w:webHidden/>
+              </w:rPr>
+              <w:fldChar w:fldCharType="separate"/>
+            </w:r>
+            <w:r>
+              <w:rPr>
                 <w:noProof/>
-              </w:rPr>
-            </w:r>
-            <w:r>
-              <w:rPr>
                 <w:webHidden/>
+              </w:rPr>
+              <w:t xml:space="preserve">XX</w:t>
+            </w:r>
+            <w:r>
+              <w:rPr>
                 <w:noProof/>
-              </w:rPr>
-              <w:fldChar w:fldCharType="separate"/>
-            </w:r>
-            <w:r>
-              <w:rPr>
                 <w:webHidden/>
-                <w:noProof/>
-              </w:rPr>
-              <w:t>XX</w:t>
-            </w:r>
-            <w:r>
-              <w:rPr>
-                <w:webHidden/>
-                <w:noProof/>
               </w:rPr>
               <w:fldChar w:fldCharType="end"/>
             </w:r>
@@ -3708,19 +3697,17 @@
               <w14:ligatures w14:val="standardContextual"/>
             </w:rPr>
           </w:pPr>
-          <w:hyperlink w:anchor="_Toc_Ch2_02" w:history="1">
+          <w:hyperlink w:anchor="_Toc_new_ch2_02" w:history="1">
             <w:r>
               <w:rPr>
                 <w:rStyle w:val="Hipervnculo"/>
                 <w:noProof/>
-                <w:iCs w:val="0"/>
-              </w:rPr>
-              <w:t>2.1.1</w:t>
+              </w:rPr>
+              <w:t xml:space="preserve">2.1.1</w:t>
             </w:r>
             <w:r>
               <w:rPr>
                 <w:noProof/>
-                <w:iCs w:val="0"/>
               </w:rPr>
               <w:tab/>
             </w:r>
@@ -3728,142 +3715,49 @@
               <w:rPr>
                 <w:rStyle w:val="Hipervnculo"/>
                 <w:noProof/>
-                <w:iCs w:val="0"/>
-              </w:rPr>
-              <w:t>Documentos de entrada y artefactos del proceso</w:t>
-            </w:r>
-            <w:r>
-              <w:rPr>
+              </w:rPr>
+              <w:t xml:space="preserve">Agentes de IA</w:t>
+            </w:r>
+            <w:r>
+              <w:rPr>
+                <w:noProof/>
                 <w:webHidden/>
+              </w:rPr>
+              <w:tab/>
+            </w:r>
+            <w:r>
+              <w:rPr>
                 <w:noProof/>
-              </w:rPr>
-              <w:tab/>
-            </w:r>
-            <w:r>
-              <w:rPr>
                 <w:webHidden/>
+              </w:rPr>
+              <w:fldChar w:fldCharType="begin"/>
+            </w:r>
+            <w:r>
+              <w:rPr>
                 <w:noProof/>
-              </w:rPr>
-              <w:fldChar w:fldCharType="begin"/>
-            </w:r>
-            <w:r>
-              <w:rPr>
                 <w:webHidden/>
+              </w:rPr>
+              <w:instrText xml:space="preserve"> PAGEREF _Toc_new_ch2_02 \h </w:instrText>
+            </w:r>
+            <w:r/>
+            <w:r>
+              <w:rPr>
                 <w:noProof/>
-              </w:rPr>
-              <w:instrText xml:space="preserve"> PAGEREF _Toc_Ch2_02 \h </w:instrText>
-            </w:r>
-            <w:r>
-              <w:rPr>
                 <w:webHidden/>
+              </w:rPr>
+              <w:fldChar w:fldCharType="separate"/>
+            </w:r>
+            <w:r>
+              <w:rPr>
                 <w:noProof/>
-              </w:rPr>
-            </w:r>
-            <w:r>
-              <w:rPr>
                 <w:webHidden/>
+              </w:rPr>
+              <w:t xml:space="preserve">XX</w:t>
+            </w:r>
+            <w:r>
+              <w:rPr>
                 <w:noProof/>
-              </w:rPr>
-              <w:fldChar w:fldCharType="separate"/>
-            </w:r>
-            <w:r>
-              <w:rPr>
                 <w:webHidden/>
-                <w:noProof/>
-              </w:rPr>
-              <w:t>XX</w:t>
-            </w:r>
-            <w:r>
-              <w:rPr>
-                <w:webHidden/>
-                <w:noProof/>
-              </w:rPr>
-              <w:fldChar w:fldCharType="end"/>
-            </w:r>
-          </w:hyperlink>
-        </w:p>
-        <w:p>
-          <w:pPr>
-            <w:pStyle w:val="TDC2"/>
-            <w:tabs>
-              <w:tab w:val="left" w:pos="960"/>
-              <w:tab w:val="right" w:leader="dot" w:pos="8777"/>
-            </w:tabs>
-            <w:rPr>
-              <w:rFonts w:asciiTheme="minorHAnsi" w:eastAsiaTheme="minorEastAsia" w:hAnsiTheme="minorHAnsi" w:cstheme="minorBidi"/>
-              <w:noProof/>
-              <w:kern w:val="2"/>
-              <w:szCs w:val="24"/>
-              <w:lang w:val="es-PE" w:eastAsia="es-PE"/>
-              <w14:ligatures w14:val="standardContextual"/>
-            </w:rPr>
-          </w:pPr>
-          <w:hyperlink w:anchor="_Toc_Ch2_03" w:history="1">
-            <w:r>
-              <w:rPr>
-                <w:rStyle w:val="Hipervnculo"/>
-                <w:noProof/>
-              </w:rPr>
-              <w:t>2.2</w:t>
-            </w:r>
-            <w:r>
-              <w:rPr>
-                <w:noProof/>
-              </w:rPr>
-              <w:tab/>
-            </w:r>
-            <w:r>
-              <w:rPr>
-                <w:rStyle w:val="Hipervnculo"/>
-                <w:noProof/>
-              </w:rPr>
-              <w:t>Fundamentos Pedagógicos</w:t>
-            </w:r>
-            <w:r>
-              <w:rPr>
-                <w:webHidden/>
-                <w:noProof/>
-              </w:rPr>
-              <w:tab/>
-            </w:r>
-            <w:r>
-              <w:rPr>
-                <w:webHidden/>
-                <w:noProof/>
-              </w:rPr>
-              <w:fldChar w:fldCharType="begin"/>
-            </w:r>
-            <w:r>
-              <w:rPr>
-                <w:webHidden/>
-                <w:noProof/>
-              </w:rPr>
-              <w:instrText xml:space="preserve"> PAGEREF _Toc_Ch2_03 \h </w:instrText>
-            </w:r>
-            <w:r>
-              <w:rPr>
-                <w:webHidden/>
-                <w:noProof/>
-              </w:rPr>
-            </w:r>
-            <w:r>
-              <w:rPr>
-                <w:webHidden/>
-                <w:noProof/>
-              </w:rPr>
-              <w:fldChar w:fldCharType="separate"/>
-            </w:r>
-            <w:r>
-              <w:rPr>
-                <w:webHidden/>
-                <w:noProof/>
-              </w:rPr>
-              <w:t>XX</w:t>
-            </w:r>
-            <w:r>
-              <w:rPr>
-                <w:webHidden/>
-                <w:noProof/>
               </w:rPr>
               <w:fldChar w:fldCharType="end"/>
             </w:r>
@@ -3886,19 +3780,17 @@
               <w14:ligatures w14:val="standardContextual"/>
             </w:rPr>
           </w:pPr>
-          <w:hyperlink w:anchor="_Toc_Ch2_04" w:history="1">
+          <w:hyperlink w:anchor="_Toc_new_ch2_03" w:history="1">
             <w:r>
               <w:rPr>
                 <w:rStyle w:val="Hipervnculo"/>
                 <w:noProof/>
-                <w:iCs w:val="0"/>
-              </w:rPr>
-              <w:t>2.2.1</w:t>
+              </w:rPr>
+              <w:t xml:space="preserve">2.1.2</w:t>
             </w:r>
             <w:r>
               <w:rPr>
                 <w:noProof/>
-                <w:iCs w:val="0"/>
               </w:rPr>
               <w:tab/>
             </w:r>
@@ -3906,142 +3798,49 @@
               <w:rPr>
                 <w:rStyle w:val="Hipervnculo"/>
                 <w:noProof/>
-                <w:iCs w:val="0"/>
-              </w:rPr>
-              <w:t>Taxonomía de Bloom</w:t>
-            </w:r>
-            <w:r>
-              <w:rPr>
+              </w:rPr>
+              <w:t xml:space="preserve">Prompt Engineering</w:t>
+            </w:r>
+            <w:r>
+              <w:rPr>
+                <w:noProof/>
                 <w:webHidden/>
+              </w:rPr>
+              <w:tab/>
+            </w:r>
+            <w:r>
+              <w:rPr>
                 <w:noProof/>
-              </w:rPr>
-              <w:tab/>
-            </w:r>
-            <w:r>
-              <w:rPr>
                 <w:webHidden/>
+              </w:rPr>
+              <w:fldChar w:fldCharType="begin"/>
+            </w:r>
+            <w:r>
+              <w:rPr>
                 <w:noProof/>
-              </w:rPr>
-              <w:fldChar w:fldCharType="begin"/>
-            </w:r>
-            <w:r>
-              <w:rPr>
                 <w:webHidden/>
+              </w:rPr>
+              <w:instrText xml:space="preserve"> PAGEREF _Toc_new_ch2_03 \h </w:instrText>
+            </w:r>
+            <w:r/>
+            <w:r>
+              <w:rPr>
                 <w:noProof/>
-              </w:rPr>
-              <w:instrText xml:space="preserve"> PAGEREF _Toc_Ch2_04 \h </w:instrText>
-            </w:r>
-            <w:r>
-              <w:rPr>
                 <w:webHidden/>
+              </w:rPr>
+              <w:fldChar w:fldCharType="separate"/>
+            </w:r>
+            <w:r>
+              <w:rPr>
                 <w:noProof/>
-              </w:rPr>
-            </w:r>
-            <w:r>
-              <w:rPr>
                 <w:webHidden/>
+              </w:rPr>
+              <w:t xml:space="preserve">XX</w:t>
+            </w:r>
+            <w:r>
+              <w:rPr>
                 <w:noProof/>
-              </w:rPr>
-              <w:fldChar w:fldCharType="separate"/>
-            </w:r>
-            <w:r>
-              <w:rPr>
                 <w:webHidden/>
-                <w:noProof/>
-              </w:rPr>
-              <w:t>XX</w:t>
-            </w:r>
-            <w:r>
-              <w:rPr>
-                <w:webHidden/>
-                <w:noProof/>
-              </w:rPr>
-              <w:fldChar w:fldCharType="end"/>
-            </w:r>
-          </w:hyperlink>
-        </w:p>
-        <w:p>
-          <w:pPr>
-            <w:pStyle w:val="TDC2"/>
-            <w:tabs>
-              <w:tab w:val="left" w:pos="960"/>
-              <w:tab w:val="right" w:leader="dot" w:pos="8777"/>
-            </w:tabs>
-            <w:rPr>
-              <w:rFonts w:asciiTheme="minorHAnsi" w:eastAsiaTheme="minorEastAsia" w:hAnsiTheme="minorHAnsi" w:cstheme="minorBidi"/>
-              <w:noProof/>
-              <w:kern w:val="2"/>
-              <w:szCs w:val="24"/>
-              <w:lang w:val="es-PE" w:eastAsia="es-PE"/>
-              <w14:ligatures w14:val="standardContextual"/>
-            </w:rPr>
-          </w:pPr>
-          <w:hyperlink w:anchor="_Toc_Ch2_05" w:history="1">
-            <w:r>
-              <w:rPr>
-                <w:rStyle w:val="Hipervnculo"/>
-                <w:noProof/>
-              </w:rPr>
-              <w:t>2.3</w:t>
-            </w:r>
-            <w:r>
-              <w:rPr>
-                <w:noProof/>
-              </w:rPr>
-              <w:tab/>
-            </w:r>
-            <w:r>
-              <w:rPr>
-                <w:rStyle w:val="Hipervnculo"/>
-                <w:noProof/>
-              </w:rPr>
-              <w:t>Fundamentos Técnicos</w:t>
-            </w:r>
-            <w:r>
-              <w:rPr>
-                <w:webHidden/>
-                <w:noProof/>
-              </w:rPr>
-              <w:tab/>
-            </w:r>
-            <w:r>
-              <w:rPr>
-                <w:webHidden/>
-                <w:noProof/>
-              </w:rPr>
-              <w:fldChar w:fldCharType="begin"/>
-            </w:r>
-            <w:r>
-              <w:rPr>
-                <w:webHidden/>
-                <w:noProof/>
-              </w:rPr>
-              <w:instrText xml:space="preserve"> PAGEREF _Toc_Ch2_05 \h </w:instrText>
-            </w:r>
-            <w:r>
-              <w:rPr>
-                <w:webHidden/>
-                <w:noProof/>
-              </w:rPr>
-            </w:r>
-            <w:r>
-              <w:rPr>
-                <w:webHidden/>
-                <w:noProof/>
-              </w:rPr>
-              <w:fldChar w:fldCharType="separate"/>
-            </w:r>
-            <w:r>
-              <w:rPr>
-                <w:webHidden/>
-                <w:noProof/>
-              </w:rPr>
-              <w:t>XX</w:t>
-            </w:r>
-            <w:r>
-              <w:rPr>
-                <w:webHidden/>
-                <w:noProof/>
               </w:rPr>
               <w:fldChar w:fldCharType="end"/>
             </w:r>
@@ -4064,19 +3863,17 @@
               <w14:ligatures w14:val="standardContextual"/>
             </w:rPr>
           </w:pPr>
-          <w:hyperlink w:anchor="_Toc_Ch2_06" w:history="1">
+          <w:hyperlink w:anchor="_Toc_new_ch2_04" w:history="1">
             <w:r>
               <w:rPr>
                 <w:rStyle w:val="Hipervnculo"/>
                 <w:noProof/>
-                <w:iCs w:val="0"/>
-              </w:rPr>
-              <w:t>2.3.1</w:t>
+              </w:rPr>
+              <w:t xml:space="preserve">2.1.3</w:t>
             </w:r>
             <w:r>
               <w:rPr>
                 <w:noProof/>
-                <w:iCs w:val="0"/>
               </w:rPr>
               <w:tab/>
             </w:r>
@@ -4084,55 +3881,49 @@
               <w:rPr>
                 <w:rStyle w:val="Hipervnculo"/>
                 <w:noProof/>
-                <w:iCs w:val="0"/>
-              </w:rPr>
-              <w:t>Agentes de IA</w:t>
-            </w:r>
-            <w:r>
-              <w:rPr>
+              </w:rPr>
+              <w:t xml:space="preserve">Structured Outputs (Salidas Estructuradas)</w:t>
+            </w:r>
+            <w:r>
+              <w:rPr>
+                <w:noProof/>
                 <w:webHidden/>
+              </w:rPr>
+              <w:tab/>
+            </w:r>
+            <w:r>
+              <w:rPr>
                 <w:noProof/>
-              </w:rPr>
-              <w:tab/>
-            </w:r>
-            <w:r>
-              <w:rPr>
                 <w:webHidden/>
+              </w:rPr>
+              <w:fldChar w:fldCharType="begin"/>
+            </w:r>
+            <w:r>
+              <w:rPr>
                 <w:noProof/>
-              </w:rPr>
-              <w:fldChar w:fldCharType="begin"/>
-            </w:r>
-            <w:r>
-              <w:rPr>
                 <w:webHidden/>
+              </w:rPr>
+              <w:instrText xml:space="preserve"> PAGEREF _Toc_new_ch2_04 \h </w:instrText>
+            </w:r>
+            <w:r/>
+            <w:r>
+              <w:rPr>
                 <w:noProof/>
-              </w:rPr>
-              <w:instrText xml:space="preserve"> PAGEREF _Toc_Ch2_06 \h </w:instrText>
-            </w:r>
-            <w:r>
-              <w:rPr>
                 <w:webHidden/>
+              </w:rPr>
+              <w:fldChar w:fldCharType="separate"/>
+            </w:r>
+            <w:r>
+              <w:rPr>
                 <w:noProof/>
-              </w:rPr>
-            </w:r>
-            <w:r>
-              <w:rPr>
                 <w:webHidden/>
+              </w:rPr>
+              <w:t xml:space="preserve">XX</w:t>
+            </w:r>
+            <w:r>
+              <w:rPr>
                 <w:noProof/>
-              </w:rPr>
-              <w:fldChar w:fldCharType="separate"/>
-            </w:r>
-            <w:r>
-              <w:rPr>
                 <w:webHidden/>
-                <w:noProof/>
-              </w:rPr>
-              <w:t>XX</w:t>
-            </w:r>
-            <w:r>
-              <w:rPr>
-                <w:webHidden/>
-                <w:noProof/>
               </w:rPr>
               <w:fldChar w:fldCharType="end"/>
             </w:r>
@@ -4155,19 +3946,17 @@
               <w14:ligatures w14:val="standardContextual"/>
             </w:rPr>
           </w:pPr>
-          <w:hyperlink w:anchor="_Toc_Ch2_07" w:history="1">
+          <w:hyperlink w:anchor="_Toc_new_ch2_05" w:history="1">
             <w:r>
               <w:rPr>
                 <w:rStyle w:val="Hipervnculo"/>
                 <w:noProof/>
-                <w:iCs w:val="0"/>
-              </w:rPr>
-              <w:t>2.3.2</w:t>
+              </w:rPr>
+              <w:t xml:space="preserve">2.1.4</w:t>
             </w:r>
             <w:r>
               <w:rPr>
                 <w:noProof/>
-                <w:iCs w:val="0"/>
               </w:rPr>
               <w:tab/>
             </w:r>
@@ -4175,142 +3964,49 @@
               <w:rPr>
                 <w:rStyle w:val="Hipervnculo"/>
                 <w:noProof/>
-                <w:iCs w:val="0"/>
-              </w:rPr>
-              <w:t>Infraestructura Backend</w:t>
-            </w:r>
-            <w:r>
-              <w:rPr>
+              </w:rPr>
+              <w:t xml:space="preserve">Sistemas Multi-Agente</w:t>
+            </w:r>
+            <w:r>
+              <w:rPr>
+                <w:noProof/>
                 <w:webHidden/>
+              </w:rPr>
+              <w:tab/>
+            </w:r>
+            <w:r>
+              <w:rPr>
                 <w:noProof/>
-              </w:rPr>
-              <w:tab/>
-            </w:r>
-            <w:r>
-              <w:rPr>
                 <w:webHidden/>
+              </w:rPr>
+              <w:fldChar w:fldCharType="begin"/>
+            </w:r>
+            <w:r>
+              <w:rPr>
                 <w:noProof/>
-              </w:rPr>
-              <w:fldChar w:fldCharType="begin"/>
-            </w:r>
-            <w:r>
-              <w:rPr>
                 <w:webHidden/>
+              </w:rPr>
+              <w:instrText xml:space="preserve"> PAGEREF _Toc_new_ch2_05 \h </w:instrText>
+            </w:r>
+            <w:r/>
+            <w:r>
+              <w:rPr>
                 <w:noProof/>
-              </w:rPr>
-              <w:instrText xml:space="preserve"> PAGEREF _Toc_Ch2_07 \h </w:instrText>
-            </w:r>
-            <w:r>
-              <w:rPr>
                 <w:webHidden/>
+              </w:rPr>
+              <w:fldChar w:fldCharType="separate"/>
+            </w:r>
+            <w:r>
+              <w:rPr>
                 <w:noProof/>
-              </w:rPr>
-            </w:r>
-            <w:r>
-              <w:rPr>
                 <w:webHidden/>
+              </w:rPr>
+              <w:t xml:space="preserve">XX</w:t>
+            </w:r>
+            <w:r>
+              <w:rPr>
                 <w:noProof/>
-              </w:rPr>
-              <w:fldChar w:fldCharType="separate"/>
-            </w:r>
-            <w:r>
-              <w:rPr>
                 <w:webHidden/>
-                <w:noProof/>
-              </w:rPr>
-              <w:t>XX</w:t>
-            </w:r>
-            <w:r>
-              <w:rPr>
-                <w:webHidden/>
-                <w:noProof/>
-              </w:rPr>
-              <w:fldChar w:fldCharType="end"/>
-            </w:r>
-          </w:hyperlink>
-        </w:p>
-        <w:p>
-          <w:pPr>
-            <w:pStyle w:val="TDC2"/>
-            <w:tabs>
-              <w:tab w:val="left" w:pos="960"/>
-              <w:tab w:val="right" w:leader="dot" w:pos="8777"/>
-            </w:tabs>
-            <w:rPr>
-              <w:rFonts w:asciiTheme="minorHAnsi" w:eastAsiaTheme="minorEastAsia" w:hAnsiTheme="minorHAnsi" w:cstheme="minorBidi"/>
-              <w:noProof/>
-              <w:kern w:val="2"/>
-              <w:szCs w:val="24"/>
-              <w:lang w:val="es-PE" w:eastAsia="es-PE"/>
-              <w14:ligatures w14:val="standardContextual"/>
-            </w:rPr>
-          </w:pPr>
-          <w:hyperlink w:anchor="_Toc_Ch2_08" w:history="1">
-            <w:r>
-              <w:rPr>
-                <w:rStyle w:val="Hipervnculo"/>
-                <w:noProof/>
-              </w:rPr>
-              <w:t>2.4</w:t>
-            </w:r>
-            <w:r>
-              <w:rPr>
-                <w:noProof/>
-              </w:rPr>
-              <w:tab/>
-            </w:r>
-            <w:r>
-              <w:rPr>
-                <w:rStyle w:val="Hipervnculo"/>
-                <w:noProof/>
-              </w:rPr>
-              <w:t>Metodología de Desarrollo</w:t>
-            </w:r>
-            <w:r>
-              <w:rPr>
-                <w:webHidden/>
-                <w:noProof/>
-              </w:rPr>
-              <w:tab/>
-            </w:r>
-            <w:r>
-              <w:rPr>
-                <w:webHidden/>
-                <w:noProof/>
-              </w:rPr>
-              <w:fldChar w:fldCharType="begin"/>
-            </w:r>
-            <w:r>
-              <w:rPr>
-                <w:webHidden/>
-                <w:noProof/>
-              </w:rPr>
-              <w:instrText xml:space="preserve"> PAGEREF _Toc_Ch2_08 \h </w:instrText>
-            </w:r>
-            <w:r>
-              <w:rPr>
-                <w:webHidden/>
-                <w:noProof/>
-              </w:rPr>
-            </w:r>
-            <w:r>
-              <w:rPr>
-                <w:webHidden/>
-                <w:noProof/>
-              </w:rPr>
-              <w:fldChar w:fldCharType="separate"/>
-            </w:r>
-            <w:r>
-              <w:rPr>
-                <w:webHidden/>
-                <w:noProof/>
-              </w:rPr>
-              <w:t>XX</w:t>
-            </w:r>
-            <w:r>
-              <w:rPr>
-                <w:webHidden/>
-                <w:noProof/>
               </w:rPr>
               <w:fldChar w:fldCharType="end"/>
             </w:r>
@@ -4333,19 +4029,17 @@
               <w14:ligatures w14:val="standardContextual"/>
             </w:rPr>
           </w:pPr>
-          <w:hyperlink w:anchor="_Toc_Ch2_09" w:history="1">
+          <w:hyperlink w:anchor="_Toc_new_ch2_06" w:history="1">
             <w:r>
               <w:rPr>
                 <w:rStyle w:val="Hipervnculo"/>
                 <w:noProof/>
-                <w:iCs w:val="0"/>
-              </w:rPr>
-              <w:t>2.4.1</w:t>
+              </w:rPr>
+              <w:t xml:space="preserve">2.1.5</w:t>
             </w:r>
             <w:r>
               <w:rPr>
                 <w:noProof/>
-                <w:iCs w:val="0"/>
               </w:rPr>
               <w:tab/>
             </w:r>
@@ -4353,55 +4047,630 @@
               <w:rPr>
                 <w:rStyle w:val="Hipervnculo"/>
                 <w:noProof/>
-                <w:iCs w:val="0"/>
-              </w:rPr>
-              <w:t>SCRUM en equipos multidisciplinarios</w:t>
-            </w:r>
-            <w:r>
-              <w:rPr>
+              </w:rPr>
+              <w:t xml:space="preserve">Nodos y Grafos de Estado</w:t>
+            </w:r>
+            <w:r>
+              <w:rPr>
+                <w:noProof/>
                 <w:webHidden/>
+              </w:rPr>
+              <w:tab/>
+            </w:r>
+            <w:r>
+              <w:rPr>
                 <w:noProof/>
+                <w:webHidden/>
+              </w:rPr>
+              <w:fldChar w:fldCharType="begin"/>
+            </w:r>
+            <w:r>
+              <w:rPr>
+                <w:noProof/>
+                <w:webHidden/>
+              </w:rPr>
+              <w:instrText xml:space="preserve"> PAGEREF _Toc_new_ch2_06 \h </w:instrText>
+            </w:r>
+            <w:r/>
+            <w:r>
+              <w:rPr>
+                <w:noProof/>
+                <w:webHidden/>
+              </w:rPr>
+              <w:fldChar w:fldCharType="separate"/>
+            </w:r>
+            <w:r>
+              <w:rPr>
+                <w:noProof/>
+                <w:webHidden/>
+              </w:rPr>
+              <w:t xml:space="preserve">XX</w:t>
+            </w:r>
+            <w:r>
+              <w:rPr>
+                <w:noProof/>
+                <w:webHidden/>
+              </w:rPr>
+              <w:fldChar w:fldCharType="end"/>
+            </w:r>
+          </w:hyperlink>
+        </w:p>
+        <w:p>
+          <w:pPr>
+            <w:pStyle w:val="TDC3"/>
+            <w:tabs>
+              <w:tab w:val="left" w:pos="1440"/>
+              <w:tab w:val="right" w:leader="dot" w:pos="8777"/>
+            </w:tabs>
+            <w:rPr>
+              <w:rFonts w:asciiTheme="minorHAnsi" w:eastAsiaTheme="minorEastAsia" w:hAnsiTheme="minorHAnsi" w:cstheme="minorBidi"/>
+              <w:iCs w:val="0"/>
+              <w:noProof/>
+              <w:kern w:val="2"/>
+              <w:szCs w:val="24"/>
+              <w:lang w:val="es-PE" w:eastAsia="es-PE"/>
+              <w14:ligatures w14:val="standardContextual"/>
+            </w:rPr>
+          </w:pPr>
+          <w:hyperlink w:anchor="_Toc_new_ch2_07" w:history="1">
+            <w:r>
+              <w:rPr>
+                <w:rStyle w:val="Hipervnculo"/>
+                <w:noProof/>
+              </w:rPr>
+              <w:t xml:space="preserve">2.1.6</w:t>
+            </w:r>
+            <w:r>
+              <w:rPr>
+                <w:noProof/>
               </w:rPr>
               <w:tab/>
             </w:r>
             <w:r>
               <w:rPr>
+                <w:rStyle w:val="Hipervnculo"/>
+                <w:noProof/>
+              </w:rPr>
+              <w:t xml:space="preserve">Agent Framework: LangChain y LangGraph</w:t>
+            </w:r>
+            <w:r>
+              <w:rPr>
+                <w:noProof/>
                 <w:webHidden/>
+              </w:rPr>
+              <w:tab/>
+            </w:r>
+            <w:r>
+              <w:rPr>
                 <w:noProof/>
+                <w:webHidden/>
               </w:rPr>
               <w:fldChar w:fldCharType="begin"/>
             </w:r>
             <w:r>
               <w:rPr>
+                <w:noProof/>
                 <w:webHidden/>
+              </w:rPr>
+              <w:instrText xml:space="preserve"> PAGEREF _Toc_new_ch2_07 \h </w:instrText>
+            </w:r>
+            <w:r/>
+            <w:r>
+              <w:rPr>
                 <w:noProof/>
-              </w:rPr>
-              <w:instrText xml:space="preserve"> PAGEREF _Toc_Ch2_09 \h </w:instrText>
-            </w:r>
-            <w:r>
-              <w:rPr>
                 <w:webHidden/>
+              </w:rPr>
+              <w:fldChar w:fldCharType="separate"/>
+            </w:r>
+            <w:r>
+              <w:rPr>
                 <w:noProof/>
-              </w:rPr>
-            </w:r>
-            <w:r>
-              <w:rPr>
                 <w:webHidden/>
+              </w:rPr>
+              <w:t xml:space="preserve">XX</w:t>
+            </w:r>
+            <w:r>
+              <w:rPr>
                 <w:noProof/>
+                <w:webHidden/>
+              </w:rPr>
+              <w:fldChar w:fldCharType="end"/>
+            </w:r>
+          </w:hyperlink>
+        </w:p>
+        <w:p>
+          <w:pPr>
+            <w:pStyle w:val="TDC3"/>
+            <w:tabs>
+              <w:tab w:val="left" w:pos="1440"/>
+              <w:tab w:val="right" w:leader="dot" w:pos="8777"/>
+            </w:tabs>
+            <w:rPr>
+              <w:rFonts w:asciiTheme="minorHAnsi" w:eastAsiaTheme="minorEastAsia" w:hAnsiTheme="minorHAnsi" w:cstheme="minorBidi"/>
+              <w:iCs w:val="0"/>
+              <w:noProof/>
+              <w:kern w:val="2"/>
+              <w:szCs w:val="24"/>
+              <w:lang w:val="es-PE" w:eastAsia="es-PE"/>
+              <w14:ligatures w14:val="standardContextual"/>
+            </w:rPr>
+          </w:pPr>
+          <w:hyperlink w:anchor="_Toc_new_ch2_08" w:history="1">
+            <w:r>
+              <w:rPr>
+                <w:rStyle w:val="Hipervnculo"/>
+                <w:noProof/>
+              </w:rPr>
+              <w:t xml:space="preserve">2.1.7</w:t>
+            </w:r>
+            <w:r>
+              <w:rPr>
+                <w:noProof/>
+              </w:rPr>
+              <w:tab/>
+            </w:r>
+            <w:r>
+              <w:rPr>
+                <w:rStyle w:val="Hipervnculo"/>
+                <w:noProof/>
+              </w:rPr>
+              <w:t xml:space="preserve">Python como ecosistema de desarrollo de IA</w:t>
+            </w:r>
+            <w:r>
+              <w:rPr>
+                <w:noProof/>
+                <w:webHidden/>
+              </w:rPr>
+              <w:tab/>
+            </w:r>
+            <w:r>
+              <w:rPr>
+                <w:noProof/>
+                <w:webHidden/>
+              </w:rPr>
+              <w:fldChar w:fldCharType="begin"/>
+            </w:r>
+            <w:r>
+              <w:rPr>
+                <w:noProof/>
+                <w:webHidden/>
+              </w:rPr>
+              <w:instrText xml:space="preserve"> PAGEREF _Toc_new_ch2_08 \h </w:instrText>
+            </w:r>
+            <w:r/>
+            <w:r>
+              <w:rPr>
+                <w:noProof/>
+                <w:webHidden/>
               </w:rPr>
               <w:fldChar w:fldCharType="separate"/>
             </w:r>
             <w:r>
               <w:rPr>
+                <w:noProof/>
                 <w:webHidden/>
+              </w:rPr>
+              <w:t xml:space="preserve">XX</w:t>
+            </w:r>
+            <w:r>
+              <w:rPr>
                 <w:noProof/>
-              </w:rPr>
-              <w:t>XX</w:t>
-            </w:r>
-            <w:r>
-              <w:rPr>
                 <w:webHidden/>
+              </w:rPr>
+              <w:fldChar w:fldCharType="end"/>
+            </w:r>
+          </w:hyperlink>
+        </w:p>
+        <w:p>
+          <w:pPr>
+            <w:pStyle w:val="TDC3"/>
+            <w:tabs>
+              <w:tab w:val="left" w:pos="1440"/>
+              <w:tab w:val="right" w:leader="dot" w:pos="8777"/>
+            </w:tabs>
+            <w:rPr>
+              <w:rFonts w:asciiTheme="minorHAnsi" w:eastAsiaTheme="minorEastAsia" w:hAnsiTheme="minorHAnsi" w:cstheme="minorBidi"/>
+              <w:iCs w:val="0"/>
+              <w:noProof/>
+              <w:kern w:val="2"/>
+              <w:szCs w:val="24"/>
+              <w:lang w:val="es-PE" w:eastAsia="es-PE"/>
+              <w14:ligatures w14:val="standardContextual"/>
+            </w:rPr>
+          </w:pPr>
+          <w:hyperlink w:anchor="_Toc_new_ch2_09" w:history="1">
+            <w:r>
+              <w:rPr>
+                <w:rStyle w:val="Hipervnculo"/>
                 <w:noProof/>
+              </w:rPr>
+              <w:t xml:space="preserve">2.1.8</w:t>
+            </w:r>
+            <w:r>
+              <w:rPr>
+                <w:noProof/>
+              </w:rPr>
+              <w:tab/>
+            </w:r>
+            <w:r>
+              <w:rPr>
+                <w:rStyle w:val="Hipervnculo"/>
+                <w:noProof/>
+              </w:rPr>
+              <w:t xml:space="preserve">Infraestructura Backend</w:t>
+            </w:r>
+            <w:r>
+              <w:rPr>
+                <w:noProof/>
+                <w:webHidden/>
+              </w:rPr>
+              <w:tab/>
+            </w:r>
+            <w:r>
+              <w:rPr>
+                <w:noProof/>
+                <w:webHidden/>
+              </w:rPr>
+              <w:fldChar w:fldCharType="begin"/>
+            </w:r>
+            <w:r>
+              <w:rPr>
+                <w:noProof/>
+                <w:webHidden/>
+              </w:rPr>
+              <w:instrText xml:space="preserve"> PAGEREF _Toc_new_ch2_09 \h </w:instrText>
+            </w:r>
+            <w:r/>
+            <w:r>
+              <w:rPr>
+                <w:noProof/>
+                <w:webHidden/>
+              </w:rPr>
+              <w:fldChar w:fldCharType="separate"/>
+            </w:r>
+            <w:r>
+              <w:rPr>
+                <w:noProof/>
+                <w:webHidden/>
+              </w:rPr>
+              <w:t xml:space="preserve">XX</w:t>
+            </w:r>
+            <w:r>
+              <w:rPr>
+                <w:noProof/>
+                <w:webHidden/>
+              </w:rPr>
+              <w:fldChar w:fldCharType="end"/>
+            </w:r>
+          </w:hyperlink>
+        </w:p>
+        <w:p>
+          <w:pPr>
+            <w:pStyle w:val="TDC3"/>
+            <w:tabs>
+              <w:tab w:val="left" w:pos="1440"/>
+              <w:tab w:val="right" w:leader="dot" w:pos="8777"/>
+            </w:tabs>
+            <w:rPr>
+              <w:rFonts w:asciiTheme="minorHAnsi" w:eastAsiaTheme="minorEastAsia" w:hAnsiTheme="minorHAnsi" w:cstheme="minorBidi"/>
+              <w:iCs w:val="0"/>
+              <w:noProof/>
+              <w:kern w:val="2"/>
+              <w:szCs w:val="24"/>
+              <w:lang w:val="es-PE" w:eastAsia="es-PE"/>
+              <w14:ligatures w14:val="standardContextual"/>
+            </w:rPr>
+          </w:pPr>
+          <w:hyperlink w:anchor="_Toc_new_ch2_10" w:history="1">
+            <w:r>
+              <w:rPr>
+                <w:rStyle w:val="Hipervnculo"/>
+                <w:noProof/>
+              </w:rPr>
+              <w:t xml:space="preserve">2.1.9</w:t>
+            </w:r>
+            <w:r>
+              <w:rPr>
+                <w:noProof/>
+              </w:rPr>
+              <w:tab/>
+            </w:r>
+            <w:r>
+              <w:rPr>
+                <w:rStyle w:val="Hipervnculo"/>
+                <w:noProof/>
+              </w:rPr>
+              <w:t xml:space="preserve">Backend</w:t>
+            </w:r>
+            <w:r>
+              <w:rPr>
+                <w:noProof/>
+                <w:webHidden/>
+              </w:rPr>
+              <w:tab/>
+            </w:r>
+            <w:r>
+              <w:rPr>
+                <w:noProof/>
+                <w:webHidden/>
+              </w:rPr>
+              <w:fldChar w:fldCharType="begin"/>
+            </w:r>
+            <w:r>
+              <w:rPr>
+                <w:noProof/>
+                <w:webHidden/>
+              </w:rPr>
+              <w:instrText xml:space="preserve"> PAGEREF _Toc_new_ch2_10 \h </w:instrText>
+            </w:r>
+            <w:r/>
+            <w:r>
+              <w:rPr>
+                <w:noProof/>
+                <w:webHidden/>
+              </w:rPr>
+              <w:fldChar w:fldCharType="separate"/>
+            </w:r>
+            <w:r>
+              <w:rPr>
+                <w:noProof/>
+                <w:webHidden/>
+              </w:rPr>
+              <w:t xml:space="preserve">XX</w:t>
+            </w:r>
+            <w:r>
+              <w:rPr>
+                <w:noProof/>
+                <w:webHidden/>
+              </w:rPr>
+              <w:fldChar w:fldCharType="end"/>
+            </w:r>
+          </w:hyperlink>
+        </w:p>
+        <w:p>
+          <w:pPr>
+            <w:pStyle w:val="TDC3"/>
+            <w:tabs>
+              <w:tab w:val="left" w:pos="1440"/>
+              <w:tab w:val="right" w:leader="dot" w:pos="8777"/>
+            </w:tabs>
+            <w:rPr>
+              <w:rFonts w:asciiTheme="minorHAnsi" w:eastAsiaTheme="minorEastAsia" w:hAnsiTheme="minorHAnsi" w:cstheme="minorBidi"/>
+              <w:iCs w:val="0"/>
+              <w:noProof/>
+              <w:kern w:val="2"/>
+              <w:szCs w:val="24"/>
+              <w:lang w:val="es-PE" w:eastAsia="es-PE"/>
+              <w14:ligatures w14:val="standardContextual"/>
+            </w:rPr>
+          </w:pPr>
+          <w:hyperlink w:anchor="_Toc_new_ch2_11" w:history="1">
+            <w:r>
+              <w:rPr>
+                <w:rStyle w:val="Hipervnculo"/>
+                <w:noProof/>
+              </w:rPr>
+              <w:t xml:space="preserve">2.1.10</w:t>
+            </w:r>
+            <w:r>
+              <w:rPr>
+                <w:noProof/>
+              </w:rPr>
+              <w:tab/>
+            </w:r>
+            <w:r>
+              <w:rPr>
+                <w:rStyle w:val="Hipervnculo"/>
+                <w:noProof/>
+              </w:rPr>
+              <w:t xml:space="preserve">Arquitectura del Sistema</w:t>
+            </w:r>
+            <w:r>
+              <w:rPr>
+                <w:noProof/>
+                <w:webHidden/>
+              </w:rPr>
+              <w:tab/>
+            </w:r>
+            <w:r>
+              <w:rPr>
+                <w:noProof/>
+                <w:webHidden/>
+              </w:rPr>
+              <w:fldChar w:fldCharType="begin"/>
+            </w:r>
+            <w:r>
+              <w:rPr>
+                <w:noProof/>
+                <w:webHidden/>
+              </w:rPr>
+              <w:instrText xml:space="preserve"> PAGEREF _Toc_new_ch2_11 \h </w:instrText>
+            </w:r>
+            <w:r/>
+            <w:r>
+              <w:rPr>
+                <w:noProof/>
+                <w:webHidden/>
+              </w:rPr>
+              <w:fldChar w:fldCharType="separate"/>
+            </w:r>
+            <w:r>
+              <w:rPr>
+                <w:noProof/>
+                <w:webHidden/>
+              </w:rPr>
+              <w:t xml:space="preserve">XX</w:t>
+            </w:r>
+            <w:r>
+              <w:rPr>
+                <w:noProof/>
+                <w:webHidden/>
+              </w:rPr>
+              <w:fldChar w:fldCharType="end"/>
+            </w:r>
+          </w:hyperlink>
+        </w:p>
+        <w:p>
+          <w:pPr>
+            <w:pStyle w:val="TDC3"/>
+            <w:tabs>
+              <w:tab w:val="left" w:pos="1440"/>
+              <w:tab w:val="right" w:leader="dot" w:pos="8777"/>
+            </w:tabs>
+            <w:rPr>
+              <w:rFonts w:asciiTheme="minorHAnsi" w:eastAsiaTheme="minorEastAsia" w:hAnsiTheme="minorHAnsi" w:cstheme="minorBidi"/>
+              <w:iCs w:val="0"/>
+              <w:noProof/>
+              <w:kern w:val="2"/>
+              <w:szCs w:val="24"/>
+              <w:lang w:val="es-PE" w:eastAsia="es-PE"/>
+              <w14:ligatures w14:val="standardContextual"/>
+            </w:rPr>
+          </w:pPr>
+          <w:hyperlink w:anchor="_Toc_new_ch2_12" w:history="1">
+            <w:r>
+              <w:rPr>
+                <w:rStyle w:val="Hipervnculo"/>
+                <w:noProof/>
+              </w:rPr>
+              <w:t xml:space="preserve">2.1.11</w:t>
+            </w:r>
+            <w:r>
+              <w:rPr>
+                <w:noProof/>
+              </w:rPr>
+              <w:tab/>
+            </w:r>
+            <w:r>
+              <w:rPr>
+                <w:rStyle w:val="Hipervnculo"/>
+                <w:noProof/>
+              </w:rPr>
+              <w:t xml:space="preserve">Procesamiento Asíncrono</w:t>
+            </w:r>
+            <w:r>
+              <w:rPr>
+                <w:noProof/>
+                <w:webHidden/>
+              </w:rPr>
+              <w:tab/>
+            </w:r>
+            <w:r>
+              <w:rPr>
+                <w:noProof/>
+                <w:webHidden/>
+              </w:rPr>
+              <w:fldChar w:fldCharType="begin"/>
+            </w:r>
+            <w:r>
+              <w:rPr>
+                <w:noProof/>
+                <w:webHidden/>
+              </w:rPr>
+              <w:instrText xml:space="preserve"> PAGEREF _Toc_new_ch2_12 \h </w:instrText>
+            </w:r>
+            <w:r/>
+            <w:r>
+              <w:rPr>
+                <w:noProof/>
+                <w:webHidden/>
+              </w:rPr>
+              <w:fldChar w:fldCharType="separate"/>
+            </w:r>
+            <w:r>
+              <w:rPr>
+                <w:noProof/>
+                <w:webHidden/>
+              </w:rPr>
+              <w:t xml:space="preserve">XX</w:t>
+            </w:r>
+            <w:r>
+              <w:rPr>
+                <w:noProof/>
+                <w:webHidden/>
+              </w:rPr>
+              <w:fldChar w:fldCharType="end"/>
+            </w:r>
+          </w:hyperlink>
+        </w:p>
+        <w:p>
+          <w:pPr>
+            <w:pStyle w:val="TDC3"/>
+            <w:tabs>
+              <w:tab w:val="left" w:pos="1440"/>
+              <w:tab w:val="right" w:leader="dot" w:pos="8777"/>
+            </w:tabs>
+            <w:rPr>
+              <w:rFonts w:asciiTheme="minorHAnsi" w:eastAsiaTheme="minorEastAsia" w:hAnsiTheme="minorHAnsi" w:cstheme="minorBidi"/>
+              <w:iCs w:val="0"/>
+              <w:noProof/>
+              <w:kern w:val="2"/>
+              <w:szCs w:val="24"/>
+              <w:lang w:val="es-PE" w:eastAsia="es-PE"/>
+              <w14:ligatures w14:val="standardContextual"/>
+            </w:rPr>
+          </w:pPr>
+          <w:hyperlink w:anchor="_Toc_new_ch2_13" w:history="1">
+            <w:r>
+              <w:rPr>
+                <w:rStyle w:val="Hipervnculo"/>
+                <w:noProof/>
+              </w:rPr>
+              <w:t xml:space="preserve">2.1.12</w:t>
+            </w:r>
+            <w:r>
+              <w:rPr>
+                <w:noProof/>
+              </w:rPr>
+              <w:tab/>
+            </w:r>
+            <w:r>
+              <w:rPr>
+                <w:rStyle w:val="Hipervnculo"/>
+                <w:noProof/>
+              </w:rPr>
+              <w:t xml:space="preserve">Amazon Web Services (AWS)</w:t>
+            </w:r>
+            <w:r>
+              <w:rPr>
+                <w:noProof/>
+                <w:webHidden/>
+              </w:rPr>
+              <w:tab/>
+            </w:r>
+            <w:r>
+              <w:rPr>
+                <w:noProof/>
+                <w:webHidden/>
+              </w:rPr>
+              <w:fldChar w:fldCharType="begin"/>
+            </w:r>
+            <w:r>
+              <w:rPr>
+                <w:noProof/>
+                <w:webHidden/>
+              </w:rPr>
+              <w:instrText xml:space="preserve"> PAGEREF _Toc_new_ch2_13 \h </w:instrText>
+            </w:r>
+            <w:r/>
+            <w:r>
+              <w:rPr>
+                <w:noProof/>
+                <w:webHidden/>
+              </w:rPr>
+              <w:fldChar w:fldCharType="separate"/>
+            </w:r>
+            <w:r>
+              <w:rPr>
+                <w:noProof/>
+                <w:webHidden/>
+              </w:rPr>
+              <w:t xml:space="preserve">XX</w:t>
+            </w:r>
+            <w:r>
+              <w:rPr>
+                <w:noProof/>
+                <w:webHidden/>
               </w:rPr>
               <w:fldChar w:fldCharType="end"/>
             </w:r>
@@ -4423,59 +4692,467 @@
               <w14:ligatures w14:val="standardContextual"/>
             </w:rPr>
           </w:pPr>
-          <w:hyperlink w:anchor="_Toc_Ch2_10" w:history="1">
+          <w:hyperlink w:anchor="_Toc_new_ch2_14" w:history="1">
             <w:r>
               <w:rPr>
                 <w:rStyle w:val="Hipervnculo"/>
                 <w:noProof/>
               </w:rPr>
-              <w:t>Referencias del Capítulo</w:t>
-            </w:r>
-            <w:r>
-              <w:rPr>
+              <w:t xml:space="preserve">2.2</w:t>
+            </w:r>
+            <w:r>
+              <w:rPr>
+                <w:noProof/>
+              </w:rPr>
+              <w:tab/>
+            </w:r>
+            <w:r>
+              <w:rPr>
+                <w:rStyle w:val="Hipervnculo"/>
+                <w:noProof/>
+              </w:rPr>
+              <w:t xml:space="preserve">Estándares, Frameworks y Buenas Prácticas</w:t>
+            </w:r>
+            <w:r>
+              <w:rPr>
+                <w:noProof/>
                 <w:webHidden/>
+              </w:rPr>
+              <w:tab/>
+            </w:r>
+            <w:r>
+              <w:rPr>
                 <w:noProof/>
+                <w:webHidden/>
+              </w:rPr>
+              <w:fldChar w:fldCharType="begin"/>
+            </w:r>
+            <w:r>
+              <w:rPr>
+                <w:noProof/>
+                <w:webHidden/>
+              </w:rPr>
+              <w:instrText xml:space="preserve"> PAGEREF _Toc_new_ch2_14 \h </w:instrText>
+            </w:r>
+            <w:r/>
+            <w:r>
+              <w:rPr>
+                <w:noProof/>
+                <w:webHidden/>
+              </w:rPr>
+              <w:fldChar w:fldCharType="separate"/>
+            </w:r>
+            <w:r>
+              <w:rPr>
+                <w:noProof/>
+                <w:webHidden/>
+              </w:rPr>
+              <w:t xml:space="preserve">XX</w:t>
+            </w:r>
+            <w:r>
+              <w:rPr>
+                <w:noProof/>
+                <w:webHidden/>
+              </w:rPr>
+              <w:fldChar w:fldCharType="end"/>
+            </w:r>
+          </w:hyperlink>
+        </w:p>
+        <w:p>
+          <w:pPr>
+            <w:pStyle w:val="TDC3"/>
+            <w:tabs>
+              <w:tab w:val="left" w:pos="1440"/>
+              <w:tab w:val="right" w:leader="dot" w:pos="8777"/>
+            </w:tabs>
+            <w:rPr>
+              <w:rFonts w:asciiTheme="minorHAnsi" w:eastAsiaTheme="minorEastAsia" w:hAnsiTheme="minorHAnsi" w:cstheme="minorBidi"/>
+              <w:iCs w:val="0"/>
+              <w:noProof/>
+              <w:kern w:val="2"/>
+              <w:szCs w:val="24"/>
+              <w:lang w:val="es-PE" w:eastAsia="es-PE"/>
+              <w14:ligatures w14:val="standardContextual"/>
+            </w:rPr>
+          </w:pPr>
+          <w:hyperlink w:anchor="_Toc_new_ch2_15" w:history="1">
+            <w:r>
+              <w:rPr>
+                <w:rStyle w:val="Hipervnculo"/>
+                <w:noProof/>
+              </w:rPr>
+              <w:t xml:space="preserve">2.2.1</w:t>
+            </w:r>
+            <w:r>
+              <w:rPr>
+                <w:noProof/>
               </w:rPr>
               <w:tab/>
             </w:r>
             <w:r>
               <w:rPr>
+                <w:rStyle w:val="Hipervnculo"/>
+                <w:noProof/>
+              </w:rPr>
+              <w:t xml:space="preserve">Taxonomía de Bloom</w:t>
+            </w:r>
+            <w:r>
+              <w:rPr>
+                <w:noProof/>
                 <w:webHidden/>
+              </w:rPr>
+              <w:tab/>
+            </w:r>
+            <w:r>
+              <w:rPr>
                 <w:noProof/>
+                <w:webHidden/>
               </w:rPr>
               <w:fldChar w:fldCharType="begin"/>
             </w:r>
             <w:r>
               <w:rPr>
+                <w:noProof/>
                 <w:webHidden/>
+              </w:rPr>
+              <w:instrText xml:space="preserve"> PAGEREF _Toc_new_ch2_15 \h </w:instrText>
+            </w:r>
+            <w:r/>
+            <w:r>
+              <w:rPr>
                 <w:noProof/>
-              </w:rPr>
-              <w:instrText xml:space="preserve"> PAGEREF _Toc_Ch2_10 \h </w:instrText>
-            </w:r>
-            <w:r>
-              <w:rPr>
                 <w:webHidden/>
+              </w:rPr>
+              <w:fldChar w:fldCharType="separate"/>
+            </w:r>
+            <w:r>
+              <w:rPr>
                 <w:noProof/>
-              </w:rPr>
-            </w:r>
-            <w:r>
-              <w:rPr>
                 <w:webHidden/>
+              </w:rPr>
+              <w:t xml:space="preserve">XX</w:t>
+            </w:r>
+            <w:r>
+              <w:rPr>
                 <w:noProof/>
+                <w:webHidden/>
+              </w:rPr>
+              <w:fldChar w:fldCharType="end"/>
+            </w:r>
+          </w:hyperlink>
+        </w:p>
+        <w:p>
+          <w:pPr>
+            <w:pStyle w:val="TDC3"/>
+            <w:tabs>
+              <w:tab w:val="left" w:pos="1440"/>
+              <w:tab w:val="right" w:leader="dot" w:pos="8777"/>
+            </w:tabs>
+            <w:rPr>
+              <w:rFonts w:asciiTheme="minorHAnsi" w:eastAsiaTheme="minorEastAsia" w:hAnsiTheme="minorHAnsi" w:cstheme="minorBidi"/>
+              <w:iCs w:val="0"/>
+              <w:noProof/>
+              <w:kern w:val="2"/>
+              <w:szCs w:val="24"/>
+              <w:lang w:val="es-PE" w:eastAsia="es-PE"/>
+              <w14:ligatures w14:val="standardContextual"/>
+            </w:rPr>
+          </w:pPr>
+          <w:hyperlink w:anchor="_Toc_new_ch2_16" w:history="1">
+            <w:r>
+              <w:rPr>
+                <w:rStyle w:val="Hipervnculo"/>
+                <w:noProof/>
+              </w:rPr>
+              <w:t xml:space="preserve">2.2.2</w:t>
+            </w:r>
+            <w:r>
+              <w:rPr>
+                <w:noProof/>
+              </w:rPr>
+              <w:tab/>
+            </w:r>
+            <w:r>
+              <w:rPr>
+                <w:rStyle w:val="Hipervnculo"/>
+                <w:noProof/>
+              </w:rPr>
+              <w:t xml:space="preserve">SCRUM en equipos multidisciplinarios</w:t>
+            </w:r>
+            <w:r>
+              <w:rPr>
+                <w:noProof/>
+                <w:webHidden/>
+              </w:rPr>
+              <w:tab/>
+            </w:r>
+            <w:r>
+              <w:rPr>
+                <w:noProof/>
+                <w:webHidden/>
+              </w:rPr>
+              <w:fldChar w:fldCharType="begin"/>
+            </w:r>
+            <w:r>
+              <w:rPr>
+                <w:noProof/>
+                <w:webHidden/>
+              </w:rPr>
+              <w:instrText xml:space="preserve"> PAGEREF _Toc_new_ch2_16 \h </w:instrText>
+            </w:r>
+            <w:r/>
+            <w:r>
+              <w:rPr>
+                <w:noProof/>
+                <w:webHidden/>
               </w:rPr>
               <w:fldChar w:fldCharType="separate"/>
             </w:r>
             <w:r>
               <w:rPr>
+                <w:noProof/>
                 <w:webHidden/>
+              </w:rPr>
+              <w:t xml:space="preserve">XX</w:t>
+            </w:r>
+            <w:r>
+              <w:rPr>
                 <w:noProof/>
-              </w:rPr>
-              <w:t>XX</w:t>
-            </w:r>
-            <w:r>
-              <w:rPr>
                 <w:webHidden/>
+              </w:rPr>
+              <w:fldChar w:fldCharType="end"/>
+            </w:r>
+          </w:hyperlink>
+        </w:p>
+        <w:p>
+          <w:pPr>
+            <w:pStyle w:val="TDC2"/>
+            <w:tabs>
+              <w:tab w:val="left" w:pos="960"/>
+              <w:tab w:val="right" w:leader="dot" w:pos="8777"/>
+            </w:tabs>
+            <w:rPr>
+              <w:rFonts w:asciiTheme="minorHAnsi" w:eastAsiaTheme="minorEastAsia" w:hAnsiTheme="minorHAnsi" w:cstheme="minorBidi"/>
+              <w:noProof/>
+              <w:kern w:val="2"/>
+              <w:szCs w:val="24"/>
+              <w:lang w:val="es-PE" w:eastAsia="es-PE"/>
+              <w14:ligatures w14:val="standardContextual"/>
+            </w:rPr>
+          </w:pPr>
+          <w:hyperlink w:anchor="_Toc_new_ch2_17" w:history="1">
+            <w:r>
+              <w:rPr>
+                <w:rStyle w:val="Hipervnculo"/>
                 <w:noProof/>
+              </w:rPr>
+              <w:t xml:space="preserve">2.3</w:t>
+            </w:r>
+            <w:r>
+              <w:rPr>
+                <w:noProof/>
+              </w:rPr>
+              <w:tab/>
+            </w:r>
+            <w:r>
+              <w:rPr>
+                <w:rStyle w:val="Hipervnculo"/>
+                <w:noProof/>
+              </w:rPr>
+              <w:t xml:space="preserve">Bases Legales y Marco Normativo</w:t>
+            </w:r>
+            <w:r>
+              <w:rPr>
+                <w:noProof/>
+                <w:webHidden/>
+              </w:rPr>
+              <w:tab/>
+            </w:r>
+            <w:r>
+              <w:rPr>
+                <w:noProof/>
+                <w:webHidden/>
+              </w:rPr>
+              <w:fldChar w:fldCharType="begin"/>
+            </w:r>
+            <w:r>
+              <w:rPr>
+                <w:noProof/>
+                <w:webHidden/>
+              </w:rPr>
+              <w:instrText xml:space="preserve"> PAGEREF _Toc_new_ch2_17 \h </w:instrText>
+            </w:r>
+            <w:r/>
+            <w:r>
+              <w:rPr>
+                <w:noProof/>
+                <w:webHidden/>
+              </w:rPr>
+              <w:fldChar w:fldCharType="separate"/>
+            </w:r>
+            <w:r>
+              <w:rPr>
+                <w:noProof/>
+                <w:webHidden/>
+              </w:rPr>
+              <w:t xml:space="preserve">XX</w:t>
+            </w:r>
+            <w:r>
+              <w:rPr>
+                <w:noProof/>
+                <w:webHidden/>
+              </w:rPr>
+              <w:fldChar w:fldCharType="end"/>
+            </w:r>
+          </w:hyperlink>
+        </w:p>
+        <w:p>
+          <w:pPr>
+            <w:pStyle w:val="TDC3"/>
+            <w:tabs>
+              <w:tab w:val="left" w:pos="1440"/>
+              <w:tab w:val="right" w:leader="dot" w:pos="8777"/>
+            </w:tabs>
+            <w:rPr>
+              <w:rFonts w:asciiTheme="minorHAnsi" w:eastAsiaTheme="minorEastAsia" w:hAnsiTheme="minorHAnsi" w:cstheme="minorBidi"/>
+              <w:iCs w:val="0"/>
+              <w:noProof/>
+              <w:kern w:val="2"/>
+              <w:szCs w:val="24"/>
+              <w:lang w:val="es-PE" w:eastAsia="es-PE"/>
+              <w14:ligatures w14:val="standardContextual"/>
+            </w:rPr>
+          </w:pPr>
+          <w:hyperlink w:anchor="_Toc_new_ch2_18" w:history="1">
+            <w:r>
+              <w:rPr>
+                <w:rStyle w:val="Hipervnculo"/>
+                <w:noProof/>
+              </w:rPr>
+              <w:t xml:space="preserve">2.3.1</w:t>
+            </w:r>
+            <w:r>
+              <w:rPr>
+                <w:noProof/>
+              </w:rPr>
+              <w:tab/>
+            </w:r>
+            <w:r>
+              <w:rPr>
+                <w:rStyle w:val="Hipervnculo"/>
+                <w:noProof/>
+              </w:rPr>
+              <w:t xml:space="preserve">Ley de Protección de Datos Personales (Ley 29733 — Perú)</w:t>
+            </w:r>
+            <w:r>
+              <w:rPr>
+                <w:noProof/>
+                <w:webHidden/>
+              </w:rPr>
+              <w:tab/>
+            </w:r>
+            <w:r>
+              <w:rPr>
+                <w:noProof/>
+                <w:webHidden/>
+              </w:rPr>
+              <w:fldChar w:fldCharType="begin"/>
+            </w:r>
+            <w:r>
+              <w:rPr>
+                <w:noProof/>
+                <w:webHidden/>
+              </w:rPr>
+              <w:instrText xml:space="preserve"> PAGEREF _Toc_new_ch2_18 \h </w:instrText>
+            </w:r>
+            <w:r/>
+            <w:r>
+              <w:rPr>
+                <w:noProof/>
+                <w:webHidden/>
+              </w:rPr>
+              <w:fldChar w:fldCharType="separate"/>
+            </w:r>
+            <w:r>
+              <w:rPr>
+                <w:noProof/>
+                <w:webHidden/>
+              </w:rPr>
+              <w:t xml:space="preserve">XX</w:t>
+            </w:r>
+            <w:r>
+              <w:rPr>
+                <w:noProof/>
+                <w:webHidden/>
+              </w:rPr>
+              <w:fldChar w:fldCharType="end"/>
+            </w:r>
+          </w:hyperlink>
+        </w:p>
+        <w:p>
+          <w:pPr>
+            <w:pStyle w:val="TDC2"/>
+            <w:tabs>
+              <w:tab w:val="left" w:pos="960"/>
+              <w:tab w:val="right" w:leader="dot" w:pos="8777"/>
+            </w:tabs>
+            <w:rPr>
+              <w:rFonts w:asciiTheme="minorHAnsi" w:eastAsiaTheme="minorEastAsia" w:hAnsiTheme="minorHAnsi" w:cstheme="minorBidi"/>
+              <w:noProof/>
+              <w:kern w:val="2"/>
+              <w:szCs w:val="24"/>
+              <w:lang w:val="es-PE" w:eastAsia="es-PE"/>
+              <w14:ligatures w14:val="standardContextual"/>
+            </w:rPr>
+          </w:pPr>
+          <w:hyperlink w:anchor="_Toc_new_ch2_19" w:history="1">
+            <w:r>
+              <w:rPr>
+                <w:rStyle w:val="Hipervnculo"/>
+                <w:noProof/>
+              </w:rPr>
+              <w:t xml:space="preserve">Referencias del Capítulo</w:t>
+            </w:r>
+            <w:r>
+              <w:rPr>
+                <w:noProof/>
+                <w:webHidden/>
+              </w:rPr>
+              <w:tab/>
+            </w:r>
+            <w:r>
+              <w:rPr>
+                <w:noProof/>
+                <w:webHidden/>
+              </w:rPr>
+              <w:fldChar w:fldCharType="begin"/>
+            </w:r>
+            <w:r>
+              <w:rPr>
+                <w:noProof/>
+                <w:webHidden/>
+              </w:rPr>
+              <w:instrText xml:space="preserve"> PAGEREF _Toc_new_ch2_19 \h </w:instrText>
+            </w:r>
+            <w:r/>
+            <w:r>
+              <w:rPr>
+                <w:noProof/>
+                <w:webHidden/>
+              </w:rPr>
+              <w:fldChar w:fldCharType="separate"/>
+            </w:r>
+            <w:r>
+              <w:rPr>
+                <w:noProof/>
+                <w:webHidden/>
+              </w:rPr>
+              <w:t xml:space="preserve">XX</w:t>
+            </w:r>
+            <w:r>
+              <w:rPr>
+                <w:noProof/>
+                <w:webHidden/>
               </w:rPr>
               <w:fldChar w:fldCharType="end"/>
             </w:r>
@@ -13020,6 +13697,14 @@
     <w:p>
       <w:pPr>
         <w:pStyle w:val="Ttulo2"/>
+      </w:pPr>
+      <w:r>
+        <w:t>2.1  Marco Conceptual</w:t>
+      </w:r>
+    </w:p>
+    <w:p>
+      <w:pPr>
+        <w:pStyle w:val="Normal"/>
         <w:numPr>
           <w:ilvl w:val="0"/>
           <w:numId w:val="0"/>
@@ -13027,10 +13712,7 @@
         <w:ind w:left="576" w:hanging="576"/>
       </w:pPr>
       <w:r>
-        <w:t>2.1 El</w:t>
-      </w:r>
-      <w:r>
-        <w:t xml:space="preserve"> Proceso de Producción Instruccional</w:t>
+        <w:t xml:space="preserve">El Proceso de Producción Instruccional</w:t>
       </w:r>
     </w:p>
     <w:p>
@@ -13039,6 +13721,71 @@
       </w:r>
       <w:r>
         <w:t>producción de cursos virtuales en una institución de educación superior: los documentos de entrada que definen el curso y los artefactos que se producen a lo largo del proceso.</w:t>
+      </w:r>
+    </w:p>
+    <w:p>
+      <w:r>
+        <w:t>Se describen los document</w:t>
+      </w:r>
+      <w:r>
+        <w:t xml:space="preserve">os e insumos que intervienen en el proceso de producción instruccional. El proceso parte de dos documentos de entrada: el </w:t>
+      </w:r>
+      <w:r>
+        <w:rPr>
+          <w:b/>
+        </w:rPr>
+        <w:t>sílabo</w:t>
+      </w:r>
+      <w:r>
+        <w:t xml:space="preserve">, documento oficial del curso que establece su estructura académica (unidades, semanas, temas y logros de aprendizaje), y el </w:t>
+      </w:r>
+      <w:r>
+        <w:rPr>
+          <w:b/>
+        </w:rPr>
+        <w:t>kic</w:t>
+      </w:r>
+      <w:r>
+        <w:rPr>
+          <w:b/>
+        </w:rPr>
+        <w:t>koff</w:t>
+      </w:r>
+      <w:r>
+        <w:t xml:space="preserve"> o acta de reunión de inicio, que recoge los acuerdos pedagógicos previos a la producción (perfil del estudiante, enfoque didáctico y criterios específicos del curso). A partir de estos insumos, el proceso genera tres artefactos de forma secuencial: el</w:t>
+      </w:r>
+      <w:r>
+        <w:t xml:space="preserve"> </w:t>
+      </w:r>
+      <w:r>
+        <w:rPr>
+          <w:b/>
+        </w:rPr>
+        <w:t>IPES</w:t>
+      </w:r>
+      <w:r>
+        <w:t xml:space="preserve"> (Introducción, Presentaciones y Ejercicios), documento de planificación instruccional semanal que actúa como hoja de ruta del contenido a producir; el </w:t>
+      </w:r>
+      <w:r>
+        <w:rPr>
+          <w:b/>
+        </w:rPr>
+        <w:t>Material Base</w:t>
+      </w:r>
+      <w:r>
+        <w:t>, que constituye el contenido final que consumen los estudiantes (guiones de video, se</w:t>
+      </w:r>
+      <w:r>
+        <w:t xml:space="preserve">paratas, recursos interactivos); y las </w:t>
+      </w:r>
+      <w:r>
+        <w:rPr>
+          <w:b/>
+        </w:rPr>
+        <w:t>Consignas</w:t>
+      </w:r>
+      <w:r>
+        <w:t>, instrumentos formales de evaluación que definen cómo se valorará el desempeño del estudiante en las actividades calificadas.</w:t>
       </w:r>
     </w:p>
     <w:p>
@@ -13051,99 +13798,279 @@
         <w:ind w:left="720" w:hanging="720"/>
       </w:pPr>
       <w:r>
-        <w:t>2.1.1 Documentos</w:t>
-      </w:r>
-      <w:r>
-        <w:t xml:space="preserve"> de entrada y artefactos del proceso</w:t>
+        <w:t xml:space="preserve">2.1.1  Agentes de IA</w:t>
       </w:r>
     </w:p>
     <w:p>
       <w:r>
-        <w:t>Se describen los document</w:t>
-      </w:r>
-      <w:r>
-        <w:t xml:space="preserve">os e insumos que intervienen en el proceso de producción instruccional. El proceso parte de dos documentos de entrada: el </w:t>
-      </w:r>
-      <w:r>
-        <w:rPr>
-          <w:b/>
-        </w:rPr>
-        <w:t>sílabo</w:t>
-      </w:r>
-      <w:r>
-        <w:t xml:space="preserve">, documento oficial del curso que establece su estructura académica (unidades, semanas, temas y logros de aprendizaje), y el </w:t>
-      </w:r>
-      <w:r>
-        <w:rPr>
-          <w:b/>
-        </w:rPr>
-        <w:t>kic</w:t>
-      </w:r>
-      <w:r>
-        <w:rPr>
-          <w:b/>
-        </w:rPr>
-        <w:t>koff</w:t>
-      </w:r>
-      <w:r>
-        <w:t xml:space="preserve"> o acta de reunión de inicio, que recoge los acuerdos pedagógicos previos a la producción (perfil del estudiante, enfoque didáctico y criterios específicos del curso). A partir de estos insumos, el proceso genera tres artefactos de forma secuencial: el</w:t>
-      </w:r>
-      <w:r>
-        <w:t xml:space="preserve"> </w:t>
-      </w:r>
-      <w:r>
-        <w:rPr>
-          <w:b/>
-        </w:rPr>
-        <w:t>IPES</w:t>
-      </w:r>
-      <w:r>
-        <w:t xml:space="preserve"> (Introducción, Presentaciones y Ejercicios), documento de planificación instruccional semanal que actúa como hoja de ruta del contenido a producir; el </w:t>
-      </w:r>
-      <w:r>
-        <w:rPr>
-          <w:b/>
-        </w:rPr>
-        <w:t>Material Base</w:t>
-      </w:r>
-      <w:r>
-        <w:t>, que constituye el contenido final que consumen los estudiantes (guiones de video, se</w:t>
-      </w:r>
-      <w:r>
-        <w:t xml:space="preserve">paratas, recursos interactivos); y las </w:t>
-      </w:r>
-      <w:r>
-        <w:rPr>
-          <w:b/>
-        </w:rPr>
-        <w:t>Consignas</w:t>
-      </w:r>
-      <w:r>
-        <w:t>, instrumentos formales de evaluación que definen cómo se valorará el desempeño del estudiante en las actividades calificadas.</w:t>
+        <w:t>Se presentan los conceptos q</w:t>
+      </w:r>
+      <w:r>
+        <w:t>ue conforman la capa de inteligencia artificial del sistema: el mecanismo de instrucción de los modelos, la estructura de sus salidas, la especialización por agente, el control de flujo y el framework de orquestación.</w:t>
       </w:r>
     </w:p>
     <w:p>
       <w:pPr>
-        <w:pStyle w:val="Ttulo2"/>
+        <w:pStyle w:val="Ttulo3"/>
         <w:numPr>
           <w:ilvl w:val="0"/>
           <w:numId w:val="0"/>
         </w:numPr>
-        <w:ind w:left="576" w:hanging="576"/>
-      </w:pPr>
-      <w:r>
-        <w:t>2.2 Fundamentos</w:t>
-      </w:r>
-      <w:r>
-        <w:t xml:space="preserve"> Pedagógicos</w:t>
+        <w:ind w:left="864" w:hanging="864"/>
+      </w:pPr>
+      <w:proofErr w:type="spellStart"/>
+      <w:proofErr w:type="spellEnd"/>
+      <w:proofErr w:type="spellStart"/>
+      <w:proofErr w:type="spellEnd"/>
+      <w:r>
+        <w:t xml:space="preserve">2.1.2  Prompt Engineering</w:t>
       </w:r>
     </w:p>
     <w:p>
       <w:r>
-        <w:t>En esta sección se presenta el marco teórico del apr</w:t>
-      </w:r>
-      <w:r>
-        <w:t>endizaje que sustenta las reglas pedagógicas codificadas en el sistema.</w:t>
+        <w:t>El diseño de prompt</w:t>
+      </w:r>
+      <w:r>
+        <w:t>s es la principal interfaz de programación con los modelos de lenguaje grandes. En este trabajo, cada agente del sistema está definido por un prompt que especifica su rol, sus reglas obligatorias y sus lineamientos de criterio. Se explicará por qué es rele</w:t>
+      </w:r>
+      <w:r>
+        <w:t>vante para esta tesis:</w:t>
+      </w:r>
+    </w:p>
+    <w:p>
+      <w:pPr>
+        <w:pStyle w:val="Listaconvietas"/>
+      </w:pPr>
+      <w:r>
+        <w:t>Qué es un prompt y la separación entre system prompt (instrucciones permanentes de rol y reglas) y user prompt (contexto variable de cada ejecución).</w:t>
+      </w:r>
+    </w:p>
+    <w:p>
+      <w:pPr>
+        <w:pStyle w:val="Listaconvietas"/>
+      </w:pPr>
+      <w:r>
+        <w:t>El patrón de hard rules vs. soft guidelines: reglas no negociables que el agente de</w:t>
+      </w:r>
+      <w:r>
+        <w:t>be respetar siempre, versus lineamientos donde aplica criterio propio. Este patrón gobierna todos los agentes del sistema.</w:t>
+      </w:r>
+    </w:p>
+    <w:p>
+      <w:pPr>
+        <w:pStyle w:val="Listaconvietas"/>
+      </w:pPr>
+      <w:r>
+        <w:t>El proceso iterativo de refinamiento de prompts con validación por expertos como metodología de desarrollo de la capa de IA (Wei et a</w:t>
+      </w:r>
+      <w:r>
+        <w:t>l., 2022).</w:t>
+      </w:r>
+    </w:p>
+    <w:p>
+      <w:pPr>
+        <w:pStyle w:val="Ttulo3"/>
+        <w:numPr>
+          <w:ilvl w:val="0"/>
+          <w:numId w:val="0"/>
+        </w:numPr>
+        <w:ind w:left="864" w:hanging="864"/>
+      </w:pPr>
+      <w:proofErr w:type="spellStart"/>
+      <w:proofErr w:type="spellEnd"/>
+      <w:r>
+        <w:t xml:space="preserve">2.1.3  Structured Outputs (Salidas Estructuradas)</w:t>
+      </w:r>
+    </w:p>
+    <w:p>
+      <w:r>
+        <w:t>Para que la solución funcione como pipeline encadenado, cada agente debe producir datos en formato JSON validado, no texto libre. Se explicará por qué es fundamental en esta tesis:</w:t>
+      </w:r>
+    </w:p>
+    <w:p>
+      <w:pPr>
+        <w:pStyle w:val="Listaconvietas"/>
+      </w:pPr>
+      <w:r>
+        <w:lastRenderedPageBreak/>
+        <w:t>JSON mode / structure</w:t>
+      </w:r>
+      <w:r>
+        <w:t>d output: el modelo es forzado a producir un JSON que cumple un esquema predefinido (OpenAI, 2024; Google DeepMind, 2024). Permite que el output de un agente sea el input directo del siguiente.</w:t>
+      </w:r>
+    </w:p>
+    <w:p>
+      <w:pPr>
+        <w:pStyle w:val="Listaconvietas"/>
+      </w:pPr>
+      <w:r>
+        <w:t xml:space="preserve">Pydantic como contrato de datos: cada agente define su modelo </w:t>
+      </w:r>
+      <w:r>
+        <w:t>de entrada y salida mediante clases Pydantic, garantizando tipos y campos correctos en toda la cadena de producción.</w:t>
+      </w:r>
+    </w:p>
+    <w:p>
+      <w:pPr>
+        <w:pStyle w:val="Ttulo3"/>
+        <w:numPr>
+          <w:ilvl w:val="0"/>
+          <w:numId w:val="0"/>
+        </w:numPr>
+        <w:ind w:left="864" w:hanging="864"/>
+      </w:pPr>
+      <w:r>
+        <w:t xml:space="preserve">2.1.4  Sistemas Multi-Agente</w:t>
+      </w:r>
+    </w:p>
+    <w:p>
+      <w:r>
+        <w:t>El sistema distribuye la generación de contenido entre múltiples agentes especializados en lugar de un único agente g</w:t>
+      </w:r>
+      <w:r>
+        <w:t>eneralista. Se explicará por qué este enfoque es relevante para esta tesis:</w:t>
+      </w:r>
+    </w:p>
+    <w:p>
+      <w:pPr>
+        <w:pStyle w:val="Listaconvietas"/>
+      </w:pPr>
+      <w:r>
+        <w:t>Qué es un agente de IA: una instancia de un modelo de lenguaje con un rol, instrucciones y responsabilidad específica.</w:t>
+      </w:r>
+    </w:p>
+    <w:p>
+      <w:pPr>
+        <w:pStyle w:val="Listaconvietas"/>
+      </w:pPr>
+      <w:r>
+        <w:t xml:space="preserve">Por qué especializar: un agente con una sola </w:t>
+      </w:r>
+      <w:r>
+        <w:t>responsabilidad bien definida produce resultados más precisos y confiables. En este sistema, agentes distintos manejan el parseo, el esquema curricular, la generación de contenido y la validación de calidad (Park et al., 2023).</w:t>
+      </w:r>
+    </w:p>
+    <w:p>
+      <w:pPr>
+        <w:pStyle w:val="Ttulo3"/>
+        <w:numPr>
+          <w:ilvl w:val="0"/>
+          <w:numId w:val="0"/>
+        </w:numPr>
+        <w:ind w:left="864" w:hanging="864"/>
+      </w:pPr>
+      <w:r>
+        <w:t xml:space="preserve">2.1.5  Nodos y Grafos de Estado</w:t>
+      </w:r>
+    </w:p>
+    <w:p>
+      <w:r>
+        <w:t>La orquestación de agentes en el sistema se implementa como un grafo de estado dirigido, donde cada nodo representa un paso de procesamiento. Se explicará por qué es relevante para esta tesis:</w:t>
+      </w:r>
+    </w:p>
+    <w:p>
+      <w:pPr>
+        <w:pStyle w:val="Listaconvietas"/>
+      </w:pPr>
+      <w:r>
+        <w:t>Un nodo como unidad de procesamiento: puede invocar un L</w:t>
+      </w:r>
+      <w:r>
+        <w:t>LM, ejecutar código determinístico o tomar una decisión condicional. El estado es compartido entre todos los nodos del grafo.</w:t>
+      </w:r>
+    </w:p>
+    <w:p>
+      <w:pPr>
+        <w:pStyle w:val="Listaconvietas"/>
+      </w:pPr>
+      <w:r>
+        <w:t>Aristas condicionales y ciclos de reintento: el flujo puede bifurcarse según el resultado de un nodo (validación pasa → continuar,</w:t>
+      </w:r>
+      <w:r>
+        <w:t xml:space="preserve"> validación falla → reintentar con feedback). Este mecanismo es el que garantiza el cumplimiento de restricciones pedagógicas.</w:t>
+      </w:r>
+    </w:p>
+    <w:p>
+      <w:pPr>
+        <w:pStyle w:val="Ttulo3"/>
+        <w:numPr>
+          <w:ilvl w:val="0"/>
+          <w:numId w:val="0"/>
+        </w:numPr>
+        <w:ind w:left="864" w:hanging="864"/>
+      </w:pPr>
+      <w:proofErr w:type="spellStart"/>
+      <w:proofErr w:type="spellEnd"/>
+      <w:r>
+        <w:t xml:space="preserve">2.1.6  Agent Framework: LangChain y LangGraph</w:t>
+      </w:r>
+    </w:p>
+    <w:p>
+      <w:r>
+        <w:t xml:space="preserve">LangChain y LangGraph son las herramientas de orquestación sobre las que se implementó el </w:t>
+      </w:r>
+      <w:r>
+        <w:t>sistema. Se explicará por qué son relevantes para esta tesis:</w:t>
+      </w:r>
+    </w:p>
+    <w:p>
+      <w:pPr>
+        <w:pStyle w:val="Listaconvietas"/>
+      </w:pPr>
+      <w:r>
+        <w:lastRenderedPageBreak/>
+        <w:t>LangChain: capa de abstracción sobre múltiples proveedores de LLM (OpenAI, Google Gemini) que estandariza la invocación de modelos, el manejo de prompts y el procesamiento de outputs.</w:t>
+      </w:r>
+    </w:p>
+    <w:p>
+      <w:pPr>
+        <w:pStyle w:val="Listaconvietas"/>
+      </w:pPr>
+      <w:r>
+        <w:t>LangGraph:</w:t>
+      </w:r>
+      <w:r>
+        <w:t xml:space="preserve"> extensión de LangChain que implementa grafos de estado dirigidos, habilitando flujos condicionales, ciclos de reintento y estado compartido entre nodos. Supera al prompt chaining simple al permitir lógica de control real sobre el flujo de generación (Chas</w:t>
+      </w:r>
+      <w:r>
+        <w:t>e, 2024).</w:t>
+      </w:r>
+    </w:p>
+    <w:p>
+      <w:pPr>
+        <w:pStyle w:val="Ttulo3"/>
+        <w:numPr>
+          <w:ilvl w:val="0"/>
+          <w:numId w:val="0"/>
+        </w:numPr>
+        <w:ind w:left="864" w:hanging="864"/>
+      </w:pPr>
+      <w:r>
+        <w:t xml:space="preserve">2.1.7  Python como ecosistema de desarrollo de IA</w:t>
+      </w:r>
+    </w:p>
+    <w:p>
+      <w:r>
+        <w:t>Python es el lenguaje de implementación del backend. Ya que nos permite tener lo siguiente:</w:t>
+      </w:r>
+    </w:p>
+    <w:p>
+      <w:pPr>
+        <w:pStyle w:val="Listaconvietas"/>
+      </w:pPr>
+      <w:r>
+        <w:t>Ecosistema: concentra las bibliotecas más utilizadas para modelos de lenguaje (LangChain, LangGraph), procesami</w:t>
+      </w:r>
+      <w:r>
+        <w:t>ento documental (pdfplumber, python-docx, pandas) y exposición de APIs (FastAPI).</w:t>
+      </w:r>
+    </w:p>
+    <w:p>
+      <w:pPr>
+        <w:pStyle w:val="Listaconvietas"/>
+      </w:pPr>
+      <w:r>
+        <w:t>FastAPI y Pydantic: FastAPI expone los agentes como endpoints HTTP; Pydantic valida los modelos de datos y hace cumplir los structured outputs en toda la cadena de agentes.</w:t>
       </w:r>
     </w:p>
     <w:p>
@@ -13155,87 +14082,133 @@
         </w:numPr>
         <w:ind w:left="720" w:hanging="720"/>
       </w:pPr>
-      <w:proofErr w:type="gramStart"/>
-      <w:r>
-        <w:t>2.2.1  Taxonomía</w:t>
-      </w:r>
-      <w:proofErr w:type="gramEnd"/>
-      <w:r>
-        <w:t xml:space="preserve"> de Bloom</w:t>
+      <w:r>
+        <w:t xml:space="preserve">2.1.8  Infraestructura Backend</w:t>
       </w:r>
     </w:p>
     <w:p>
       <w:r>
-        <w:t>La Taxonomía de Bloom, en su revisión de Anderson &amp; Krathwohl (2001), constituye el marco central de clasificación de objetivos de aprendizaje sobre el que el</w:t>
-      </w:r>
-      <w:r>
-        <w:t xml:space="preserve"> sistema fundamenta sus decisiones de selección de recursos. Se explicará en detalle dado su rol estructural en la lógica del sistema. Los puntos a cubrir son:</w:t>
+        <w:t>Se presentan los conceptos de arquitectura de software y servicios cloud que soportan la ejecución del sistema en producción.</w:t>
       </w:r>
     </w:p>
     <w:p>
       <w:pPr>
-        <w:pStyle w:val="Listaconvietas"/>
-      </w:pPr>
-      <w:r>
-        <w:t>Los seis niveles cognitivos y sus verbos asociados (Recordar, Comprender, Aplicar, Analizar, Eva</w:t>
-      </w:r>
-      <w:r>
-        <w:t>luar, Crear), según la revisión de Anderson &amp; Krathwohl (2001) sobre la taxonomía original de Bloom et al. (1956).</w:t>
-      </w:r>
-    </w:p>
-    <w:p>
-      <w:pPr>
-        <w:pStyle w:val="Listaconvietas"/>
-      </w:pPr>
-      <w:r>
-        <w:t>Cómo el verbo del logro de aprendizaje semanal determina el tipo de recurso a utilizar: la tabla verbo × densidad de contenido → tipo de recu</w:t>
-      </w:r>
-      <w:r>
-        <w:t>rso que el sistema aplica en cada semana del curso.</w:t>
-      </w:r>
-    </w:p>
-    <w:p>
-      <w:pPr>
-        <w:pStyle w:val="Listaconvietas"/>
-      </w:pPr>
-      <w:r>
-        <w:lastRenderedPageBreak/>
-        <w:t>La jerarquía de logros: Logro del Curso → Logro de Unidad → Logro de Semana → Propósito del Recurso, y por qué cada nivel debe ser consistente con el superior (principio de alineación vertical).</w:t>
-      </w:r>
-    </w:p>
-    <w:p>
-      <w:pPr>
-        <w:pStyle w:val="Listaconvietas"/>
-      </w:pPr>
-      <w:r>
-        <w:t>La distin</w:t>
-      </w:r>
-      <w:r>
-        <w:t>ción entre contenido procedimental (requiere recurso demostrativo), teórico (requiere recurso expositivo) y básico (flexible), y cómo el verbo del logro permite identificar cada tipo.</w:t>
-      </w:r>
-    </w:p>
-    <w:p>
-      <w:pPr>
-        <w:pStyle w:val="Ttulo2"/>
+        <w:pStyle w:val="Ttulo3"/>
         <w:numPr>
           <w:ilvl w:val="0"/>
           <w:numId w:val="0"/>
         </w:numPr>
-        <w:ind w:left="576" w:hanging="576"/>
-      </w:pPr>
-      <w:r>
-        <w:t>2.3 Fundamentos</w:t>
-      </w:r>
-      <w:r>
-        <w:t xml:space="preserve"> Técnicos</w:t>
+        <w:ind w:left="864" w:hanging="864"/>
+      </w:pPr>
+      <w:r>
+        <w:t xml:space="preserve">2.1.9  Backend</w:t>
       </w:r>
     </w:p>
     <w:p>
       <w:r>
-        <w:t xml:space="preserve">En esta sección se presentan los conceptos de </w:t>
-      </w:r>
-      <w:r>
-        <w:t>inteligencia artificial e ingeniería de software sobre los que se construyó el sistema, organizados en dos capas: los componentes de la capa de agentes de IA y los componentes de la infraestructura backend.</w:t>
+        <w:t>El backend de una aplicación es la capa de software responsable de procesar la lógica de neg</w:t>
+      </w:r>
+      <w:r>
+        <w:t>ocio, gestionar el acceso a datos y exponer servicios a los clientes mediante interfaces de red —típicamente APIs HTTP—. A diferencia del frontend, que gestiona la presentación e interacción con el usuario, el backend concentra el procesamiento, la persist</w:t>
+      </w:r>
+      <w:r>
+        <w:t>encia y la seguridad del sistema (Richardson, 2018).</w:t>
+      </w:r>
+    </w:p>
+    <w:p>
+      <w:pPr>
+        <w:pStyle w:val="Ttulo3"/>
+        <w:numPr>
+          <w:ilvl w:val="0"/>
+          <w:numId w:val="0"/>
+        </w:numPr>
+        <w:ind w:left="864" w:hanging="864"/>
+      </w:pPr>
+      <w:r>
+        <w:t xml:space="preserve">2.1.10  Arquitectura del Sistema</w:t>
+      </w:r>
+    </w:p>
+    <w:p>
+      <w:r>
+        <w:t xml:space="preserve">La arquitectura de software </w:t>
+      </w:r>
+      <w:proofErr w:type="gramStart"/>
+      <w:r>
+        <w:t>define</w:t>
+      </w:r>
+      <w:proofErr w:type="gramEnd"/>
+      <w:r>
+        <w:t xml:space="preserve"> cómo los componentes de un sistema se organizan, comunican y escalan para cumplir los requisitos funcionales y no funcionales (Richardson, 2018</w:t>
+      </w:r>
+      <w:r>
+        <w:t>). En sistemas que procesan tareas de duración media o prolongada, la arquitectura incorpora capas especializadas: un punto de entrada que gestiona las solicitudes, un motor de cómputo que ejecuta el procesamiento, y componentes de mensajería que desacopla</w:t>
+      </w:r>
+      <w:r>
+        <w:t>n la recepción de una solicitud de su ejecución efectiva.</w:t>
+      </w:r>
+    </w:p>
+    <w:p>
+      <w:pPr>
+        <w:pStyle w:val="Ttulo3"/>
+        <w:numPr>
+          <w:ilvl w:val="0"/>
+          <w:numId w:val="0"/>
+        </w:numPr>
+        <w:ind w:left="864" w:hanging="864"/>
+      </w:pPr>
+      <w:r>
+        <w:t xml:space="preserve">2.1.11  Procesamiento Asíncrono</w:t>
+      </w:r>
+    </w:p>
+    <w:p>
+      <w:r>
+        <w:t>El procesamiento asíncrono es el patrón arquitectónico que desacopla la recepción de una solicitud de su ejecución. En un modelo síncrono, el cliente espera bloqueado hasta r</w:t>
+      </w:r>
+      <w:r>
+        <w:t>ecibir respuesta; para tareas de duración prolongada esto genera timeouts inaceptables (Kleppmann, 2017). En el modelo asíncrono, el cliente recibe una confirmación inmediata y el trabajo se ejecuta en segundo plano; al finalizar, el sistema notifica al cl</w:t>
+      </w:r>
+      <w:r>
+        <w:t>iente a través de un webhook o servicio de mensajería. Este patrón sigue el modelo productor-consumidor: una cola de mensajes actúa como intermediario entre quien solicita el trabajo y quien lo ejecuta (Richardson, 2018).</w:t>
+      </w:r>
+    </w:p>
+    <w:p>
+      <w:pPr>
+        <w:pStyle w:val="Ttulo3"/>
+        <w:numPr>
+          <w:ilvl w:val="0"/>
+          <w:numId w:val="0"/>
+        </w:numPr>
+        <w:ind w:left="864" w:hanging="864"/>
+      </w:pPr>
+      <w:proofErr w:type="spellStart"/>
+      <w:proofErr w:type="spellEnd"/>
+      <w:r>
+        <w:t xml:space="preserve">2.1.12  Amazon Web Services (AWS)</w:t>
+      </w:r>
+    </w:p>
+    <w:p>
+      <w:r>
+        <w:t>Amazon W</w:t>
+      </w:r>
+      <w:r>
+        <w:t>eb Services (AWS) es la plataforma cloud seleccionada para el despliegue de la infraestructura backend del sistema. AWS ofrece un ecosistema de servicios gestionados bajo un modelo de pago por uso que abarca cómputo serverless, mensajería, almacenamiento y</w:t>
+      </w:r>
+      <w:r>
+        <w:t xml:space="preserve"> gestión de APIs, lo que reduce la complejidad operativa frente a infraestructura autogestionada (Wittig &amp; Wittig, 2018). Para implementar la arquitectura asíncrona descrita, el sistema utiliza cuatro servicios de AWS: un servicio de gestión y exposición d</w:t>
+      </w:r>
+      <w:r>
+        <w:t>e APIs HTTP (Amazon API Gateway), un motor de cómputo serverless que ejecuta el pipeline de agentes (AWS Lambda), un servicio de cola de mensajes que actúa como buffer de trabajos (Amazon SQS) y un sistema de notificaciones pub/sub que comunica la finaliza</w:t>
+      </w:r>
+      <w:r>
+        <w:t>ción del procesamiento (Amazon SNS). La configuración e integración específica de cada uno de estos servicios se describe en el Capítulo 3.</w:t>
+      </w:r>
+    </w:p>
+    <w:p>
+      <w:pPr>
+        <w:pStyle w:val="Ttulo2"/>
+      </w:pPr>
+      <w:r>
+        <w:t>2.2  Estándares, Frameworks y Buenas Prácticas</w:t>
       </w:r>
     </w:p>
     <w:p>
@@ -13247,59 +14220,40 @@
         </w:numPr>
         <w:ind w:left="720" w:hanging="720"/>
       </w:pPr>
-      <w:r>
-        <w:t>2.3.1 Agentes</w:t>
-      </w:r>
-      <w:r>
-        <w:t xml:space="preserve"> de IA</w:t>
+      <w:proofErr w:type="gramStart"/>
+      <w:proofErr w:type="gramEnd"/>
+      <w:r>
+        <w:t xml:space="preserve">2.2.1  Taxonomía de Bloom</w:t>
       </w:r>
     </w:p>
     <w:p>
       <w:r>
-        <w:t>Se presentan los conceptos q</w:t>
-      </w:r>
-      <w:r>
-        <w:t>ue conforman la capa de inteligencia artificial del sistema: el mecanismo de instrucción de los modelos, la estructura de sus salidas, la especialización por agente, el control de flujo y el framework de orquestación.</w:t>
+        <w:t>La Taxonomía de Bloom, en su revisión de Anderson &amp; Krathwohl (2001), constituye el marco central de clasificación de objetivos de aprendizaje sobre el que el</w:t>
+      </w:r>
+      <w:r>
+        <w:t xml:space="preserve"> sistema fundamenta sus decisiones de selección de recursos. Se explicará en detalle dado su rol estructural en la lógica del sistema. Los puntos a cubrir son:</w:t>
       </w:r>
     </w:p>
     <w:p>
       <w:pPr>
-        <w:pStyle w:val="Ttulo4"/>
-        <w:numPr>
-          <w:ilvl w:val="0"/>
-          <w:numId w:val="0"/>
-        </w:numPr>
-        <w:ind w:left="864" w:hanging="864"/>
-      </w:pPr>
-      <w:r>
-        <w:t>2.3.</w:t>
-      </w:r>
-      <w:r>
-        <w:t xml:space="preserve">2 </w:t>
-      </w:r>
-      <w:proofErr w:type="spellStart"/>
-      <w:r>
-        <w:t>Prompt</w:t>
-      </w:r>
-      <w:proofErr w:type="spellEnd"/>
-      <w:r>
-        <w:t xml:space="preserve"> </w:t>
-      </w:r>
-      <w:proofErr w:type="spellStart"/>
-      <w:r>
-        <w:t>Engineering</w:t>
-      </w:r>
-      <w:proofErr w:type="spellEnd"/>
+        <w:pStyle w:val="Listaconvietas"/>
+      </w:pPr>
+      <w:r>
+        <w:t>Los seis niveles cognitivos y sus verbos asociados (Recordar, Comprender, Aplicar, Analizar, Eva</w:t>
+      </w:r>
+      <w:r>
+        <w:t>luar, Crear), según la revisión de Anderson &amp; Krathwohl (2001) sobre la taxonomía original de Bloom et al. (1956).</w:t>
+      </w:r>
     </w:p>
     <w:p>
-      <w:r>
-        <w:t>El diseño de prompt</w:t>
-      </w:r>
-      <w:r>
-        <w:t>s es la principal interfaz de programación con los modelos de lenguaje grandes. En este trabajo, cada agente del sistema está definido por un prompt que especifica su rol, sus reglas obligatorias y sus lineamientos de criterio. Se explicará por qué es rele</w:t>
-      </w:r>
-      <w:r>
-        <w:t>vante para esta tesis:</w:t>
+      <w:pPr>
+        <w:pStyle w:val="Listaconvietas"/>
+      </w:pPr>
+      <w:r>
+        <w:t>Cómo el verbo del logro de aprendizaje semanal determina el tipo de recurso a utilizar: la tabla verbo × densidad de contenido → tipo de recu</w:t>
+      </w:r>
+      <w:r>
+        <w:t>rso que el sistema aplica en cada semana del curso.</w:t>
       </w:r>
     </w:p>
     <w:p>
@@ -13307,7 +14261,8 @@
         <w:pStyle w:val="Listaconvietas"/>
       </w:pPr>
       <w:r>
-        <w:t>Qué es un prompt y la separación entre system prompt (instrucciones permanentes de rol y reglas) y user prompt (contexto variable de cada ejecución).</w:t>
+        <w:lastRenderedPageBreak/>
+        <w:t>La jerarquía de logros: Logro del Curso → Logro de Unidad → Logro de Semana → Propósito del Recurso, y por qué cada nivel debe ser consistente con el superior (principio de alineación vertical).</w:t>
       </w:r>
     </w:p>
     <w:p>
@@ -13315,272 +14270,10 @@
         <w:pStyle w:val="Listaconvietas"/>
       </w:pPr>
       <w:r>
-        <w:t>El patrón de hard rules vs. soft guidelines: reglas no negociables que el agente de</w:t>
-      </w:r>
-      <w:r>
-        <w:t>be respetar siempre, versus lineamientos donde aplica criterio propio. Este patrón gobierna todos los agentes del sistema.</w:t>
-      </w:r>
-    </w:p>
-    <w:p>
-      <w:pPr>
-        <w:pStyle w:val="Listaconvietas"/>
-      </w:pPr>
-      <w:r>
-        <w:t>El proceso iterativo de refinamiento de prompts con validación por expertos como metodología de desarrollo de la capa de IA (Wei et a</w:t>
-      </w:r>
-      <w:r>
-        <w:t>l., 2022).</w:t>
-      </w:r>
-    </w:p>
-    <w:p>
-      <w:pPr>
-        <w:pStyle w:val="Ttulo4"/>
-        <w:numPr>
-          <w:ilvl w:val="0"/>
-          <w:numId w:val="0"/>
-        </w:numPr>
-        <w:ind w:left="864" w:hanging="864"/>
-      </w:pPr>
-      <w:r>
-        <w:t xml:space="preserve">2.3.3 </w:t>
-      </w:r>
-      <w:proofErr w:type="spellStart"/>
-      <w:r>
-        <w:t>Structured</w:t>
-      </w:r>
-      <w:proofErr w:type="spellEnd"/>
-      <w:r>
-        <w:t xml:space="preserve"> Outputs (Salidas Estructuradas)</w:t>
-      </w:r>
-    </w:p>
-    <w:p>
-      <w:r>
-        <w:t>Para que la solución funcione como pipeline encadenado, cada agente debe producir datos en formato JSON validado, no texto libre. Se explicará por qué es fundamental en esta tesis:</w:t>
-      </w:r>
-    </w:p>
-    <w:p>
-      <w:pPr>
-        <w:pStyle w:val="Listaconvietas"/>
-      </w:pPr>
-      <w:r>
-        <w:lastRenderedPageBreak/>
-        <w:t>JSON mode / structure</w:t>
-      </w:r>
-      <w:r>
-        <w:t>d output: el modelo es forzado a producir un JSON que cumple un esquema predefinido (OpenAI, 2024; Google DeepMind, 2024). Permite que el output de un agente sea el input directo del siguiente.</w:t>
-      </w:r>
-    </w:p>
-    <w:p>
-      <w:pPr>
-        <w:pStyle w:val="Listaconvietas"/>
-      </w:pPr>
-      <w:r>
-        <w:t xml:space="preserve">Pydantic como contrato de datos: cada agente define su modelo </w:t>
-      </w:r>
-      <w:r>
-        <w:t>de entrada y salida mediante clases Pydantic, garantizando tipos y campos correctos en toda la cadena de producción.</w:t>
-      </w:r>
-    </w:p>
-    <w:p>
-      <w:pPr>
-        <w:pStyle w:val="Ttulo4"/>
-        <w:numPr>
-          <w:ilvl w:val="0"/>
-          <w:numId w:val="0"/>
-        </w:numPr>
-        <w:ind w:left="864" w:hanging="864"/>
-      </w:pPr>
-      <w:r>
-        <w:t>2.3.</w:t>
-      </w:r>
-      <w:r>
-        <w:t>4</w:t>
-      </w:r>
-      <w:r>
-        <w:t xml:space="preserve"> </w:t>
-      </w:r>
-      <w:r>
-        <w:t>Sistemas Multi-Agente</w:t>
-      </w:r>
-    </w:p>
-    <w:p>
-      <w:r>
-        <w:t>El sistema distribuye la generación de contenido entre múltiples agentes especializados en lugar de un único agente g</w:t>
-      </w:r>
-      <w:r>
-        <w:t>eneralista. Se explicará por qué este enfoque es relevante para esta tesis:</w:t>
-      </w:r>
-    </w:p>
-    <w:p>
-      <w:pPr>
-        <w:pStyle w:val="Listaconvietas"/>
-      </w:pPr>
-      <w:r>
-        <w:t>Qué es un agente de IA: una instancia de un modelo de lenguaje con un rol, instrucciones y responsabilidad específica.</w:t>
-      </w:r>
-    </w:p>
-    <w:p>
-      <w:pPr>
-        <w:pStyle w:val="Listaconvietas"/>
-      </w:pPr>
-      <w:r>
-        <w:t xml:space="preserve">Por qué especializar: un agente con una sola </w:t>
-      </w:r>
-      <w:r>
-        <w:t>responsabilidad bien definida produce resultados más precisos y confiables. En este sistema, agentes distintos manejan el parseo, el esquema curricular, la generación de contenido y la validación de calidad (Park et al., 2023).</w:t>
-      </w:r>
-    </w:p>
-    <w:p>
-      <w:pPr>
-        <w:pStyle w:val="Ttulo4"/>
-        <w:numPr>
-          <w:ilvl w:val="0"/>
-          <w:numId w:val="0"/>
-        </w:numPr>
-        <w:ind w:left="864" w:hanging="864"/>
-      </w:pPr>
-      <w:r>
-        <w:t>2.3.</w:t>
-      </w:r>
-      <w:r>
-        <w:t>5</w:t>
-      </w:r>
-      <w:r>
-        <w:t xml:space="preserve"> </w:t>
-      </w:r>
-      <w:r>
-        <w:t xml:space="preserve">Nodos y Grafos de </w:t>
-      </w:r>
-      <w:r>
-        <w:t>Estado</w:t>
-      </w:r>
-    </w:p>
-    <w:p>
-      <w:r>
-        <w:t>La orquestación de agentes en el sistema se implementa como un grafo de estado dirigido, donde cada nodo representa un paso de procesamiento. Se explicará por qué es relevante para esta tesis:</w:t>
-      </w:r>
-    </w:p>
-    <w:p>
-      <w:pPr>
-        <w:pStyle w:val="Listaconvietas"/>
-      </w:pPr>
-      <w:r>
-        <w:t>Un nodo como unidad de procesamiento: puede invocar un L</w:t>
-      </w:r>
-      <w:r>
-        <w:t>LM, ejecutar código determinístico o tomar una decisión condicional. El estado es compartido entre todos los nodos del grafo.</w:t>
-      </w:r>
-    </w:p>
-    <w:p>
-      <w:pPr>
-        <w:pStyle w:val="Listaconvietas"/>
-      </w:pPr>
-      <w:r>
-        <w:t>Aristas condicionales y ciclos de reintento: el flujo puede bifurcarse según el resultado de un nodo (validación pasa → continuar,</w:t>
-      </w:r>
-      <w:r>
-        <w:t xml:space="preserve"> validación falla → reintentar con feedback). Este mecanismo es el que garantiza el cumplimiento de restricciones pedagógicas.</w:t>
-      </w:r>
-    </w:p>
-    <w:p>
-      <w:pPr>
-        <w:pStyle w:val="Ttulo4"/>
-        <w:numPr>
-          <w:ilvl w:val="0"/>
-          <w:numId w:val="0"/>
-        </w:numPr>
-        <w:ind w:left="864" w:hanging="864"/>
-      </w:pPr>
-      <w:r>
-        <w:t>2.3.</w:t>
-      </w:r>
-      <w:r>
-        <w:t>6</w:t>
-      </w:r>
-      <w:r>
-        <w:t xml:space="preserve"> </w:t>
-      </w:r>
-      <w:proofErr w:type="spellStart"/>
-      <w:r>
-        <w:t>Agent</w:t>
-      </w:r>
-      <w:proofErr w:type="spellEnd"/>
-      <w:r>
-        <w:t xml:space="preserve"> Framework: LangChain y LangGraph</w:t>
-      </w:r>
-    </w:p>
-    <w:p>
-      <w:r>
-        <w:t xml:space="preserve">LangChain y LangGraph son las herramientas de orquestación sobre las que se implementó el </w:t>
-      </w:r>
-      <w:r>
-        <w:t>sistema. Se explicará por qué son relevantes para esta tesis:</w:t>
-      </w:r>
-    </w:p>
-    <w:p>
-      <w:pPr>
-        <w:pStyle w:val="Listaconvietas"/>
-      </w:pPr>
-      <w:r>
-        <w:lastRenderedPageBreak/>
-        <w:t>LangChain: capa de abstracción sobre múltiples proveedores de LLM (OpenAI, Google Gemini) que estandariza la invocación de modelos, el manejo de prompts y el procesamiento de outputs.</w:t>
-      </w:r>
-    </w:p>
-    <w:p>
-      <w:pPr>
-        <w:pStyle w:val="Listaconvietas"/>
-      </w:pPr>
-      <w:r>
-        <w:t>LangGraph:</w:t>
-      </w:r>
-      <w:r>
-        <w:t xml:space="preserve"> extensión de LangChain que implementa grafos de estado dirigidos, habilitando flujos condicionales, ciclos de reintento y estado compartido entre nodos. Supera al prompt chaining simple al permitir lógica de control real sobre el flujo de generación (Chas</w:t>
-      </w:r>
-      <w:r>
-        <w:t>e, 2024).</w:t>
-      </w:r>
-    </w:p>
-    <w:p>
-      <w:pPr>
-        <w:pStyle w:val="Ttulo4"/>
-        <w:numPr>
-          <w:ilvl w:val="0"/>
-          <w:numId w:val="0"/>
-        </w:numPr>
-        <w:ind w:left="864" w:hanging="864"/>
-      </w:pPr>
-      <w:r>
-        <w:t>2.3.</w:t>
-      </w:r>
-      <w:r>
-        <w:t xml:space="preserve">7 </w:t>
-      </w:r>
-      <w:r>
-        <w:t>Python como ecosistema de desarrollo de IA</w:t>
-      </w:r>
-    </w:p>
-    <w:p>
-      <w:r>
-        <w:t>Python es el lenguaje de implementación del backend. Ya que nos permite tener lo siguiente:</w:t>
-      </w:r>
-    </w:p>
-    <w:p>
-      <w:pPr>
-        <w:pStyle w:val="Listaconvietas"/>
-      </w:pPr>
-      <w:r>
-        <w:t>Ecosistema: concentra las bibliotecas más utilizadas para modelos de lenguaje (LangChain, LangGraph), procesami</w:t>
-      </w:r>
-      <w:r>
-        <w:t>ento documental (pdfplumber, python-docx, pandas) y exposición de APIs (FastAPI).</w:t>
-      </w:r>
-    </w:p>
-    <w:p>
-      <w:pPr>
-        <w:pStyle w:val="Listaconvietas"/>
-      </w:pPr>
-      <w:r>
-        <w:t>FastAPI y Pydantic: FastAPI expone los agentes como endpoints HTTP; Pydantic valida los modelos de datos y hace cumplir los structured outputs en toda la cadena de agentes.</w:t>
+        <w:t>La distin</w:t>
+      </w:r>
+      <w:r>
+        <w:t>ción entre contenido procedimental (requiere recurso demostrativo), teórico (requiere recurso expositivo) y básico (flexible), y cómo el verbo del logro permite identificar cada tipo.</w:t>
       </w:r>
     </w:p>
     <w:p>
@@ -13593,251 +14286,85 @@
         <w:ind w:left="720" w:hanging="720"/>
       </w:pPr>
       <w:r>
-        <w:t>2.3.8 Infraestructura</w:t>
-      </w:r>
-      <w:r>
-        <w:t xml:space="preserve"> Backend</w:t>
+        <w:t xml:space="preserve">2.2.2  SCRUM en equipos multidisciplinarios</w:t>
       </w:r>
     </w:p>
     <w:p>
       <w:r>
-        <w:t>Se presentan los conceptos de arquitectura de software y servicios cloud que soportan la ejecución del sistema en producción.</w:t>
+        <w:t>Se explicará el framework SCRUM (Schwaber &amp; Sutherland, 2020) y su aplicación en un equipo compuesto por perfiles de distintas disciplinas (ingeniería de software, diseño instruccional, e</w:t>
+      </w:r>
+      <w:r>
+        <w:t>xpertos temáticos). Los puntos a cubrir son:</w:t>
       </w:r>
     </w:p>
     <w:p>
       <w:pPr>
-        <w:pStyle w:val="Ttulo4"/>
-        <w:numPr>
-          <w:ilvl w:val="0"/>
-          <w:numId w:val="0"/>
-        </w:numPr>
-        <w:ind w:left="864" w:hanging="864"/>
-      </w:pPr>
-      <w:r>
-        <w:t>2.3.</w:t>
-      </w:r>
-      <w:r>
-        <w:t xml:space="preserve">9 </w:t>
-      </w:r>
-      <w:r>
-        <w:t>Backend</w:t>
+        <w:pStyle w:val="Listaconvietas"/>
+      </w:pPr>
+      <w:r>
+        <w:t>Qué es SCRUM: framework ágil de desarrollo iterativo e incremental basado en sprints de duración fija, revisiones constantes y adaptación continua (Schwaber &amp; Sutherland, 2020).</w:t>
       </w:r>
     </w:p>
     <w:p>
-      <w:r>
-        <w:t>El backend de una aplicación es la capa de software responsable de procesar la lógica de neg</w:t>
-      </w:r>
-      <w:r>
-        <w:t>ocio, gestionar el acceso a datos y exponer servicios a los clientes mediante interfaces de red —típicamente APIs HTTP—. A diferencia del frontend, que gestiona la presentación e interacción con el usuario, el backend concentra el procesamiento, la persist</w:t>
-      </w:r>
-      <w:r>
-        <w:t>encia y la seguridad del sistema (Richardson, 2018).</w:t>
+      <w:pPr>
+        <w:pStyle w:val="Listaconvietas"/>
+      </w:pPr>
+      <w:r>
+        <w:lastRenderedPageBreak/>
+        <w:t xml:space="preserve">Por qué SCRUM es adecuado </w:t>
+      </w:r>
+      <w:r>
+        <w:t>para proyectos de IA: la calidad del output de un sistema LLM es desconocida hasta que se prueba con datos reales; los ciclos cortos permiten detectar y corregir problemas de prompt y arquitectura rápidamente.</w:t>
       </w:r>
     </w:p>
     <w:p>
       <w:pPr>
-        <w:pStyle w:val="Ttulo4"/>
-        <w:numPr>
-          <w:ilvl w:val="0"/>
-          <w:numId w:val="0"/>
-        </w:numPr>
-        <w:ind w:left="864" w:hanging="864"/>
-      </w:pPr>
-      <w:r>
-        <w:t>2.3.</w:t>
-      </w:r>
-      <w:r>
-        <w:t>10</w:t>
-      </w:r>
-      <w:r>
-        <w:t xml:space="preserve"> </w:t>
-      </w:r>
-      <w:r>
-        <w:t>Arquitectura del Sistema</w:t>
+        <w:pStyle w:val="Listaconvietas"/>
+      </w:pPr>
+      <w:r>
+        <w:t>La dimensión multidisciplinaria: el equipo int</w:t>
+      </w:r>
+      <w:r>
+        <w:t>egró roles de desarrollo (backend, frontend) con roles instruccionales (LxD, Docente Revisor), lo que exige una coordinación explícita y roles bien definidos dentro del sprint.</w:t>
       </w:r>
     </w:p>
     <w:p>
-      <w:r>
-        <w:t xml:space="preserve">La arquitectura de software </w:t>
-      </w:r>
-      <w:proofErr w:type="gramStart"/>
-      <w:r>
-        <w:t>define</w:t>
-      </w:r>
-      <w:proofErr w:type="gramEnd"/>
-      <w:r>
-        <w:t xml:space="preserve"> cómo los componentes de un sistema se organizan, comunican y escalan para cumplir los requisitos funcionales y no funcionales (Richardson, 2018</w:t>
-      </w:r>
-      <w:r>
-        <w:t>). En sistemas que procesan tareas de duración media o prolongada, la arquitectura incorpora capas especializadas: un punto de entrada que gestiona las solicitudes, un motor de cómputo que ejecuta el procesamiento, y componentes de mensajería que desacopla</w:t>
-      </w:r>
-      <w:r>
-        <w:t>n la recepción de una solicitud de su ejecución efectiva.</w:t>
+      <w:pPr>
+        <w:pStyle w:val="Listaconvietas"/>
+      </w:pPr>
+      <w:r>
+        <w:t>El rol del Docente Revisor como validador en cada sprint: cada iteración de pro</w:t>
+      </w:r>
+      <w:r>
+        <w:t>mpts se valida con expertos reales, no solo con métricas automáticas.</w:t>
       </w:r>
     </w:p>
     <w:p>
       <w:pPr>
-        <w:pStyle w:val="Ttulo4"/>
-        <w:numPr>
-          <w:ilvl w:val="0"/>
-          <w:numId w:val="0"/>
-        </w:numPr>
-        <w:ind w:left="864" w:hanging="864"/>
-      </w:pPr>
-      <w:r>
-        <w:lastRenderedPageBreak/>
-        <w:t>2.3.</w:t>
-      </w:r>
-      <w:r>
-        <w:t xml:space="preserve">11 </w:t>
-      </w:r>
-      <w:r>
-        <w:t>Procesamiento Asíncrono</w:t>
+        <w:pStyle w:val="Ttulo2"/>
+      </w:pPr>
+      <w:r>
+        <w:t>2.3  Bases Legales y Marco Normativo</w:t>
       </w:r>
     </w:p>
     <w:p>
-      <w:r>
-        <w:t>El procesamiento asíncrono es el patrón arquitectónico que desacopla la recepción de una solicitud de su ejecución. En un modelo síncrono, el cliente espera bloqueado hasta r</w:t>
-      </w:r>
-      <w:r>
-        <w:t>ecibir respuesta; para tareas de duración prolongada esto genera timeouts inaceptables (Kleppmann, 2017). En el modelo asíncrono, el cliente recibe una confirmación inmediata y el trabajo se ejecuta en segundo plano; al finalizar, el sistema notifica al cl</w:t>
-      </w:r>
-      <w:r>
-        <w:t>iente a través de un webhook o servicio de mensajería. Este patrón sigue el modelo productor-consumidor: una cola de mensajes actúa como intermediario entre quien solicita el trabajo y quien lo ejecuta (Richardson, 2018).</w:t>
+      <w:pPr>
+        <w:pStyle w:val="Ttulo3"/>
+      </w:pPr>
+      <w:r>
+        <w:t>2.3.1  Ley de Protección de Datos Personales (Ley 29733 — Perú)</w:t>
       </w:r>
     </w:p>
     <w:p>
-      <w:pPr>
-        <w:pStyle w:val="Ttulo4"/>
-        <w:numPr>
-          <w:ilvl w:val="0"/>
-          <w:numId w:val="0"/>
-        </w:numPr>
-        <w:ind w:left="864" w:hanging="864"/>
-      </w:pPr>
-      <w:r>
-        <w:t>2.3.</w:t>
-      </w:r>
-      <w:r>
-        <w:t xml:space="preserve">12 </w:t>
-      </w:r>
-      <w:r>
-        <w:t xml:space="preserve">Amazon Web </w:t>
-      </w:r>
-      <w:proofErr w:type="spellStart"/>
-      <w:r>
-        <w:t>Services</w:t>
-      </w:r>
-      <w:proofErr w:type="spellEnd"/>
-      <w:r>
-        <w:t xml:space="preserve"> (AWS)</w:t>
+      <w:pPr/>
+      <w:r>
+        <w:t>La Ley N.° 29733, Ley de Protección de Datos Personales (2011), y su Reglamento aprobado mediante D.S. N.° 003-2013-JUS, constituyen el marco normativo vigente en el Perú para el tratamiento de datos de carácter personal. La norma establece los principios de legalidad, consentimiento informado, finalidad, proporcionalidad y seguridad como ejes rectores de todo procesamiento. Su autoridad de supervisión es la Autoridad Nacional de Protección de Datos Personales (ANPDP), adscrita al Ministerio de Justicia y Derechos Humanos, con facultad sancionadora ante infracciones.</w:t>
       </w:r>
     </w:p>
     <w:p>
-      <w:r>
-        <w:t>Amazon W</w:t>
-      </w:r>
-      <w:r>
-        <w:t>eb Services (AWS) es la plataforma cloud seleccionada para el despliegue de la infraestructura backend del sistema. AWS ofrece un ecosistema de servicios gestionados bajo un modelo de pago por uso que abarca cómputo serverless, mensajería, almacenamiento y</w:t>
-      </w:r>
-      <w:r>
-        <w:t xml:space="preserve"> gestión de APIs, lo que reduce la complejidad operativa frente a infraestructura autogestionada (Wittig &amp; Wittig, 2018). Para implementar la arquitectura asíncrona descrita, el sistema utiliza cuatro servicios de AWS: un servicio de gestión y exposición d</w:t>
-      </w:r>
-      <w:r>
-        <w:t>e APIs HTTP (Amazon API Gateway), un motor de cómputo serverless que ejecuta el pipeline de agentes (AWS Lambda), un servicio de cola de mensajes que actúa como buffer de trabajos (Amazon SQS) y un sistema de notificaciones pub/sub que comunica la finaliza</w:t>
-      </w:r>
-      <w:r>
-        <w:t>ción del procesamiento (Amazon SNS). La configuración e integración específica de cada uno de estos servicios se describe en el Capítulo 3.</w:t>
-      </w:r>
-    </w:p>
-    <w:p>
-      <w:pPr>
-        <w:pStyle w:val="Ttulo2"/>
-        <w:numPr>
-          <w:ilvl w:val="0"/>
-          <w:numId w:val="0"/>
-        </w:numPr>
-        <w:ind w:left="576" w:hanging="576"/>
-      </w:pPr>
-      <w:r>
-        <w:t>2.4 Metodología</w:t>
-      </w:r>
-      <w:r>
-        <w:t xml:space="preserve"> de Desarrollo</w:t>
-      </w:r>
-    </w:p>
-    <w:p>
-      <w:r>
-        <w:t xml:space="preserve">En esta sección se describe el marco metodológico que guió el desarrollo del sistema </w:t>
-      </w:r>
-      <w:r>
-        <w:t>a lo largo del proyecto.</w:t>
-      </w:r>
-    </w:p>
-    <w:p>
-      <w:pPr>
-        <w:pStyle w:val="Ttulo3"/>
-        <w:numPr>
-          <w:ilvl w:val="0"/>
-          <w:numId w:val="0"/>
-        </w:numPr>
-        <w:ind w:left="720" w:hanging="720"/>
-      </w:pPr>
-      <w:r>
-        <w:t>2.4.1 SCRUM</w:t>
-      </w:r>
-      <w:r>
-        <w:t xml:space="preserve"> en equipos multidisciplinarios</w:t>
-      </w:r>
-    </w:p>
-    <w:p>
-      <w:r>
-        <w:t>Se explicará el framework SCRUM (Schwaber &amp; Sutherland, 2020) y su aplicación en un equipo compuesto por perfiles de distintas disciplinas (ingeniería de software, diseño instruccional, e</w:t>
-      </w:r>
-      <w:r>
-        <w:t>xpertos temáticos). Los puntos a cubrir son:</w:t>
-      </w:r>
-    </w:p>
-    <w:p>
-      <w:pPr>
-        <w:pStyle w:val="Listaconvietas"/>
-      </w:pPr>
-      <w:r>
-        <w:t>Qué es SCRUM: framework ágil de desarrollo iterativo e incremental basado en sprints de duración fija, revisiones constantes y adaptación continua (Schwaber &amp; Sutherland, 2020).</w:t>
-      </w:r>
-    </w:p>
-    <w:p>
-      <w:pPr>
-        <w:pStyle w:val="Listaconvietas"/>
-      </w:pPr>
-      <w:r>
-        <w:lastRenderedPageBreak/>
-        <w:t xml:space="preserve">Por qué SCRUM es adecuado </w:t>
-      </w:r>
-      <w:r>
-        <w:t>para proyectos de IA: la calidad del output de un sistema LLM es desconocida hasta que se prueba con datos reales; los ciclos cortos permiten detectar y corregir problemas de prompt y arquitectura rápidamente.</w:t>
-      </w:r>
-    </w:p>
-    <w:p>
-      <w:pPr>
-        <w:pStyle w:val="Listaconvietas"/>
-      </w:pPr>
-      <w:r>
-        <w:t>La dimensión multidisciplinaria: el equipo int</w:t>
-      </w:r>
-      <w:r>
-        <w:t>egró roles de desarrollo (backend, frontend) con roles instruccionales (LxD, Docente Revisor), lo que exige una coordinación explícita y roles bien definidos dentro del sprint.</w:t>
-      </w:r>
-    </w:p>
-    <w:p>
-      <w:pPr>
-        <w:pStyle w:val="Listaconvietas"/>
-      </w:pPr>
-      <w:r>
-        <w:t>El rol del Docente Revisor como validador en cada sprint: cada iteración de pro</w:t>
-      </w:r>
-      <w:r>
-        <w:t>mpts se valida con expertos reales, no solo con métricas automáticas.</w:t>
+      <w:pPr/>
+      <w:r>
+        <w:t>En el contexto del sistema desarrollado, la normativa resulta aplicable dado que el proceso instruccional involucra documentos institucionales que pueden contener referencias a personas identificables, como docentes y coordinadores académicos. Por ello, el diseño del sistema contempla: (i) procesamiento en entornos controlados sin almacenamiento persistente de datos personales; (ii) tratamiento de los documentos de entrada como insumos transitorios que no son indexados ni cedidos a terceros; y (iii) alineación con el principio de minimización de datos, procesando únicamente la información estrictamente necesaria para la generación de los materiales instruccionales.</w:t>
       </w:r>
     </w:p>
     <w:p>

</xml_diff>

<commit_message>
capitulo 2 referencias apa 7 mejoradas + cursiva + mendeley
</commit_message>
<xml_diff>
--- a/Tesis_Final.docx
+++ b/Tesis_Final.docx
@@ -14376,116 +14376,402 @@
       </w:r>
     </w:p>
     <w:p>
-      <w:r>
-        <w:t>Anderson, L. W., &amp; Krathwohl, D. R. (2001). A Taxonomy for Learning, Teaching, and Assessing: A Revision of Bloom's Taxonomy of Educational Objectives. Longman.</w:t>
+      <w:pPr>
+        <w:pStyle w:val="Normal"/>
+        <w:ind w:left="720" w:hanging="720"/>
+      </w:pPr>
+      <w:r>
+        <w:rPr/>
+        <w:t xml:space="preserve">Amazon Web Services. (2024). </w:t>
+      </w:r>
+      <w:r>
+        <w:rPr>
+          <w:i/>
+          <w:iCs/>
+        </w:rPr>
+        <w:t xml:space="preserve">AWS documentation</w:t>
+      </w:r>
+      <w:r>
+        <w:rPr/>
+        <w:t xml:space="preserve">. Amazon Web Services. Recuperado el 5 de mayo de 2026, de https://docs.aws.amazon.com</w:t>
       </w:r>
     </w:p>
     <w:p>
-      <w:r>
-        <w:t>Amazon Web Services. (2024). AWS Documentation. https://docs.aws.amazon.com</w:t>
+      <w:pPr>
+        <w:pStyle w:val="Normal"/>
+        <w:ind w:left="720" w:hanging="720"/>
+      </w:pPr>
+      <w:r>
+        <w:rPr/>
+        <w:t xml:space="preserve">Anderson, L. W., &amp; Krathwohl, D. R. (Eds.). (2001). </w:t>
+      </w:r>
+      <w:r>
+        <w:rPr>
+          <w:i/>
+          <w:iCs/>
+        </w:rPr>
+        <w:t xml:space="preserve">A taxonomy for learning, teaching, and assessing: A revision of Bloom's taxonomy of educational objectives</w:t>
+      </w:r>
+      <w:r>
+        <w:rPr/>
+        <w:t xml:space="preserve">. Longman.</w:t>
       </w:r>
     </w:p>
     <w:p>
-      <w:r>
-        <w:t>Bloom, B. S., Engelhart, M. D., Furst, E. J., Hill, W. H., &amp; Krathwohl, D. R. (1956). Taxonomy of Educational Objectives: The Classification of Educational Goals. David McKay.</w:t>
+      <w:pPr>
+        <w:pStyle w:val="Normal"/>
+        <w:ind w:left="720" w:hanging="720"/>
+      </w:pPr>
+      <w:r>
+        <w:rPr/>
+        <w:t xml:space="preserve">Bloom, B. S., Engelhart, M. D., Furst, E. J., Hill, W. H., &amp; Krathwohl, D. R. (1956). </w:t>
+      </w:r>
+      <w:r>
+        <w:rPr>
+          <w:i/>
+          <w:iCs/>
+        </w:rPr>
+        <w:t xml:space="preserve">Taxonomy of educational objectives: The classification of educational goals</w:t>
+      </w:r>
+      <w:r>
+        <w:rPr/>
+        <w:t xml:space="preserve">. David McKay.</w:t>
       </w:r>
     </w:p>
     <w:p>
-      <w:r>
-        <w:t>Brow</w:t>
-      </w:r>
-      <w:r>
-        <w:t>n, T. B., Mann, B., Ryder, N., Subbiah, M., Kaplan, J., Dhariwal, P., &amp; Amodei, D. (2020). Language models are few-shot learners. Advances in Neural Information Processing Systems, 33, 1877–1901.</w:t>
+      <w:pPr>
+        <w:pStyle w:val="Normal"/>
+        <w:ind w:left="720" w:hanging="720"/>
+      </w:pPr>
+      <w:r>
+        <w:rPr/>
+        <w:t xml:space="preserve">Brown, T. B., Mann, B., Ryder, N., Subbiah, M., Kaplan, J., Dhariwal, P., &amp; Amodei, D. (2020). Language models are few-shot learners. </w:t>
+      </w:r>
+      <w:r>
+        <w:rPr>
+          <w:i/>
+          <w:iCs/>
+        </w:rPr>
+        <w:t xml:space="preserve">Advances in Neural Information Processing Systems, 33</w:t>
+      </w:r>
+      <w:r>
+        <w:rPr/>
+        <w:t xml:space="preserve">, 1877–1901. https://doi.org/10.48550/arXiv.2005.14165</w:t>
       </w:r>
     </w:p>
     <w:p>
-      <w:r>
-        <w:t xml:space="preserve">Chase, H. (2024). LangGraph: Building stateful, multi-actor </w:t>
-      </w:r>
-      <w:r>
-        <w:t>applications with LLMs. LangChain, Inc. https://langchain-ai.github.io/langgraph/</w:t>
+      <w:pPr>
+        <w:pStyle w:val="Normal"/>
+        <w:ind w:left="720" w:hanging="720"/>
+      </w:pPr>
+      <w:r>
+        <w:rPr/>
+        <w:t xml:space="preserve">Chase, H. (2024). </w:t>
+      </w:r>
+      <w:r>
+        <w:rPr>
+          <w:i/>
+          <w:iCs/>
+        </w:rPr>
+        <w:t xml:space="preserve">LangGraph: Building stateful, multi-actor applications with LLMs</w:t>
+      </w:r>
+      <w:r>
+        <w:rPr/>
+        <w:t xml:space="preserve">. LangChain, Inc. Recuperado el 5 de mayo de 2026, de https://langchain-ai.github.io/langgraph/</w:t>
       </w:r>
     </w:p>
     <w:p>
-      <w:r>
-        <w:t>Kleppmann, M. (2017). Designing Data-Intensive Applications: The Big Ideas Behind Reliable, Scalable, and Maintainable Systems. O'Reilly Media.</w:t>
+      <w:pPr>
+        <w:pStyle w:val="Normal"/>
+        <w:ind w:left="720" w:hanging="720"/>
+      </w:pPr>
+      <w:r>
+        <w:rPr/>
+        <w:t xml:space="preserve">Decreto Supremo 003-2013-JUS. (2013). </w:t>
+      </w:r>
+      <w:r>
+        <w:rPr>
+          <w:i/>
+          <w:iCs/>
+        </w:rPr>
+        <w:t xml:space="preserve">Reglamento de la Ley N.° 29733, Ley de protección de datos personales</w:t>
+      </w:r>
+      <w:r>
+        <w:rPr/>
+        <w:t xml:space="preserve">. Presidencia de la República.</w:t>
       </w:r>
     </w:p>
     <w:p>
-      <w:r>
-        <w:t>Liu, P., Yuan, W., Fu, J., Jia</w:t>
-      </w:r>
-      <w:r>
-        <w:t>ng, Z., Hayashi, H., &amp; Neubig, G. (2023). Pre-train, prompt, and predict: A systematic survey of prompting methods in natural language processing. ACM Computing Surveys, 55(9), 1–35.</w:t>
+      <w:pPr>
+        <w:pStyle w:val="Normal"/>
+        <w:ind w:left="720" w:hanging="720"/>
+      </w:pPr>
+      <w:r>
+        <w:rPr/>
+        <w:t xml:space="preserve">Kleppmann, M. (2017). </w:t>
+      </w:r>
+      <w:r>
+        <w:rPr>
+          <w:i/>
+          <w:iCs/>
+        </w:rPr>
+        <w:t xml:space="preserve">Designing data-intensive applications: The big ideas behind reliable, scalable, and maintainable systems</w:t>
+      </w:r>
+      <w:r>
+        <w:rPr/>
+        <w:t xml:space="preserve">. O’Reilly Media.</w:t>
       </w:r>
     </w:p>
     <w:p>
-      <w:r>
-        <w:t>OpenAI. (2024). Structured outputs. OpenAI Platform Documentation. https:</w:t>
-      </w:r>
-      <w:r>
-        <w:t>//platform.openai.com/docs/guides/structured-outputs</w:t>
+      <w:pPr>
+        <w:pStyle w:val="Normal"/>
+        <w:ind w:left="720" w:hanging="720"/>
+      </w:pPr>
+      <w:r>
+        <w:rPr/>
+        <w:t xml:space="preserve">Ley 29733. (2011). </w:t>
+      </w:r>
+      <w:r>
+        <w:rPr>
+          <w:i/>
+          <w:iCs/>
+        </w:rPr>
+        <w:t xml:space="preserve">Ley de protección de datos personales</w:t>
+      </w:r>
+      <w:r>
+        <w:rPr/>
+        <w:t xml:space="preserve">. Congreso de la República del Perú.</w:t>
       </w:r>
     </w:p>
     <w:p>
-      <w:r>
-        <w:lastRenderedPageBreak/>
-        <w:t>Park, J. S., O'Brien, J. C., Cai, C. J., Morris, M. R., Liang, P., &amp; Bernstein, M. S. (2023). Generative agents: Interactive simulacra of human behavior. Proceedings of the 36th Annual ACM Symposium on U</w:t>
-      </w:r>
-      <w:r>
-        <w:t>ser Interface Software and Technology (UIST).</w:t>
+      <w:pPr>
+        <w:pStyle w:val="Normal"/>
+        <w:ind w:left="720" w:hanging="720"/>
+      </w:pPr>
+      <w:r>
+        <w:rPr/>
+        <w:t xml:space="preserve">Liu, P., Yuan, W., Fu, J., Jiang, Z., Hayashi, H., &amp; Neubig, G. (2023). Pre-train, prompt, and predict: A systematic survey of prompting methods in natural language processing. </w:t>
+      </w:r>
+      <w:r>
+        <w:rPr>
+          <w:i/>
+          <w:iCs/>
+        </w:rPr>
+        <w:t xml:space="preserve">ACM Computing Surveys, 55</w:t>
+      </w:r>
+      <w:r>
+        <w:rPr/>
+        <w:t xml:space="preserve">(9), 1–35. https://doi.org/10.1145/3560815</w:t>
       </w:r>
     </w:p>
     <w:p>
-      <w:r>
-        <w:t>Raschka, S., Patterson, J., &amp; Nolet, C. (2020). Machine learning in Python: Main developments and technology trends in data science, machine learning, and artificial intelligence. Information, 11(4), 193.</w:t>
+      <w:pPr>
+        <w:pStyle w:val="Normal"/>
+        <w:ind w:left="720" w:hanging="720"/>
+      </w:pPr>
+      <w:r>
+        <w:rPr/>
+        <w:t xml:space="preserve">OpenAI. (2024). </w:t>
+      </w:r>
+      <w:r>
+        <w:rPr>
+          <w:i/>
+          <w:iCs/>
+        </w:rPr>
+        <w:t xml:space="preserve">Structured outputs</w:t>
+      </w:r>
+      <w:r>
+        <w:rPr/>
+        <w:t xml:space="preserve">. OpenAI Platform Documentation. Recuperado el 5 de mayo de 2026, de https://platform.openai.com/docs/guides/structured-outputs</w:t>
       </w:r>
     </w:p>
     <w:p>
-      <w:r>
-        <w:t>Richa</w:t>
-      </w:r>
-      <w:r>
-        <w:t>rdson, C. (2018). Microservices Patterns: With Examples in Java. Manning Publications.</w:t>
+      <w:pPr>
+        <w:pStyle w:val="Normal"/>
+        <w:ind w:left="720" w:hanging="720"/>
+      </w:pPr>
+      <w:r>
+        <w:rPr/>
+        <w:t xml:space="preserve">Park, J. S., O’Brien, J. C., Cai, C. J., Morris, M. R., Liang, P., &amp; Bernstein, M. S. (2023). </w:t>
+      </w:r>
+      <w:r>
+        <w:rPr>
+          <w:i/>
+          <w:iCs/>
+        </w:rPr>
+        <w:t xml:space="preserve">Generative agents: Interactive simulacra of human behavior</w:t>
+      </w:r>
+      <w:r>
+        <w:rPr/>
+        <w:t xml:space="preserve"> [Ponencia]. 36th Annual ACM Symposium on User Interface Software and Technology. https://doi.org/10.1145/3586183.3606763</w:t>
       </w:r>
     </w:p>
     <w:p>
-      <w:r>
-        <w:t>Rigby, D. K., Sutherland, J., &amp; Takeuchi, H. (2016). Embracing agile. Harvard Business Review, 94(5), 40–50.</w:t>
+      <w:pPr>
+        <w:pStyle w:val="Normal"/>
+        <w:ind w:left="720" w:hanging="720"/>
+      </w:pPr>
+      <w:r>
+        <w:rPr/>
+        <w:t xml:space="preserve">Raschka, S., Patterson, J., &amp; Nolet, C. (2020). Machine learning in Python: Main developments and technology trends in data science, machine learning, and artificial intelligence. </w:t>
+      </w:r>
+      <w:r>
+        <w:rPr>
+          <w:i/>
+          <w:iCs/>
+        </w:rPr>
+        <w:t xml:space="preserve">Information, 11</w:t>
+      </w:r>
+      <w:r>
+        <w:rPr/>
+        <w:t xml:space="preserve">(4), 193. https://doi.org/10.3390/info11040193</w:t>
       </w:r>
     </w:p>
     <w:p>
-      <w:r>
-        <w:t>Schwaber, K., &amp; Sutherland, J. (2020). The Scrum Guide. Scru</w:t>
-      </w:r>
-      <w:r>
-        <w:t>m.org. https://scrumguides.org/scrum-guide.html</w:t>
+      <w:pPr>
+        <w:pStyle w:val="Normal"/>
+        <w:ind w:left="720" w:hanging="720"/>
+      </w:pPr>
+      <w:r>
+        <w:rPr/>
+        <w:t xml:space="preserve">Richardson, C. (2018). </w:t>
+      </w:r>
+      <w:r>
+        <w:rPr>
+          <w:i/>
+          <w:iCs/>
+        </w:rPr>
+        <w:t xml:space="preserve">Microservices patterns: With examples in Java</w:t>
+      </w:r>
+      <w:r>
+        <w:rPr/>
+        <w:t xml:space="preserve">. Manning Publications.</w:t>
       </w:r>
     </w:p>
     <w:p>
-      <w:r>
-        <w:t>Wei, J., Wang, X., Schuurmans, D., Bosma, M., Xia, F., Chi, E., &amp; Zhou, D. (2022). Chain-of-thought prompting elicits reasoning in large language models. Advances in Neural Information Processing Systems, 35,</w:t>
-      </w:r>
-      <w:r>
-        <w:t xml:space="preserve"> 24824–24837.</w:t>
+      <w:pPr>
+        <w:pStyle w:val="Normal"/>
+        <w:ind w:left="720" w:hanging="720"/>
+      </w:pPr>
+      <w:r>
+        <w:rPr/>
+        <w:t xml:space="preserve">Rigby, D. K., Sutherland, J., &amp; Takeuchi, H. (2016). Embracing agile. </w:t>
+      </w:r>
+      <w:r>
+        <w:rPr>
+          <w:i/>
+          <w:iCs/>
+        </w:rPr>
+        <w:t xml:space="preserve">Harvard Business Review, 94</w:t>
+      </w:r>
+      <w:r>
+        <w:rPr/>
+        <w:t xml:space="preserve">(5), 40–50.</w:t>
       </w:r>
     </w:p>
     <w:p>
-      <w:r>
-        <w:t>Wittig, M., &amp; Wittig, A. (2018). Amazon Web Services in Action (2nd ed.). Manning Publications.</w:t>
+      <w:pPr>
+        <w:pStyle w:val="Normal"/>
+        <w:ind w:left="720" w:hanging="720"/>
+      </w:pPr>
+      <w:r>
+        <w:rPr/>
+        <w:t xml:space="preserve">Schwaber, K., &amp; Sutherland, J. (2020). </w:t>
+      </w:r>
+      <w:r>
+        <w:rPr>
+          <w:i/>
+          <w:iCs/>
+        </w:rPr>
+        <w:t xml:space="preserve">The Scrum Guide</w:t>
+      </w:r>
+      <w:r>
+        <w:rPr/>
+        <w:t xml:space="preserve">. Scrum.org. https://scrumguides.org/scrum-guide.html</w:t>
       </w:r>
     </w:p>
     <w:p>
-      <w:r>
-        <w:t>Wu, Q., Bansal, G., Zhang, J., Wu, Y., Li, B., Zhu, E., &amp; Wang, C. (2023). AutoGen: Enabling next-gen LLM applications via multi-agent conversatio</w:t>
-      </w:r>
-      <w:r>
-        <w:t>n. arXiv preprint arXiv:2308.08155.</w:t>
+      <w:pPr>
+        <w:pStyle w:val="Normal"/>
+        <w:ind w:left="720" w:hanging="720"/>
+      </w:pPr>
+      <w:r>
+        <w:rPr/>
+        <w:t xml:space="preserve">Wei, J., Wang, X., Schuurmans, D., Bosma, M., Xia, F., Chi, E., &amp; Zhou, D. (2022). Chain-of-thought prompting elicits reasoning in large language models. </w:t>
+      </w:r>
+      <w:r>
+        <w:rPr>
+          <w:i/>
+          <w:iCs/>
+        </w:rPr>
+        <w:t xml:space="preserve">Advances in Neural Information Processing Systems, 35</w:t>
+      </w:r>
+      <w:r>
+        <w:rPr/>
+        <w:t xml:space="preserve">, 24824–24837. https://doi.org/10.48550/arXiv.2201.11903</w:t>
       </w:r>
     </w:p>
     <w:p>
-      <w:r>
-        <w:t>Yao, S., Zhao, J., Yu, D., Du, N., Shafran, I., Narasimhan, K., &amp; Cao, Y. (2023). ReAct: Synergizing reasoning and acting in language models. International Conference on Learning Representations (ICLR).</w:t>
+      <w:pPr>
+        <w:pStyle w:val="Normal"/>
+        <w:ind w:left="720" w:hanging="720"/>
+      </w:pPr>
+      <w:r>
+        <w:rPr/>
+        <w:t xml:space="preserve">Wittig, M., &amp; Wittig, A. (2018). </w:t>
+      </w:r>
+      <w:r>
+        <w:rPr>
+          <w:i/>
+          <w:iCs/>
+        </w:rPr>
+        <w:t xml:space="preserve">Amazon Web Services in action</w:t>
+      </w:r>
+      <w:r>
+        <w:rPr/>
+        <w:t xml:space="preserve"> (2nd ed.). Manning Publications.</w:t>
+      </w:r>
+    </w:p>
+    <w:p>
+      <w:pPr>
+        <w:pStyle w:val="Normal"/>
+        <w:ind w:left="720" w:hanging="720"/>
+      </w:pPr>
+      <w:r>
+        <w:rPr/>
+        <w:t xml:space="preserve">Wu, Q., Bansal, G., Zhang, J., Wu, Y., Li, B., Zhu, E., &amp; Wang, C. (2023). AutoGen: Enabling next-gen LLM applications via multi-agent conversation. </w:t>
+      </w:r>
+      <w:r>
+        <w:rPr>
+          <w:i/>
+          <w:iCs/>
+        </w:rPr>
+        <w:t xml:space="preserve">arXiv</w:t>
+      </w:r>
+      <w:r>
+        <w:rPr/>
+        <w:t xml:space="preserve">. https://doi.org/10.48550/arXiv.2308.08155</w:t>
+      </w:r>
+    </w:p>
+    <w:p>
+      <w:pPr>
+        <w:pStyle w:val="Normal"/>
+        <w:ind w:left="720" w:hanging="720"/>
+      </w:pPr>
+      <w:r>
+        <w:rPr/>
+        <w:t xml:space="preserve">Yao, S., Zhao, J., Yu, D., Du, N., Shafran, I., Narasimhan, K., &amp; Cao, Y. (2023). </w:t>
+      </w:r>
+      <w:r>
+        <w:rPr>
+          <w:i/>
+          <w:iCs/>
+        </w:rPr>
+        <w:t xml:space="preserve">ReAct: Synergizing reasoning and acting in language models</w:t>
+      </w:r>
+      <w:r>
+        <w:rPr/>
+        <w:t xml:space="preserve"> [Ponencia]. International Conference on Learning Representations. https://doi.org/10.48550/arXiv.2210.03629</w:t>
       </w:r>
     </w:p>
     <w:sectPr>

</xml_diff>

<commit_message>
ultimo cambio capitulo 2 referencias
</commit_message>
<xml_diff>
--- a/Tesis_Final.docx
+++ b/Tesis_Final.docx
@@ -533,13 +533,19 @@
         <w:fldChar w:fldCharType="begin"/>
       </w:r>
       <w:r>
+        <w:instrText xml:space="preserve"> INCLUDEPICTURE  "http://ile.pe/wp-content/uploads/2016/01/logo-upc.jpg" \* MERGEFORMATINET </w:instrText>
+      </w:r>
+      <w:r>
+        <w:fldChar w:fldCharType="separate"/>
+      </w:r>
+      <w:r>
+        <w:fldChar w:fldCharType="begin"/>
+      </w:r>
+      <w:r>
         <w:instrText xml:space="preserve"> </w:instrText>
       </w:r>
       <w:r>
-        <w:instrText>INCLUDEPICTURE  "http://ile.pe/wp-content/uploads/2016/01/logo-</w:instrText>
-      </w:r>
-      <w:r>
-        <w:instrText>upc.jpg" \* MERGEFORMATINET</w:instrText>
+        <w:instrText>INCLUDEPICTURE  "http://ile.pe/wp-content/uploads/2016/01/logo-upc.jpg" \* MERGEFORMATINET</w:instrText>
       </w:r>
       <w:r>
         <w:instrText xml:space="preserve"> </w:instrText>
@@ -548,7 +554,7 @@
         <w:fldChar w:fldCharType="separate"/>
       </w:r>
       <w:r>
-        <w:pict w14:anchorId="3B30EA8B">
+        <w:pict w14:anchorId="7E2F65D5">
           <v:shapetype id="_x0000_t75" coordsize="21600,21600" o:spt="75" o:preferrelative="t" path="m@4@5l@4@11@9@11@9@5xe" filled="f" stroked="f">
             <v:stroke joinstyle="miter"/>
             <v:formulas>
@@ -568,10 +574,13 @@
             <v:path o:extrusionok="f" gradientshapeok="t" o:connecttype="rect"/>
             <o:lock v:ext="edit" aspectratio="t"/>
           </v:shapetype>
-          <v:shape id="_x0000_i1025" type="#_x0000_t75" alt="Resultado de imagen para LOGO UPC" style="width:72.45pt;height:72.45pt">
+          <v:shape id="_x0000_i1025" type="#_x0000_t75" alt="Resultado de imagen para LOGO UPC" style="width:72.55pt;height:72.55pt">
             <v:imagedata r:id="rId11" r:href="rId12"/>
           </v:shape>
         </w:pict>
+      </w:r>
+      <w:r>
+        <w:fldChar w:fldCharType="end"/>
       </w:r>
       <w:r>
         <w:fldChar w:fldCharType="end"/>
@@ -3551,7 +3560,7 @@
                 <w:rStyle w:val="Hipervnculo"/>
                 <w:noProof/>
               </w:rPr>
-              <w:t xml:space="preserve">CAPÍTULO 2: MARCO TEÓRICO</w:t>
+              <w:t>CAPÍTULO 2: MARCO TEÓRICO</w:t>
             </w:r>
             <w:r>
               <w:rPr>
@@ -3574,12 +3583,17 @@
               </w:rPr>
               <w:instrText xml:space="preserve"> PAGEREF _Toc_new_ch2_00 \h </w:instrText>
             </w:r>
-            <w:r/>
             <w:r>
               <w:rPr>
                 <w:noProof/>
                 <w:webHidden/>
               </w:rPr>
+            </w:r>
+            <w:r>
+              <w:rPr>
+                <w:noProof/>
+                <w:webHidden/>
+              </w:rPr>
               <w:fldChar w:fldCharType="separate"/>
             </w:r>
             <w:r>
@@ -3587,7 +3601,7 @@
                 <w:noProof/>
                 <w:webHidden/>
               </w:rPr>
-              <w:t xml:space="preserve">XX</w:t>
+              <w:t>XX</w:t>
             </w:r>
             <w:r>
               <w:rPr>
@@ -3620,7 +3634,7 @@
                 <w:rStyle w:val="Hipervnculo"/>
                 <w:noProof/>
               </w:rPr>
-              <w:t xml:space="preserve">2.1</w:t>
+              <w:t>2.1</w:t>
             </w:r>
             <w:r>
               <w:rPr>
@@ -3633,7 +3647,7 @@
                 <w:rStyle w:val="Hipervnculo"/>
                 <w:noProof/>
               </w:rPr>
-              <w:t xml:space="preserve">Marco Conceptual</w:t>
+              <w:t>Marco Conceptual</w:t>
             </w:r>
             <w:r>
               <w:rPr>
@@ -3656,12 +3670,17 @@
               </w:rPr>
               <w:instrText xml:space="preserve"> PAGEREF _Toc_new_ch2_01 \h </w:instrText>
             </w:r>
-            <w:r/>
             <w:r>
               <w:rPr>
                 <w:noProof/>
                 <w:webHidden/>
               </w:rPr>
+            </w:r>
+            <w:r>
+              <w:rPr>
+                <w:noProof/>
+                <w:webHidden/>
+              </w:rPr>
               <w:fldChar w:fldCharType="separate"/>
             </w:r>
             <w:r>
@@ -3669,7 +3688,7 @@
                 <w:noProof/>
                 <w:webHidden/>
               </w:rPr>
-              <w:t xml:space="preserve">XX</w:t>
+              <w:t>XX</w:t>
             </w:r>
             <w:r>
               <w:rPr>
@@ -3703,7 +3722,7 @@
                 <w:rStyle w:val="Hipervnculo"/>
                 <w:noProof/>
               </w:rPr>
-              <w:t xml:space="preserve">2.1.1</w:t>
+              <w:t>2.1.1</w:t>
             </w:r>
             <w:r>
               <w:rPr>
@@ -3716,7 +3735,7 @@
                 <w:rStyle w:val="Hipervnculo"/>
                 <w:noProof/>
               </w:rPr>
-              <w:t xml:space="preserve">Agentes de IA</w:t>
+              <w:t>Agentes de IA</w:t>
             </w:r>
             <w:r>
               <w:rPr>
@@ -3739,12 +3758,17 @@
               </w:rPr>
               <w:instrText xml:space="preserve"> PAGEREF _Toc_new_ch2_02 \h </w:instrText>
             </w:r>
-            <w:r/>
             <w:r>
               <w:rPr>
                 <w:noProof/>
                 <w:webHidden/>
               </w:rPr>
+            </w:r>
+            <w:r>
+              <w:rPr>
+                <w:noProof/>
+                <w:webHidden/>
+              </w:rPr>
               <w:fldChar w:fldCharType="separate"/>
             </w:r>
             <w:r>
@@ -3752,7 +3776,7 @@
                 <w:noProof/>
                 <w:webHidden/>
               </w:rPr>
-              <w:t xml:space="preserve">XX</w:t>
+              <w:t>XX</w:t>
             </w:r>
             <w:r>
               <w:rPr>
@@ -3786,7 +3810,7 @@
                 <w:rStyle w:val="Hipervnculo"/>
                 <w:noProof/>
               </w:rPr>
-              <w:t xml:space="preserve">2.1.2</w:t>
+              <w:t>2.1.2</w:t>
             </w:r>
             <w:r>
               <w:rPr>
@@ -3799,7 +3823,7 @@
                 <w:rStyle w:val="Hipervnculo"/>
                 <w:noProof/>
               </w:rPr>
-              <w:t xml:space="preserve">Prompt Engineering</w:t>
+              <w:t>Prompt Engineering</w:t>
             </w:r>
             <w:r>
               <w:rPr>
@@ -3822,12 +3846,17 @@
               </w:rPr>
               <w:instrText xml:space="preserve"> PAGEREF _Toc_new_ch2_03 \h </w:instrText>
             </w:r>
-            <w:r/>
             <w:r>
               <w:rPr>
                 <w:noProof/>
                 <w:webHidden/>
               </w:rPr>
+            </w:r>
+            <w:r>
+              <w:rPr>
+                <w:noProof/>
+                <w:webHidden/>
+              </w:rPr>
               <w:fldChar w:fldCharType="separate"/>
             </w:r>
             <w:r>
@@ -3835,7 +3864,7 @@
                 <w:noProof/>
                 <w:webHidden/>
               </w:rPr>
-              <w:t xml:space="preserve">XX</w:t>
+              <w:t>XX</w:t>
             </w:r>
             <w:r>
               <w:rPr>
@@ -3869,7 +3898,7 @@
                 <w:rStyle w:val="Hipervnculo"/>
                 <w:noProof/>
               </w:rPr>
-              <w:t xml:space="preserve">2.1.3</w:t>
+              <w:t>2.1.3</w:t>
             </w:r>
             <w:r>
               <w:rPr>
@@ -3882,7 +3911,7 @@
                 <w:rStyle w:val="Hipervnculo"/>
                 <w:noProof/>
               </w:rPr>
-              <w:t xml:space="preserve">Structured Outputs (Salidas Estructuradas)</w:t>
+              <w:t>Structured Outputs (Salidas Estructuradas)</w:t>
             </w:r>
             <w:r>
               <w:rPr>
@@ -3905,12 +3934,17 @@
               </w:rPr>
               <w:instrText xml:space="preserve"> PAGEREF _Toc_new_ch2_04 \h </w:instrText>
             </w:r>
-            <w:r/>
             <w:r>
               <w:rPr>
                 <w:noProof/>
                 <w:webHidden/>
               </w:rPr>
+            </w:r>
+            <w:r>
+              <w:rPr>
+                <w:noProof/>
+                <w:webHidden/>
+              </w:rPr>
               <w:fldChar w:fldCharType="separate"/>
             </w:r>
             <w:r>
@@ -3918,7 +3952,7 @@
                 <w:noProof/>
                 <w:webHidden/>
               </w:rPr>
-              <w:t xml:space="preserve">XX</w:t>
+              <w:t>XX</w:t>
             </w:r>
             <w:r>
               <w:rPr>
@@ -3952,7 +3986,7 @@
                 <w:rStyle w:val="Hipervnculo"/>
                 <w:noProof/>
               </w:rPr>
-              <w:t xml:space="preserve">2.1.4</w:t>
+              <w:t>2.1.4</w:t>
             </w:r>
             <w:r>
               <w:rPr>
@@ -3965,7 +3999,7 @@
                 <w:rStyle w:val="Hipervnculo"/>
                 <w:noProof/>
               </w:rPr>
-              <w:t xml:space="preserve">Sistemas Multi-Agente</w:t>
+              <w:t>Sistemas Multi-Agente</w:t>
             </w:r>
             <w:r>
               <w:rPr>
@@ -3988,12 +4022,17 @@
               </w:rPr>
               <w:instrText xml:space="preserve"> PAGEREF _Toc_new_ch2_05 \h </w:instrText>
             </w:r>
-            <w:r/>
             <w:r>
               <w:rPr>
                 <w:noProof/>
                 <w:webHidden/>
               </w:rPr>
+            </w:r>
+            <w:r>
+              <w:rPr>
+                <w:noProof/>
+                <w:webHidden/>
+              </w:rPr>
               <w:fldChar w:fldCharType="separate"/>
             </w:r>
             <w:r>
@@ -4001,7 +4040,7 @@
                 <w:noProof/>
                 <w:webHidden/>
               </w:rPr>
-              <w:t xml:space="preserve">XX</w:t>
+              <w:t>XX</w:t>
             </w:r>
             <w:r>
               <w:rPr>
@@ -4035,7 +4074,7 @@
                 <w:rStyle w:val="Hipervnculo"/>
                 <w:noProof/>
               </w:rPr>
-              <w:t xml:space="preserve">2.1.5</w:t>
+              <w:t>2.1.5</w:t>
             </w:r>
             <w:r>
               <w:rPr>
@@ -4048,7 +4087,7 @@
                 <w:rStyle w:val="Hipervnculo"/>
                 <w:noProof/>
               </w:rPr>
-              <w:t xml:space="preserve">Nodos y Grafos de Estado</w:t>
+              <w:t>Nodos y Grafos de Estado</w:t>
             </w:r>
             <w:r>
               <w:rPr>
@@ -4071,12 +4110,17 @@
               </w:rPr>
               <w:instrText xml:space="preserve"> PAGEREF _Toc_new_ch2_06 \h </w:instrText>
             </w:r>
-            <w:r/>
             <w:r>
               <w:rPr>
                 <w:noProof/>
                 <w:webHidden/>
               </w:rPr>
+            </w:r>
+            <w:r>
+              <w:rPr>
+                <w:noProof/>
+                <w:webHidden/>
+              </w:rPr>
               <w:fldChar w:fldCharType="separate"/>
             </w:r>
             <w:r>
@@ -4084,7 +4128,7 @@
                 <w:noProof/>
                 <w:webHidden/>
               </w:rPr>
-              <w:t xml:space="preserve">XX</w:t>
+              <w:t>XX</w:t>
             </w:r>
             <w:r>
               <w:rPr>
@@ -4118,7 +4162,7 @@
                 <w:rStyle w:val="Hipervnculo"/>
                 <w:noProof/>
               </w:rPr>
-              <w:t xml:space="preserve">2.1.6</w:t>
+              <w:t>2.1.6</w:t>
             </w:r>
             <w:r>
               <w:rPr>
@@ -4131,7 +4175,7 @@
                 <w:rStyle w:val="Hipervnculo"/>
                 <w:noProof/>
               </w:rPr>
-              <w:t xml:space="preserve">Agent Framework: LangChain y LangGraph</w:t>
+              <w:t>Agent Framework: LangChain y LangGraph</w:t>
             </w:r>
             <w:r>
               <w:rPr>
@@ -4154,12 +4198,17 @@
               </w:rPr>
               <w:instrText xml:space="preserve"> PAGEREF _Toc_new_ch2_07 \h </w:instrText>
             </w:r>
-            <w:r/>
             <w:r>
               <w:rPr>
                 <w:noProof/>
                 <w:webHidden/>
               </w:rPr>
+            </w:r>
+            <w:r>
+              <w:rPr>
+                <w:noProof/>
+                <w:webHidden/>
+              </w:rPr>
               <w:fldChar w:fldCharType="separate"/>
             </w:r>
             <w:r>
@@ -4167,7 +4216,7 @@
                 <w:noProof/>
                 <w:webHidden/>
               </w:rPr>
-              <w:t xml:space="preserve">XX</w:t>
+              <w:t>XX</w:t>
             </w:r>
             <w:r>
               <w:rPr>
@@ -4201,7 +4250,7 @@
                 <w:rStyle w:val="Hipervnculo"/>
                 <w:noProof/>
               </w:rPr>
-              <w:t xml:space="preserve">2.1.7</w:t>
+              <w:t>2.1.7</w:t>
             </w:r>
             <w:r>
               <w:rPr>
@@ -4214,7 +4263,7 @@
                 <w:rStyle w:val="Hipervnculo"/>
                 <w:noProof/>
               </w:rPr>
-              <w:t xml:space="preserve">Python como ecosistema de desarrollo de IA</w:t>
+              <w:t>Python como ecosistema de desarrollo de IA</w:t>
             </w:r>
             <w:r>
               <w:rPr>
@@ -4237,12 +4286,17 @@
               </w:rPr>
               <w:instrText xml:space="preserve"> PAGEREF _Toc_new_ch2_08 \h </w:instrText>
             </w:r>
-            <w:r/>
             <w:r>
               <w:rPr>
                 <w:noProof/>
                 <w:webHidden/>
               </w:rPr>
+            </w:r>
+            <w:r>
+              <w:rPr>
+                <w:noProof/>
+                <w:webHidden/>
+              </w:rPr>
               <w:fldChar w:fldCharType="separate"/>
             </w:r>
             <w:r>
@@ -4250,7 +4304,7 @@
                 <w:noProof/>
                 <w:webHidden/>
               </w:rPr>
-              <w:t xml:space="preserve">XX</w:t>
+              <w:t>XX</w:t>
             </w:r>
             <w:r>
               <w:rPr>
@@ -4284,7 +4338,7 @@
                 <w:rStyle w:val="Hipervnculo"/>
                 <w:noProof/>
               </w:rPr>
-              <w:t xml:space="preserve">2.1.8</w:t>
+              <w:t>2.1.8</w:t>
             </w:r>
             <w:r>
               <w:rPr>
@@ -4297,7 +4351,7 @@
                 <w:rStyle w:val="Hipervnculo"/>
                 <w:noProof/>
               </w:rPr>
-              <w:t xml:space="preserve">Infraestructura Backend</w:t>
+              <w:t>Infraestructura Backend</w:t>
             </w:r>
             <w:r>
               <w:rPr>
@@ -4320,12 +4374,17 @@
               </w:rPr>
               <w:instrText xml:space="preserve"> PAGEREF _Toc_new_ch2_09 \h </w:instrText>
             </w:r>
-            <w:r/>
             <w:r>
               <w:rPr>
                 <w:noProof/>
                 <w:webHidden/>
               </w:rPr>
+            </w:r>
+            <w:r>
+              <w:rPr>
+                <w:noProof/>
+                <w:webHidden/>
+              </w:rPr>
               <w:fldChar w:fldCharType="separate"/>
             </w:r>
             <w:r>
@@ -4333,7 +4392,7 @@
                 <w:noProof/>
                 <w:webHidden/>
               </w:rPr>
-              <w:t xml:space="preserve">XX</w:t>
+              <w:t>XX</w:t>
             </w:r>
             <w:r>
               <w:rPr>
@@ -4367,7 +4426,7 @@
                 <w:rStyle w:val="Hipervnculo"/>
                 <w:noProof/>
               </w:rPr>
-              <w:t xml:space="preserve">2.1.9</w:t>
+              <w:t>2.1.9</w:t>
             </w:r>
             <w:r>
               <w:rPr>
@@ -4380,7 +4439,7 @@
                 <w:rStyle w:val="Hipervnculo"/>
                 <w:noProof/>
               </w:rPr>
-              <w:t xml:space="preserve">Backend</w:t>
+              <w:t>Backend</w:t>
             </w:r>
             <w:r>
               <w:rPr>
@@ -4403,12 +4462,17 @@
               </w:rPr>
               <w:instrText xml:space="preserve"> PAGEREF _Toc_new_ch2_10 \h </w:instrText>
             </w:r>
-            <w:r/>
             <w:r>
               <w:rPr>
                 <w:noProof/>
                 <w:webHidden/>
               </w:rPr>
+            </w:r>
+            <w:r>
+              <w:rPr>
+                <w:noProof/>
+                <w:webHidden/>
+              </w:rPr>
               <w:fldChar w:fldCharType="separate"/>
             </w:r>
             <w:r>
@@ -4416,7 +4480,7 @@
                 <w:noProof/>
                 <w:webHidden/>
               </w:rPr>
-              <w:t xml:space="preserve">XX</w:t>
+              <w:t>XX</w:t>
             </w:r>
             <w:r>
               <w:rPr>
@@ -4450,7 +4514,7 @@
                 <w:rStyle w:val="Hipervnculo"/>
                 <w:noProof/>
               </w:rPr>
-              <w:t xml:space="preserve">2.1.10</w:t>
+              <w:t>2.1.10</w:t>
             </w:r>
             <w:r>
               <w:rPr>
@@ -4463,7 +4527,7 @@
                 <w:rStyle w:val="Hipervnculo"/>
                 <w:noProof/>
               </w:rPr>
-              <w:t xml:space="preserve">Arquitectura del Sistema</w:t>
+              <w:t>Arquitectura del Sistema</w:t>
             </w:r>
             <w:r>
               <w:rPr>
@@ -4486,12 +4550,17 @@
               </w:rPr>
               <w:instrText xml:space="preserve"> PAGEREF _Toc_new_ch2_11 \h </w:instrText>
             </w:r>
-            <w:r/>
             <w:r>
               <w:rPr>
                 <w:noProof/>
                 <w:webHidden/>
               </w:rPr>
+            </w:r>
+            <w:r>
+              <w:rPr>
+                <w:noProof/>
+                <w:webHidden/>
+              </w:rPr>
               <w:fldChar w:fldCharType="separate"/>
             </w:r>
             <w:r>
@@ -4499,7 +4568,7 @@
                 <w:noProof/>
                 <w:webHidden/>
               </w:rPr>
-              <w:t xml:space="preserve">XX</w:t>
+              <w:t>XX</w:t>
             </w:r>
             <w:r>
               <w:rPr>
@@ -4533,7 +4602,7 @@
                 <w:rStyle w:val="Hipervnculo"/>
                 <w:noProof/>
               </w:rPr>
-              <w:t xml:space="preserve">2.1.11</w:t>
+              <w:t>2.1.11</w:t>
             </w:r>
             <w:r>
               <w:rPr>
@@ -4546,7 +4615,7 @@
                 <w:rStyle w:val="Hipervnculo"/>
                 <w:noProof/>
               </w:rPr>
-              <w:t xml:space="preserve">Procesamiento Asíncrono</w:t>
+              <w:t>Procesamiento Asíncrono</w:t>
             </w:r>
             <w:r>
               <w:rPr>
@@ -4569,12 +4638,17 @@
               </w:rPr>
               <w:instrText xml:space="preserve"> PAGEREF _Toc_new_ch2_12 \h </w:instrText>
             </w:r>
-            <w:r/>
             <w:r>
               <w:rPr>
                 <w:noProof/>
                 <w:webHidden/>
               </w:rPr>
+            </w:r>
+            <w:r>
+              <w:rPr>
+                <w:noProof/>
+                <w:webHidden/>
+              </w:rPr>
               <w:fldChar w:fldCharType="separate"/>
             </w:r>
             <w:r>
@@ -4582,7 +4656,7 @@
                 <w:noProof/>
                 <w:webHidden/>
               </w:rPr>
-              <w:t xml:space="preserve">XX</w:t>
+              <w:t>XX</w:t>
             </w:r>
             <w:r>
               <w:rPr>
@@ -4616,7 +4690,7 @@
                 <w:rStyle w:val="Hipervnculo"/>
                 <w:noProof/>
               </w:rPr>
-              <w:t xml:space="preserve">2.1.12</w:t>
+              <w:t>2.1.12</w:t>
             </w:r>
             <w:r>
               <w:rPr>
@@ -4629,7 +4703,7 @@
                 <w:rStyle w:val="Hipervnculo"/>
                 <w:noProof/>
               </w:rPr>
-              <w:t xml:space="preserve">Amazon Web Services (AWS)</w:t>
+              <w:t>Amazon Web Services (AWS)</w:t>
             </w:r>
             <w:r>
               <w:rPr>
@@ -4652,12 +4726,17 @@
               </w:rPr>
               <w:instrText xml:space="preserve"> PAGEREF _Toc_new_ch2_13 \h </w:instrText>
             </w:r>
-            <w:r/>
             <w:r>
               <w:rPr>
                 <w:noProof/>
                 <w:webHidden/>
               </w:rPr>
+            </w:r>
+            <w:r>
+              <w:rPr>
+                <w:noProof/>
+                <w:webHidden/>
+              </w:rPr>
               <w:fldChar w:fldCharType="separate"/>
             </w:r>
             <w:r>
@@ -4665,7 +4744,7 @@
                 <w:noProof/>
                 <w:webHidden/>
               </w:rPr>
-              <w:t xml:space="preserve">XX</w:t>
+              <w:t>XX</w:t>
             </w:r>
             <w:r>
               <w:rPr>
@@ -4698,7 +4777,7 @@
                 <w:rStyle w:val="Hipervnculo"/>
                 <w:noProof/>
               </w:rPr>
-              <w:t xml:space="preserve">2.2</w:t>
+              <w:t>2.2</w:t>
             </w:r>
             <w:r>
               <w:rPr>
@@ -4711,7 +4790,7 @@
                 <w:rStyle w:val="Hipervnculo"/>
                 <w:noProof/>
               </w:rPr>
-              <w:t xml:space="preserve">Estándares, Frameworks y Buenas Prácticas</w:t>
+              <w:t>Estándares, Frameworks y Buenas Prácticas</w:t>
             </w:r>
             <w:r>
               <w:rPr>
@@ -4734,12 +4813,17 @@
               </w:rPr>
               <w:instrText xml:space="preserve"> PAGEREF _Toc_new_ch2_14 \h </w:instrText>
             </w:r>
-            <w:r/>
             <w:r>
               <w:rPr>
                 <w:noProof/>
                 <w:webHidden/>
               </w:rPr>
+            </w:r>
+            <w:r>
+              <w:rPr>
+                <w:noProof/>
+                <w:webHidden/>
+              </w:rPr>
               <w:fldChar w:fldCharType="separate"/>
             </w:r>
             <w:r>
@@ -4747,7 +4831,7 @@
                 <w:noProof/>
                 <w:webHidden/>
               </w:rPr>
-              <w:t xml:space="preserve">XX</w:t>
+              <w:t>XX</w:t>
             </w:r>
             <w:r>
               <w:rPr>
@@ -4781,7 +4865,7 @@
                 <w:rStyle w:val="Hipervnculo"/>
                 <w:noProof/>
               </w:rPr>
-              <w:t xml:space="preserve">2.2.1</w:t>
+              <w:t>2.2.1</w:t>
             </w:r>
             <w:r>
               <w:rPr>
@@ -4794,7 +4878,7 @@
                 <w:rStyle w:val="Hipervnculo"/>
                 <w:noProof/>
               </w:rPr>
-              <w:t xml:space="preserve">Taxonomía de Bloom</w:t>
+              <w:t>Taxonomía de Bloom</w:t>
             </w:r>
             <w:r>
               <w:rPr>
@@ -4817,12 +4901,17 @@
               </w:rPr>
               <w:instrText xml:space="preserve"> PAGEREF _Toc_new_ch2_15 \h </w:instrText>
             </w:r>
-            <w:r/>
             <w:r>
               <w:rPr>
                 <w:noProof/>
                 <w:webHidden/>
               </w:rPr>
+            </w:r>
+            <w:r>
+              <w:rPr>
+                <w:noProof/>
+                <w:webHidden/>
+              </w:rPr>
               <w:fldChar w:fldCharType="separate"/>
             </w:r>
             <w:r>
@@ -4830,7 +4919,7 @@
                 <w:noProof/>
                 <w:webHidden/>
               </w:rPr>
-              <w:t xml:space="preserve">XX</w:t>
+              <w:t>XX</w:t>
             </w:r>
             <w:r>
               <w:rPr>
@@ -4864,7 +4953,7 @@
                 <w:rStyle w:val="Hipervnculo"/>
                 <w:noProof/>
               </w:rPr>
-              <w:t xml:space="preserve">2.2.2</w:t>
+              <w:t>2.2.2</w:t>
             </w:r>
             <w:r>
               <w:rPr>
@@ -4877,7 +4966,7 @@
                 <w:rStyle w:val="Hipervnculo"/>
                 <w:noProof/>
               </w:rPr>
-              <w:t xml:space="preserve">SCRUM en equipos multidisciplinarios</w:t>
+              <w:t>SCRUM en equipos multidisciplinarios</w:t>
             </w:r>
             <w:r>
               <w:rPr>
@@ -4900,12 +4989,17 @@
               </w:rPr>
               <w:instrText xml:space="preserve"> PAGEREF _Toc_new_ch2_16 \h </w:instrText>
             </w:r>
-            <w:r/>
             <w:r>
               <w:rPr>
                 <w:noProof/>
                 <w:webHidden/>
               </w:rPr>
+            </w:r>
+            <w:r>
+              <w:rPr>
+                <w:noProof/>
+                <w:webHidden/>
+              </w:rPr>
               <w:fldChar w:fldCharType="separate"/>
             </w:r>
             <w:r>
@@ -4913,7 +5007,7 @@
                 <w:noProof/>
                 <w:webHidden/>
               </w:rPr>
-              <w:t xml:space="preserve">XX</w:t>
+              <w:t>XX</w:t>
             </w:r>
             <w:r>
               <w:rPr>
@@ -4946,7 +5040,7 @@
                 <w:rStyle w:val="Hipervnculo"/>
                 <w:noProof/>
               </w:rPr>
-              <w:t xml:space="preserve">2.3</w:t>
+              <w:t>2.3</w:t>
             </w:r>
             <w:r>
               <w:rPr>
@@ -4959,7 +5053,7 @@
                 <w:rStyle w:val="Hipervnculo"/>
                 <w:noProof/>
               </w:rPr>
-              <w:t xml:space="preserve">Bases Legales y Marco Normativo</w:t>
+              <w:t>Bases Legales y Marco Normativo</w:t>
             </w:r>
             <w:r>
               <w:rPr>
@@ -4982,12 +5076,17 @@
               </w:rPr>
               <w:instrText xml:space="preserve"> PAGEREF _Toc_new_ch2_17 \h </w:instrText>
             </w:r>
-            <w:r/>
             <w:r>
               <w:rPr>
                 <w:noProof/>
                 <w:webHidden/>
               </w:rPr>
+            </w:r>
+            <w:r>
+              <w:rPr>
+                <w:noProof/>
+                <w:webHidden/>
+              </w:rPr>
               <w:fldChar w:fldCharType="separate"/>
             </w:r>
             <w:r>
@@ -4995,7 +5094,7 @@
                 <w:noProof/>
                 <w:webHidden/>
               </w:rPr>
-              <w:t xml:space="preserve">XX</w:t>
+              <w:t>XX</w:t>
             </w:r>
             <w:r>
               <w:rPr>
@@ -5029,7 +5128,7 @@
                 <w:rStyle w:val="Hipervnculo"/>
                 <w:noProof/>
               </w:rPr>
-              <w:t xml:space="preserve">2.3.1</w:t>
+              <w:t>2.3.1</w:t>
             </w:r>
             <w:r>
               <w:rPr>
@@ -5042,7 +5141,7 @@
                 <w:rStyle w:val="Hipervnculo"/>
                 <w:noProof/>
               </w:rPr>
-              <w:t xml:space="preserve">Ley de Protección de Datos Personales (Ley 29733 — Perú)</w:t>
+              <w:t>Ley de Protección de Datos Personales (Ley 29733 — Perú)</w:t>
             </w:r>
             <w:r>
               <w:rPr>
@@ -5065,12 +5164,17 @@
               </w:rPr>
               <w:instrText xml:space="preserve"> PAGEREF _Toc_new_ch2_18 \h </w:instrText>
             </w:r>
-            <w:r/>
             <w:r>
               <w:rPr>
                 <w:noProof/>
                 <w:webHidden/>
               </w:rPr>
+            </w:r>
+            <w:r>
+              <w:rPr>
+                <w:noProof/>
+                <w:webHidden/>
+              </w:rPr>
               <w:fldChar w:fldCharType="separate"/>
             </w:r>
             <w:r>
@@ -5078,7 +5182,7 @@
                 <w:noProof/>
                 <w:webHidden/>
               </w:rPr>
-              <w:t xml:space="preserve">XX</w:t>
+              <w:t>XX</w:t>
             </w:r>
             <w:r>
               <w:rPr>
@@ -5111,7 +5215,7 @@
                 <w:rStyle w:val="Hipervnculo"/>
                 <w:noProof/>
               </w:rPr>
-              <w:t xml:space="preserve">Referencias del Capítulo</w:t>
+              <w:t>Referencias del Capítulo</w:t>
             </w:r>
             <w:r>
               <w:rPr>
@@ -5134,12 +5238,17 @@
               </w:rPr>
               <w:instrText xml:space="preserve"> PAGEREF _Toc_new_ch2_19 \h </w:instrText>
             </w:r>
-            <w:r/>
             <w:r>
               <w:rPr>
                 <w:noProof/>
                 <w:webHidden/>
               </w:rPr>
+            </w:r>
+            <w:r>
+              <w:rPr>
+                <w:noProof/>
+                <w:webHidden/>
+              </w:rPr>
               <w:fldChar w:fldCharType="separate"/>
             </w:r>
             <w:r>
@@ -5147,7 +5256,7 @@
                 <w:noProof/>
                 <w:webHidden/>
               </w:rPr>
-              <w:t xml:space="preserve">XX</w:t>
+              <w:t>XX</w:t>
             </w:r>
             <w:r>
               <w:rPr>
@@ -8912,13 +9021,7 @@
         <w:rPr>
           <w:lang w:val="es-PE"/>
         </w:rPr>
-        <w:t xml:space="preserve"> mensuales que reflejan el t</w:t>
-      </w:r>
-      <w:r>
-        <w:rPr>
-          <w:lang w:val="es-PE"/>
-        </w:rPr>
-        <w:t>rabajo efectivamente realizado.</w:t>
+        <w:t xml:space="preserve"> mensuales que reflejan el trabajo efectivamente realizado.</w:t>
       </w:r>
     </w:p>
     <w:p>
@@ -9268,13 +9371,7 @@
               <w:rPr>
                 <w:lang w:val="es-PE"/>
               </w:rPr>
-              <w:t>- Diseñ</w:t>
-            </w:r>
-            <w:r>
-              <w:rPr>
-                <w:lang w:val="es-PE"/>
-              </w:rPr>
-              <w:t xml:space="preserve">o inicial del </w:t>
+              <w:t xml:space="preserve">- Diseño inicial del </w:t>
             </w:r>
             <w:proofErr w:type="spellStart"/>
             <w:r>
@@ -9521,13 +9618,7 @@
               <w:rPr>
                 <w:lang w:val="es-PE"/>
               </w:rPr>
-              <w:t xml:space="preserve"> de documentos → estructura JSO</w:t>
-            </w:r>
-            <w:r>
-              <w:rPr>
-                <w:lang w:val="es-PE"/>
-              </w:rPr>
-              <w:t>N.</w:t>
+              <w:t xml:space="preserve"> de documentos → estructura JSON.</w:t>
             </w:r>
           </w:p>
           <w:p>
@@ -9649,13 +9740,7 @@
               <w:rPr>
                 <w:lang w:val="es-PE"/>
               </w:rPr>
-              <w:t xml:space="preserve"> generad</w:t>
-            </w:r>
-            <w:r>
-              <w:rPr>
-                <w:lang w:val="es-PE"/>
-              </w:rPr>
-              <w:t>o como primer output del sistema</w:t>
+              <w:t xml:space="preserve"> generado como primer output del sistema</w:t>
             </w:r>
           </w:p>
         </w:tc>
@@ -9745,13 +9830,7 @@
                 <w:lang w:val="es-PE"/>
               </w:rPr>
               <w:lastRenderedPageBreak/>
-              <w:t>- Integración del pipeline completo: Diseño → Generación IP</w:t>
-            </w:r>
-            <w:r>
-              <w:rPr>
-                <w:lang w:val="es-PE"/>
-              </w:rPr>
-              <w:t>ES.</w:t>
+              <w:t>- Integración del pipeline completo: Diseño → Generación IPES.</w:t>
             </w:r>
           </w:p>
           <w:p>
@@ -9874,10 +9953,7 @@
           </w:tcPr>
           <w:p>
             <w:r>
-              <w:t xml:space="preserve">Dic 1 – Dic 31, </w:t>
-            </w:r>
-            <w:r>
-              <w:t>2025</w:t>
+              <w:t>Dic 1 – Dic 31, 2025</w:t>
             </w:r>
           </w:p>
         </w:tc>
@@ -9980,13 +10056,7 @@
               <w:rPr>
                 <w:lang w:val="es-PE"/>
               </w:rPr>
-              <w:t>- 15 dic: Demo con coordinadora DAV (Dirección Ac</w:t>
-            </w:r>
-            <w:r>
-              <w:rPr>
-                <w:lang w:val="es-PE"/>
-              </w:rPr>
-              <w:t xml:space="preserve">adémica Virtual): presentó interés en la generación IPES y en el flujo paso a paso de la plataforma; solicitó </w:t>
+              <w:t xml:space="preserve">- 15 dic: Demo con coordinadora DAV (Dirección Académica Virtual): presentó interés en la generación IPES y en el flujo paso a paso de la plataforma; solicitó </w:t>
             </w:r>
             <w:proofErr w:type="spellStart"/>
             <w:r>
@@ -10053,13 +10123,7 @@
               <w:rPr>
                 <w:lang w:val="es-PE"/>
               </w:rPr>
-              <w:t>stakehol</w:t>
-            </w:r>
-            <w:r>
-              <w:rPr>
-                <w:lang w:val="es-PE"/>
-              </w:rPr>
-              <w:t>der</w:t>
+              <w:t>stakeholder</w:t>
             </w:r>
             <w:proofErr w:type="spellEnd"/>
             <w:r>
@@ -10246,13 +10310,7 @@
               <w:rPr>
                 <w:lang w:val="es-PE"/>
               </w:rPr>
-              <w:t>-feb: jefe directo indica preparar paquete del proyecto para presentación a gerencia; proyecto queda</w:t>
-            </w:r>
-            <w:r>
-              <w:rPr>
-                <w:lang w:val="es-PE"/>
-              </w:rPr>
-              <w:t xml:space="preserve"> en espera.</w:t>
+              <w:t>-feb: jefe directo indica preparar paquete del proyecto para presentación a gerencia; proyecto queda en espera.</w:t>
             </w:r>
           </w:p>
         </w:tc>
@@ -10387,13 +10445,7 @@
               <w:rPr>
                 <w:lang w:val="es-PE"/>
               </w:rPr>
-              <w:t xml:space="preserve">-mar: reunión con jefe: revisión del estado del proyecto; IPES </w:t>
-            </w:r>
-            <w:r>
-              <w:rPr>
-                <w:lang w:val="es-PE"/>
-              </w:rPr>
-              <w:t xml:space="preserve">validado, plataforma </w:t>
+              <w:t xml:space="preserve">-mar: reunión con jefe: revisión del estado del proyecto; IPES validado, plataforma </w:t>
             </w:r>
             <w:r>
               <w:rPr>
@@ -10426,13 +10478,7 @@
               <w:rPr>
                 <w:lang w:val="es-PE"/>
               </w:rPr>
-              <w:t>- Segunda quincena: validación con docentes revisores — contenido valorado como interesante con ob</w:t>
-            </w:r>
-            <w:r>
-              <w:rPr>
-                <w:lang w:val="es-PE"/>
-              </w:rPr>
-              <w:t>servaciones menores.</w:t>
+              <w:t>- Segunda quincena: validación con docentes revisores — contenido valorado como interesante con observaciones menores.</w:t>
             </w:r>
           </w:p>
           <w:p>
@@ -10605,13 +10651,7 @@
               <w:rPr>
                 <w:lang w:val="es-PE"/>
               </w:rPr>
-              <w:t xml:space="preserve">- Pulido </w:t>
-            </w:r>
-            <w:r>
-              <w:rPr>
-                <w:lang w:val="es-PE"/>
-              </w:rPr>
-              <w:t>continuo de IPES y generación de contenido.</w:t>
+              <w:t>- Pulido continuo de IPES y generación de contenido.</w:t>
             </w:r>
           </w:p>
           <w:p>
@@ -10657,13 +10697,7 @@
                 <w:lang w:val="es-PE"/>
               </w:rPr>
               <w:lastRenderedPageBreak/>
-              <w:t>Referencias al conte</w:t>
-            </w:r>
-            <w:r>
-              <w:rPr>
-                <w:lang w:val="es-PE"/>
-              </w:rPr>
-              <w:t>nido) y CU7 (Generación de Consignas).</w:t>
+              <w:t>Referencias al contenido) y CU7 (Generación de Consignas).</w:t>
             </w:r>
           </w:p>
           <w:p>
@@ -13704,31 +13738,20 @@
     </w:p>
     <w:p>
       <w:pPr>
-        <w:pStyle w:val="Normal"/>
-        <w:numPr>
-          <w:ilvl w:val="0"/>
-          <w:numId w:val="0"/>
-        </w:numPr>
         <w:ind w:left="576" w:hanging="576"/>
       </w:pPr>
       <w:r>
-        <w:t xml:space="preserve">El Proceso de Producción Instruccional</w:t>
+        <w:t>El Proceso de Producción Instruccional</w:t>
       </w:r>
     </w:p>
     <w:p>
       <w:r>
-        <w:t xml:space="preserve">En esta sección se describen los elementos que componen el proceso de </w:t>
-      </w:r>
-      <w:r>
-        <w:t>producción de cursos virtuales en una institución de educación superior: los documentos de entrada que definen el curso y los artefactos que se producen a lo largo del proceso.</w:t>
+        <w:t>En esta sección se describen los elementos que componen el proceso de producción de cursos virtuales en una institución de educación superior: los documentos de entrada que definen el curso y los artefactos que se producen a lo largo del proceso.</w:t>
       </w:r>
     </w:p>
     <w:p>
       <w:r>
-        <w:t>Se describen los document</w:t>
-      </w:r>
-      <w:r>
-        <w:t xml:space="preserve">os e insumos que intervienen en el proceso de producción instruccional. El proceso parte de dos documentos de entrada: el </w:t>
+        <w:t xml:space="preserve">Se describen los documentos e insumos que intervienen en el proceso de producción instruccional. El proceso parte de dos documentos de entrada: el </w:t>
       </w:r>
       <w:r>
         <w:rPr>
@@ -13743,40 +13766,28 @@
         <w:rPr>
           <w:b/>
         </w:rPr>
-        <w:t>kic</w:t>
+        <w:t>kickoff</w:t>
+      </w:r>
+      <w:r>
+        <w:t xml:space="preserve"> o acta de reunión de inicio, que recoge los acuerdos pedagógicos previos a la producción (perfil del estudiante, enfoque didáctico y criterios específicos del curso). A partir de estos insumos, el proceso genera tres artefactos de forma secuencial: el </w:t>
       </w:r>
       <w:r>
         <w:rPr>
           <w:b/>
         </w:rPr>
-        <w:t>koff</w:t>
-      </w:r>
-      <w:r>
-        <w:t xml:space="preserve"> o acta de reunión de inicio, que recoge los acuerdos pedagógicos previos a la producción (perfil del estudiante, enfoque didáctico y criterios específicos del curso). A partir de estos insumos, el proceso genera tres artefactos de forma secuencial: el</w:t>
-      </w:r>
-      <w:r>
-        <w:t xml:space="preserve"> </w:t>
+        <w:t>IPES</w:t>
+      </w:r>
+      <w:r>
+        <w:t xml:space="preserve"> (Introducción, Presentaciones y Ejercicios), documento de planificación instruccional semanal que actúa como hoja de ruta del contenido a producir; el </w:t>
       </w:r>
       <w:r>
         <w:rPr>
           <w:b/>
         </w:rPr>
-        <w:t>IPES</w:t>
-      </w:r>
-      <w:r>
-        <w:t xml:space="preserve"> (Introducción, Presentaciones y Ejercicios), documento de planificación instruccional semanal que actúa como hoja de ruta del contenido a producir; el </w:t>
-      </w:r>
-      <w:r>
-        <w:rPr>
-          <w:b/>
-        </w:rPr>
         <w:t>Material Base</w:t>
       </w:r>
       <w:r>
-        <w:t>, que constituye el contenido final que consumen los estudiantes (guiones de video, se</w:t>
-      </w:r>
-      <w:r>
-        <w:t xml:space="preserve">paratas, recursos interactivos); y las </w:t>
+        <w:t xml:space="preserve">, que constituye el contenido final que consumen los estudiantes (guiones de video, separatas, recursos interactivos); y las </w:t>
       </w:r>
       <w:r>
         <w:rPr>
@@ -13798,15 +13809,12 @@
         <w:ind w:left="720" w:hanging="720"/>
       </w:pPr>
       <w:r>
-        <w:t xml:space="preserve">2.1.1  Agentes de IA</w:t>
+        <w:t>2.1.1  Agentes de IA</w:t>
       </w:r>
     </w:p>
     <w:p>
       <w:r>
-        <w:t>Se presentan los conceptos q</w:t>
-      </w:r>
-      <w:r>
-        <w:t>ue conforman la capa de inteligencia artificial del sistema: el mecanismo de instrucción de los modelos, la estructura de sus salidas, la especialización por agente, el control de flujo y el framework de orquestación.</w:t>
+        <w:t>Se presentan los conceptos que conforman la capa de inteligencia artificial del sistema: el mecanismo de instrucción de los modelos, la estructura de sus salidas, la especialización por agente, el control de flujo y el framework de orquestación.</w:t>
       </w:r>
     </w:p>
     <w:p>
@@ -13818,23 +13826,13 @@
         </w:numPr>
         <w:ind w:left="864" w:hanging="864"/>
       </w:pPr>
-      <w:proofErr w:type="spellStart"/>
-      <w:proofErr w:type="spellEnd"/>
-      <w:proofErr w:type="spellStart"/>
-      <w:proofErr w:type="spellEnd"/>
-      <w:r>
-        <w:t xml:space="preserve">2.1.2  Prompt Engineering</w:t>
+      <w:r>
+        <w:t>2.1.2  Prompt Engineering</w:t>
       </w:r>
     </w:p>
     <w:p>
       <w:r>
-        <w:t>El diseño de prompt</w:t>
-      </w:r>
-      <w:r>
-        <w:t>s es la principal interfaz de programación con los modelos de lenguaje grandes. En este trabajo, cada agente del sistema está definido por un prompt que especifica su rol, sus reglas obligatorias y sus lineamientos de criterio. Se explicará por qué es rele</w:t>
-      </w:r>
-      <w:r>
-        <w:t>vante para esta tesis:</w:t>
+        <w:t>El diseño de prompts es la principal interfaz de programación con los modelos de lenguaje grandes. En este trabajo, cada agente del sistema está definido por un prompt que especifica su rol, sus reglas obligatorias y sus lineamientos de criterio. Se explicará por qué es relevante para esta tesis:</w:t>
       </w:r>
     </w:p>
     <w:p>
@@ -13850,10 +13848,7 @@
         <w:pStyle w:val="Listaconvietas"/>
       </w:pPr>
       <w:r>
-        <w:t>El patrón de hard rules vs. soft guidelines: reglas no negociables que el agente de</w:t>
-      </w:r>
-      <w:r>
-        <w:t>be respetar siempre, versus lineamientos donde aplica criterio propio. Este patrón gobierna todos los agentes del sistema.</w:t>
+        <w:t>El patrón de hard rules vs. soft guidelines: reglas no negociables que el agente debe respetar siempre, versus lineamientos donde aplica criterio propio. Este patrón gobierna todos los agentes del sistema.</w:t>
       </w:r>
     </w:p>
     <w:p>
@@ -13861,10 +13856,8 @@
         <w:pStyle w:val="Listaconvietas"/>
       </w:pPr>
       <w:r>
-        <w:t>El proceso iterativo de refinamiento de prompts con validación por expertos como metodología de desarrollo de la capa de IA (Wei et a</w:t>
-      </w:r>
-      <w:r>
-        <w:t>l., 2022).</w:t>
+        <w:lastRenderedPageBreak/>
+        <w:t>El proceso iterativo de refinamiento de prompts con validación por expertos como metodología de desarrollo de la capa de IA (Wei et al., 2022).</w:t>
       </w:r>
     </w:p>
     <w:p>
@@ -13876,10 +13869,8 @@
         </w:numPr>
         <w:ind w:left="864" w:hanging="864"/>
       </w:pPr>
-      <w:proofErr w:type="spellStart"/>
-      <w:proofErr w:type="spellEnd"/>
-      <w:r>
-        <w:t xml:space="preserve">2.1.3  Structured Outputs (Salidas Estructuradas)</w:t>
+      <w:r>
+        <w:t>2.1.3  Structured Outputs (Salidas Estructuradas)</w:t>
       </w:r>
     </w:p>
     <w:p>
@@ -13892,11 +13883,7 @@
         <w:pStyle w:val="Listaconvietas"/>
       </w:pPr>
       <w:r>
-        <w:lastRenderedPageBreak/>
-        <w:t>JSON mode / structure</w:t>
-      </w:r>
-      <w:r>
-        <w:t>d output: el modelo es forzado a producir un JSON que cumple un esquema predefinido (OpenAI, 2024; Google DeepMind, 2024). Permite que el output de un agente sea el input directo del siguiente.</w:t>
+        <w:t>JSON mode / structured output: el modelo es forzado a producir un JSON que cumple un esquema predefinido (OpenAI, 2024; Google DeepMind, 2024). Permite que el output de un agente sea el input directo del siguiente.</w:t>
       </w:r>
     </w:p>
     <w:p>
@@ -13904,10 +13891,7 @@
         <w:pStyle w:val="Listaconvietas"/>
       </w:pPr>
       <w:r>
-        <w:t xml:space="preserve">Pydantic como contrato de datos: cada agente define su modelo </w:t>
-      </w:r>
-      <w:r>
-        <w:t>de entrada y salida mediante clases Pydantic, garantizando tipos y campos correctos en toda la cadena de producción.</w:t>
+        <w:t>Pydantic como contrato de datos: cada agente define su modelo de entrada y salida mediante clases Pydantic, garantizando tipos y campos correctos en toda la cadena de producción.</w:t>
       </w:r>
     </w:p>
     <w:p>
@@ -13920,15 +13904,12 @@
         <w:ind w:left="864" w:hanging="864"/>
       </w:pPr>
       <w:r>
-        <w:t xml:space="preserve">2.1.4  Sistemas Multi-Agente</w:t>
+        <w:t>2.1.4  Sistemas Multi-Agente</w:t>
       </w:r>
     </w:p>
     <w:p>
       <w:r>
-        <w:t>El sistema distribuye la generación de contenido entre múltiples agentes especializados en lugar de un único agente g</w:t>
-      </w:r>
-      <w:r>
-        <w:t>eneralista. Se explicará por qué este enfoque es relevante para esta tesis:</w:t>
+        <w:t>El sistema distribuye la generación de contenido entre múltiples agentes especializados en lugar de un único agente generalista. Se explicará por qué este enfoque es relevante para esta tesis:</w:t>
       </w:r>
     </w:p>
     <w:p>
@@ -13944,10 +13925,7 @@
         <w:pStyle w:val="Listaconvietas"/>
       </w:pPr>
       <w:r>
-        <w:t xml:space="preserve">Por qué especializar: un agente con una sola </w:t>
-      </w:r>
-      <w:r>
-        <w:t>responsabilidad bien definida produce resultados más precisos y confiables. En este sistema, agentes distintos manejan el parseo, el esquema curricular, la generación de contenido y la validación de calidad (Park et al., 2023).</w:t>
+        <w:t>Por qué especializar: un agente con una sola responsabilidad bien definida produce resultados más precisos y confiables. En este sistema, agentes distintos manejan el parseo, el esquema curricular, la generación de contenido y la validación de calidad (Park et al., 2023).</w:t>
       </w:r>
     </w:p>
     <w:p>
@@ -13960,7 +13938,7 @@
         <w:ind w:left="864" w:hanging="864"/>
       </w:pPr>
       <w:r>
-        <w:t xml:space="preserve">2.1.5  Nodos y Grafos de Estado</w:t>
+        <w:t>2.1.5  Nodos y Grafos de Estado</w:t>
       </w:r>
     </w:p>
     <w:p>
@@ -13973,10 +13951,7 @@
         <w:pStyle w:val="Listaconvietas"/>
       </w:pPr>
       <w:r>
-        <w:t>Un nodo como unidad de procesamiento: puede invocar un L</w:t>
-      </w:r>
-      <w:r>
-        <w:t>LM, ejecutar código determinístico o tomar una decisión condicional. El estado es compartido entre todos los nodos del grafo.</w:t>
+        <w:t>Un nodo como unidad de procesamiento: puede invocar un LLM, ejecutar código determinístico o tomar una decisión condicional. El estado es compartido entre todos los nodos del grafo.</w:t>
       </w:r>
     </w:p>
     <w:p>
@@ -13984,10 +13959,7 @@
         <w:pStyle w:val="Listaconvietas"/>
       </w:pPr>
       <w:r>
-        <w:t>Aristas condicionales y ciclos de reintento: el flujo puede bifurcarse según el resultado de un nodo (validación pasa → continuar,</w:t>
-      </w:r>
-      <w:r>
-        <w:t xml:space="preserve"> validación falla → reintentar con feedback). Este mecanismo es el que garantiza el cumplimiento de restricciones pedagógicas.</w:t>
+        <w:t>Aristas condicionales y ciclos de reintento: el flujo puede bifurcarse según el resultado de un nodo (validación pasa → continuar, validación falla → reintentar con feedback). Este mecanismo es el que garantiza el cumplimiento de restricciones pedagógicas.</w:t>
       </w:r>
     </w:p>
     <w:p>
@@ -13999,18 +13971,14 @@
         </w:numPr>
         <w:ind w:left="864" w:hanging="864"/>
       </w:pPr>
-      <w:proofErr w:type="spellStart"/>
-      <w:proofErr w:type="spellEnd"/>
-      <w:r>
-        <w:t xml:space="preserve">2.1.6  Agent Framework: LangChain y LangGraph</w:t>
+      <w:r>
+        <w:lastRenderedPageBreak/>
+        <w:t>2.1.6  Agent Framework: LangChain y LangGraph</w:t>
       </w:r>
     </w:p>
     <w:p>
       <w:r>
-        <w:t xml:space="preserve">LangChain y LangGraph son las herramientas de orquestación sobre las que se implementó el </w:t>
-      </w:r>
-      <w:r>
-        <w:t>sistema. Se explicará por qué son relevantes para esta tesis:</w:t>
+        <w:t>LangChain y LangGraph son las herramientas de orquestación sobre las que se implementó el sistema. Se explicará por qué son relevantes para esta tesis:</w:t>
       </w:r>
     </w:p>
     <w:p>
@@ -14018,7 +13986,6 @@
         <w:pStyle w:val="Listaconvietas"/>
       </w:pPr>
       <w:r>
-        <w:lastRenderedPageBreak/>
         <w:t>LangChain: capa de abstracción sobre múltiples proveedores de LLM (OpenAI, Google Gemini) que estandariza la invocación de modelos, el manejo de prompts y el procesamiento de outputs.</w:t>
       </w:r>
     </w:p>
@@ -14027,13 +13994,7 @@
         <w:pStyle w:val="Listaconvietas"/>
       </w:pPr>
       <w:r>
-        <w:t>LangGraph:</w:t>
-      </w:r>
-      <w:r>
-        <w:t xml:space="preserve"> extensión de LangChain que implementa grafos de estado dirigidos, habilitando flujos condicionales, ciclos de reintento y estado compartido entre nodos. Supera al prompt chaining simple al permitir lógica de control real sobre el flujo de generación (Chas</w:t>
-      </w:r>
-      <w:r>
-        <w:t>e, 2024).</w:t>
+        <w:t>LangGraph: extensión de LangChain que implementa grafos de estado dirigidos, habilitando flujos condicionales, ciclos de reintento y estado compartido entre nodos. Supera al prompt chaining simple al permitir lógica de control real sobre el flujo de generación (Chase, 2024).</w:t>
       </w:r>
     </w:p>
     <w:p>
@@ -14046,7 +14007,7 @@
         <w:ind w:left="864" w:hanging="864"/>
       </w:pPr>
       <w:r>
-        <w:t xml:space="preserve">2.1.7  Python como ecosistema de desarrollo de IA</w:t>
+        <w:t>2.1.7  Python como ecosistema de desarrollo de IA</w:t>
       </w:r>
     </w:p>
     <w:p>
@@ -14059,10 +14020,7 @@
         <w:pStyle w:val="Listaconvietas"/>
       </w:pPr>
       <w:r>
-        <w:t>Ecosistema: concentra las bibliotecas más utilizadas para modelos de lenguaje (LangChain, LangGraph), procesami</w:t>
-      </w:r>
-      <w:r>
-        <w:t>ento documental (pdfplumber, python-docx, pandas) y exposición de APIs (FastAPI).</w:t>
+        <w:t>Ecosistema: concentra las bibliotecas más utilizadas para modelos de lenguaje (LangChain, LangGraph), procesamiento documental (pdfplumber, python-docx, pandas) y exposición de APIs (FastAPI).</w:t>
       </w:r>
     </w:p>
     <w:p>
@@ -14083,7 +14041,7 @@
         <w:ind w:left="720" w:hanging="720"/>
       </w:pPr>
       <w:r>
-        <w:t xml:space="preserve">2.1.8  Infraestructura Backend</w:t>
+        <w:t>2.1.8  Infraestructura Backend</w:t>
       </w:r>
     </w:p>
     <w:p>
@@ -14101,18 +14059,12 @@
         <w:ind w:left="864" w:hanging="864"/>
       </w:pPr>
       <w:r>
-        <w:t xml:space="preserve">2.1.9  Backend</w:t>
+        <w:t>2.1.9  Backend</w:t>
       </w:r>
     </w:p>
     <w:p>
       <w:r>
-        <w:t>El backend de una aplicación es la capa de software responsable de procesar la lógica de neg</w:t>
-      </w:r>
-      <w:r>
-        <w:t>ocio, gestionar el acceso a datos y exponer servicios a los clientes mediante interfaces de red —típicamente APIs HTTP—. A diferencia del frontend, que gestiona la presentación e interacción con el usuario, el backend concentra el procesamiento, la persist</w:t>
-      </w:r>
-      <w:r>
-        <w:t>encia y la seguridad del sistema (Richardson, 2018).</w:t>
+        <w:t>El backend de una aplicación es la capa de software responsable de procesar la lógica de negocio, gestionar el acceso a datos y exponer servicios a los clientes mediante interfaces de red —típicamente APIs HTTP—. A diferencia del frontend, que gestiona la presentación e interacción con el usuario, el backend concentra el procesamiento, la persistencia y la seguridad del sistema (Richardson, 2018).</w:t>
       </w:r>
     </w:p>
     <w:p>
@@ -14125,7 +14077,7 @@
         <w:ind w:left="864" w:hanging="864"/>
       </w:pPr>
       <w:r>
-        <w:t xml:space="preserve">2.1.10  Arquitectura del Sistema</w:t>
+        <w:t>2.1.10  Arquitectura del Sistema</w:t>
       </w:r>
     </w:p>
     <w:p>
@@ -14138,13 +14090,11 @@
       </w:r>
       <w:proofErr w:type="gramEnd"/>
       <w:r>
-        <w:t xml:space="preserve"> cómo los componentes de un sistema se organizan, comunican y escalan para cumplir los requisitos funcionales y no funcionales (Richardson, 2018</w:t>
-      </w:r>
-      <w:r>
-        <w:t>). En sistemas que procesan tareas de duración media o prolongada, la arquitectura incorpora capas especializadas: un punto de entrada que gestiona las solicitudes, un motor de cómputo que ejecuta el procesamiento, y componentes de mensajería que desacopla</w:t>
-      </w:r>
-      <w:r>
-        <w:t>n la recepción de una solicitud de su ejecución efectiva.</w:t>
+        <w:t xml:space="preserve"> cómo los componentes de un sistema se organizan, comunican y escalan para cumplir los requisitos funcionales y no funcionales (Richardson, 2018). En sistemas que procesan tareas de duración media o prolongada, la arquitectura incorpora capas especializadas: un punto de entrada que gestiona las solicitudes, un motor </w:t>
+      </w:r>
+      <w:r>
+        <w:lastRenderedPageBreak/>
+        <w:t>de cómputo que ejecuta el procesamiento, y componentes de mensajería que desacoplan la recepción de una solicitud de su ejecución efectiva.</w:t>
       </w:r>
     </w:p>
     <w:p>
@@ -14157,18 +14107,12 @@
         <w:ind w:left="864" w:hanging="864"/>
       </w:pPr>
       <w:r>
-        <w:t xml:space="preserve">2.1.11  Procesamiento Asíncrono</w:t>
+        <w:t>2.1.11  Procesamiento Asíncrono</w:t>
       </w:r>
     </w:p>
     <w:p>
       <w:r>
-        <w:t>El procesamiento asíncrono es el patrón arquitectónico que desacopla la recepción de una solicitud de su ejecución. En un modelo síncrono, el cliente espera bloqueado hasta r</w:t>
-      </w:r>
-      <w:r>
-        <w:t>ecibir respuesta; para tareas de duración prolongada esto genera timeouts inaceptables (Kleppmann, 2017). En el modelo asíncrono, el cliente recibe una confirmación inmediata y el trabajo se ejecuta en segundo plano; al finalizar, el sistema notifica al cl</w:t>
-      </w:r>
-      <w:r>
-        <w:t>iente a través de un webhook o servicio de mensajería. Este patrón sigue el modelo productor-consumidor: una cola de mensajes actúa como intermediario entre quien solicita el trabajo y quien lo ejecuta (Richardson, 2018).</w:t>
+        <w:t>El procesamiento asíncrono es el patrón arquitectónico que desacopla la recepción de una solicitud de su ejecución. En un modelo síncrono, el cliente espera bloqueado hasta recibir respuesta; para tareas de duración prolongada esto genera timeouts inaceptables (Kleppmann, 2017). En el modelo asíncrono, el cliente recibe una confirmación inmediata y el trabajo se ejecuta en segundo plano; al finalizar, el sistema notifica al cliente a través de un webhook o servicio de mensajería. Este patrón sigue el modelo productor-consumidor: una cola de mensajes actúa como intermediario entre quien solicita el trabajo y quien lo ejecuta (Richardson, 2018).</w:t>
       </w:r>
     </w:p>
     <w:p>
@@ -14180,27 +14124,13 @@
         </w:numPr>
         <w:ind w:left="864" w:hanging="864"/>
       </w:pPr>
-      <w:proofErr w:type="spellStart"/>
-      <w:proofErr w:type="spellEnd"/>
-      <w:r>
-        <w:t xml:space="preserve">2.1.12  Amazon Web Services (AWS)</w:t>
+      <w:r>
+        <w:t>2.1.12  Amazon Web Services (AWS)</w:t>
       </w:r>
     </w:p>
     <w:p>
       <w:r>
-        <w:t>Amazon W</w:t>
-      </w:r>
-      <w:r>
-        <w:t>eb Services (AWS) es la plataforma cloud seleccionada para el despliegue de la infraestructura backend del sistema. AWS ofrece un ecosistema de servicios gestionados bajo un modelo de pago por uso que abarca cómputo serverless, mensajería, almacenamiento y</w:t>
-      </w:r>
-      <w:r>
-        <w:t xml:space="preserve"> gestión de APIs, lo que reduce la complejidad operativa frente a infraestructura autogestionada (Wittig &amp; Wittig, 2018). Para implementar la arquitectura asíncrona descrita, el sistema utiliza cuatro servicios de AWS: un servicio de gestión y exposición d</w:t>
-      </w:r>
-      <w:r>
-        <w:t>e APIs HTTP (Amazon API Gateway), un motor de cómputo serverless que ejecuta el pipeline de agentes (AWS Lambda), un servicio de cola de mensajes que actúa como buffer de trabajos (Amazon SQS) y un sistema de notificaciones pub/sub que comunica la finaliza</w:t>
-      </w:r>
-      <w:r>
-        <w:t>ción del procesamiento (Amazon SNS). La configuración e integración específica de cada uno de estos servicios se describe en el Capítulo 3.</w:t>
+        <w:t>Amazon Web Services (AWS) es la plataforma cloud seleccionada para el despliegue de la infraestructura backend del sistema. AWS ofrece un ecosistema de servicios gestionados bajo un modelo de pago por uso que abarca cómputo serverless, mensajería, almacenamiento y gestión de APIs, lo que reduce la complejidad operativa frente a infraestructura autogestionada (Wittig &amp; Wittig, 2018). Para implementar la arquitectura asíncrona descrita, el sistema utiliza cuatro servicios de AWS: un servicio de gestión y exposición de APIs HTTP (Amazon API Gateway), un motor de cómputo serverless que ejecuta el pipeline de agentes (AWS Lambda), un servicio de cola de mensajes que actúa como buffer de trabajos (Amazon SQS) y un sistema de notificaciones pub/sub que comunica la finalización del procesamiento (Amazon SNS). La configuración e integración específica de cada uno de estos servicios se describe en el Capítulo 3.</w:t>
       </w:r>
     </w:p>
     <w:p>
@@ -14220,18 +14150,13 @@
         </w:numPr>
         <w:ind w:left="720" w:hanging="720"/>
       </w:pPr>
-      <w:proofErr w:type="gramStart"/>
-      <w:proofErr w:type="gramEnd"/>
-      <w:r>
-        <w:t xml:space="preserve">2.2.1  Taxonomía de Bloom</w:t>
+      <w:r>
+        <w:t>2.2.1  Taxonomía de Bloom</w:t>
       </w:r>
     </w:p>
     <w:p>
       <w:r>
-        <w:t>La Taxonomía de Bloom, en su revisión de Anderson &amp; Krathwohl (2001), constituye el marco central de clasificación de objetivos de aprendizaje sobre el que el</w:t>
-      </w:r>
-      <w:r>
-        <w:t xml:space="preserve"> sistema fundamenta sus decisiones de selección de recursos. Se explicará en detalle dado su rol estructural en la lógica del sistema. Los puntos a cubrir son:</w:t>
+        <w:t>La Taxonomía de Bloom, en su revisión de Anderson &amp; Krathwohl (2001), constituye el marco central de clasificación de objetivos de aprendizaje sobre el que el sistema fundamenta sus decisiones de selección de recursos. Se explicará en detalle dado su rol estructural en la lógica del sistema. Los puntos a cubrir son:</w:t>
       </w:r>
     </w:p>
     <w:p>
@@ -14239,10 +14164,8 @@
         <w:pStyle w:val="Listaconvietas"/>
       </w:pPr>
       <w:r>
-        <w:t>Los seis niveles cognitivos y sus verbos asociados (Recordar, Comprender, Aplicar, Analizar, Eva</w:t>
-      </w:r>
-      <w:r>
-        <w:t>luar, Crear), según la revisión de Anderson &amp; Krathwohl (2001) sobre la taxonomía original de Bloom et al. (1956).</w:t>
+        <w:lastRenderedPageBreak/>
+        <w:t>Los seis niveles cognitivos y sus verbos asociados (Recordar, Comprender, Aplicar, Analizar, Evaluar, Crear), según la revisión de Anderson &amp; Krathwohl (2001) sobre la taxonomía original de Bloom et al. (1956).</w:t>
       </w:r>
     </w:p>
     <w:p>
@@ -14250,10 +14173,7 @@
         <w:pStyle w:val="Listaconvietas"/>
       </w:pPr>
       <w:r>
-        <w:t>Cómo el verbo del logro de aprendizaje semanal determina el tipo de recurso a utilizar: la tabla verbo × densidad de contenido → tipo de recu</w:t>
-      </w:r>
-      <w:r>
-        <w:t>rso que el sistema aplica en cada semana del curso.</w:t>
+        <w:t>Cómo el verbo del logro de aprendizaje semanal determina el tipo de recurso a utilizar: la tabla verbo × densidad de contenido → tipo de recurso que el sistema aplica en cada semana del curso.</w:t>
       </w:r>
     </w:p>
     <w:p>
@@ -14261,7 +14181,6 @@
         <w:pStyle w:val="Listaconvietas"/>
       </w:pPr>
       <w:r>
-        <w:lastRenderedPageBreak/>
         <w:t>La jerarquía de logros: Logro del Curso → Logro de Unidad → Logro de Semana → Propósito del Recurso, y por qué cada nivel debe ser consistente con el superior (principio de alineación vertical).</w:t>
       </w:r>
     </w:p>
@@ -14270,10 +14189,7 @@
         <w:pStyle w:val="Listaconvietas"/>
       </w:pPr>
       <w:r>
-        <w:t>La distin</w:t>
-      </w:r>
-      <w:r>
-        <w:t>ción entre contenido procedimental (requiere recurso demostrativo), teórico (requiere recurso expositivo) y básico (flexible), y cómo el verbo del logro permite identificar cada tipo.</w:t>
+        <w:t>La distinción entre contenido procedimental (requiere recurso demostrativo), teórico (requiere recurso expositivo) y básico (flexible), y cómo el verbo del logro permite identificar cada tipo.</w:t>
       </w:r>
     </w:p>
     <w:p>
@@ -14286,15 +14202,12 @@
         <w:ind w:left="720" w:hanging="720"/>
       </w:pPr>
       <w:r>
-        <w:t xml:space="preserve">2.2.2  SCRUM en equipos multidisciplinarios</w:t>
+        <w:t>2.2.2  SCRUM en equipos multidisciplinarios</w:t>
       </w:r>
     </w:p>
     <w:p>
       <w:r>
-        <w:t>Se explicará el framework SCRUM (Schwaber &amp; Sutherland, 2020) y su aplicación en un equipo compuesto por perfiles de distintas disciplinas (ingeniería de software, diseño instruccional, e</w:t>
-      </w:r>
-      <w:r>
-        <w:t>xpertos temáticos). Los puntos a cubrir son:</w:t>
+        <w:t>Se explicará el framework SCRUM (Schwaber &amp; Sutherland, 2020) y su aplicación en un equipo compuesto por perfiles de distintas disciplinas (ingeniería de software, diseño instruccional, expertos temáticos). Los puntos a cubrir son:</w:t>
       </w:r>
     </w:p>
     <w:p>
@@ -14310,11 +14223,7 @@
         <w:pStyle w:val="Listaconvietas"/>
       </w:pPr>
       <w:r>
-        <w:lastRenderedPageBreak/>
-        <w:t xml:space="preserve">Por qué SCRUM es adecuado </w:t>
-      </w:r>
-      <w:r>
-        <w:t>para proyectos de IA: la calidad del output de un sistema LLM es desconocida hasta que se prueba con datos reales; los ciclos cortos permiten detectar y corregir problemas de prompt y arquitectura rápidamente.</w:t>
+        <w:t>Por qué SCRUM es adecuado para proyectos de IA: la calidad del output de un sistema LLM es desconocida hasta que se prueba con datos reales; los ciclos cortos permiten detectar y corregir problemas de prompt y arquitectura rápidamente.</w:t>
       </w:r>
     </w:p>
     <w:p>
@@ -14322,10 +14231,7 @@
         <w:pStyle w:val="Listaconvietas"/>
       </w:pPr>
       <w:r>
-        <w:t>La dimensión multidisciplinaria: el equipo int</w:t>
-      </w:r>
-      <w:r>
-        <w:t>egró roles de desarrollo (backend, frontend) con roles instruccionales (LxD, Docente Revisor), lo que exige una coordinación explícita y roles bien definidos dentro del sprint.</w:t>
+        <w:t>La dimensión multidisciplinaria: el equipo integró roles de desarrollo (backend, frontend) con roles instruccionales (LxD, Docente Revisor), lo que exige una coordinación explícita y roles bien definidos dentro del sprint.</w:t>
       </w:r>
     </w:p>
     <w:p>
@@ -14333,10 +14239,7 @@
         <w:pStyle w:val="Listaconvietas"/>
       </w:pPr>
       <w:r>
-        <w:t>El rol del Docente Revisor como validador en cada sprint: cada iteración de pro</w:t>
-      </w:r>
-      <w:r>
-        <w:t>mpts se valida con expertos reales, no solo con métricas automáticas.</w:t>
+        <w:t>El rol del Docente Revisor como validador en cada sprint: cada iteración de prompts se valida con expertos reales, no solo con métricas automáticas.</w:t>
       </w:r>
     </w:p>
     <w:p>
@@ -14356,15 +14259,32 @@
       </w:r>
     </w:p>
     <w:p>
-      <w:pPr/>
-      <w:r>
-        <w:t>La Ley N.° 29733, Ley de Protección de Datos Personales (2011), y su Reglamento aprobado mediante D.S. N.° 003-2013-JUS, constituyen el marco normativo vigente en el Perú para el tratamiento de datos de carácter personal. La norma establece los principios de legalidad, consentimiento informado, finalidad, proporcionalidad y seguridad como ejes rectores de todo procesamiento. Su autoridad de supervisión es la Autoridad Nacional de Protección de Datos Personales (ANPDP), adscrita al Ministerio de Justicia y Derechos Humanos, con facultad sancionadora ante infracciones.</w:t>
+      <w:r>
+        <w:t>La Ley N.° 29733, Ley de Protección de Datos Personales (2011), y su Reglamento aprobado mediante D.S. N.° 003-2013-J</w:t>
+      </w:r>
+      <w:r>
+        <w:t xml:space="preserve">US, constituyen el marco normativo vigente en el Perú para el tratamiento de datos de carácter personal. La norma establece los principios de legalidad, </w:t>
+      </w:r>
+      <w:r>
+        <w:lastRenderedPageBreak/>
+        <w:t>consentimiento informado, finalidad, proporcionalidad y seguridad como ejes rectores de todo procesamie</w:t>
+      </w:r>
+      <w:r>
+        <w:t>nto. Su autoridad de supervisión es la Autoridad Nacional de Protección de Datos Personales (ANPDP), adscrita al Ministerio de Justicia y Derechos Humanos, con facultad sancionadora ante infracciones.</w:t>
       </w:r>
     </w:p>
     <w:p>
-      <w:pPr/>
-      <w:r>
-        <w:t>En el contexto del sistema desarrollado, la normativa resulta aplicable dado que el proceso instruccional involucra documentos institucionales que pueden contener referencias a personas identificables, como docentes y coordinadores académicos. Por ello, el diseño del sistema contempla: (i) procesamiento en entornos controlados sin almacenamiento persistente de datos personales; (ii) tratamiento de los documentos de entrada como insumos transitorios que no son indexados ni cedidos a terceros; y (iii) alineación con el principio de minimización de datos, procesando únicamente la información estrictamente necesaria para la generación de los materiales instruccionales.</w:t>
+      <w:r>
+        <w:t>En el contexto del sistema desarrollado, la normativa r</w:t>
+      </w:r>
+      <w:r>
+        <w:t>esulta aplicable dado que el proceso instruccional involucra documentos institucionales que pueden contener referencias a personas identificables, como docentes y coordinadores académicos. Por ello, el diseño del sistema contempla: (i) procesamiento en ent</w:t>
+      </w:r>
+      <w:r>
+        <w:t>ornos controlados sin almacenamiento persistente de datos personales; (ii) tratamiento de los documentos de entrada como insumos transitorios que no son indexados ni cedidos a terceros; y (iii) alineación con el principio de minimización de datos, procesan</w:t>
+      </w:r>
+      <w:r>
+        <w:t>do únicamente la información estrictamente necesaria para la generación de los materiales instruccionales.</w:t>
       </w:r>
     </w:p>
     <w:p>
@@ -14377,11 +14297,9 @@
     </w:p>
     <w:p>
       <w:pPr>
-        <w:pStyle w:val="Normal"/>
         <w:ind w:left="720" w:hanging="720"/>
       </w:pPr>
       <w:r>
-        <w:rPr/>
         <w:t xml:space="preserve">Amazon Web Services. (2024). </w:t>
       </w:r>
       <w:r>
@@ -14389,20 +14307,20 @@
           <w:i/>
           <w:iCs/>
         </w:rPr>
-        <w:t xml:space="preserve">AWS documentation</w:t>
-      </w:r>
-      <w:r>
-        <w:rPr/>
-        <w:t xml:space="preserve">. Amazon Web Services. Recuperado el 5 de mayo de 2026, de https://docs.aws.amazon.com</w:t>
+        <w:t>AWS documentation</w:t>
+      </w:r>
+      <w:r>
+        <w:t>. Amazon Web Services. Recuperado el 5 de mayo de 2026, de https://docs.aws.am</w:t>
+      </w:r>
+      <w:r>
+        <w:t>azon.com</w:t>
       </w:r>
     </w:p>
     <w:p>
       <w:pPr>
-        <w:pStyle w:val="Normal"/>
         <w:ind w:left="720" w:hanging="720"/>
       </w:pPr>
       <w:r>
-        <w:rPr/>
         <w:t xml:space="preserve">Anderson, L. W., &amp; Krathwohl, D. R. (Eds.). (2001). </w:t>
       </w:r>
       <w:r>
@@ -14410,41 +14328,38 @@
           <w:i/>
           <w:iCs/>
         </w:rPr>
-        <w:t xml:space="preserve">A taxonomy for learning, teaching, and assessing: A revision of Bloom's taxonomy of educational objectives</w:t>
-      </w:r>
-      <w:r>
-        <w:rPr/>
-        <w:t xml:space="preserve">. Longman.</w:t>
+        <w:t>A taxonomy for learning, teaching, and assessing: A revision of Bloom's taxonomy of educational objectives</w:t>
+      </w:r>
+      <w:r>
+        <w:t>. Longman.</w:t>
       </w:r>
     </w:p>
     <w:p>
       <w:pPr>
-        <w:pStyle w:val="Normal"/>
         <w:ind w:left="720" w:hanging="720"/>
       </w:pPr>
       <w:r>
-        <w:rPr/>
-        <w:t xml:space="preserve">Bloom, B. S., Engelhart, M. D., Furst, E. J., Hill, W. H., &amp; Krathwohl, D. R. (1956). </w:t>
+        <w:t xml:space="preserve">Bloom, B. S., Engelhart, M. D., Furst, E. J., Hill, W. H., &amp; Krathwohl, D. R. </w:t>
+      </w:r>
+      <w:r>
+        <w:t xml:space="preserve">(1956). </w:t>
       </w:r>
       <w:r>
         <w:rPr>
           <w:i/>
           <w:iCs/>
         </w:rPr>
-        <w:t xml:space="preserve">Taxonomy of educational objectives: The classification of educational goals</w:t>
-      </w:r>
-      <w:r>
-        <w:rPr/>
-        <w:t xml:space="preserve">. David McKay.</w:t>
+        <w:t>Taxonomy of educational objectives: The classification of educational goals</w:t>
+      </w:r>
+      <w:r>
+        <w:t>. David McKay.</w:t>
       </w:r>
     </w:p>
     <w:p>
       <w:pPr>
-        <w:pStyle w:val="Normal"/>
         <w:ind w:left="720" w:hanging="720"/>
       </w:pPr>
       <w:r>
-        <w:rPr/>
         <w:t xml:space="preserve">Brown, T. B., Mann, B., Ryder, N., Subbiah, M., Kaplan, J., Dhariwal, P., &amp; Amodei, D. (2020). Language models are few-shot learners. </w:t>
       </w:r>
       <w:r>
@@ -14452,20 +14367,24 @@
           <w:i/>
           <w:iCs/>
         </w:rPr>
-        <w:t xml:space="preserve">Advances in Neural Information Processing Systems, 33</w:t>
-      </w:r>
-      <w:r>
-        <w:rPr/>
-        <w:t xml:space="preserve">, 1877–1901. https://doi.org/10.48550/arXiv.2005.14165</w:t>
+        <w:t>Advances in Neural Infor</w:t>
+      </w:r>
+      <w:r>
+        <w:rPr>
+          <w:i/>
+          <w:iCs/>
+        </w:rPr>
+        <w:t>mation Processing Systems, 33</w:t>
+      </w:r>
+      <w:r>
+        <w:t>, 1877–1901. https://doi.org/10.48550/arXiv.2005.14165</w:t>
       </w:r>
     </w:p>
     <w:p>
       <w:pPr>
-        <w:pStyle w:val="Normal"/>
         <w:ind w:left="720" w:hanging="720"/>
       </w:pPr>
       <w:r>
-        <w:rPr/>
         <w:t xml:space="preserve">Chase, H. (2024). </w:t>
       </w:r>
       <w:r>
@@ -14473,20 +14392,20 @@
           <w:i/>
           <w:iCs/>
         </w:rPr>
-        <w:t xml:space="preserve">LangGraph: Building stateful, multi-actor applications with LLMs</w:t>
-      </w:r>
-      <w:r>
-        <w:rPr/>
-        <w:t xml:space="preserve">. LangChain, Inc. Recuperado el 5 de mayo de 2026, de https://langchain-ai.github.io/langgraph/</w:t>
+        <w:t>LangGraph: Building stateful, multi-actor applications with LLMs</w:t>
+      </w:r>
+      <w:r>
+        <w:t>. LangChain, Inc. Recuperado el 5 de mayo de 2026, de https://langchain-ai.github.io/langg</w:t>
+      </w:r>
+      <w:r>
+        <w:t>raph/</w:t>
       </w:r>
     </w:p>
     <w:p>
       <w:pPr>
-        <w:pStyle w:val="Normal"/>
         <w:ind w:left="720" w:hanging="720"/>
       </w:pPr>
       <w:r>
-        <w:rPr/>
         <w:t xml:space="preserve">Decreto Supremo 003-2013-JUS. (2013). </w:t>
       </w:r>
       <w:r>
@@ -14494,20 +14413,17 @@
           <w:i/>
           <w:iCs/>
         </w:rPr>
-        <w:t xml:space="preserve">Reglamento de la Ley N.° 29733, Ley de protección de datos personales</w:t>
-      </w:r>
-      <w:r>
-        <w:rPr/>
-        <w:t xml:space="preserve">. Presidencia de la República.</w:t>
+        <w:t>Reglamento de la Ley N.° 29733, Ley de protección de datos personales</w:t>
+      </w:r>
+      <w:r>
+        <w:t>. Presidencia de la República.</w:t>
       </w:r>
     </w:p>
     <w:p>
       <w:pPr>
-        <w:pStyle w:val="Normal"/>
         <w:ind w:left="720" w:hanging="720"/>
       </w:pPr>
       <w:r>
-        <w:rPr/>
         <w:t xml:space="preserve">Kleppmann, M. (2017). </w:t>
       </w:r>
       <w:r>
@@ -14515,20 +14431,18 @@
           <w:i/>
           <w:iCs/>
         </w:rPr>
-        <w:t xml:space="preserve">Designing data-intensive applications: The big ideas behind reliable, scalable, and maintainable systems</w:t>
-      </w:r>
-      <w:r>
-        <w:rPr/>
-        <w:t xml:space="preserve">. O’Reilly Media.</w:t>
+        <w:t>Designing data-intensive applications: The big ideas behind reliable, scalable, and maintainable systems</w:t>
+      </w:r>
+      <w:r>
+        <w:t>. O’Reilly Media.</w:t>
       </w:r>
     </w:p>
     <w:p>
       <w:pPr>
-        <w:pStyle w:val="Normal"/>
         <w:ind w:left="720" w:hanging="720"/>
       </w:pPr>
       <w:r>
-        <w:rPr/>
+        <w:lastRenderedPageBreak/>
         <w:t xml:space="preserve">Ley 29733. (2011). </w:t>
       </w:r>
       <w:r>
@@ -14536,41 +14450,38 @@
           <w:i/>
           <w:iCs/>
         </w:rPr>
-        <w:t xml:space="preserve">Ley de protección de datos personales</w:t>
-      </w:r>
-      <w:r>
-        <w:rPr/>
-        <w:t xml:space="preserve">. Congreso de la República del Perú.</w:t>
+        <w:t>Ley de protección de datos personales</w:t>
+      </w:r>
+      <w:r>
+        <w:t>. Congreso de la República del Perú.</w:t>
       </w:r>
     </w:p>
     <w:p>
       <w:pPr>
-        <w:pStyle w:val="Normal"/>
         <w:ind w:left="720" w:hanging="720"/>
       </w:pPr>
       <w:r>
-        <w:rPr/>
-        <w:t xml:space="preserve">Liu, P., Yuan, W., Fu, J., Jiang, Z., Hayashi, H., &amp; Neubig, G. (2023). Pre-train, prompt, and predict: A systematic survey of prompting methods in natural language processing. </w:t>
+        <w:t>Liu, P., Yuan, W., Fu, J., Jiang, Z., Hay</w:t>
+      </w:r>
+      <w:r>
+        <w:t xml:space="preserve">ashi, H., &amp; Neubig, G. (2023). Pre-train, prompt, and predict: A systematic survey of prompting methods in natural language processing. </w:t>
       </w:r>
       <w:r>
         <w:rPr>
           <w:i/>
           <w:iCs/>
         </w:rPr>
-        <w:t xml:space="preserve">ACM Computing Surveys, 55</w:t>
-      </w:r>
-      <w:r>
-        <w:rPr/>
-        <w:t xml:space="preserve">(9), 1–35. https://doi.org/10.1145/3560815</w:t>
+        <w:t>ACM Computing Surveys, 55</w:t>
+      </w:r>
+      <w:r>
+        <w:t>(9), 1–35. https://doi.org/10.1145/3560815</w:t>
       </w:r>
     </w:p>
     <w:p>
       <w:pPr>
-        <w:pStyle w:val="Normal"/>
         <w:ind w:left="720" w:hanging="720"/>
       </w:pPr>
       <w:r>
-        <w:rPr/>
         <w:t xml:space="preserve">OpenAI. (2024). </w:t>
       </w:r>
       <w:r>
@@ -14578,20 +14489,20 @@
           <w:i/>
           <w:iCs/>
         </w:rPr>
-        <w:t xml:space="preserve">Structured outputs</w:t>
-      </w:r>
-      <w:r>
-        <w:rPr/>
-        <w:t xml:space="preserve">. OpenAI Platform Documentation. Recuperado el 5 de mayo de 2026, de https://platform.openai.com/docs/guides/structured-outputs</w:t>
+        <w:t>Structured outputs</w:t>
+      </w:r>
+      <w:r>
+        <w:t xml:space="preserve">. OpenAI Platform </w:t>
+      </w:r>
+      <w:r>
+        <w:t>Documentation. Recuperado el 5 de mayo de 2026, de https://platform.openai.com/docs/guides/structured-outputs</w:t>
       </w:r>
     </w:p>
     <w:p>
       <w:pPr>
-        <w:pStyle w:val="Normal"/>
         <w:ind w:left="720" w:hanging="720"/>
       </w:pPr>
       <w:r>
-        <w:rPr/>
         <w:t xml:space="preserve">Park, J. S., O’Brien, J. C., Cai, C. J., Morris, M. R., Liang, P., &amp; Bernstein, M. S. (2023). </w:t>
       </w:r>
       <w:r>
@@ -14599,41 +14510,45 @@
           <w:i/>
           <w:iCs/>
         </w:rPr>
-        <w:t xml:space="preserve">Generative agents: Interactive simulacra of human behavior</w:t>
-      </w:r>
-      <w:r>
-        <w:rPr/>
+        <w:t>Generative agents: Interactive simulacra of human be</w:t>
+      </w:r>
+      <w:r>
+        <w:rPr>
+          <w:i/>
+          <w:iCs/>
+        </w:rPr>
+        <w:t>havior</w:t>
+      </w:r>
+      <w:r>
         <w:t xml:space="preserve"> [Ponencia]. 36th Annual ACM Symposium on User Interface Software and Technology. https://doi.org/10.1145/3586183.3606763</w:t>
       </w:r>
     </w:p>
     <w:p>
       <w:pPr>
-        <w:pStyle w:val="Normal"/>
         <w:ind w:left="720" w:hanging="720"/>
       </w:pPr>
       <w:r>
-        <w:rPr/>
-        <w:t xml:space="preserve">Raschka, S., Patterson, J., &amp; Nolet, C. (2020). Machine learning in Python: Main developments and technology trends in data science, machine learning, and artificial intelligence. </w:t>
+        <w:t>Raschka, S., Patterson, J., &amp; Nolet, C. (2020). Machine learning in Python: Main developments and technology trends in data scie</w:t>
+      </w:r>
+      <w:r>
+        <w:t xml:space="preserve">nce, machine learning, and artificial intelligence. </w:t>
       </w:r>
       <w:r>
         <w:rPr>
           <w:i/>
           <w:iCs/>
         </w:rPr>
-        <w:t xml:space="preserve">Information, 11</w:t>
-      </w:r>
-      <w:r>
-        <w:rPr/>
-        <w:t xml:space="preserve">(4), 193. https://doi.org/10.3390/info11040193</w:t>
+        <w:t>Information, 11</w:t>
+      </w:r>
+      <w:r>
+        <w:t>(4), 193. https://doi.org/10.3390/info11040193</w:t>
       </w:r>
     </w:p>
     <w:p>
       <w:pPr>
-        <w:pStyle w:val="Normal"/>
         <w:ind w:left="720" w:hanging="720"/>
       </w:pPr>
       <w:r>
-        <w:rPr/>
         <w:t xml:space="preserve">Richardson, C. (2018). </w:t>
       </w:r>
       <w:r>
@@ -14641,41 +14556,38 @@
           <w:i/>
           <w:iCs/>
         </w:rPr>
-        <w:t xml:space="preserve">Microservices patterns: With examples in Java</w:t>
-      </w:r>
-      <w:r>
-        <w:rPr/>
-        <w:t xml:space="preserve">. Manning Publications.</w:t>
+        <w:t>Microservices patterns: With examples in Java</w:t>
+      </w:r>
+      <w:r>
+        <w:t>. Manning Publications.</w:t>
       </w:r>
     </w:p>
     <w:p>
       <w:pPr>
-        <w:pStyle w:val="Normal"/>
         <w:ind w:left="720" w:hanging="720"/>
       </w:pPr>
       <w:r>
-        <w:rPr/>
-        <w:t xml:space="preserve">Rigby, D. K., Sutherland, J., &amp; Takeuchi, H. (2016). Embracing agile. </w:t>
+        <w:t>Rigby, D. K., Sutherland, J., &amp; Takeuchi, H. (2016</w:t>
+      </w:r>
+      <w:r>
+        <w:t xml:space="preserve">). Embracing agile. </w:t>
       </w:r>
       <w:r>
         <w:rPr>
           <w:i/>
           <w:iCs/>
         </w:rPr>
-        <w:t xml:space="preserve">Harvard Business Review, 94</w:t>
-      </w:r>
-      <w:r>
-        <w:rPr/>
-        <w:t xml:space="preserve">(5), 40–50.</w:t>
+        <w:t>Harvard Business Review, 94</w:t>
+      </w:r>
+      <w:r>
+        <w:t>(5), 40–50.</w:t>
       </w:r>
     </w:p>
     <w:p>
       <w:pPr>
-        <w:pStyle w:val="Normal"/>
         <w:ind w:left="720" w:hanging="720"/>
       </w:pPr>
       <w:r>
-        <w:rPr/>
         <w:t xml:space="preserve">Schwaber, K., &amp; Sutherland, J. (2020). </w:t>
       </w:r>
       <w:r>
@@ -14683,20 +14595,17 @@
           <w:i/>
           <w:iCs/>
         </w:rPr>
-        <w:t xml:space="preserve">The Scrum Guide</w:t>
-      </w:r>
-      <w:r>
-        <w:rPr/>
-        <w:t xml:space="preserve">. Scrum.org. https://scrumguides.org/scrum-guide.html</w:t>
+        <w:t>The Scrum Guide</w:t>
+      </w:r>
+      <w:r>
+        <w:t>. Scrum.org. https://scrumguides.org/scrum-guide.html</w:t>
       </w:r>
     </w:p>
     <w:p>
       <w:pPr>
-        <w:pStyle w:val="Normal"/>
         <w:ind w:left="720" w:hanging="720"/>
       </w:pPr>
       <w:r>
-        <w:rPr/>
         <w:t xml:space="preserve">Wei, J., Wang, X., Schuurmans, D., Bosma, M., Xia, F., Chi, E., &amp; Zhou, D. (2022). Chain-of-thought prompting elicits reasoning in large language models. </w:t>
       </w:r>
       <w:r>
@@ -14704,20 +14613,20 @@
           <w:i/>
           <w:iCs/>
         </w:rPr>
-        <w:t xml:space="preserve">Advances in Neural Information Processing Systems, 35</w:t>
-      </w:r>
-      <w:r>
-        <w:rPr/>
-        <w:t xml:space="preserve">, 24824–24837. https://doi.org/10.48550/arXiv.2201.11903</w:t>
+        <w:t>Advances in Neural Information Processing Systems, 35</w:t>
+      </w:r>
+      <w:r>
+        <w:t>, 24824–24837. https://doi.org/10.48550/arXiv.220</w:t>
+      </w:r>
+      <w:r>
+        <w:t>1.11903</w:t>
       </w:r>
     </w:p>
     <w:p>
       <w:pPr>
-        <w:pStyle w:val="Normal"/>
         <w:ind w:left="720" w:hanging="720"/>
       </w:pPr>
       <w:r>
-        <w:rPr/>
         <w:t xml:space="preserve">Wittig, M., &amp; Wittig, A. (2018). </w:t>
       </w:r>
       <w:r>
@@ -14725,20 +14634,17 @@
           <w:i/>
           <w:iCs/>
         </w:rPr>
-        <w:t xml:space="preserve">Amazon Web Services in action</w:t>
-      </w:r>
-      <w:r>
-        <w:rPr/>
+        <w:t>Amazon Web Services in action</w:t>
+      </w:r>
+      <w:r>
         <w:t xml:space="preserve"> (2nd ed.). Manning Publications.</w:t>
       </w:r>
     </w:p>
     <w:p>
       <w:pPr>
-        <w:pStyle w:val="Normal"/>
         <w:ind w:left="720" w:hanging="720"/>
       </w:pPr>
       <w:r>
-        <w:rPr/>
         <w:t xml:space="preserve">Wu, Q., Bansal, G., Zhang, J., Wu, Y., Li, B., Zhu, E., &amp; Wang, C. (2023). AutoGen: Enabling next-gen LLM applications via multi-agent conversation. </w:t>
       </w:r>
       <w:r>
@@ -14746,20 +14652,25 @@
           <w:i/>
           <w:iCs/>
         </w:rPr>
-        <w:t xml:space="preserve">arXiv</w:t>
-      </w:r>
-      <w:r>
-        <w:rPr/>
-        <w:t xml:space="preserve">. https://doi.org/10.48550/arXiv.2308.08155</w:t>
+        <w:t>arX</w:t>
+      </w:r>
+      <w:r>
+        <w:rPr>
+          <w:i/>
+          <w:iCs/>
+        </w:rPr>
+        <w:t>iv</w:t>
+      </w:r>
+      <w:r>
+        <w:t>. https://doi.org/10.48550/arXiv.2308.08155</w:t>
       </w:r>
     </w:p>
     <w:p>
       <w:pPr>
-        <w:pStyle w:val="Normal"/>
         <w:ind w:left="720" w:hanging="720"/>
       </w:pPr>
       <w:r>
-        <w:rPr/>
+        <w:lastRenderedPageBreak/>
         <w:t xml:space="preserve">Yao, S., Zhao, J., Yu, D., Du, N., Shafran, I., Narasimhan, K., &amp; Cao, Y. (2023). </w:t>
       </w:r>
       <w:r>
@@ -14767,15 +14678,27 @@
           <w:i/>
           <w:iCs/>
         </w:rPr>
-        <w:t xml:space="preserve">ReAct: Synergizing reasoning and acting in language models</w:t>
-      </w:r>
-      <w:r>
-        <w:rPr/>
-        <w:t xml:space="preserve"> [Ponencia]. International Conference on Learning Representations. https://doi.org/10.48550/arXiv.2210.03629</w:t>
-      </w:r>
+        <w:t>ReAct: Synergizing reasoning and acting in language models</w:t>
+      </w:r>
+      <w:r>
+        <w:t xml:space="preserve"> [Ponencia]. International Conference on Learning Representations. </w:t>
+      </w:r>
+      <w:hyperlink r:id="rId15" w:history="1">
+        <w:r>
+          <w:rPr>
+            <w:rStyle w:val="Hipervnculo"/>
+          </w:rPr>
+          <w:t>https://doi.org/10.48550/arXiv.2210.03629</w:t>
+        </w:r>
+      </w:hyperlink>
+    </w:p>
+    <w:p>
+      <w:pPr>
+        <w:ind w:left="720" w:hanging="720"/>
+      </w:pPr>
     </w:p>
     <w:sectPr>
-      <w:footerReference w:type="default" r:id="rId15"/>
+      <w:footerReference w:type="default" r:id="rId16"/>
       <w:pgSz w:w="11906" w:h="16838"/>
       <w:pgMar w:top="1418" w:right="1418" w:bottom="1701" w:left="1701" w:header="709" w:footer="709" w:gutter="0"/>
       <w:pgNumType w:start="1"/>
@@ -28415,6 +28338,18 @@
       </w:tcPr>
     </w:tblStylePr>
   </w:style>
+  <w:style w:type="character" w:styleId="Mencinsinresolver">
+    <w:name w:val="Unresolved Mention"/>
+    <w:basedOn w:val="Fuentedeprrafopredeter"/>
+    <w:uiPriority w:val="99"/>
+    <w:semiHidden/>
+    <w:unhideWhenUsed/>
+    <w:rsid w:val="00E74E3A"/>
+    <w:rPr>
+      <w:color w:val="605E5C"/>
+      <w:shd w:val="clear" w:color="auto" w:fill="E1DFDD"/>
+    </w:rPr>
+  </w:style>
 </w:styles>
 </file>
 
@@ -28697,6 +28632,7 @@
     <w:rsid w:val="005D0A02"/>
     <w:rsid w:val="00604825"/>
     <w:rsid w:val="00624C4F"/>
+    <w:rsid w:val="006A24E9"/>
     <w:rsid w:val="006D10FA"/>
     <w:rsid w:val="006D4367"/>
     <w:rsid w:val="007D473D"/>
@@ -28710,6 +28646,7 @@
     <w:rsid w:val="0096795E"/>
     <w:rsid w:val="00AA7CA8"/>
     <w:rsid w:val="00AD3F06"/>
+    <w:rsid w:val="00B2144F"/>
     <w:rsid w:val="00B82D84"/>
     <w:rsid w:val="00BC1BD3"/>
     <w:rsid w:val="00C6134E"/>
@@ -29520,6 +29457,10 @@
 </file>
 
 <file path=customXml/item1.xml><?xml version="1.0" encoding="utf-8"?>
+<b:Sources xmlns:b="http://schemas.openxmlformats.org/officeDocument/2006/bibliography" xmlns="http://schemas.openxmlformats.org/officeDocument/2006/bibliography" SelectedStyle="\APASixthEditionOfficeOnline.xsl" StyleName="APA" Version="6"/>
+</file>
+
+<file path=customXml/item2.xml><?xml version="1.0" encoding="utf-8"?>
 <?mso-contentType ?>
 <FormTemplates xmlns="http://schemas.microsoft.com/sharepoint/v3/contenttype/forms">
   <Display>DocumentLibraryForm</Display>
@@ -29528,27 +29469,7 @@
 </FormTemplates>
 </file>
 
-<file path=customXml/item2.xml><?xml version="1.0" encoding="utf-8"?>
-<b:Sources xmlns:b="http://schemas.openxmlformats.org/officeDocument/2006/bibliography" xmlns="http://schemas.openxmlformats.org/officeDocument/2006/bibliography" SelectedStyle="\APASixthEditionOfficeOnline.xsl" StyleName="APA" Version="6"/>
-</file>
-
 <file path=customXml/item3.xml><?xml version="1.0" encoding="utf-8"?>
-<p:properties xmlns:p="http://schemas.microsoft.com/office/2006/metadata/properties" xmlns:xsi="http://www.w3.org/2001/XMLSchema-instance" xmlns:pc="http://schemas.microsoft.com/office/infopath/2007/PartnerControls">
-  <documentManagement>
-    <MigrationWizId xmlns="d46416e7-6d2c-4f4a-a0c5-4be57ee88241" xsi:nil="true"/>
-    <MigrationWizIdDocumentLibraryPermissions xmlns="d46416e7-6d2c-4f4a-a0c5-4be57ee88241" xsi:nil="true"/>
-    <MigrationWizIdSecurityGroups xmlns="d46416e7-6d2c-4f4a-a0c5-4be57ee88241" xsi:nil="true"/>
-    <MigrationWizIdPermissionLevels xmlns="d46416e7-6d2c-4f4a-a0c5-4be57ee88241" xsi:nil="true"/>
-    <lcf76f155ced4ddcb4097134ff3c332f xmlns="d46416e7-6d2c-4f4a-a0c5-4be57ee88241">
-      <Terms xmlns="http://schemas.microsoft.com/office/infopath/2007/PartnerControls"/>
-    </lcf76f155ced4ddcb4097134ff3c332f>
-    <MigrationWizIdPermissions xmlns="d46416e7-6d2c-4f4a-a0c5-4be57ee88241" xsi:nil="true"/>
-    <TaxCatchAll xmlns="14756a95-b37b-4efb-8433-c7c61bd362cb" xsi:nil="true"/>
-  </documentManagement>
-</p:properties>
-</file>
-
-<file path=customXml/item4.xml><?xml version="1.0" encoding="utf-8"?>
 <ct:contentTypeSchema xmlns:ct="http://schemas.microsoft.com/office/2006/metadata/contentType" xmlns:ma="http://schemas.microsoft.com/office/2006/metadata/properties/metaAttributes" ct:_="" ma:_="" ma:contentTypeName="Documento" ma:contentTypeID="0x010100AA800A0632DE254DA2317B4367B6018B" ma:contentTypeVersion="20" ma:contentTypeDescription="Crear nuevo documento." ma:contentTypeScope="" ma:versionID="0aa06a1bb3d45c1749f3c7b56b50ab45">
   <xsd:schema xmlns:xsd="http://www.w3.org/2001/XMLSchema" xmlns:xs="http://www.w3.org/2001/XMLSchema" xmlns:p="http://schemas.microsoft.com/office/2006/metadata/properties" xmlns:ns2="d46416e7-6d2c-4f4a-a0c5-4be57ee88241" xmlns:ns3="14756a95-b37b-4efb-8433-c7c61bd362cb" targetNamespace="http://schemas.microsoft.com/office/2006/metadata/properties" ma:root="true" ma:fieldsID="d9674b9f5a8de70e4f04c0b8a889fe03" ns2:_="" ns3:_="">
     <xsd:import namespace="d46416e7-6d2c-4f4a-a0c5-4be57ee88241"/>
@@ -29815,7 +29736,31 @@
 </ct:contentTypeSchema>
 </file>
 
+<file path=customXml/item4.xml><?xml version="1.0" encoding="utf-8"?>
+<p:properties xmlns:p="http://schemas.microsoft.com/office/2006/metadata/properties" xmlns:xsi="http://www.w3.org/2001/XMLSchema-instance" xmlns:pc="http://schemas.microsoft.com/office/infopath/2007/PartnerControls">
+  <documentManagement>
+    <MigrationWizId xmlns="d46416e7-6d2c-4f4a-a0c5-4be57ee88241" xsi:nil="true"/>
+    <MigrationWizIdDocumentLibraryPermissions xmlns="d46416e7-6d2c-4f4a-a0c5-4be57ee88241" xsi:nil="true"/>
+    <MigrationWizIdSecurityGroups xmlns="d46416e7-6d2c-4f4a-a0c5-4be57ee88241" xsi:nil="true"/>
+    <MigrationWizIdPermissionLevels xmlns="d46416e7-6d2c-4f4a-a0c5-4be57ee88241" xsi:nil="true"/>
+    <lcf76f155ced4ddcb4097134ff3c332f xmlns="d46416e7-6d2c-4f4a-a0c5-4be57ee88241">
+      <Terms xmlns="http://schemas.microsoft.com/office/infopath/2007/PartnerControls"/>
+    </lcf76f155ced4ddcb4097134ff3c332f>
+    <MigrationWizIdPermissions xmlns="d46416e7-6d2c-4f4a-a0c5-4be57ee88241" xsi:nil="true"/>
+    <TaxCatchAll xmlns="14756a95-b37b-4efb-8433-c7c61bd362cb" xsi:nil="true"/>
+  </documentManagement>
+</p:properties>
+</file>
+
 <file path=customXml/itemProps1.xml><?xml version="1.0" encoding="utf-8"?>
+<ds:datastoreItem xmlns:ds="http://schemas.openxmlformats.org/officeDocument/2006/customXml" ds:itemID="{3097DD69-CA88-45EF-991D-66FF90578E16}">
+  <ds:schemaRefs>
+    <ds:schemaRef ds:uri="http://schemas.openxmlformats.org/officeDocument/2006/bibliography"/>
+  </ds:schemaRefs>
+</ds:datastoreItem>
+</file>
+
+<file path=customXml/itemProps2.xml><?xml version="1.0" encoding="utf-8"?>
 <ds:datastoreItem xmlns:ds="http://schemas.openxmlformats.org/officeDocument/2006/customXml" ds:itemID="{DD53D5E1-A9E6-4974-A55D-57904EA87C5E}">
   <ds:schemaRefs>
     <ds:schemaRef ds:uri="http://schemas.microsoft.com/sharepoint/v3/contenttype/forms"/>
@@ -29823,26 +29768,7 @@
 </ds:datastoreItem>
 </file>
 
-<file path=customXml/itemProps2.xml><?xml version="1.0" encoding="utf-8"?>
-<ds:datastoreItem xmlns:ds="http://schemas.openxmlformats.org/officeDocument/2006/customXml" ds:itemID="{3097DD69-CA88-45EF-991D-66FF90578E16}">
-  <ds:schemaRefs>
-    <ds:schemaRef ds:uri="http://schemas.openxmlformats.org/officeDocument/2006/bibliography"/>
-  </ds:schemaRefs>
-</ds:datastoreItem>
-</file>
-
 <file path=customXml/itemProps3.xml><?xml version="1.0" encoding="utf-8"?>
-<ds:datastoreItem xmlns:ds="http://schemas.openxmlformats.org/officeDocument/2006/customXml" ds:itemID="{C8D5FA6B-9919-4CF7-992B-01E47542701B}">
-  <ds:schemaRefs>
-    <ds:schemaRef ds:uri="http://schemas.microsoft.com/office/2006/metadata/properties"/>
-    <ds:schemaRef ds:uri="http://schemas.microsoft.com/office/infopath/2007/PartnerControls"/>
-    <ds:schemaRef ds:uri="d46416e7-6d2c-4f4a-a0c5-4be57ee88241"/>
-    <ds:schemaRef ds:uri="14756a95-b37b-4efb-8433-c7c61bd362cb"/>
-  </ds:schemaRefs>
-</ds:datastoreItem>
-</file>
-
-<file path=customXml/itemProps4.xml><?xml version="1.0" encoding="utf-8"?>
 <ds:datastoreItem xmlns:ds="http://schemas.openxmlformats.org/officeDocument/2006/customXml" ds:itemID="{BE5EAF9A-E65E-4020-BBFF-316AF046608A}">
   <ds:schemaRefs>
     <ds:schemaRef ds:uri="http://schemas.microsoft.com/office/2006/metadata/contentType"/>
@@ -29859,4 +29785,15 @@
     <ds:schemaRef ds:uri="http://schemas.microsoft.com/internal/obd"/>
   </ds:schemaRefs>
 </ds:datastoreItem>
+</file>
+
+<file path=customXml/itemProps4.xml><?xml version="1.0" encoding="utf-8"?>
+<ds:datastoreItem xmlns:ds="http://schemas.openxmlformats.org/officeDocument/2006/customXml" ds:itemID="{C8D5FA6B-9919-4CF7-992B-01E47542701B}">
+  <ds:schemaRefs>
+    <ds:schemaRef ds:uri="http://schemas.microsoft.com/office/2006/metadata/properties"/>
+    <ds:schemaRef ds:uri="http://schemas.microsoft.com/office/infopath/2007/PartnerControls"/>
+    <ds:schemaRef ds:uri="d46416e7-6d2c-4f4a-a0c5-4be57ee88241"/>
+    <ds:schemaRef ds:uri="14756a95-b37b-4efb-8433-c7c61bd362cb"/>
+  </ds:schemaRefs>
+</ds:datastoreItem>
 </file>
</xml_diff>

<commit_message>
feat: add 3.3 Validación del proyecto with figures and references
- Write full validation section (3.3) with 6 subsections: objective, methodology, participants, evaluation rubric, results, conclusions
- Add 3 APA 7 figures adapted from internal UTP validation report: sessions screenshots, scores-per-resource bar chart, C01-C06 criteria comparison chart
- Add 2 new references: Scarfe et al. (2024) PLOS ONE and Ullmann et al. (2024) EURODL

Co-Authored-By: Claude Sonnet 4.6 <noreply@anthropic.com>
</commit_message>
<xml_diff>
--- a/Tesis_Final.docx
+++ b/Tesis_Final.docx
@@ -677,10 +677,22 @@
         <w:fldChar w:fldCharType="begin"/>
       </w:r>
       <w:r>
+        <w:instrText xml:space="preserve"> INCLUDEPICTURE  "http://ile.pe/wp-content/uploads/2016/01/logo-upc.jpg" \* MERGEFORMATINET </w:instrText>
+      </w:r>
+      <w:r>
+        <w:fldChar w:fldCharType="separate"/>
+      </w:r>
+      <w:r>
+        <w:fldChar w:fldCharType="begin"/>
+      </w:r>
+      <w:r>
         <w:instrText xml:space="preserve"> </w:instrText>
       </w:r>
       <w:r>
-        <w:instrText>INCLUDEPICTURE  "http://ile.pe/wp-content/uploads/2016/01/logo-upc.jpg" \* MERGEFORMATINET</w:instrText>
+        <w:instrText>INCLUDEPICTURE  "http://ile.pe/wp-c</w:instrText>
+      </w:r>
+      <w:r>
+        <w:instrText>ontent/uploads/2016/01/logo-upc.jpg" \* MERGEFORMATINET</w:instrText>
       </w:r>
       <w:r>
         <w:instrText xml:space="preserve"> </w:instrText>
@@ -689,7 +701,7 @@
         <w:fldChar w:fldCharType="separate"/>
       </w:r>
       <w:r>
-        <w:pict w14:anchorId="59294386">
+        <w:pict w14:anchorId="24E87E3F">
           <v:shapetype id="_x0000_t75" coordsize="21600,21600" o:spt="75" o:preferrelative="t" path="m@4@5l@4@11@9@11@9@5xe" filled="f" stroked="f">
             <v:stroke joinstyle="miter"/>
             <v:formulas>
@@ -709,10 +721,13 @@
             <v:path o:extrusionok="f" gradientshapeok="t" o:connecttype="rect"/>
             <o:lock v:ext="edit" aspectratio="t"/>
           </v:shapetype>
-          <v:shape id="_x0000_i1025" type="#_x0000_t75" alt="Resultado de imagen para LOGO UPC" style="width:72.95pt;height:72.95pt">
+          <v:shape id="_x0000_i1025" type="#_x0000_t75" alt="Resultado de imagen para LOGO UPC" style="width:73.05pt;height:73.05pt">
             <v:imagedata r:id="rId11" r:href="rId12"/>
           </v:shape>
         </w:pict>
+      </w:r>
+      <w:r>
+        <w:fldChar w:fldCharType="end"/>
       </w:r>
       <w:r>
         <w:fldChar w:fldCharType="end"/>
@@ -31868,7 +31883,7 @@
           <w:lang w:eastAsia="es-PE"/>
         </w:rPr>
         <w:drawing>
-          <wp:inline distT="0" distB="0" distL="0" distR="0" wp14:anchorId="0060D18C" wp14:editId="2ADE4F95">
+          <wp:inline distT="0" distB="0" distL="0" distR="0" wp14:anchorId="063FFEBF" wp14:editId="601CA047">
             <wp:extent cx="5759532" cy="2802052"/>
             <wp:effectExtent l="0" t="0" r="0" b="0"/>
             <wp:docPr id="2" name="Imagen 2"/>
@@ -32031,7 +32046,7 @@
           <w:lang w:eastAsia="es-PE"/>
         </w:rPr>
         <w:drawing>
-          <wp:anchor distT="0" distB="0" distL="114300" distR="114300" simplePos="0" relativeHeight="251659264" behindDoc="0" locked="0" layoutInCell="1" allowOverlap="1" wp14:anchorId="6EBDCD8D" wp14:editId="399990D3">
+          <wp:anchor distT="0" distB="0" distL="114300" distR="114300" simplePos="0" relativeHeight="251659264" behindDoc="0" locked="0" layoutInCell="1" allowOverlap="1" wp14:anchorId="453DBB27" wp14:editId="6C41AE91">
             <wp:simplePos x="0" y="0"/>
             <wp:positionH relativeFrom="margin">
               <wp:align>left</wp:align>
@@ -32678,7 +32693,7 @@
           <w:lang w:val="es-ES"/>
         </w:rPr>
         <w:drawing>
-          <wp:anchor distT="0" distB="0" distL="114300" distR="114300" simplePos="0" relativeHeight="251658240" behindDoc="0" locked="0" layoutInCell="1" allowOverlap="1" wp14:anchorId="1F105209" wp14:editId="0D7BF8EC">
+          <wp:anchor distT="0" distB="0" distL="114300" distR="114300" simplePos="0" relativeHeight="251658240" behindDoc="0" locked="0" layoutInCell="1" allowOverlap="1" wp14:anchorId="2ED2E3FE" wp14:editId="6B814FBA">
             <wp:simplePos x="0" y="0"/>
             <wp:positionH relativeFrom="page">
               <wp:align>center</wp:align>
@@ -32760,10 +32775,867 @@
     </w:p>
     <w:p>
       <w:pPr>
-        <w:rPr>
-          <w:lang w:val="es-ES"/>
-        </w:rPr>
-      </w:pPr>
+        <w:pStyle w:val="Ttulo3"/>
+        <w:numPr>
+          <w:ilvl w:val="0"/>
+          <w:numId w:val="0"/>
+        </w:numPr>
+        <w:ind w:left="720" w:hanging="720"/>
+        <w:rPr>
+          <w:i w:val="0"/>
+          <w:iCs w:val="0"/>
+        </w:rPr>
+      </w:pPr>
+      <w:r>
+        <w:rPr>
+          <w:i w:val="0"/>
+          <w:iCs w:val="0"/>
+        </w:rPr>
+        <w:t>3.</w:t>
+      </w:r>
+      <w:r>
+        <w:rPr>
+          <w:i w:val="0"/>
+          <w:iCs w:val="0"/>
+        </w:rPr>
+        <w:t>3</w:t>
+      </w:r>
+      <w:r>
+        <w:rPr>
+          <w:i w:val="0"/>
+          <w:iCs w:val="0"/>
+        </w:rPr>
+        <w:t xml:space="preserve">    </w:t>
+      </w:r>
+      <w:r>
+        <w:rPr>
+          <w:i w:val="0"/>
+          <w:iCs w:val="0"/>
+        </w:rPr>
+        <w:t>Validación del proyecto</w:t>
+      </w:r>
+    </w:p>
+    <w:p>
+      <w:pPr>
+        <w:rPr>
+          <w:lang w:val="es-ES"/>
+        </w:rPr>
+      </w:pPr>
+    </w:p>
+    <w:p>
+      <w:pPr>
+        <w:rPr>
+          <w:lang w:val="es-ES"/>
+        </w:rPr>
+      </w:pPr>
+    </w:p>
+    <w:p>
+      <w:pPr>
+        <w:rPr>
+          <w:lang w:val="es-ES"/>
+        </w:rPr>
+      </w:pPr>
+      <w:r>
+        <w:t xml:space="preserve">La validación del proyecto tuvo como objetivo verificar si el contenido generado por la aplicación Experto Temático alcanza una calidad equivalente a la del material producido por docentes humanos expertos en los cursos. Para ello, se diseñó un experimento de evaluación ciega que permitiera contrastar el material de IA con material elaborado por humanos, sin que los evaluadores supieran de antemano cuál era cuál. Este enfoque sigue la lógica de estudios de evaluación ciega en educación superior, en los cuales los evaluadores califican contenido sin conocer su origen para minimizar sesgos (Scarfe et al., 2024; Ullmann et al., 2024).</w:t>
+      </w:r>
+    </w:p>
+    <w:p>
+      <w:pPr>
+        <w:rPr>
+          <w:lang w:val="es-ES"/>
+        </w:rPr>
+      </w:pPr>
+      <w:r>
+        <w:t xml:space="preserve">3.3.1    Objetivo de la validación</w:t>
+      </w:r>
+    </w:p>
+    <w:p>
+      <w:pPr>
+        <w:rPr>
+          <w:lang w:val="es-ES"/>
+        </w:rPr>
+      </w:pPr>
+      <w:r>
+        <w:t xml:space="preserve">El objetivo principal fue determinar si docentes expertos en los cursos son capaces de detectar diferencias significativas entre el material base generado por IA y el creado por humanos, y si el contenido de la IA cumple criterios de calidad comparables a los materiales elaborados por profesionales.</w:t>
+      </w:r>
+    </w:p>
+    <w:p>
+      <w:pPr>
+        <w:rPr>
+          <w:lang w:val="es-ES"/>
+        </w:rPr>
+      </w:pPr>
+      <w:r>
+        <w:t xml:space="preserve">Los objetivos secundarios fueron:</w:t>
+      </w:r>
+    </w:p>
+    <w:p>
+      <w:pPr>
+        <w:rPr>
+          <w:lang w:val="es-ES"/>
+        </w:rPr>
+      </w:pPr>
+      <w:r>
+        <w:t xml:space="preserve">-  Identificar las fortalezas y debilidades del contenido generado por Experto Temático.</w:t>
+      </w:r>
+    </w:p>
+    <w:p>
+      <w:pPr>
+        <w:rPr>
+          <w:lang w:val="es-ES"/>
+        </w:rPr>
+      </w:pPr>
+      <w:r>
+        <w:t xml:space="preserve">-  Detectar y comparar los patrones de error en cada tipo de contenido.</w:t>
+      </w:r>
+    </w:p>
+    <w:p>
+      <w:pPr>
+        <w:rPr>
+          <w:lang w:val="es-ES"/>
+        </w:rPr>
+      </w:pPr>
+      <w:r>
+        <w:t xml:space="preserve">-  Evaluar si el contenido generado estaba listo para pasar a etapa de producción.</w:t>
+      </w:r>
+    </w:p>
+    <w:p>
+      <w:pPr>
+        <w:rPr>
+          <w:lang w:val="es-ES"/>
+        </w:rPr>
+      </w:pPr>
+      <w:r>
+        <w:t xml:space="preserve">3.3.2    Diseño metodológico</w:t>
+      </w:r>
+    </w:p>
+    <w:p>
+      <w:pPr>
+        <w:rPr>
+          <w:lang w:val="es-ES"/>
+        </w:rPr>
+      </w:pPr>
+      <w:r>
+        <w:t xml:space="preserve">Se diseñó una validación larga estructurada en tres fases secuenciales que combinan evaluación cuantitativa mediante rúbrica y exploración cualitativa mediante entrevista de diagnóstico.</w:t>
+      </w:r>
+    </w:p>
+    <w:p>
+      <w:pPr>
+        <w:rPr>
+          <w:lang w:val="es-ES"/>
+        </w:rPr>
+      </w:pPr>
+      <w:r>
+        <w:t xml:space="preserve">Fase 1 – Evaluación ciega: Cada docente recibió entre 6 y 8 piezas de material base (textos educativos) que incluían un mix de aproximadamente 50% generado por IA y 50% producido por humanos. El material se presentó en formato textual uniforme y sin marcas de origen, de modo que los evaluadores no pudieran distinguirlos visualmente. Los docentes calificaron cada pieza utilizando la rúbrica de validación.</w:t>
+      </w:r>
+    </w:p>
+    <w:p>
+      <w:pPr>
+        <w:rPr>
+          <w:lang w:val="es-ES"/>
+        </w:rPr>
+      </w:pPr>
+      <w:r>
+        <w:t xml:space="preserve">Fase 2 – Revelación del ciego: Al concluir la evaluación, se reveló a los docentes cuáles piezas habían sido generadas por Experto Temático y cuáles por humanos, y se les invitó a reflexionar sobre sus calificaciones a la luz de esta información.</w:t>
+      </w:r>
+    </w:p>
+    <w:p>
+      <w:pPr>
+        <w:rPr>
+          <w:lang w:val="es-ES"/>
+        </w:rPr>
+      </w:pPr>
+      <w:r>
+        <w:t xml:space="preserve">Fase 3 – Entrevista de diagnóstico: Se aplicó una guía estructurada de preguntas diagnósticas para explorar los patrones de error observados, la calidad del material para producción y las diferencias percibidas entre ambos tipos de contenido.</w:t>
+      </w:r>
+    </w:p>
+    <w:p>
+      <w:pPr>
+        <w:rPr>
+          <w:lang w:val="es-ES"/>
+        </w:rPr>
+      </w:pPr>
+      <w:r>
+        <w:t xml:space="preserve">Cada sesión tuvo una duración aproximada de 90 minutos y se realizó de forma remota a través de la plataforma Microsoft Teams. Las sesiones se llevaron a cabo entre el 23 de abril y el 6 de mayo de 2026, con grabación de video previa autorización de los participantes.</w:t>
+      </w:r>
+    </w:p>
+    <w:p>
+      <w:pPr>
+        <w:pStyle w:val="Imagenes"/>
+      </w:pPr>
+      <w:r>
+        <w:t xml:space="preserve">Figura N</w:t>
+      </w:r>
+    </w:p>
+    <w:p>
+      <w:pPr>
+        <w:pStyle w:val="Imagenes"/>
+      </w:pPr>
+      <w:r>
+        <w:t xml:space="preserve">Capturas de sesiones de validación: docente revisando material, compartiendo referencias y calificando con la rúbrica</w:t>
+      </w:r>
+    </w:p>
+    <w:p>
+      <w:pPr>
+        <w:pStyle w:val="Imagenes"/>
+      </w:pPr>
+      <w:r>
+        <w:drawing>
+          <wp:inline xmlns:a="http://schemas.openxmlformats.org/drawingml/2006/main" xmlns:pic="http://schemas.openxmlformats.org/drawingml/2006/picture">
+            <wp:extent cx="5029200" cy="2771256"/>
+            <wp:docPr id="6" name="Picture 6"/>
+            <wp:cNvGraphicFramePr>
+              <a:graphicFrameLocks noChangeAspect="1"/>
+            </wp:cNvGraphicFramePr>
+            <a:graphic>
+              <a:graphicData uri="http://schemas.openxmlformats.org/drawingml/2006/picture">
+                <pic:pic>
+                  <pic:nvPicPr>
+                    <pic:cNvPr id="0" name="chart_sesiones.png"/>
+                    <pic:cNvPicPr/>
+                  </pic:nvPicPr>
+                  <pic:blipFill>
+                    <a:blip r:embed="rId25"/>
+                    <a:stretch>
+                      <a:fillRect/>
+                    </a:stretch>
+                  </pic:blipFill>
+                  <pic:spPr>
+                    <a:xfrm>
+                      <a:off x="0" y="0"/>
+                      <a:ext cx="5029200" cy="2771256"/>
+                    </a:xfrm>
+                    <a:prstGeom prst="rect"/>
+                  </pic:spPr>
+                </pic:pic>
+              </a:graphicData>
+            </a:graphic>
+          </wp:inline>
+        </w:drawing>
+      </w:r>
+    </w:p>
+    <w:p>
+      <w:pPr>
+        <w:pStyle w:val="Imagenes"/>
+      </w:pPr>
+      <w:r>
+        <w:t xml:space="preserve">Nota. Adaptado de Resultados de validación larga de Experto Temático [Documento interno]. Universidad Tecnológica del Perú.</w:t>
+      </w:r>
+    </w:p>
+    <w:p>
+      <w:pPr>
+        <w:rPr>
+          <w:lang w:val="es-ES"/>
+        </w:rPr>
+      </w:pPr>
+    </w:p>
+    <w:p>
+      <w:pPr>
+        <w:rPr>
+          <w:lang w:val="es-ES"/>
+        </w:rPr>
+      </w:pPr>
+      <w:r>
+        <w:t xml:space="preserve">3.3.3    Participantes</w:t>
+      </w:r>
+    </w:p>
+    <w:p>
+      <w:pPr>
+        <w:rPr>
+          <w:lang w:val="es-ES"/>
+        </w:rPr>
+      </w:pPr>
+      <w:r>
+        <w:t xml:space="preserve">La selección de participantes se centró en docentes internos de la Universidad Tecnológica del Perú (UTP) con experiencia comprobada en la enseñanza de los cursos evaluados, denominados docentes dictantes. Se optó por docentes propios de la institución —en lugar de evaluadores externos— dado que el acceso a docentes de planta facilitó la coordinación y aseguró que los evaluadores contaran con el conocimiento tácito específico de los cursos, los estándares pedagógicos de la universidad y el perfil real de los estudiantes.</w:t>
+      </w:r>
+    </w:p>
+    <w:p>
+      <w:pPr>
+        <w:rPr>
+          <w:lang w:val="es-ES"/>
+        </w:rPr>
+      </w:pPr>
+      <w:r>
+        <w:t xml:space="preserve">Participaron 15 docentes distribuidos equitativamente en tres cursos:</w:t>
+      </w:r>
+    </w:p>
+    <w:p>
+      <w:pPr>
+        <w:rPr>
+          <w:lang w:val="es-ES"/>
+        </w:rPr>
+      </w:pPr>
+      <w:r>
+        <w:t xml:space="preserve">-  Cálculo para la toma de decisiones: 5 docentes.</w:t>
+      </w:r>
+    </w:p>
+    <w:p>
+      <w:pPr>
+        <w:rPr>
+          <w:lang w:val="es-ES"/>
+        </w:rPr>
+      </w:pPr>
+      <w:r>
+        <w:t xml:space="preserve">-  Ciudadanía y Reflexión Ética: 5 docentes.</w:t>
+      </w:r>
+    </w:p>
+    <w:p>
+      <w:pPr>
+        <w:rPr>
+          <w:lang w:val="es-ES"/>
+        </w:rPr>
+      </w:pPr>
+      <w:r>
+        <w:t xml:space="preserve">-  Sistemas Operativos: 5 docentes.</w:t>
+      </w:r>
+    </w:p>
+    <w:p>
+      <w:pPr>
+        <w:rPr>
+          <w:lang w:val="es-ES"/>
+        </w:rPr>
+      </w:pPr>
+      <w:r>
+        <w:t xml:space="preserve">El reclutamiento se realizó por invitación directa vía correo electrónico institucional. La invitación especificó el objetivo del estudio, el compromiso de tiempo requerido (aproximadamente 80 minutos en total, divididos en una fase de evaluación de 30 a 40 minutos y una entrevista de 30 a 40 minutos), y la compensación económica de S/ 150, incorporada a la planilla mensual de cada participante. Las evaluaciones se procesaron de forma anónima, sin vincular la identidad del docente a comentarios específicos.</w:t>
+      </w:r>
+    </w:p>
+    <w:p>
+      <w:pPr>
+        <w:rPr>
+          <w:lang w:val="es-ES"/>
+        </w:rPr>
+      </w:pPr>
+      <w:r>
+        <w:t xml:space="preserve">3.3.4    Instrumento de evaluación</w:t>
+      </w:r>
+    </w:p>
+    <w:p>
+      <w:pPr>
+        <w:rPr>
+          <w:lang w:val="es-ES"/>
+        </w:rPr>
+      </w:pPr>
+      <w:r>
+        <w:t xml:space="preserve">Se utilizó una rúbrica de validación compuesta por seis criterios que cubrieron tanto las dimensiones pedagógicas como las de comunicación del material educativo:</w:t>
+      </w:r>
+    </w:p>
+    <w:p>
+      <w:pPr>
+        <w:rPr>
+          <w:lang w:val="es-ES"/>
+        </w:rPr>
+      </w:pPr>
+      <w:r>
+        <w:t xml:space="preserve">-  C01 – Alineación del contenido: Evalúa si el material se alinea con el logro de aprendizaje de la semana o unidad correspondiente.</w:t>
+      </w:r>
+    </w:p>
+    <w:p>
+      <w:pPr>
+        <w:rPr>
+          <w:lang w:val="es-ES"/>
+        </w:rPr>
+      </w:pPr>
+      <w:r>
+        <w:t xml:space="preserve">-  C02 – Exactitud del contenido: Verifica la precisión técnica y factual del contenido presentado.</w:t>
+      </w:r>
+    </w:p>
+    <w:p>
+      <w:pPr>
+        <w:rPr>
+          <w:lang w:val="es-ES"/>
+        </w:rPr>
+      </w:pPr>
+      <w:r>
+        <w:t xml:space="preserve">-  C03 – Rigor académico: Evalúa el uso adecuado de citas, referencias bibliográficas y lenguaje académico.</w:t>
+      </w:r>
+    </w:p>
+    <w:p>
+      <w:pPr>
+        <w:rPr>
+          <w:lang w:val="es-ES"/>
+        </w:rPr>
+      </w:pPr>
+      <w:r>
+        <w:t xml:space="preserve">-  C04 – Propiedad para el nivel del alumno: Valora si el lenguaje, profundidad y ejemplos son adecuados para el ciclo académico del estudiante.</w:t>
+      </w:r>
+    </w:p>
+    <w:p>
+      <w:pPr>
+        <w:rPr>
+          <w:lang w:val="es-ES"/>
+        </w:rPr>
+      </w:pPr>
+      <w:r>
+        <w:t xml:space="preserve">-  C05 – Calidad de ejemplos: Evalúa la relevancia, claridad y diversidad de los ejemplos utilizados en el material.</w:t>
+      </w:r>
+    </w:p>
+    <w:p>
+      <w:pPr>
+        <w:rPr>
+          <w:lang w:val="es-ES"/>
+        </w:rPr>
+      </w:pPr>
+      <w:r>
+        <w:t xml:space="preserve">-  C06 – Probabilidad de que el alumno complete el material: Estima el nivel de engagement y la legibilidad general del contenido.</w:t>
+      </w:r>
+    </w:p>
+    <w:p>
+      <w:pPr>
+        <w:rPr>
+          <w:lang w:val="es-ES"/>
+        </w:rPr>
+      </w:pPr>
+      <w:r>
+        <w:t xml:space="preserve">3.3.5    Resultados</w:t>
+      </w:r>
+    </w:p>
+    <w:p>
+      <w:pPr>
+        <w:rPr>
+          <w:lang w:val="es-ES"/>
+        </w:rPr>
+      </w:pPr>
+      <w:r>
+        <w:rPr>
+          <w:b/>
+        </w:rPr>
+        <w:t xml:space="preserve">Resultados cuantitativos</w:t>
+      </w:r>
+    </w:p>
+    <w:p>
+      <w:pPr>
+        <w:rPr>
+          <w:lang w:val="es-ES"/>
+        </w:rPr>
+      </w:pPr>
+      <w:r>
+        <w:t xml:space="preserve">El análisis de los puntajes obtenidos reveló que no existe una diferencia significativa entre el material generado por IA y el producido por humanos. El contenido humano obtuvo un puntaje promedio de 23.6 puntos, mientras que el contenido generado por Experto Temático alcanzó 22.43 puntos. El puntaje máximo promedio fue de 27.2 para el material humano y de 27 para el material IA, lo que evidencia un rendimiento prácticamente equivalente en términos de calidad percibida.</w:t>
+      </w:r>
+    </w:p>
+    <w:p>
+      <w:pPr>
+        <w:pStyle w:val="Imagenes"/>
+      </w:pPr>
+      <w:r>
+        <w:t xml:space="preserve">Figura N</w:t>
+      </w:r>
+    </w:p>
+    <w:p>
+      <w:pPr>
+        <w:pStyle w:val="Imagenes"/>
+      </w:pPr>
+      <w:r>
+        <w:t xml:space="preserve">Puntaje total obtenido por recurso evaluado: material humano (H) vs. Experto Temático (IA)</w:t>
+      </w:r>
+    </w:p>
+    <w:p>
+      <w:pPr>
+        <w:pStyle w:val="Imagenes"/>
+      </w:pPr>
+      <w:r>
+        <w:drawing>
+          <wp:inline xmlns:a="http://schemas.openxmlformats.org/drawingml/2006/main" xmlns:pic="http://schemas.openxmlformats.org/drawingml/2006/picture">
+            <wp:extent cx="5029200" cy="2771256"/>
+            <wp:docPr id="5" name="Picture 5"/>
+            <wp:cNvGraphicFramePr>
+              <a:graphicFrameLocks noChangeAspect="1"/>
+            </wp:cNvGraphicFramePr>
+            <a:graphic>
+              <a:graphicData uri="http://schemas.openxmlformats.org/drawingml/2006/picture">
+                <pic:pic>
+                  <pic:nvPicPr>
+                    <pic:cNvPr id="0" name="chart_puntaje_recursos.png"/>
+                    <pic:cNvPicPr/>
+                  </pic:nvPicPr>
+                  <pic:blipFill>
+                    <a:blip r:embed="rId24"/>
+                    <a:stretch>
+                      <a:fillRect/>
+                    </a:stretch>
+                  </pic:blipFill>
+                  <pic:spPr>
+                    <a:xfrm>
+                      <a:off x="0" y="0"/>
+                      <a:ext cx="5029200" cy="2771256"/>
+                    </a:xfrm>
+                    <a:prstGeom prst="rect"/>
+                  </pic:spPr>
+                </pic:pic>
+              </a:graphicData>
+            </a:graphic>
+          </wp:inline>
+        </w:drawing>
+      </w:r>
+    </w:p>
+    <w:p>
+      <w:pPr>
+        <w:pStyle w:val="Imagenes"/>
+      </w:pPr>
+      <w:r>
+        <w:t xml:space="preserve">Nota. Adaptado de Resultados de validación larga de Experto Temático [Documento interno]. Universidad Tecnológica del Perú.</w:t>
+      </w:r>
+    </w:p>
+    <w:p>
+      <w:pPr>
+        <w:rPr>
+          <w:lang w:val="es-ES"/>
+        </w:rPr>
+      </w:pPr>
+    </w:p>
+    <w:p>
+      <w:pPr>
+        <w:rPr>
+          <w:lang w:val="es-ES"/>
+        </w:rPr>
+      </w:pPr>
+      <w:r>
+        <w:t xml:space="preserve">El puntaje más bajo registrado para el material de IA fue de 19.2 puntos, atribuido principalmente al desarrollo de un caso ficticio indicado en la consigna de la rúbrica y a la ausencia de citado de fuentes a lo largo del contenido; ambas situaciones son corregibles mediante ajustes en los inputs y en el diseño del pipeline de generación.</w:t>
+      </w:r>
+    </w:p>
+    <w:p>
+      <w:pPr>
+        <w:rPr>
+          <w:lang w:val="es-ES"/>
+        </w:rPr>
+      </w:pPr>
+      <w:r>
+        <w:t xml:space="preserve">Un hallazgo particularmente relevante fue que ninguno de los 15 docentes modificó su evaluación tras conocer cuál material había sido generado por IA. Esto confirma que la calidad del contenido fue valorada de forma objetiva, sin influencia del origen de los materiales, resultado consistente con lo documentado en investigaciones previas sobre evaluación ciega en contextos de educación superior (Scarfe et al., 2024).</w:t>
+      </w:r>
+    </w:p>
+    <w:p>
+      <w:pPr>
+        <w:rPr>
+          <w:lang w:val="es-ES"/>
+        </w:rPr>
+      </w:pPr>
+      <w:r>
+        <w:rPr>
+          <w:b/>
+        </w:rPr>
+        <w:t xml:space="preserve">Resultados cualitativos</w:t>
+      </w:r>
+    </w:p>
+    <w:p>
+      <w:pPr>
+        <w:rPr>
+          <w:lang w:val="es-ES"/>
+        </w:rPr>
+      </w:pPr>
+      <w:r>
+        <w:t xml:space="preserve">El análisis cualitativo derivado de las sesiones de validación permitió identificar atributos diferenciados para ambos tipos de contenido.</w:t>
+      </w:r>
+    </w:p>
+    <w:p>
+      <w:pPr>
+        <w:rPr>
+          <w:lang w:val="es-ES"/>
+        </w:rPr>
+      </w:pPr>
+      <w:r>
+        <w:rPr>
+          <w:b/>
+        </w:rPr>
+        <w:t xml:space="preserve">Fortalezas de Experto Temático:</w:t>
+      </w:r>
+    </w:p>
+    <w:p>
+      <w:pPr>
+        <w:rPr>
+          <w:lang w:val="es-ES"/>
+        </w:rPr>
+      </w:pPr>
+      <w:r>
+        <w:t xml:space="preserve">-  Buena forma narrativa y fluidez en la redacción.</w:t>
+      </w:r>
+    </w:p>
+    <w:p>
+      <w:pPr>
+        <w:rPr>
+          <w:lang w:val="es-ES"/>
+        </w:rPr>
+      </w:pPr>
+      <w:r>
+        <w:t xml:space="preserve">-  Mayor variedad y nivel de detalle en los ejemplos proporcionados, valorados especialmente en Ciudadanía y en Cálculo.</w:t>
+      </w:r>
+    </w:p>
+    <w:p>
+      <w:pPr>
+        <w:rPr>
+          <w:lang w:val="es-ES"/>
+        </w:rPr>
+      </w:pPr>
+      <w:r>
+        <w:t xml:space="preserve">-  Estructuras que facilitan la lectura y la comprensión de los elementos conceptuales.</w:t>
+      </w:r>
+    </w:p>
+    <w:p>
+      <w:pPr>
+        <w:rPr>
+          <w:lang w:val="es-ES"/>
+        </w:rPr>
+      </w:pPr>
+      <w:r>
+        <w:t xml:space="preserve">-  El contenido generado requirió únicamente correcciones menores o medianas, sin necesidad de reescritura completa.</w:t>
+      </w:r>
+    </w:p>
+    <w:p>
+      <w:pPr>
+        <w:rPr>
+          <w:lang w:val="es-ES"/>
+        </w:rPr>
+      </w:pPr>
+      <w:r>
+        <w:rPr>
+          <w:b/>
+        </w:rPr>
+        <w:t xml:space="preserve">Debilidades de Experto Temático:</w:t>
+      </w:r>
+    </w:p>
+    <w:p>
+      <w:pPr>
+        <w:rPr>
+          <w:lang w:val="es-ES"/>
+        </w:rPr>
+      </w:pPr>
+      <w:r>
+        <w:t xml:space="preserve">-  Mayor necesidad de contexto explícito: la herramienta genera mejor contenido cuando los inputs incluyen información tácita específica del curso (dificultades comunes de los alumnos, carreras, metodología de enseñanza).</w:t>
+      </w:r>
+    </w:p>
+    <w:p>
+      <w:pPr>
+        <w:rPr>
+          <w:lang w:val="es-ES"/>
+        </w:rPr>
+      </w:pPr>
+      <w:r>
+        <w:t xml:space="preserve">-  Incumplimiento sistemático de las normas APA 7 al generar las citas dentro del material.</w:t>
+      </w:r>
+    </w:p>
+    <w:p>
+      <w:pPr>
+        <w:rPr>
+          <w:lang w:val="es-ES"/>
+        </w:rPr>
+      </w:pPr>
+      <w:r>
+        <w:t xml:space="preserve">-  Errores menores en las citas generadas: ausencia de número de página, fechas faltantes o nombres con imprecisiones.</w:t>
+      </w:r>
+    </w:p>
+    <w:p>
+      <w:pPr>
+        <w:rPr>
+          <w:lang w:val="es-ES"/>
+        </w:rPr>
+      </w:pPr>
+      <w:r>
+        <w:t xml:space="preserve">-  Puntaje ligeramente inferior en el criterio C01 (Alineación del contenido), cuya causa exacta no se determinó, pero podría estar relacionada con la cobertura de los temas de la semana.</w:t>
+      </w:r>
+    </w:p>
+    <w:p>
+      <w:pPr>
+        <w:rPr>
+          <w:lang w:val="es-ES"/>
+        </w:rPr>
+      </w:pPr>
+      <w:r>
+        <w:rPr>
+          <w:b/>
+        </w:rPr>
+        <w:t xml:space="preserve">Fortalezas del material humano:</w:t>
+      </w:r>
+    </w:p>
+    <w:p>
+      <w:pPr>
+        <w:rPr>
+          <w:lang w:val="es-ES"/>
+        </w:rPr>
+      </w:pPr>
+      <w:r>
+        <w:t xml:space="preserve">-  Refleja conocimiento tácito sobre las habilidades y comportamientos de los alumnos, especialmente en el contexto de exámenes y actividades.</w:t>
+      </w:r>
+    </w:p>
+    <w:p>
+      <w:pPr>
+        <w:rPr>
+          <w:lang w:val="es-ES"/>
+        </w:rPr>
+      </w:pPr>
+      <w:r>
+        <w:t xml:space="preserve">-  Vocabulario y terminología más ajustados al consenso de la industria o área disciplinar.</w:t>
+      </w:r>
+    </w:p>
+    <w:p>
+      <w:pPr>
+        <w:rPr>
+          <w:lang w:val="es-ES"/>
+        </w:rPr>
+      </w:pPr>
+      <w:r>
+        <w:t xml:space="preserve">-  Sin errores en la resolución de ejercicios (C02), cumpliendo correctamente con los criterios de exactitud.</w:t>
+      </w:r>
+    </w:p>
+    <w:p>
+      <w:pPr>
+        <w:rPr>
+          <w:lang w:val="es-ES"/>
+        </w:rPr>
+      </w:pPr>
+      <w:r>
+        <w:rPr>
+          <w:b/>
+        </w:rPr>
+        <w:t xml:space="preserve">Debilidades del material humano:</w:t>
+      </w:r>
+    </w:p>
+    <w:p>
+      <w:pPr>
+        <w:rPr>
+          <w:lang w:val="es-ES"/>
+        </w:rPr>
+      </w:pPr>
+      <w:r>
+        <w:t xml:space="preserve">-  Carencia de citas bibliográficas: en promedio, el material humano obtuvo 17 puntos menos que el de IA en el criterio de rigor académico (C03).</w:t>
+      </w:r>
+    </w:p>
+    <w:p>
+      <w:pPr>
+        <w:rPr>
+          <w:lang w:val="es-ES"/>
+        </w:rPr>
+      </w:pPr>
+      <w:r>
+        <w:t xml:space="preserve">-  Errores ortográficos, palabras incorrectas e incongruencias gramaticales.</w:t>
+      </w:r>
+    </w:p>
+    <w:p>
+      <w:pPr>
+        <w:rPr>
+          <w:lang w:val="es-ES"/>
+        </w:rPr>
+      </w:pPr>
+      <w:r>
+        <w:t xml:space="preserve">-  Ausencia de normas APA 7 en la redacción del contenido.</w:t>
+      </w:r>
+    </w:p>
+    <w:p>
+      <w:pPr>
+        <w:rPr>
+          <w:lang w:val="es-ES"/>
+        </w:rPr>
+      </w:pPr>
+      <w:r>
+        <w:t xml:space="preserve">El criterio con el menor puntaje en ambos tipos de contenido fue C05 (Calidad de ejemplos), lo que indica que la mejora en los ejemplos es una oportunidad transversal, independientemente del origen del material (Lee et al., 2024). Las observaciones específicas por curso incluyeron: para Cálculo para la toma de decisiones, la necesidad de estandarizar la notación matemática y utilizar ecuaciones de Microsoft Word en lugar de LaTeX; para Ciudadanía y Reflexión Ética, el uso de casos reales y actuales vinculados con la realidad nacional en lugar de ficticios; y para Sistemas Operativos, la actualización de referencias tecnológicas desfasadas, como menciones a discos mecánicos como estándar cuando actualmente predominan los SSD.</w:t>
+      </w:r>
+    </w:p>
+    <w:p>
+      <w:pPr>
+        <w:pStyle w:val="Imagenes"/>
+      </w:pPr>
+      <w:r>
+        <w:t xml:space="preserve">Figura N</w:t>
+      </w:r>
+    </w:p>
+    <w:p>
+      <w:pPr>
+        <w:pStyle w:val="Imagenes"/>
+      </w:pPr>
+      <w:r>
+        <w:t xml:space="preserve">Puntaje total por criterio de evaluación: material humano (H) vs. Experto Temático (IA)</w:t>
+      </w:r>
+    </w:p>
+    <w:p>
+      <w:pPr>
+        <w:pStyle w:val="Imagenes"/>
+      </w:pPr>
+      <w:r>
+        <w:drawing>
+          <wp:inline xmlns:a="http://schemas.openxmlformats.org/drawingml/2006/main" xmlns:pic="http://schemas.openxmlformats.org/drawingml/2006/picture">
+            <wp:extent cx="5029200" cy="4018321"/>
+            <wp:docPr id="4" name="Picture 4"/>
+            <wp:cNvGraphicFramePr>
+              <a:graphicFrameLocks noChangeAspect="1"/>
+            </wp:cNvGraphicFramePr>
+            <a:graphic>
+              <a:graphicData uri="http://schemas.openxmlformats.org/drawingml/2006/picture">
+                <pic:pic>
+                  <pic:nvPicPr>
+                    <pic:cNvPr id="0" name="chart_criterios.png"/>
+                    <pic:cNvPicPr/>
+                  </pic:nvPicPr>
+                  <pic:blipFill>
+                    <a:blip r:embed="rId23"/>
+                    <a:stretch>
+                      <a:fillRect/>
+                    </a:stretch>
+                  </pic:blipFill>
+                  <pic:spPr>
+                    <a:xfrm>
+                      <a:off x="0" y="0"/>
+                      <a:ext cx="5029200" cy="4018321"/>
+                    </a:xfrm>
+                    <a:prstGeom prst="rect"/>
+                  </pic:spPr>
+                </pic:pic>
+              </a:graphicData>
+            </a:graphic>
+          </wp:inline>
+        </w:drawing>
+      </w:r>
+    </w:p>
+    <w:p>
+      <w:pPr>
+        <w:pStyle w:val="Imagenes"/>
+      </w:pPr>
+      <w:r>
+        <w:t xml:space="preserve">Nota. Adaptado de Resultados de validación larga de Experto Temático [Documento interno]. Universidad Tecnológica del Perú.</w:t>
+      </w:r>
+    </w:p>
+    <w:p>
+      <w:pPr>
+        <w:rPr>
+          <w:lang w:val="es-ES"/>
+        </w:rPr>
+      </w:pPr>
+    </w:p>
+    <w:p>
+      <w:pPr>
+        <w:rPr>
+          <w:lang w:val="es-ES"/>
+        </w:rPr>
+      </w:pPr>
+      <w:r>
+        <w:t xml:space="preserve">3.3.6    Conclusiones de la validación</w:t>
+      </w:r>
+    </w:p>
+    <w:p>
+      <w:pPr>
+        <w:rPr>
+          <w:lang w:val="es-ES"/>
+        </w:rPr>
+      </w:pPr>
+      <w:r>
+        <w:t xml:space="preserve">Los resultados de la validación demuestran que la aplicación Experto Temático genera material educativo de calidad comparable al producido por docentes humanos expertos, lo que respalda la viabilidad del proyecto para su integración en el proceso de producción de cursos virtuales en UTP. Este hallazgo es coherente con la literatura reciente que señala que el contenido generado por IA, cuando se integra en flujos de trabajo instruccionales estructurados, puede alcanzar estándares de calidad aceptables según criterios académicos (Ullmann et al., 2024; Lee et al., 2024).</w:t>
+      </w:r>
+    </w:p>
+    <w:p>
+      <w:pPr>
+        <w:rPr>
+          <w:lang w:val="es-ES"/>
+        </w:rPr>
+      </w:pPr>
+      <w:r>
+        <w:t xml:space="preserve">La incapacidad de los docentes para distinguir entre el material IA y el humano sugiere que la principal barrera para la adopción exitosa de la herramienta no radica en la calidad del contenido en sí, sino en la necesidad de establecer lineamientos institucionales claros sobre estándares de citación, personalización del contenido por carrera y criterios de alineación con los logros de aprendizaje de cada unidad.</w:t>
+      </w:r>
+    </w:p>
+    <w:p>
+      <w:pPr>
+        <w:rPr>
+          <w:lang w:val="es-ES"/>
+        </w:rPr>
+      </w:pPr>
+      <w:r>
+        <w:t xml:space="preserve">La validación confirmó asimismo que el flujo de producción deberá incorporar una revisión experta antes de la publicación definitiva del material, para corregir las debilidades identificadas, principalmente en materia de rigor académico (citación APA 7) y pertinencia de los ejemplos. Estos hallazgos retroalimentan directamente el diseño de los inputs del pipeline y apuntan hacia ajustes concretos para futuras iteraciones de la aplicación.</w:t>
+      </w:r>
     </w:p>
     <w:p>
       <w:pPr>
@@ -32816,6 +33688,7 @@
         <w:ind w:left="720" w:hanging="720"/>
       </w:pPr>
       <w:r>
+        <w:lastRenderedPageBreak/>
         <w:t xml:space="preserve">Bloom, B. S., Engelhart, M. D., Furst, E. J., Hill, W. H., &amp; Krathwohl, D. R. (1956). </w:t>
       </w:r>
       <w:r>
@@ -32834,7 +33707,6 @@
         <w:ind w:left="720" w:hanging="720"/>
       </w:pPr>
       <w:r>
-        <w:lastRenderedPageBreak/>
         <w:t xml:space="preserve">Brown, T. B., Mann, B., Ryder, N., Subbiah, M., Kaplan, J., Dhariwal, P., &amp; Amodei, D. (2020). Language models are few-shot learners. </w:t>
       </w:r>
       <w:r>
@@ -32915,6 +33787,17 @@
         <w:ind w:left="720" w:hanging="720"/>
       </w:pPr>
       <w:r>
+        <w:t>Kasneci, E., Sessler, K., Küchemann, S., Bannert, M., Dementieva, D., Fischer, F., Gasser, U., Groh, G., Günnemann, S., Hüllermeier, E., Krusche, S., Kutyniok, G., Michaeli, T., Nerdel, C., Pfeffer, J., Poquet, O., Sailer, M., Schmidt, A., Seidel, T., &amp; Ka</w:t>
+      </w:r>
+      <w:r>
+        <w:t>sneci, G. (2023). ChatGPT for good? On opportunities and challenges of large language models for education. Learning and Individual Differences, 103, Artículo 102274. https://doi.org/10.1016/j.lindif.2023.102274</w:t>
+      </w:r>
+    </w:p>
+    <w:p>
+      <w:pPr>
+        <w:ind w:left="720" w:hanging="720"/>
+      </w:pPr>
+      <w:r>
         <w:t xml:space="preserve">Kleppmann, M. (2017). </w:t>
       </w:r>
       <w:r>
@@ -32941,7 +33824,11 @@
         <w:ind w:left="720" w:hanging="720"/>
       </w:pPr>
       <w:r>
-        <w:t xml:space="preserve">Lee, D., Arnold, M., Srivastava, A., Plastow, K., Strelan, P., Ploeckl, F., Lekkas, D., &amp; Palmer, E. (2024). The impact of generative AI on higher education learning and teaching: A study of educators' perspectives. </w:t>
+        <w:t xml:space="preserve">Lee, D., Arnold, M., Srivastava, A., Plastow, K., Strelan, P., Ploeckl, F., Lekkas, D., &amp; Palmer, E. (2024). The impact of generative AI on higher education learning and </w:t>
+      </w:r>
+      <w:r>
+        <w:lastRenderedPageBreak/>
+        <w:t xml:space="preserve">teaching: A study of educators' perspectives. </w:t>
       </w:r>
       <w:r>
         <w:rPr>
@@ -32993,7 +33880,6 @@
         <w:ind w:left="720" w:hanging="720"/>
       </w:pPr>
       <w:r>
-        <w:lastRenderedPageBreak/>
         <w:t>Lou, X., Lázaro-Gredilla, M., Dedieu, A., Wendelken, C., Lehrach, W., &amp; Murphy, K. P. (2026). AutoHarness: Improving LLM agents by automatically synthesizing a code harness. arXiv. https://doi.org/10.48550/arXiv.2603.03329</w:t>
       </w:r>
     </w:p>
@@ -33099,6 +33985,7 @@
         <w:ind w:left="720" w:hanging="720"/>
       </w:pPr>
       <w:r>
+        <w:lastRenderedPageBreak/>
         <w:t>Rigby, D. K., Sutherland, J., &amp; Takeuchi, H. (2016). Embracing agile. Harvard Business Review, 94(5), 40–50. https://hbr.org/2016/05/embracing-agile</w:t>
       </w:r>
     </w:p>
@@ -33115,6 +34002,14 @@
         <w:ind w:left="720" w:hanging="720"/>
       </w:pPr>
       <w:r>
+        <w:t xml:space="preserve">Scarfe, P., Watcham, K., Clarke, A., &amp; Roesch, E. (2024). A real-world test of artificial intelligence infiltration of a university examinations system: A "Turing Test" case study. PLOS ONE, 19(6), e0305354. https://doi.org/10.1371/journal.pone.0305354</w:t>
+      </w:r>
+    </w:p>
+    <w:p>
+      <w:pPr>
+        <w:ind w:left="720" w:hanging="720"/>
+      </w:pPr>
+      <w:r>
         <w:t xml:space="preserve">Schwaber, K., &amp; Sutherland, J. (2020). </w:t>
       </w:r>
       <w:r>
@@ -33133,7 +34028,33 @@
         <w:ind w:left="720" w:hanging="720"/>
       </w:pPr>
       <w:r>
-        <w:lastRenderedPageBreak/>
+        <w:t>Tlili, A., Shehata, B., Adarkwah, M. A., Bozkurt, A., Hickey, D. T., Huang, R., &amp; Agyemang, B. (2023). What if the devil is my guardian angel: ChatGPT as a case study of using chatbots in education. Smart Learning Environments, 10(1), Artículo 15</w:t>
+      </w:r>
+      <w:r>
+        <w:t>. https://doi.org/10.1186/s40561-023-00237-x</w:t>
+      </w:r>
+    </w:p>
+    <w:p>
+      <w:pPr>
+        <w:ind w:left="720" w:hanging="720"/>
+      </w:pPr>
+      <w:r>
+        <w:t xml:space="preserve">Ullmann, T. D., Edwards, C., Bektik, D., Herodotou, C., &amp; Whitelock, D. (2024). Towards generative AI for course content production: Expert reflections. European Journal of Open, Distance and E-Learning, 27(1). https://doi.org/10.2478/eurodl-2024-0013</w:t>
+      </w:r>
+    </w:p>
+    <w:p>
+      <w:pPr>
+        <w:ind w:left="720" w:hanging="720"/>
+      </w:pPr>
+      <w:r>
+        <w:t>UNESCO. (2021). National education responses to COVID-19: The situation of Latin America. Recuperado el 5 de mayo de 2026, de https://unesdoc.unesco.org/ark:/48223/pf0000377074_eng</w:t>
+      </w:r>
+    </w:p>
+    <w:p>
+      <w:pPr>
+        <w:ind w:left="720" w:hanging="720"/>
+      </w:pPr>
+      <w:r>
         <w:t xml:space="preserve">Wei, J., Wang, X., Schuurmans, D., Bosma, M., Xia, F., Chi, E., &amp; Zhou, D. (2022). Chain-of-thought prompting elicits reasoning in large language models. </w:t>
       </w:r>
       <w:r>
@@ -48283,8 +49204,8 @@
   <w:font w:name="Courier">
     <w:panose1 w:val="02070409020205020404"/>
     <w:charset w:val="00"/>
-    <w:family w:val="modern"/>
-    <w:pitch w:val="fixed"/>
+    <w:family w:val="auto"/>
+    <w:pitch w:val="variable"/>
     <w:sig w:usb0="00000003" w:usb1="00000000" w:usb2="00000000" w:usb3="00000000" w:csb0="00000001" w:csb1="00000000"/>
   </w:font>
   <w:font w:name="Yu Mincho">
@@ -48337,6 +49258,7 @@
     <w:rsid w:val="00364623"/>
     <w:rsid w:val="00372B88"/>
     <w:rsid w:val="004153F1"/>
+    <w:rsid w:val="00420B7D"/>
     <w:rsid w:val="004804B8"/>
     <w:rsid w:val="00481FEA"/>
     <w:rsid w:val="004B1736"/>
@@ -49188,26 +50110,6 @@
 </file>
 
 <file path=customXml/item1.xml><?xml version="1.0" encoding="utf-8"?>
-<b:Sources xmlns:b="http://schemas.openxmlformats.org/officeDocument/2006/bibliography" xmlns="http://schemas.openxmlformats.org/officeDocument/2006/bibliography" SelectedStyle="\APASixthEditionOfficeOnline.xsl" StyleName="APA" Version="6"/>
-</file>
-
-<file path=customXml/item2.xml><?xml version="1.0" encoding="utf-8"?>
-<p:properties xmlns:p="http://schemas.microsoft.com/office/2006/metadata/properties" xmlns:xsi="http://www.w3.org/2001/XMLSchema-instance" xmlns:pc="http://schemas.microsoft.com/office/infopath/2007/PartnerControls">
-  <documentManagement>
-    <MigrationWizId xmlns="d46416e7-6d2c-4f4a-a0c5-4be57ee88241" xsi:nil="true"/>
-    <MigrationWizIdDocumentLibraryPermissions xmlns="d46416e7-6d2c-4f4a-a0c5-4be57ee88241" xsi:nil="true"/>
-    <MigrationWizIdSecurityGroups xmlns="d46416e7-6d2c-4f4a-a0c5-4be57ee88241" xsi:nil="true"/>
-    <MigrationWizIdPermissionLevels xmlns="d46416e7-6d2c-4f4a-a0c5-4be57ee88241" xsi:nil="true"/>
-    <lcf76f155ced4ddcb4097134ff3c332f xmlns="d46416e7-6d2c-4f4a-a0c5-4be57ee88241">
-      <Terms xmlns="http://schemas.microsoft.com/office/infopath/2007/PartnerControls"/>
-    </lcf76f155ced4ddcb4097134ff3c332f>
-    <MigrationWizIdPermissions xmlns="d46416e7-6d2c-4f4a-a0c5-4be57ee88241" xsi:nil="true"/>
-    <TaxCatchAll xmlns="14756a95-b37b-4efb-8433-c7c61bd362cb" xsi:nil="true"/>
-  </documentManagement>
-</p:properties>
-</file>
-
-<file path=customXml/item3.xml><?xml version="1.0" encoding="utf-8"?>
 <ct:contentTypeSchema xmlns:ct="http://schemas.microsoft.com/office/2006/metadata/contentType" xmlns:ma="http://schemas.microsoft.com/office/2006/metadata/properties/metaAttributes" ct:_="" ma:_="" ma:contentTypeName="Documento" ma:contentTypeID="0x010100AA800A0632DE254DA2317B4367B6018B" ma:contentTypeVersion="20" ma:contentTypeDescription="Crear nuevo documento." ma:contentTypeScope="" ma:versionID="0aa06a1bb3d45c1749f3c7b56b50ab45">
   <xsd:schema xmlns:xsd="http://www.w3.org/2001/XMLSchema" xmlns:xs="http://www.w3.org/2001/XMLSchema" xmlns:p="http://schemas.microsoft.com/office/2006/metadata/properties" xmlns:ns2="d46416e7-6d2c-4f4a-a0c5-4be57ee88241" xmlns:ns3="14756a95-b37b-4efb-8433-c7c61bd362cb" targetNamespace="http://schemas.microsoft.com/office/2006/metadata/properties" ma:root="true" ma:fieldsID="d9674b9f5a8de70e4f04c0b8a889fe03" ns2:_="" ns3:_="">
     <xsd:import namespace="d46416e7-6d2c-4f4a-a0c5-4be57ee88241"/>
@@ -49474,6 +50376,26 @@
 </ct:contentTypeSchema>
 </file>
 
+<file path=customXml/item2.xml><?xml version="1.0" encoding="utf-8"?>
+<p:properties xmlns:p="http://schemas.microsoft.com/office/2006/metadata/properties" xmlns:xsi="http://www.w3.org/2001/XMLSchema-instance" xmlns:pc="http://schemas.microsoft.com/office/infopath/2007/PartnerControls">
+  <documentManagement>
+    <MigrationWizId xmlns="d46416e7-6d2c-4f4a-a0c5-4be57ee88241" xsi:nil="true"/>
+    <MigrationWizIdDocumentLibraryPermissions xmlns="d46416e7-6d2c-4f4a-a0c5-4be57ee88241" xsi:nil="true"/>
+    <MigrationWizIdSecurityGroups xmlns="d46416e7-6d2c-4f4a-a0c5-4be57ee88241" xsi:nil="true"/>
+    <MigrationWizIdPermissionLevels xmlns="d46416e7-6d2c-4f4a-a0c5-4be57ee88241" xsi:nil="true"/>
+    <lcf76f155ced4ddcb4097134ff3c332f xmlns="d46416e7-6d2c-4f4a-a0c5-4be57ee88241">
+      <Terms xmlns="http://schemas.microsoft.com/office/infopath/2007/PartnerControls"/>
+    </lcf76f155ced4ddcb4097134ff3c332f>
+    <MigrationWizIdPermissions xmlns="d46416e7-6d2c-4f4a-a0c5-4be57ee88241" xsi:nil="true"/>
+    <TaxCatchAll xmlns="14756a95-b37b-4efb-8433-c7c61bd362cb" xsi:nil="true"/>
+  </documentManagement>
+</p:properties>
+</file>
+
+<file path=customXml/item3.xml><?xml version="1.0" encoding="utf-8"?>
+<b:Sources xmlns:b="http://schemas.openxmlformats.org/officeDocument/2006/bibliography" xmlns="http://schemas.openxmlformats.org/officeDocument/2006/bibliography" SelectedStyle="\APASixthEditionOfficeOnline.xsl" StyleName="APA" Version="6"/>
+</file>
+
 <file path=customXml/item4.xml><?xml version="1.0" encoding="utf-8"?>
 <?mso-contentType ?>
 <FormTemplates xmlns="http://schemas.microsoft.com/sharepoint/v3/contenttype/forms">
@@ -49484,25 +50406,6 @@
 </file>
 
 <file path=customXml/itemProps1.xml><?xml version="1.0" encoding="utf-8"?>
-<ds:datastoreItem xmlns:ds="http://schemas.openxmlformats.org/officeDocument/2006/customXml" ds:itemID="{3097DD69-CA88-45EF-991D-66FF90578E16}">
-  <ds:schemaRefs>
-    <ds:schemaRef ds:uri="http://schemas.openxmlformats.org/officeDocument/2006/bibliography"/>
-  </ds:schemaRefs>
-</ds:datastoreItem>
-</file>
-
-<file path=customXml/itemProps2.xml><?xml version="1.0" encoding="utf-8"?>
-<ds:datastoreItem xmlns:ds="http://schemas.openxmlformats.org/officeDocument/2006/customXml" ds:itemID="{C8D5FA6B-9919-4CF7-992B-01E47542701B}">
-  <ds:schemaRefs>
-    <ds:schemaRef ds:uri="http://schemas.microsoft.com/office/2006/metadata/properties"/>
-    <ds:schemaRef ds:uri="http://schemas.microsoft.com/office/infopath/2007/PartnerControls"/>
-    <ds:schemaRef ds:uri="d46416e7-6d2c-4f4a-a0c5-4be57ee88241"/>
-    <ds:schemaRef ds:uri="14756a95-b37b-4efb-8433-c7c61bd362cb"/>
-  </ds:schemaRefs>
-</ds:datastoreItem>
-</file>
-
-<file path=customXml/itemProps3.xml><?xml version="1.0" encoding="utf-8"?>
 <ds:datastoreItem xmlns:ds="http://schemas.openxmlformats.org/officeDocument/2006/customXml" ds:itemID="{BE5EAF9A-E65E-4020-BBFF-316AF046608A}">
   <ds:schemaRefs>
     <ds:schemaRef ds:uri="http://schemas.microsoft.com/office/2006/metadata/contentType"/>
@@ -49521,6 +50424,25 @@
 </ds:datastoreItem>
 </file>
 
+<file path=customXml/itemProps2.xml><?xml version="1.0" encoding="utf-8"?>
+<ds:datastoreItem xmlns:ds="http://schemas.openxmlformats.org/officeDocument/2006/customXml" ds:itemID="{C8D5FA6B-9919-4CF7-992B-01E47542701B}">
+  <ds:schemaRefs>
+    <ds:schemaRef ds:uri="http://schemas.microsoft.com/office/2006/metadata/properties"/>
+    <ds:schemaRef ds:uri="http://schemas.microsoft.com/office/infopath/2007/PartnerControls"/>
+    <ds:schemaRef ds:uri="d46416e7-6d2c-4f4a-a0c5-4be57ee88241"/>
+    <ds:schemaRef ds:uri="14756a95-b37b-4efb-8433-c7c61bd362cb"/>
+  </ds:schemaRefs>
+</ds:datastoreItem>
+</file>
+
+<file path=customXml/itemProps3.xml><?xml version="1.0" encoding="utf-8"?>
+<ds:datastoreItem xmlns:ds="http://schemas.openxmlformats.org/officeDocument/2006/customXml" ds:itemID="{3097DD69-CA88-45EF-991D-66FF90578E16}">
+  <ds:schemaRefs>
+    <ds:schemaRef ds:uri="http://schemas.openxmlformats.org/officeDocument/2006/bibliography"/>
+  </ds:schemaRefs>
+</ds:datastoreItem>
+</file>
+
 <file path=customXml/itemProps4.xml><?xml version="1.0" encoding="utf-8"?>
 <ds:datastoreItem xmlns:ds="http://schemas.openxmlformats.org/officeDocument/2006/customXml" ds:itemID="{DD53D5E1-A9E6-4974-A55D-57904EA87C5E}">
   <ds:schemaRefs>

</xml_diff>

<commit_message>
ultimos cambios capitulo 3,4 sobre validacion y resultados
</commit_message>
<xml_diff>
--- a/Tesis_Final.docx
+++ b/Tesis_Final.docx
@@ -2,6 +2,8 @@
 <file path=word/document.xml><?xml version="1.0" encoding="utf-8"?>
 <w:document xmlns:wpc="http://schemas.microsoft.com/office/word/2010/wordprocessingCanvas" xmlns:cx="http://schemas.microsoft.com/office/drawing/2014/chartex" xmlns:cx1="http://schemas.microsoft.com/office/drawing/2015/9/8/chartex" xmlns:cx2="http://schemas.microsoft.com/office/drawing/2015/10/21/chartex" xmlns:cx3="http://schemas.microsoft.com/office/drawing/2016/5/9/chartex" xmlns:cx4="http://schemas.microsoft.com/office/drawing/2016/5/10/chartex" xmlns:cx5="http://schemas.microsoft.com/office/drawing/2016/5/11/chartex" xmlns:cx6="http://schemas.microsoft.com/office/drawing/2016/5/12/chartex" xmlns:cx7="http://schemas.microsoft.com/office/drawing/2016/5/13/chartex" xmlns:cx8="http://schemas.microsoft.com/office/drawing/2016/5/14/chartex" xmlns:mc="http://schemas.openxmlformats.org/markup-compatibility/2006" xmlns:aink="http://schemas.microsoft.com/office/drawing/2016/ink" xmlns:am3d="http://schemas.microsoft.com/office/drawing/2017/model3d" xmlns:o="urn:schemas-microsoft-com:office:office" xmlns:r="http://schemas.openxmlformats.org/officeDocument/2006/relationships" xmlns:m="http://schemas.openxmlformats.org/officeDocument/2006/math" xmlns:v="urn:schemas-microsoft-com:vml" xmlns:wp14="http://schemas.microsoft.com/office/word/2010/wordprocessingDrawing" xmlns:wp="http://schemas.openxmlformats.org/drawingml/2006/wordprocessingDrawing" xmlns:w10="urn:schemas-microsoft-com:office:word" xmlns:w="http://schemas.openxmlformats.org/wordprocessingml/2006/main" xmlns:w14="http://schemas.microsoft.com/office/word/2010/wordml" xmlns:w15="http://schemas.microsoft.com/office/word/2012/wordml" xmlns:w16cex="http://schemas.microsoft.com/office/word/2018/wordml/cex" xmlns:w16cid="http://schemas.microsoft.com/office/word/2016/wordml/cid" xmlns:w16="http://schemas.microsoft.com/office/word/2018/wordml" xmlns:w16sdtdh="http://schemas.microsoft.com/office/word/2020/wordml/sdtdatahash" xmlns:w16se="http://schemas.microsoft.com/office/word/2015/wordml/symex" xmlns:wpg="http://schemas.microsoft.com/office/word/2010/wordprocessingGroup" xmlns:wpi="http://schemas.microsoft.com/office/word/2010/wordprocessingInk" xmlns:wne="http://schemas.microsoft.com/office/word/2006/wordml" xmlns:wps="http://schemas.microsoft.com/office/word/2010/wordprocessingShape" mc:Ignorable="w14 w15 w16se w16cid w16 w16cex w16sdtdh wp14">
   <w:body>
+    <w:bookmarkStart w:id="0" w:name="_Hlk230630625"/>
+    <w:bookmarkEnd w:id="0"/>
     <w:p>
       <w:pPr>
         <w:spacing w:line="259" w:lineRule="auto"/>
@@ -686,13 +688,19 @@
         <w:fldChar w:fldCharType="begin"/>
       </w:r>
       <w:r>
+        <w:instrText xml:space="preserve"> INCLUDEPICTURE  "http://ile.pe/wp-content/uploads/2016/01/logo-upc.jpg" \* MERGEFORMATINET </w:instrText>
+      </w:r>
+      <w:r>
+        <w:fldChar w:fldCharType="separate"/>
+      </w:r>
+      <w:r>
+        <w:fldChar w:fldCharType="begin"/>
+      </w:r>
+      <w:r>
         <w:instrText xml:space="preserve"> </w:instrText>
       </w:r>
       <w:r>
-        <w:instrText>INCLUDEPICTURE  "http://ile.pe/wp-c</w:instrText>
-      </w:r>
-      <w:r>
-        <w:instrText>ontent/uploads/2016/01/logo-upc.jpg" \* MERGEFORMATINET</w:instrText>
+        <w:instrText>INCLUDEPICTURE  "http://ile.pe/wp-content/uploads/2016/01/logo-upc.jpg" \* MERGEFORMATINET</w:instrText>
       </w:r>
       <w:r>
         <w:instrText xml:space="preserve"> </w:instrText>
@@ -701,7 +709,7 @@
         <w:fldChar w:fldCharType="separate"/>
       </w:r>
       <w:r>
-        <w:pict w14:anchorId="24E87E3F">
+        <w:pict w14:anchorId="4739AA09">
           <v:shapetype id="_x0000_t75" coordsize="21600,21600" o:spt="75" o:preferrelative="t" path="m@4@5l@4@11@9@11@9@5xe" filled="f" stroked="f">
             <v:stroke joinstyle="miter"/>
             <v:formulas>
@@ -721,10 +729,13 @@
             <v:path o:extrusionok="f" gradientshapeok="t" o:connecttype="rect"/>
             <o:lock v:ext="edit" aspectratio="t"/>
           </v:shapetype>
-          <v:shape id="_x0000_i1025" type="#_x0000_t75" alt="Resultado de imagen para LOGO UPC" style="width:73.05pt;height:73.05pt">
+          <v:shape id="_x0000_i1025" type="#_x0000_t75" alt="Resultado de imagen para LOGO UPC" style="width:73.4pt;height:73.4pt">
             <v:imagedata r:id="rId11" r:href="rId12"/>
           </v:shape>
         </w:pict>
+      </w:r>
+      <w:r>
+        <w:fldChar w:fldCharType="end"/>
       </w:r>
       <w:r>
         <w:fldChar w:fldCharType="end"/>
@@ -7333,28 +7344,10 @@
       <w:pPr>
         <w:pStyle w:val="Ttulo1"/>
       </w:pPr>
-      <w:bookmarkStart w:id="0" w:name="_Toc229503006"/>
+      <w:bookmarkStart w:id="1" w:name="_Toc229503006"/>
       <w:r>
         <w:lastRenderedPageBreak/>
         <w:t>CAPÍTULO 1: DEFINICIÓN DEL PROYECTO</w:t>
-      </w:r>
-      <w:bookmarkEnd w:id="0"/>
-    </w:p>
-    <w:p>
-      <w:pPr>
-        <w:spacing w:after="120"/>
-      </w:pPr>
-      <w:r>
-        <w:t>En el presente capítulo se expone el contexto que motivó el desarrollo del proyecto. Se presentan los antecedentes de la problemática, la descripción de la organización donde se llevó a cabo la validación, el análisis del problema identificado, los objetivos propuestos, los indicadores de éxito, la matriz de consistencia y la descripción general del proyecto.</w:t>
-      </w:r>
-    </w:p>
-    <w:p>
-      <w:pPr>
-        <w:pStyle w:val="Ttulo2"/>
-      </w:pPr>
-      <w:bookmarkStart w:id="1" w:name="_Toc229503007"/>
-      <w:r>
-        <w:t>Antecedentes</w:t>
       </w:r>
       <w:bookmarkEnd w:id="1"/>
     </w:p>
@@ -7363,52 +7356,16 @@
         <w:spacing w:after="120"/>
       </w:pPr>
       <w:r>
-        <w:t>La pandemia de COVID-19 marcó un punto de inflexión en la educación superior del Perú. A partir del año 2020, y con mayor impacto durante 2021, las universidades se vieron obligadas a migrar masivamente hacia la modalidad virtual, sin contar con los procesos ni la infraestructura suficiente para sostener esa transición a escala. Según la UNESCO (2021), más del 90% de los sistemas educativos en América Latina implementaron alguna forma de educación a distancia durante la pandemia, lo que generó una demanda sin precedentes de contenido digital instruccional en plazos extremadamente cortos.</w:t>
+        <w:t>En el presente capítulo se expone el contexto que motivó el desarrollo del proyecto. Se presentan los antecedentes de la problemática, la descripción de la organización donde se llevó a cabo la validación, el análisis del problema identificado, los objetivos propuestos, los indicadores de éxito, la matriz de consistencia y la descripción general del proyecto.</w:t>
       </w:r>
     </w:p>
     <w:p>
       <w:pPr>
-        <w:spacing w:after="120"/>
-      </w:pPr>
-      <w:r>
-        <w:t>En este contexto, los equipos responsables del diseño y producción de cursos virtuales enfrentaron una doble presión: por un lado, la imposibilidad de coordinar presencialmente las etapas del proceso, y por otro, el incremento acelerado en el número de cursos que debían virtualizarse. El proceso de producción, que involucra a múltiples roles trabajando en cadena —diseñadores instruccionales, docentes revisores y virtualizadores—, se volvió especialmente vulnerable al trabajo remoto: cada entrega dependía de la disponibilidad del rol anterior, las reuniones de coordinación se dificultaron, y las versiones del contenido se multiplicaban sin control claro, generando reprocesos y retrasos acumulados.</w:t>
-      </w:r>
-    </w:p>
-    <w:p>
-      <w:pPr>
-        <w:spacing w:after="120"/>
-      </w:pPr>
-      <w:r>
-        <w:t>Salas-Pilco et al. (2022), en una revisión sistemática de instituciones de educación superior latinoamericanas, documentaron que la transición abrupta a la educación virtual durante la pandemia generó importantes brechas operativas en la producción de contenido instruccional, identificando la falta de preparación institucional y las dificultades de coordinación entre los equipos de diseño y los expertos temáticos como los principales factores que extendieron significativamente los tiempos de desarrollo de materiales educativos (Salas-Pilco et al., 2022).</w:t>
-      </w:r>
-    </w:p>
-    <w:p>
-      <w:pPr>
-        <w:spacing w:after="120"/>
-      </w:pPr>
-      <w:r>
-        <w:t xml:space="preserve">Paralelamente, la generación del contenido instruccional —la redacción de los guiones de los recursos de video, las introducciones semanales y las consignas de actividades— representa históricamente la última etapa del proceso de producción y, por tanto, la que concentra la mayor presión de entrega. En instituciones con alta demanda de cursos virtuales, </w:t>
-      </w:r>
-      <w:r>
-        <w:lastRenderedPageBreak/>
-        <w:t>esta etapa debe completarse en aproximadamente una semana por curso, lo que obliga al equipo a trabajar en paralelo con múltiples cursos simultáneamente, aumentando el riesgo de errores, inconsistencias pedagógicas y variabilidad en la calidad del contenido.</w:t>
-      </w:r>
-    </w:p>
-    <w:p>
-      <w:pPr>
-        <w:spacing w:after="120"/>
-      </w:pPr>
-      <w:r>
-        <w:t>Frente a este escenario, los modelos de lenguaje de gran escala (LLMs) han emergido como una alternativa viable para asistir en la generación de contenido instruccional. Tlili et al. (2023) realizaron una revisión sistemática sobre el uso de IA generativa en educación, identificando que la generación de materiales instruccionales es una de las aplicaciones con mayor potencial de reducción de carga operativa, siempre que se mantengan mecanismos de revisión por expertos para garantizar la calidad pedagógica. Kasneci et al. (2023) destacaron que los LLMs pueden generar contenido educativo coherente y alineado a objetivos de aprendizaje cuando se les proporcionan estructuras pedagógicas claras como punto de partida, condición que el presente proyecto satisface al partir del sílabo y el acta de reunión de inicio del curso.</w:t>
-      </w:r>
-    </w:p>
-    <w:p>
-      <w:pPr>
         <w:pStyle w:val="Ttulo2"/>
       </w:pPr>
-      <w:bookmarkStart w:id="2" w:name="_Toc229503008"/>
-      <w:r>
-        <w:t>Descripción de la organización</w:t>
+      <w:bookmarkStart w:id="2" w:name="_Toc229503007"/>
+      <w:r>
+        <w:t>Antecedentes</w:t>
       </w:r>
       <w:bookmarkEnd w:id="2"/>
     </w:p>
@@ -7417,7 +7374,7 @@
         <w:spacing w:after="120"/>
       </w:pPr>
       <w:r>
-        <w:t>La organización de estudio es una institución de educación superior privada con presencia a nivel nacional en el Perú, que ofrece programas de pregrado y posgrado tanto en modalidad presencial como virtual. Cuenta con una amplia oferta académica orientada a diversas carreras profesionales y ha apostado por el crecimiento de su modalidad virtual como parte de su estrategia institucional.</w:t>
+        <w:t>La pandemia de COVID-19 marcó un punto de inflexión en la educación superior del Perú. A partir del año 2020, y con mayor impacto durante 2021, las universidades se vieron obligadas a migrar masivamente hacia la modalidad virtual, sin contar con los procesos ni la infraestructura suficiente para sostener esa transición a escala. Según la UNESCO (2021), más del 90% de los sistemas educativos en América Latina implementaron alguna forma de educación a distancia durante la pandemia, lo que generó una demanda sin precedentes de contenido digital instruccional en plazos extremadamente cortos.</w:t>
       </w:r>
     </w:p>
     <w:p>
@@ -7425,7 +7382,7 @@
         <w:spacing w:after="120"/>
       </w:pPr>
       <w:r>
-        <w:t>En el ámbito de la educación virtual, la institución cuenta con un proceso estructurado de producción de cursos denominado virtualización, que comprende la definición del diseño instruccional, la redacción del contenido textual por semana académica y la posterior producción de los recursos multimedia. Dentro de este proceso, el docente virtualizador es el profesional encargado de redactar los materiales instruccionales denominados IPES (Introducción, Presentaciones y Ejercicios), que constituyen el contenido textual base de cada semana del curso.</w:t>
+        <w:t>En este contexto, los equipos responsables del diseño y producción de cursos virtuales enfrentaron una doble presión: por un lado, la imposibilidad de coordinar presencialmente las etapas del proceso, y por otro, el incremento acelerado en el número de cursos que debían virtualizarse. El proceso de producción, que involucra a múltiples roles trabajando en cadena —diseñadores instruccionales, docentes revisores y virtualizadores—, se volvió especialmente vulnerable al trabajo remoto: cada entrega dependía de la disponibilidad del rol anterior, las reuniones de coordinación se dificultaron, y las versiones del contenido se multiplicaban sin control claro, generando reprocesos y retrasos acumulados.</w:t>
       </w:r>
     </w:p>
     <w:p>
@@ -7433,6 +7390,60 @@
         <w:spacing w:after="120"/>
       </w:pPr>
       <w:r>
+        <w:t>Salas-Pilco et al. (2022), en una revisión sistemática de instituciones de educación superior latinoamericanas, documentaron que la transición abrupta a la educación virtual durante la pandemia generó importantes brechas operativas en la producción de contenido instruccional, identificando la falta de preparación institucional y las dificultades de coordinación entre los equipos de diseño y los expertos temáticos como los principales factores que extendieron significativamente los tiempos de desarrollo de materiales educativos (Salas-Pilco et al., 2022).</w:t>
+      </w:r>
+    </w:p>
+    <w:p>
+      <w:pPr>
+        <w:spacing w:after="120"/>
+      </w:pPr>
+      <w:r>
+        <w:t xml:space="preserve">Paralelamente, la generación del contenido instruccional —la redacción de los guiones de los recursos de video, las introducciones semanales y las consignas de actividades— representa históricamente la última etapa del proceso de producción y, por tanto, la que concentra la mayor presión de entrega. En instituciones con alta demanda de cursos virtuales, </w:t>
+      </w:r>
+      <w:r>
+        <w:lastRenderedPageBreak/>
+        <w:t>esta etapa debe completarse en aproximadamente una semana por curso, lo que obliga al equipo a trabajar en paralelo con múltiples cursos simultáneamente, aumentando el riesgo de errores, inconsistencias pedagógicas y variabilidad en la calidad del contenido.</w:t>
+      </w:r>
+    </w:p>
+    <w:p>
+      <w:pPr>
+        <w:spacing w:after="120"/>
+      </w:pPr>
+      <w:r>
+        <w:t>Frente a este escenario, los modelos de lenguaje de gran escala (LLMs) han emergido como una alternativa viable para asistir en la generación de contenido instruccional. Tlili et al. (2023) realizaron una revisión sistemática sobre el uso de IA generativa en educación, identificando que la generación de materiales instruccionales es una de las aplicaciones con mayor potencial de reducción de carga operativa, siempre que se mantengan mecanismos de revisión por expertos para garantizar la calidad pedagógica. Kasneci et al. (2023) destacaron que los LLMs pueden generar contenido educativo coherente y alineado a objetivos de aprendizaje cuando se les proporcionan estructuras pedagógicas claras como punto de partida, condición que el presente proyecto satisface al partir del sílabo y el acta de reunión de inicio del curso.</w:t>
+      </w:r>
+    </w:p>
+    <w:p>
+      <w:pPr>
+        <w:pStyle w:val="Ttulo2"/>
+      </w:pPr>
+      <w:bookmarkStart w:id="3" w:name="_Toc229503008"/>
+      <w:r>
+        <w:t>Descripción de la organización</w:t>
+      </w:r>
+      <w:bookmarkEnd w:id="3"/>
+    </w:p>
+    <w:p>
+      <w:pPr>
+        <w:spacing w:after="120"/>
+      </w:pPr>
+      <w:r>
+        <w:t>La organización de estudio es una institución de educación superior privada con presencia a nivel nacional en el Perú, que ofrece programas de pregrado y posgrado tanto en modalidad presencial como virtual. Cuenta con una amplia oferta académica orientada a diversas carreras profesionales y ha apostado por el crecimiento de su modalidad virtual como parte de su estrategia institucional.</w:t>
+      </w:r>
+    </w:p>
+    <w:p>
+      <w:pPr>
+        <w:spacing w:after="120"/>
+      </w:pPr>
+      <w:r>
+        <w:t>En el ámbito de la educación virtual, la institución cuenta con un proceso estructurado de producción de cursos denominado virtualización, que comprende la definición del diseño instruccional, la redacción del contenido textual por semana académica y la posterior producción de los recursos multimedia. Dentro de este proceso, el docente virtualizador es el profesional encargado de redactar los materiales instruccionales denominados IPES (Introducción, Presentaciones y Ejercicios), que constituyen el contenido textual base de cada semana del curso.</w:t>
+      </w:r>
+    </w:p>
+    <w:p>
+      <w:pPr>
+        <w:spacing w:after="120"/>
+      </w:pPr>
+      <w:r>
         <w:t xml:space="preserve">El proceso de producción de un curso completo de 18 semanas toma en promedio entre dos y tres semanas de trabajo, durante las cuales el docente virtualizador genera los guiones de narración para los recursos de video, las introducciones a cada semana y las consignas de los ejercicios y actividades, tanto calificadas como no calificadas. La institución establece criterios pedagógicos precisos para este contenido, incluyendo la alineación con los logros de aprendizaje del sílabo, el respeto de restricciones de tiempo de estudio y la selección de </w:t>
       </w:r>
       <w:r>
@@ -7444,11 +7455,11 @@
       <w:pPr>
         <w:pStyle w:val="Ttulo2"/>
       </w:pPr>
-      <w:bookmarkStart w:id="3" w:name="_Toc229503009"/>
+      <w:bookmarkStart w:id="4" w:name="_Toc229503009"/>
       <w:r>
         <w:t>Análisis del problema</w:t>
       </w:r>
-      <w:bookmarkEnd w:id="3"/>
+      <w:bookmarkEnd w:id="4"/>
     </w:p>
     <w:p>
       <w:pPr>
@@ -7556,9 +7567,9 @@
           <w:szCs w:val="24"/>
         </w:rPr>
       </w:pPr>
-      <w:bookmarkStart w:id="4" w:name="_Toc227156494"/>
-      <w:bookmarkStart w:id="5" w:name="_Toc227157326"/>
-      <w:bookmarkStart w:id="6" w:name="_Toc227184612"/>
+      <w:bookmarkStart w:id="5" w:name="_Toc227156494"/>
+      <w:bookmarkStart w:id="6" w:name="_Toc227157326"/>
+      <w:bookmarkStart w:id="7" w:name="_Toc227184612"/>
       <w:r>
         <w:rPr>
           <w:sz w:val="24"/>
@@ -7609,9 +7620,9 @@
         </w:rPr>
         <w:t xml:space="preserve"> Comparativa de costo: proceso manual vs. solución IA</w:t>
       </w:r>
-      <w:bookmarkEnd w:id="4"/>
       <w:bookmarkEnd w:id="5"/>
       <w:bookmarkEnd w:id="6"/>
+      <w:bookmarkEnd w:id="7"/>
     </w:p>
     <w:tbl>
       <w:tblPr>
@@ -7862,10 +7873,10 @@
           <w:szCs w:val="24"/>
         </w:rPr>
       </w:pPr>
-      <w:bookmarkStart w:id="7" w:name="_Toc226927506"/>
-      <w:bookmarkStart w:id="8" w:name="_Toc227156495"/>
-      <w:bookmarkStart w:id="9" w:name="_Toc227157327"/>
-      <w:bookmarkStart w:id="10" w:name="_Toc227184613"/>
+      <w:bookmarkStart w:id="8" w:name="_Toc226927506"/>
+      <w:bookmarkStart w:id="9" w:name="_Toc227156495"/>
+      <w:bookmarkStart w:id="10" w:name="_Toc227157327"/>
+      <w:bookmarkStart w:id="11" w:name="_Toc227184613"/>
       <w:r>
         <w:rPr>
           <w:sz w:val="24"/>
@@ -7916,10 +7927,10 @@
         </w:rPr>
         <w:t xml:space="preserve"> Síntesis de problemática</w:t>
       </w:r>
-      <w:bookmarkEnd w:id="7"/>
       <w:bookmarkEnd w:id="8"/>
       <w:bookmarkEnd w:id="9"/>
       <w:bookmarkEnd w:id="10"/>
+      <w:bookmarkEnd w:id="11"/>
     </w:p>
     <w:tbl>
       <w:tblPr>
@@ -8165,33 +8176,9 @@
       <w:pPr>
         <w:pStyle w:val="Ttulo2"/>
       </w:pPr>
-      <w:bookmarkStart w:id="11" w:name="_Toc229503010"/>
+      <w:bookmarkStart w:id="12" w:name="_Toc229503010"/>
       <w:r>
         <w:t>Objetivos</w:t>
-      </w:r>
-      <w:bookmarkEnd w:id="11"/>
-    </w:p>
-    <w:p>
-      <w:pPr>
-        <w:spacing w:after="120"/>
-      </w:pPr>
-      <w:r>
-        <w:t xml:space="preserve">A </w:t>
-      </w:r>
-      <w:r>
-        <w:t>continuación,</w:t>
-      </w:r>
-      <w:r>
-        <w:t xml:space="preserve"> se describen los objetivos propuestos para dar solución a la problemática identificada.</w:t>
-      </w:r>
-    </w:p>
-    <w:p>
-      <w:pPr>
-        <w:pStyle w:val="Ttulo3"/>
-      </w:pPr>
-      <w:bookmarkStart w:id="12" w:name="_Toc229503011"/>
-      <w:r>
-        <w:t>Objetivo general</w:t>
       </w:r>
       <w:bookmarkEnd w:id="12"/>
     </w:p>
@@ -8200,67 +8187,57 @@
         <w:spacing w:after="120"/>
       </w:pPr>
       <w:r>
-        <w:t xml:space="preserve">Implementar </w:t>
-      </w:r>
-      <w:r>
-        <w:t>una</w:t>
-      </w:r>
-      <w:r>
-        <w:t xml:space="preserve"> solución tecnológica basada en inteligencia artificial para optimizar el tiempo</w:t>
-      </w:r>
-      <w:r>
-        <w:t xml:space="preserve"> en</w:t>
-      </w:r>
-      <w:r>
-        <w:t xml:space="preserve"> la generación de contenido</w:t>
-      </w:r>
-      <w:r>
-        <w:t xml:space="preserve"> de cursos virtuales en universidades del Perú</w:t>
+        <w:t xml:space="preserve">A </w:t>
+      </w:r>
+      <w:r>
+        <w:t>continuación,</w:t>
+      </w:r>
+      <w:r>
+        <w:t xml:space="preserve"> se describen los objetivos propuestos para dar solución a la problemática identificada.</w:t>
       </w:r>
     </w:p>
     <w:p>
       <w:pPr>
         <w:pStyle w:val="Ttulo3"/>
       </w:pPr>
-      <w:bookmarkStart w:id="13" w:name="_Toc229503012"/>
-      <w:r>
-        <w:t>Objetivos específicos</w:t>
+      <w:bookmarkStart w:id="13" w:name="_Toc229503011"/>
+      <w:r>
+        <w:t>Objetivo general</w:t>
       </w:r>
       <w:bookmarkEnd w:id="13"/>
     </w:p>
     <w:p>
       <w:pPr>
-        <w:spacing w:after="80"/>
-      </w:pPr>
-      <w:r>
-        <w:rPr>
-          <w:b/>
-        </w:rPr>
-        <w:t xml:space="preserve">OE1: </w:t>
-      </w:r>
-      <w:r>
-        <w:t>Analizar la solución tecnológica basada en IA para optimizar el tiempo en la generación de contenido de cursos virtuales.</w:t>
+        <w:spacing w:after="120"/>
+      </w:pPr>
+      <w:r>
+        <w:t xml:space="preserve">Implementar </w:t>
+      </w:r>
+      <w:r>
+        <w:t>una</w:t>
+      </w:r>
+      <w:r>
+        <w:t xml:space="preserve"> solución tecnológica basada en inteligencia artificial para optimizar el tiempo</w:t>
+      </w:r>
+      <w:r>
+        <w:t xml:space="preserve"> en</w:t>
+      </w:r>
+      <w:r>
+        <w:t xml:space="preserve"> la generación de contenido</w:t>
+      </w:r>
+      <w:r>
+        <w:t xml:space="preserve"> de cursos virtuales en universidades del Perú</w:t>
       </w:r>
     </w:p>
     <w:p>
       <w:pPr>
-        <w:spacing w:after="80"/>
-      </w:pPr>
-      <w:r>
-        <w:rPr>
-          <w:b/>
-        </w:rPr>
-        <w:t xml:space="preserve">OE2: </w:t>
-      </w:r>
-      <w:r>
-        <w:t>Diseñar la arquitectura</w:t>
-      </w:r>
-      <w:r>
-        <w:t xml:space="preserve"> física y lógica</w:t>
-      </w:r>
-      <w:r>
-        <w:t xml:space="preserve"> de la solución tecnológica basada en IA para optimizar el tiempo en la generación de contenido de cursos virtuales en universidades del Perú.</w:t>
-      </w:r>
+        <w:pStyle w:val="Ttulo3"/>
+      </w:pPr>
+      <w:bookmarkStart w:id="14" w:name="_Toc229503012"/>
+      <w:r>
+        <w:t>Objetivos específicos</w:t>
+      </w:r>
+      <w:bookmarkEnd w:id="14"/>
     </w:p>
     <w:p>
       <w:pPr>
@@ -8270,10 +8247,10 @@
         <w:rPr>
           <w:b/>
         </w:rPr>
-        <w:t xml:space="preserve">OE3: </w:t>
-      </w:r>
-      <w:r>
-        <w:t>Implementar y validar la solución tecnológica basada en IA para optimizar el tiempo en la generación de contenido de cursos virtuales mediante métricas de rendimiento.</w:t>
+        <w:t xml:space="preserve">OE1: </w:t>
+      </w:r>
+      <w:r>
+        <w:t>Analizar la solución tecnológica basada en IA para optimizar el tiempo en la generación de contenido de cursos virtuales.</w:t>
       </w:r>
     </w:p>
     <w:p>
@@ -8283,52 +8260,86 @@
       <w:r>
         <w:rPr>
           <w:b/>
-          <w:bCs/>
-        </w:rPr>
-        <w:t xml:space="preserve">OE4: </w:t>
-      </w:r>
-      <w:r>
-        <w:t xml:space="preserve">Elaborar </w:t>
-      </w:r>
-      <w:bookmarkStart w:id="14" w:name="_Int_euz9ULN8"/>
-      <w:r>
-        <w:t>un plan</w:t>
-      </w:r>
-      <w:bookmarkEnd w:id="14"/>
-      <w:r>
-        <w:t xml:space="preserve"> de continuidad que asegure la viabilidad técnica de la solución tecnológica propuesta en el tiempo.</w:t>
+        </w:rPr>
+        <w:t xml:space="preserve">OE2: </w:t>
+      </w:r>
+      <w:r>
+        <w:t>Diseñar la arquitectura</w:t>
+      </w:r>
+      <w:r>
+        <w:t xml:space="preserve"> física y lógica</w:t>
+      </w:r>
+      <w:r>
+        <w:t xml:space="preserve"> de la solución tecnológica basada en IA para optimizar el tiempo en la generación de contenido de cursos virtuales en universidades del Perú.</w:t>
       </w:r>
     </w:p>
     <w:p>
       <w:pPr>
-        <w:pStyle w:val="Ttulo2"/>
-      </w:pPr>
-      <w:bookmarkStart w:id="15" w:name="_Toc229503013"/>
-      <w:r>
-        <w:t>Indicadores de éxito</w:t>
-      </w:r>
-      <w:bookmarkEnd w:id="15"/>
+        <w:spacing w:after="80"/>
+      </w:pPr>
+      <w:r>
+        <w:rPr>
+          <w:b/>
+        </w:rPr>
+        <w:t xml:space="preserve">OE3: </w:t>
+      </w:r>
+      <w:r>
+        <w:t>Implementar y validar la solución tecnológica basada en IA para optimizar el tiempo en la generación de contenido de cursos virtuales mediante métricas de rendimiento.</w:t>
+      </w:r>
     </w:p>
     <w:p>
       <w:pPr>
-        <w:spacing w:after="120"/>
-      </w:pPr>
-      <w:r>
-        <w:t>En la siguiente tabla se presentan los indicadores de éxito del proyecto, asociados a cada objetivo específico.</w:t>
+        <w:spacing w:after="80"/>
+      </w:pPr>
+      <w:r>
+        <w:rPr>
+          <w:b/>
+          <w:bCs/>
+        </w:rPr>
+        <w:t xml:space="preserve">OE4: </w:t>
+      </w:r>
+      <w:r>
+        <w:t xml:space="preserve">Elaborar </w:t>
+      </w:r>
+      <w:bookmarkStart w:id="15" w:name="_Int_euz9ULN8"/>
+      <w:r>
+        <w:t>un plan</w:t>
+      </w:r>
+      <w:bookmarkEnd w:id="15"/>
+      <w:r>
+        <w:t xml:space="preserve"> de continuidad que asegure la viabilidad técnica de la solución tecnológica propuesta en el tiempo.</w:t>
       </w:r>
     </w:p>
     <w:p>
       <w:pPr>
+        <w:pStyle w:val="Ttulo2"/>
+      </w:pPr>
+      <w:bookmarkStart w:id="16" w:name="_Toc229503013"/>
+      <w:r>
+        <w:t>Indicadores de éxito</w:t>
+      </w:r>
+      <w:bookmarkEnd w:id="16"/>
+    </w:p>
+    <w:p>
+      <w:pPr>
+        <w:spacing w:after="120"/>
+      </w:pPr>
+      <w:r>
+        <w:t>En la siguiente tabla se presentan los indicadores de éxito del proyecto, asociados a cada objetivo específico.</w:t>
+      </w:r>
+    </w:p>
+    <w:p>
+      <w:pPr>
         <w:pStyle w:val="Descripcin"/>
         <w:rPr>
           <w:sz w:val="24"/>
           <w:szCs w:val="24"/>
         </w:rPr>
       </w:pPr>
-      <w:bookmarkStart w:id="16" w:name="_Toc226927507"/>
-      <w:bookmarkStart w:id="17" w:name="_Toc227156496"/>
-      <w:bookmarkStart w:id="18" w:name="_Toc227157328"/>
-      <w:bookmarkStart w:id="19" w:name="_Toc227184614"/>
+      <w:bookmarkStart w:id="17" w:name="_Toc226927507"/>
+      <w:bookmarkStart w:id="18" w:name="_Toc227156496"/>
+      <w:bookmarkStart w:id="19" w:name="_Toc227157328"/>
+      <w:bookmarkStart w:id="20" w:name="_Toc227184614"/>
       <w:r>
         <w:rPr>
           <w:sz w:val="24"/>
@@ -8379,10 +8390,10 @@
         </w:rPr>
         <w:t xml:space="preserve"> Indicadores de éxito</w:t>
       </w:r>
-      <w:bookmarkEnd w:id="16"/>
       <w:bookmarkEnd w:id="17"/>
       <w:bookmarkEnd w:id="18"/>
       <w:bookmarkEnd w:id="19"/>
+      <w:bookmarkEnd w:id="20"/>
     </w:p>
     <w:tbl>
       <w:tblPr>
@@ -8604,11 +8615,11 @@
       <w:pPr>
         <w:pStyle w:val="Ttulo2"/>
       </w:pPr>
-      <w:bookmarkStart w:id="20" w:name="_Toc229503014"/>
+      <w:bookmarkStart w:id="21" w:name="_Toc229503014"/>
       <w:r>
         <w:t>Matriz de consistencia</w:t>
       </w:r>
-      <w:bookmarkEnd w:id="20"/>
+      <w:bookmarkEnd w:id="21"/>
     </w:p>
     <w:p>
       <w:pPr>
@@ -8626,9 +8637,9 @@
           <w:szCs w:val="24"/>
         </w:rPr>
       </w:pPr>
-      <w:bookmarkStart w:id="21" w:name="_Toc227156497"/>
-      <w:bookmarkStart w:id="22" w:name="_Toc227157329"/>
-      <w:bookmarkStart w:id="23" w:name="_Toc227184615"/>
+      <w:bookmarkStart w:id="22" w:name="_Toc227156497"/>
+      <w:bookmarkStart w:id="23" w:name="_Toc227157329"/>
+      <w:bookmarkStart w:id="24" w:name="_Toc227184615"/>
       <w:r>
         <w:rPr>
           <w:sz w:val="24"/>
@@ -8679,9 +8690,9 @@
         </w:rPr>
         <w:t xml:space="preserve"> Matriz de consistencia</w:t>
       </w:r>
-      <w:bookmarkEnd w:id="21"/>
       <w:bookmarkEnd w:id="22"/>
       <w:bookmarkEnd w:id="23"/>
+      <w:bookmarkEnd w:id="24"/>
     </w:p>
     <w:tbl>
       <w:tblPr>
@@ -8868,11 +8879,11 @@
             <w:r>
               <w:t xml:space="preserve">Implementación de agentes IA y evaluación por </w:t>
             </w:r>
-            <w:bookmarkStart w:id="24" w:name="_Int_BxY3eduy"/>
+            <w:bookmarkStart w:id="25" w:name="_Int_BxY3eduy"/>
             <w:r>
               <w:t>docentes</w:t>
             </w:r>
-            <w:bookmarkEnd w:id="24"/>
+            <w:bookmarkEnd w:id="25"/>
             <w:r>
               <w:t xml:space="preserve"> revisores mediante rúbrica de calidad pedagógica.</w:t>
             </w:r>
@@ -8946,7 +8957,7 @@
       <w:pPr>
         <w:pStyle w:val="Ttulo2"/>
       </w:pPr>
-      <w:bookmarkStart w:id="25" w:name="_Toc229503015"/>
+      <w:bookmarkStart w:id="26" w:name="_Toc229503015"/>
       <w:r>
         <w:lastRenderedPageBreak/>
         <w:t>Planificación</w:t>
@@ -8954,17 +8965,17 @@
       <w:r>
         <w:t xml:space="preserve"> del proyecto</w:t>
       </w:r>
-      <w:bookmarkEnd w:id="25"/>
+      <w:bookmarkEnd w:id="26"/>
     </w:p>
     <w:p>
       <w:pPr>
         <w:pStyle w:val="Ttulo3"/>
       </w:pPr>
-      <w:bookmarkStart w:id="26" w:name="_Toc229503016"/>
+      <w:bookmarkStart w:id="27" w:name="_Toc229503016"/>
       <w:r>
         <w:t>Cronograma</w:t>
       </w:r>
-      <w:bookmarkEnd w:id="26"/>
+      <w:bookmarkEnd w:id="27"/>
       <w:r>
         <w:t xml:space="preserve"> </w:t>
       </w:r>
@@ -8996,7 +9007,7 @@
           <w:szCs w:val="24"/>
         </w:rPr>
       </w:pPr>
-      <w:bookmarkStart w:id="27" w:name="_Toc227184616"/>
+      <w:bookmarkStart w:id="28" w:name="_Toc227184616"/>
       <w:r>
         <w:rPr>
           <w:sz w:val="24"/>
@@ -9047,7 +9058,7 @@
         </w:rPr>
         <w:t xml:space="preserve"> Cronograma de desarrollo (Sep 2025 – Abr 2026)</w:t>
       </w:r>
-      <w:bookmarkEnd w:id="27"/>
+      <w:bookmarkEnd w:id="28"/>
     </w:p>
     <w:tbl>
       <w:tblPr>
@@ -9765,11 +9776,11 @@
       <w:pPr>
         <w:pStyle w:val="Ttulo3"/>
       </w:pPr>
-      <w:bookmarkStart w:id="28" w:name="_Toc229503017"/>
+      <w:bookmarkStart w:id="29" w:name="_Toc229503017"/>
       <w:r>
         <w:t>Costos del proyecto</w:t>
       </w:r>
-      <w:bookmarkEnd w:id="28"/>
+      <w:bookmarkEnd w:id="29"/>
     </w:p>
     <w:p>
       <w:pPr>
@@ -9806,9 +9817,9 @@
           <w:szCs w:val="24"/>
         </w:rPr>
       </w:pPr>
-      <w:bookmarkStart w:id="29" w:name="_Toc227156498"/>
-      <w:bookmarkStart w:id="30" w:name="_Toc227157330"/>
-      <w:bookmarkStart w:id="31" w:name="_Toc227184617"/>
+      <w:bookmarkStart w:id="30" w:name="_Toc227156498"/>
+      <w:bookmarkStart w:id="31" w:name="_Toc227157330"/>
+      <w:bookmarkStart w:id="32" w:name="_Toc227184617"/>
       <w:r>
         <w:rPr>
           <w:sz w:val="24"/>
@@ -9859,9 +9870,9 @@
         </w:rPr>
         <w:t xml:space="preserve"> Proyección de costo de modelos LLM</w:t>
       </w:r>
-      <w:bookmarkEnd w:id="29"/>
       <w:bookmarkEnd w:id="30"/>
       <w:bookmarkEnd w:id="31"/>
+      <w:bookmarkEnd w:id="32"/>
     </w:p>
     <w:tbl>
       <w:tblPr>
@@ -10100,9 +10111,9 @@
           <w:szCs w:val="24"/>
         </w:rPr>
       </w:pPr>
-      <w:bookmarkStart w:id="32" w:name="_Toc227156499"/>
-      <w:bookmarkStart w:id="33" w:name="_Toc227157331"/>
-      <w:bookmarkStart w:id="34" w:name="_Toc227184618"/>
+      <w:bookmarkStart w:id="33" w:name="_Toc227156499"/>
+      <w:bookmarkStart w:id="34" w:name="_Toc227157331"/>
+      <w:bookmarkStart w:id="35" w:name="_Toc227184618"/>
       <w:r>
         <w:rPr>
           <w:sz w:val="24"/>
@@ -10153,9 +10164,9 @@
         </w:rPr>
         <w:t xml:space="preserve"> Proyección de costo por componente del proceso (por curso – 18 semanas)</w:t>
       </w:r>
-      <w:bookmarkEnd w:id="32"/>
       <w:bookmarkEnd w:id="33"/>
       <w:bookmarkEnd w:id="34"/>
+      <w:bookmarkEnd w:id="35"/>
     </w:p>
     <w:tbl>
       <w:tblPr>
@@ -11018,9 +11029,9 @@
           <w:szCs w:val="24"/>
         </w:rPr>
       </w:pPr>
-      <w:bookmarkStart w:id="35" w:name="_Toc227156500"/>
-      <w:bookmarkStart w:id="36" w:name="_Toc227157332"/>
-      <w:bookmarkStart w:id="37" w:name="_Toc227184619"/>
+      <w:bookmarkStart w:id="36" w:name="_Toc227156500"/>
+      <w:bookmarkStart w:id="37" w:name="_Toc227157332"/>
+      <w:bookmarkStart w:id="38" w:name="_Toc227184619"/>
       <w:r>
         <w:rPr>
           <w:sz w:val="24"/>
@@ -11071,9 +11082,9 @@
         </w:rPr>
         <w:t xml:space="preserve"> Proyección de costo del equipo de trabajo</w:t>
       </w:r>
-      <w:bookmarkEnd w:id="35"/>
       <w:bookmarkEnd w:id="36"/>
       <w:bookmarkEnd w:id="37"/>
+      <w:bookmarkEnd w:id="38"/>
     </w:p>
     <w:tbl>
       <w:tblPr>
@@ -11487,9 +11498,9 @@
           <w:lang w:val="es-ES"/>
         </w:rPr>
       </w:pPr>
-      <w:bookmarkStart w:id="38" w:name="_Toc227156501"/>
-      <w:bookmarkStart w:id="39" w:name="_Toc227157333"/>
-      <w:bookmarkStart w:id="40" w:name="_Toc227184620"/>
+      <w:bookmarkStart w:id="39" w:name="_Toc227156501"/>
+      <w:bookmarkStart w:id="40" w:name="_Toc227157333"/>
+      <w:bookmarkStart w:id="41" w:name="_Toc227184620"/>
       <w:r>
         <w:rPr>
           <w:sz w:val="24"/>
@@ -11540,9 +11551,9 @@
         </w:rPr>
         <w:t xml:space="preserve"> Proyección de costos de dispositivos de trabajo</w:t>
       </w:r>
-      <w:bookmarkEnd w:id="38"/>
       <w:bookmarkEnd w:id="39"/>
       <w:bookmarkEnd w:id="40"/>
+      <w:bookmarkEnd w:id="41"/>
     </w:p>
     <w:tbl>
       <w:tblPr>
@@ -11779,8 +11790,8 @@
           <w:lang w:val="es-ES"/>
         </w:rPr>
       </w:pPr>
-      <w:bookmarkStart w:id="41" w:name="_Toc227157334"/>
-      <w:bookmarkStart w:id="42" w:name="_Toc227184621"/>
+      <w:bookmarkStart w:id="42" w:name="_Toc227157334"/>
+      <w:bookmarkStart w:id="43" w:name="_Toc227184621"/>
       <w:r>
         <w:rPr>
           <w:sz w:val="24"/>
@@ -11831,8 +11842,8 @@
         </w:rPr>
         <w:t xml:space="preserve"> Resumen de costos totales</w:t>
       </w:r>
-      <w:bookmarkEnd w:id="41"/>
       <w:bookmarkEnd w:id="42"/>
+      <w:bookmarkEnd w:id="43"/>
     </w:p>
     <w:tbl>
       <w:tblPr>
@@ -12113,12 +12124,12 @@
       <w:pPr>
         <w:pStyle w:val="Ttulo1"/>
       </w:pPr>
-      <w:bookmarkStart w:id="43" w:name="_Toc229503018"/>
+      <w:bookmarkStart w:id="44" w:name="_Toc229503018"/>
       <w:r>
         <w:lastRenderedPageBreak/>
         <w:t>CAPÍTULO 2: MARCO TEÓRICO</w:t>
       </w:r>
-      <w:bookmarkEnd w:id="43"/>
+      <w:bookmarkEnd w:id="44"/>
     </w:p>
     <w:p>
       <w:pPr>
@@ -12142,16 +12153,15 @@
           <w:lang w:val="es-ES"/>
         </w:rPr>
       </w:pPr>
-      <w:bookmarkStart w:id="44" w:name="_Toc228894009"/>
-      <w:bookmarkStart w:id="45" w:name="_Toc229212245"/>
-      <w:bookmarkStart w:id="46" w:name="_Toc229213002"/>
-      <w:bookmarkStart w:id="47" w:name="_Toc229213041"/>
-      <w:bookmarkStart w:id="48" w:name="_Toc229221500"/>
-      <w:bookmarkStart w:id="49" w:name="_Toc229227486"/>
-      <w:bookmarkStart w:id="50" w:name="_Toc229347957"/>
-      <w:bookmarkStart w:id="51" w:name="_Toc229502977"/>
-      <w:bookmarkStart w:id="52" w:name="_Toc229503019"/>
-      <w:bookmarkEnd w:id="44"/>
+      <w:bookmarkStart w:id="45" w:name="_Toc228894009"/>
+      <w:bookmarkStart w:id="46" w:name="_Toc229212245"/>
+      <w:bookmarkStart w:id="47" w:name="_Toc229213002"/>
+      <w:bookmarkStart w:id="48" w:name="_Toc229213041"/>
+      <w:bookmarkStart w:id="49" w:name="_Toc229221500"/>
+      <w:bookmarkStart w:id="50" w:name="_Toc229227486"/>
+      <w:bookmarkStart w:id="51" w:name="_Toc229347957"/>
+      <w:bookmarkStart w:id="52" w:name="_Toc229502977"/>
+      <w:bookmarkStart w:id="53" w:name="_Toc229503019"/>
       <w:bookmarkEnd w:id="45"/>
       <w:bookmarkEnd w:id="46"/>
       <w:bookmarkEnd w:id="47"/>
@@ -12160,6 +12170,7 @@
       <w:bookmarkEnd w:id="50"/>
       <w:bookmarkEnd w:id="51"/>
       <w:bookmarkEnd w:id="52"/>
+      <w:bookmarkEnd w:id="53"/>
     </w:p>
     <w:p>
       <w:pPr>
@@ -12183,16 +12194,15 @@
           <w:lang w:val="es-ES"/>
         </w:rPr>
       </w:pPr>
-      <w:bookmarkStart w:id="53" w:name="_Toc228894010"/>
-      <w:bookmarkStart w:id="54" w:name="_Toc229212246"/>
-      <w:bookmarkStart w:id="55" w:name="_Toc229213003"/>
-      <w:bookmarkStart w:id="56" w:name="_Toc229213042"/>
-      <w:bookmarkStart w:id="57" w:name="_Toc229221501"/>
-      <w:bookmarkStart w:id="58" w:name="_Toc229227487"/>
-      <w:bookmarkStart w:id="59" w:name="_Toc229347958"/>
-      <w:bookmarkStart w:id="60" w:name="_Toc229502978"/>
-      <w:bookmarkStart w:id="61" w:name="_Toc229503020"/>
-      <w:bookmarkEnd w:id="53"/>
+      <w:bookmarkStart w:id="54" w:name="_Toc228894010"/>
+      <w:bookmarkStart w:id="55" w:name="_Toc229212246"/>
+      <w:bookmarkStart w:id="56" w:name="_Toc229213003"/>
+      <w:bookmarkStart w:id="57" w:name="_Toc229213042"/>
+      <w:bookmarkStart w:id="58" w:name="_Toc229221501"/>
+      <w:bookmarkStart w:id="59" w:name="_Toc229227487"/>
+      <w:bookmarkStart w:id="60" w:name="_Toc229347958"/>
+      <w:bookmarkStart w:id="61" w:name="_Toc229502978"/>
+      <w:bookmarkStart w:id="62" w:name="_Toc229503020"/>
       <w:bookmarkEnd w:id="54"/>
       <w:bookmarkEnd w:id="55"/>
       <w:bookmarkEnd w:id="56"/>
@@ -12201,6 +12211,7 @@
       <w:bookmarkEnd w:id="59"/>
       <w:bookmarkEnd w:id="60"/>
       <w:bookmarkEnd w:id="61"/>
+      <w:bookmarkEnd w:id="62"/>
     </w:p>
     <w:p>
       <w:pPr>
@@ -12210,23 +12221,23 @@
           <w:numId w:val="23"/>
         </w:numPr>
       </w:pPr>
-      <w:bookmarkStart w:id="62" w:name="_Toc229503021"/>
+      <w:bookmarkStart w:id="63" w:name="_Toc229503021"/>
       <w:r>
         <w:t>Marco Conceptual</w:t>
-      </w:r>
-      <w:bookmarkEnd w:id="62"/>
-    </w:p>
-    <w:p>
-      <w:pPr>
-        <w:pStyle w:val="Ttulo3"/>
-      </w:pPr>
-      <w:bookmarkStart w:id="63" w:name="_Toc229503022"/>
-      <w:r>
-        <w:t>El Proceso de Producción Instruccional</w:t>
       </w:r>
       <w:bookmarkEnd w:id="63"/>
     </w:p>
     <w:p>
+      <w:pPr>
+        <w:pStyle w:val="Ttulo3"/>
+      </w:pPr>
+      <w:bookmarkStart w:id="64" w:name="_Toc229503022"/>
+      <w:r>
+        <w:t>El Proceso de Producción Instruccional</w:t>
+      </w:r>
+      <w:bookmarkEnd w:id="64"/>
+    </w:p>
+    <w:p>
       <w:r>
         <w:t>En esta sección se describen los elementos que componen el proceso de producción de cursos virtuales en una institución de educación superior: los documentos de entrada que definen el curso y los artefactos que se producen a lo largo del proceso.</w:t>
       </w:r>
@@ -12292,202 +12303,202 @@
       <w:pPr>
         <w:pStyle w:val="Ttulo3"/>
       </w:pPr>
-      <w:bookmarkStart w:id="64" w:name="_Toc229503023"/>
+      <w:bookmarkStart w:id="65" w:name="_Toc229503023"/>
       <w:r>
         <w:t>Modelos de Lenguaje de Gran Escala (LLM)</w:t>
-      </w:r>
-      <w:bookmarkEnd w:id="64"/>
-    </w:p>
-    <w:p>
-      <w:r>
-        <w:t>Los Modelos de Lenguaje de Gran Escala (LLM, por sus siglas en inglés Large Language Models) son modelos de aprendizaje profundo entrenados sobre corpus masivos de texto mediante arquitecturas Transformer, capaces de generar, clasificar y transformar texto con alta coherencia semántica (Brown et al., 2020). Su capacidad de seguir instrucciones en lenguaje natural y producir salidas con formato definido los convierte en la capa cognitiva central de las aplicaciones de IA generativa. En la aplicación desarrollada se emplea Gemini 2.5 Flash Lite como modelo principal, optimizado para la generación de contenido instruccional extenso por su óptima relación costo-calidad-velocidad (LangChain, 2024).</w:t>
-      </w:r>
-    </w:p>
-    <w:p>
-      <w:pPr>
-        <w:pStyle w:val="Ttulo3"/>
-      </w:pPr>
-      <w:bookmarkStart w:id="65" w:name="_Toc229503024"/>
-      <w:r>
-        <w:lastRenderedPageBreak/>
-        <w:t>Agentes de IA</w:t>
       </w:r>
       <w:bookmarkEnd w:id="65"/>
     </w:p>
     <w:p>
       <w:r>
-        <w:t>Un agente de IA es un componente autónomo construido sobre un modelo de lenguaje que recibe instrucciones específicas —definidas mediante un prompt de sistema— y produce salidas determinadas para cumplir una responsabilidad única dentro de un flujo de trabajo mayor (LangChain, 2024). A diferencia de una llamada genérica a un LLM, un agente incorpora un rol delimitado, reglas obligatorias y criterios de calidad, lo que permite encadenar decisiones de forma reproducible. En la aplicación desarrollada, cada agente se especializa en una etapa del flujo instruccional y se coordina con los demás mediante un grafo de estado dirigido implementado en LangGraph.</w:t>
+        <w:t>Los Modelos de Lenguaje de Gran Escala (LLM, por sus siglas en inglés Large Language Models) son modelos de aprendizaje profundo entrenados sobre corpus masivos de texto mediante arquitecturas Transformer, capaces de generar, clasificar y transformar texto con alta coherencia semántica (Brown et al., 2020). Su capacidad de seguir instrucciones en lenguaje natural y producir salidas con formato definido los convierte en la capa cognitiva central de las aplicaciones de IA generativa. En la aplicación desarrollada se emplea Gemini 2.5 Flash Lite como modelo principal, optimizado para la generación de contenido instruccional extenso por su óptima relación costo-calidad-velocidad (LangChain, 2024).</w:t>
       </w:r>
     </w:p>
     <w:p>
       <w:pPr>
         <w:pStyle w:val="Ttulo3"/>
       </w:pPr>
-      <w:bookmarkStart w:id="66" w:name="_Toc229503025"/>
-      <w:r>
-        <w:t>Prompt Engineering</w:t>
+      <w:bookmarkStart w:id="66" w:name="_Toc229503024"/>
+      <w:r>
+        <w:lastRenderedPageBreak/>
+        <w:t>Agentes de IA</w:t>
       </w:r>
       <w:bookmarkEnd w:id="66"/>
     </w:p>
     <w:p>
       <w:r>
-        <w:t>El prompt engineering es la disciplina de diseño de instrucciones para modelos de lenguaje y constituye la principal interfaz de programación con los LLM en esta aplicación (LangChain, 2024). Un prompt se compone de dos partes: el system prompt, con las instrucciones permanentes de rol y restricciones del agente, y el user prompt, que aporta el contexto variable de cada ejecución. En cada agente se aplica el patrón hard rules vs. soft guidelines: las primeras son reglas no negociables —como el número exacto de recursos por semana—, mientras que los lineamientos blandos dejan margen de criterio al modelo para adaptar el tono y la extensión del contenido.</w:t>
+        <w:t>Un agente de IA es un componente autónomo construido sobre un modelo de lenguaje que recibe instrucciones específicas —definidas mediante un prompt de sistema— y produce salidas determinadas para cumplir una responsabilidad única dentro de un flujo de trabajo mayor (LangChain, 2024). A diferencia de una llamada genérica a un LLM, un agente incorpora un rol delimitado, reglas obligatorias y criterios de calidad, lo que permite encadenar decisiones de forma reproducible. En la aplicación desarrollada, cada agente se especializa en una etapa del flujo instruccional y se coordina con los demás mediante un grafo de estado dirigido implementado en LangGraph.</w:t>
       </w:r>
     </w:p>
     <w:p>
       <w:pPr>
         <w:pStyle w:val="Ttulo3"/>
       </w:pPr>
-      <w:bookmarkStart w:id="67" w:name="_Toc229503026"/>
-      <w:r>
-        <w:t>Structured Outputs (Salidas Estructuradas)</w:t>
+      <w:bookmarkStart w:id="67" w:name="_Toc229503025"/>
+      <w:r>
+        <w:t>Prompt Engineering</w:t>
       </w:r>
       <w:bookmarkEnd w:id="67"/>
     </w:p>
     <w:p>
       <w:r>
-        <w:t>Para que la aplicación funcione como un pipeline encadenado, cada agente debe producir datos en formato JSON validado en lugar de texto libre. Esto se logra mediante salidas estructuradas, en las que el modelo es forzado a producir un JSON que cumple un esquema predefinido, garantizando que el output de un agente sea el input directo del siguiente sin parseo adicional (LangChain, 2024). El contrato de datos entre agentes se implementa con Pydantic: cada agente define su modelo de entrada y salida mediante clases Pydantic, validando tipos y restricciones en toda la cadena de producción.</w:t>
+        <w:t>El prompt engineering es la disciplina de diseño de instrucciones para modelos de lenguaje y constituye la principal interfaz de programación con los LLM en esta aplicación (LangChain, 2024). Un prompt se compone de dos partes: el system prompt, con las instrucciones permanentes de rol y restricciones del agente, y el user prompt, que aporta el contexto variable de cada ejecución. En cada agente se aplica el patrón hard rules vs. soft guidelines: las primeras son reglas no negociables —como el número exacto de recursos por semana—, mientras que los lineamientos blandos dejan margen de criterio al modelo para adaptar el tono y la extensión del contenido.</w:t>
       </w:r>
     </w:p>
     <w:p>
       <w:pPr>
         <w:pStyle w:val="Ttulo3"/>
       </w:pPr>
-      <w:bookmarkStart w:id="68" w:name="_Toc229503027"/>
-      <w:r>
-        <w:t>Sistemas Multi-Agente</w:t>
+      <w:bookmarkStart w:id="68" w:name="_Toc229503026"/>
+      <w:r>
+        <w:t>Structured Outputs (Salidas Estructuradas)</w:t>
       </w:r>
       <w:bookmarkEnd w:id="68"/>
     </w:p>
     <w:p>
       <w:r>
-        <w:t xml:space="preserve">Un sistema multi-agente distribuye el procesamiento entre múltiples instancias especializadas de LLM en lugar de delegar todo a un único agente generalista (LangChain, 2024). Cada agente tiene un rol y responsabilidad únicos, lo que permite mayor precisión dentro de su dominio específico y facilita la depuración independiente de cada etapa. En esta aplicación, agentes distintos manejan el parseo del acta de kick-off, la clasificación de </w:t>
-      </w:r>
-      <w:r>
-        <w:lastRenderedPageBreak/>
-        <w:t>semanas, la generación del esquema curricular, la producción de IPES y la validación de calidad.</w:t>
+        <w:t>Para que la aplicación funcione como un pipeline encadenado, cada agente debe producir datos en formato JSON validado en lugar de texto libre. Esto se logra mediante salidas estructuradas, en las que el modelo es forzado a producir un JSON que cumple un esquema predefinido, garantizando que el output de un agente sea el input directo del siguiente sin parseo adicional (LangChain, 2024). El contrato de datos entre agentes se implementa con Pydantic: cada agente define su modelo de entrada y salida mediante clases Pydantic, validando tipos y restricciones en toda la cadena de producción.</w:t>
       </w:r>
     </w:p>
     <w:p>
       <w:pPr>
         <w:pStyle w:val="Ttulo3"/>
       </w:pPr>
-      <w:bookmarkStart w:id="69" w:name="_Toc229503028"/>
-      <w:r>
-        <w:t>Nodos y Grafos de Estado</w:t>
+      <w:bookmarkStart w:id="69" w:name="_Toc229503027"/>
+      <w:r>
+        <w:t>Sistemas Multi-Agente</w:t>
       </w:r>
       <w:bookmarkEnd w:id="69"/>
     </w:p>
     <w:p>
       <w:r>
-        <w:t>La orquestación de los agentes en la aplicación se implementa como un grafo de estado dirigido en LangGraph, en el que cada nodo representa una unidad de procesamiento que puede invocar un LLM, ejecutar código determinístico o tomar una decisión condicional (Chase, 2024). El estado es compartido entre todos los nodos, permitiendo que la información producida por un agente esté disponible de forma inmediata para el siguiente. Las aristas pueden ser condicionales: cuando una validación falla, se activa un ciclo de reintento con feedback correctivo que garantiza el cumplimiento de las restricciones pedagógicas definidas.</w:t>
+        <w:t xml:space="preserve">Un sistema multi-agente distribuye el procesamiento entre múltiples instancias especializadas de LLM en lugar de delegar todo a un único agente generalista (LangChain, 2024). Cada agente tiene un rol y responsabilidad únicos, lo que permite mayor precisión dentro de su dominio específico y facilita la depuración independiente de cada etapa. En esta aplicación, agentes distintos manejan el parseo del acta de kick-off, la clasificación de </w:t>
+      </w:r>
+      <w:r>
+        <w:lastRenderedPageBreak/>
+        <w:t>semanas, la generación del esquema curricular, la producción de IPES y la validación de calidad.</w:t>
       </w:r>
     </w:p>
     <w:p>
       <w:pPr>
         <w:pStyle w:val="Ttulo3"/>
       </w:pPr>
-      <w:bookmarkStart w:id="70" w:name="_Toc229503029"/>
-      <w:r>
-        <w:t>Python como ecosistema de desarrollo de IA</w:t>
+      <w:bookmarkStart w:id="70" w:name="_Toc229503028"/>
+      <w:r>
+        <w:t>Nodos y Grafos de Estado</w:t>
       </w:r>
       <w:bookmarkEnd w:id="70"/>
     </w:p>
     <w:p>
       <w:r>
-        <w:t>Python es el lenguaje de implementación del backend de la aplicación, seleccionado por concentrar las bibliotecas más relevantes para el desarrollo de aplicaciones de IA. Su ecosistema incluye LangChain y LangGraph para la orquestación de agentes y grafos de estado, pdfplumber, python-docx y pandas para el procesamiento de los documentos de entrada —sílabos y actas de kick-off—, y FastAPI para la exposición de los agentes como endpoints HTTP consumibles por el frontend. Adicionalmente, Pydantic se integra de forma nativa con FastAPI para validar los modelos de datos en cada solicitud, garantizando que los structured outputs de los agentes cumplan el esquema definido en toda la cadena de producción (Raschka et al., 2020).</w:t>
+        <w:t>La orquestación de los agentes en la aplicación se implementa como un grafo de estado dirigido en LangGraph, en el que cada nodo representa una unidad de procesamiento que puede invocar un LLM, ejecutar código determinístico o tomar una decisión condicional (Chase, 2024). El estado es compartido entre todos los nodos, permitiendo que la información producida por un agente esté disponible de forma inmediata para el siguiente. Las aristas pueden ser condicionales: cuando una validación falla, se activa un ciclo de reintento con feedback correctivo que garantiza el cumplimiento de las restricciones pedagógicas definidas.</w:t>
       </w:r>
     </w:p>
     <w:p>
       <w:pPr>
         <w:pStyle w:val="Ttulo3"/>
       </w:pPr>
-      <w:bookmarkStart w:id="71" w:name="_Toc229503030"/>
-      <w:r>
-        <w:t>Backend</w:t>
+      <w:bookmarkStart w:id="71" w:name="_Toc229503029"/>
+      <w:r>
+        <w:t>Python como ecosistema de desarrollo de IA</w:t>
       </w:r>
       <w:bookmarkEnd w:id="71"/>
     </w:p>
     <w:p>
       <w:r>
-        <w:t>El backend de una aplicación es la capa de software responsable de procesar la lógica de negocio, gestionar el acceso a datos y exponer servicios a los clientes mediante interfaces de red —típicamente APIs HTTP—. A diferencia del frontend, que gestiona la presentación e interacción con el usuario, el backend concentra el procesamiento, la persistencia y la seguridad del sistema (Richardson, 2018).</w:t>
+        <w:t>Python es el lenguaje de implementación del backend de la aplicación, seleccionado por concentrar las bibliotecas más relevantes para el desarrollo de aplicaciones de IA. Su ecosistema incluye LangChain y LangGraph para la orquestación de agentes y grafos de estado, pdfplumber, python-docx y pandas para el procesamiento de los documentos de entrada —sílabos y actas de kick-off—, y FastAPI para la exposición de los agentes como endpoints HTTP consumibles por el frontend. Adicionalmente, Pydantic se integra de forma nativa con FastAPI para validar los modelos de datos en cada solicitud, garantizando que los structured outputs de los agentes cumplan el esquema definido en toda la cadena de producción (Raschka et al., 2020).</w:t>
       </w:r>
     </w:p>
     <w:p>
       <w:pPr>
         <w:pStyle w:val="Ttulo3"/>
       </w:pPr>
-      <w:bookmarkStart w:id="72" w:name="_Toc229503031"/>
-      <w:r>
-        <w:t>Arquitectura del Sistema</w:t>
+      <w:bookmarkStart w:id="72" w:name="_Toc229503030"/>
+      <w:r>
+        <w:t>Backend</w:t>
       </w:r>
       <w:bookmarkEnd w:id="72"/>
     </w:p>
     <w:p>
       <w:r>
-        <w:t xml:space="preserve">La arquitectura de software define cómo los componentes de un sistema se organizan, comunican y escalan para cumplir los requisitos funcionales y no funcionales (Richardson, 2018). En sistemas que procesan tareas de duración media o prolongada, la arquitectura </w:t>
-      </w:r>
-      <w:r>
-        <w:lastRenderedPageBreak/>
-        <w:t>incorpora capas especializadas: un punto de entrada que gestiona las solicitudes, un motor de cómputo que ejecuta el procesamiento, y componentes de mensajería que desacoplan la recepción de una solicitud de su ejecución efectiva.</w:t>
+        <w:t>El backend de una aplicación es la capa de software responsable de procesar la lógica de negocio, gestionar el acceso a datos y exponer servicios a los clientes mediante interfaces de red —típicamente APIs HTTP—. A diferencia del frontend, que gestiona la presentación e interacción con el usuario, el backend concentra el procesamiento, la persistencia y la seguridad del sistema (Richardson, 2018).</w:t>
       </w:r>
     </w:p>
     <w:p>
       <w:pPr>
         <w:pStyle w:val="Ttulo3"/>
       </w:pPr>
-      <w:bookmarkStart w:id="73" w:name="_Toc229503032"/>
-      <w:r>
-        <w:t>Procesamiento Asíncrono</w:t>
+      <w:bookmarkStart w:id="73" w:name="_Toc229503031"/>
+      <w:r>
+        <w:t>Arquitectura del Sistema</w:t>
       </w:r>
       <w:bookmarkEnd w:id="73"/>
     </w:p>
     <w:p>
       <w:r>
-        <w:t>El procesamiento asíncrono es el patrón arquitectónico que desacopla la recepción de una solicitud de su ejecución. En un modelo síncrono, el cliente espera bloqueado hasta recibir respuesta; para tareas de duración prolongada esto genera timeouts inaceptables (Kleppmann, 2017). En el modelo asíncrono, el cliente recibe una confirmación inmediata y el trabajo se ejecuta en segundo plano; al finalizar, el sistema notifica al cliente a través de un webhook o servicio de mensajería. Este patrón sigue el modelo productor-consumidor: una cola de mensajes actúa como intermediario entre quien solicita el trabajo y quien lo ejecuta (Richardson, 2018).</w:t>
+        <w:t xml:space="preserve">La arquitectura de software define cómo los componentes de un sistema se organizan, comunican y escalan para cumplir los requisitos funcionales y no funcionales (Richardson, 2018). En sistemas que procesan tareas de duración media o prolongada, la arquitectura </w:t>
+      </w:r>
+      <w:r>
+        <w:lastRenderedPageBreak/>
+        <w:t>incorpora capas especializadas: un punto de entrada que gestiona las solicitudes, un motor de cómputo que ejecuta el procesamiento, y componentes de mensajería que desacoplan la recepción de una solicitud de su ejecución efectiva.</w:t>
       </w:r>
     </w:p>
     <w:p>
       <w:pPr>
         <w:pStyle w:val="Ttulo3"/>
       </w:pPr>
-      <w:bookmarkStart w:id="74" w:name="_Toc229503033"/>
-      <w:r>
-        <w:t>Amazon Web Services (AWS)</w:t>
+      <w:bookmarkStart w:id="74" w:name="_Toc229503032"/>
+      <w:r>
+        <w:t>Procesamiento Asíncrono</w:t>
       </w:r>
       <w:bookmarkEnd w:id="74"/>
     </w:p>
     <w:p>
       <w:r>
-        <w:t>Amazon Web Services (AWS) es la plataforma cloud seleccionada para el despliegue de la infraestructura backend de la aplicación. AWS ofrece un ecosistema de servicios gestionados bajo un modelo de pago por uso que abarca cómputo serverless, mensajería, almacenamiento y gestión de APIs, lo que reduce la complejidad operativa frente a infraestructura autogestionada (Wittig &amp; Wittig, 2018). Para implementar la arquitectura asíncrona descrita, el sistema utiliza cuatro servicios de AWS: un servicio de gestión y exposición de APIs HTTP (Amazon API Gateway), un motor de cómputo serverless que ejecuta el pipeline de agentes (AWS Lambda), un servicio de cola de mensajes que actúa como buffer de trabajos (Amazon SQS) y un sistema de notificaciones pub/sub que comunica la finalización del procesamiento (Amazon SNS). La configuración e integración específica de cada uno de estos servicios se describe en el Capítulo 3.</w:t>
+        <w:t>El procesamiento asíncrono es el patrón arquitectónico que desacopla la recepción de una solicitud de su ejecución. En un modelo síncrono, el cliente espera bloqueado hasta recibir respuesta; para tareas de duración prolongada esto genera timeouts inaceptables (Kleppmann, 2017). En el modelo asíncrono, el cliente recibe una confirmación inmediata y el trabajo se ejecuta en segundo plano; al finalizar, el sistema notifica al cliente a través de un webhook o servicio de mensajería. Este patrón sigue el modelo productor-consumidor: una cola de mensajes actúa como intermediario entre quien solicita el trabajo y quien lo ejecuta (Richardson, 2018).</w:t>
       </w:r>
     </w:p>
     <w:p>
       <w:pPr>
-        <w:pStyle w:val="Ttulo2"/>
-      </w:pPr>
-      <w:bookmarkStart w:id="75" w:name="_Toc229503034"/>
-      <w:r>
-        <w:t>Estándares, Frameworks y Buenas Prácticas</w:t>
+        <w:pStyle w:val="Ttulo3"/>
+      </w:pPr>
+      <w:bookmarkStart w:id="75" w:name="_Toc229503033"/>
+      <w:r>
+        <w:t>Amazon Web Services (AWS)</w:t>
       </w:r>
       <w:bookmarkEnd w:id="75"/>
     </w:p>
     <w:p>
-      <w:pPr>
-        <w:pStyle w:val="Ttulo3"/>
-      </w:pPr>
-      <w:bookmarkStart w:id="76" w:name="_Toc229503035"/>
-      <w:r>
-        <w:t>Taxonomía de Bloom</w:t>
+      <w:r>
+        <w:t>Amazon Web Services (AWS) es la plataforma cloud seleccionada para el despliegue de la infraestructura backend de la aplicación. AWS ofrece un ecosistema de servicios gestionados bajo un modelo de pago por uso que abarca cómputo serverless, mensajería, almacenamiento y gestión de APIs, lo que reduce la complejidad operativa frente a infraestructura autogestionada (Wittig &amp; Wittig, 2018). Para implementar la arquitectura asíncrona descrita, el sistema utiliza cuatro servicios de AWS: un servicio de gestión y exposición de APIs HTTP (Amazon API Gateway), un motor de cómputo serverless que ejecuta el pipeline de agentes (AWS Lambda), un servicio de cola de mensajes que actúa como buffer de trabajos (Amazon SQS) y un sistema de notificaciones pub/sub que comunica la finalización del procesamiento (Amazon SNS). La configuración e integración específica de cada uno de estos servicios se describe en el Capítulo 3.</w:t>
+      </w:r>
+    </w:p>
+    <w:p>
+      <w:pPr>
+        <w:pStyle w:val="Ttulo2"/>
+      </w:pPr>
+      <w:bookmarkStart w:id="76" w:name="_Toc229503034"/>
+      <w:r>
+        <w:t>Estándares, Frameworks y Buenas Prácticas</w:t>
       </w:r>
       <w:bookmarkEnd w:id="76"/>
     </w:p>
     <w:p>
-      <w:r>
-        <w:t>La Taxonomía de Bloom, en su revisión de Anderson &amp; Krathwohl (2001), constituye el marco central de clasificación de objetivos de aprendizaje sobre el que el sistema fundamenta sus decisiones de selección de recursos. Se explicará en detalle dado su rol estructural en la lógica del sistema. Los puntos a cubrir son:</w:t>
-      </w:r>
+      <w:pPr>
+        <w:pStyle w:val="Ttulo3"/>
+      </w:pPr>
+      <w:bookmarkStart w:id="77" w:name="_Toc229503035"/>
+      <w:r>
+        <w:t>Taxonomía de Bloom</w:t>
+      </w:r>
+      <w:bookmarkEnd w:id="77"/>
     </w:p>
     <w:p>
+      <w:r>
+        <w:t>La Taxonomía de Bloom, en su revisión de Anderson &amp; Krathwohl (2001), constituye el marco central de clasificación de objetivos de aprendizaje sobre el que el sistema fundamenta sus decisiones de selección de recursos. Se explicará en detalle dado su rol estructural en la lógica del sistema. Los puntos a cubrir son:</w:t>
+      </w:r>
+    </w:p>
+    <w:p>
       <w:pPr>
         <w:pStyle w:val="Listaconvietas"/>
       </w:pPr>
@@ -12524,11 +12535,11 @@
       <w:pPr>
         <w:pStyle w:val="Ttulo3"/>
       </w:pPr>
-      <w:bookmarkStart w:id="77" w:name="_Toc229503036"/>
+      <w:bookmarkStart w:id="78" w:name="_Toc229503036"/>
       <w:r>
         <w:t>SCRUM en equipos multidisciplinarios</w:t>
       </w:r>
-      <w:bookmarkEnd w:id="77"/>
+      <w:bookmarkEnd w:id="78"/>
     </w:p>
     <w:p>
       <w:r>
@@ -12575,11 +12586,11 @@
       <w:pPr>
         <w:pStyle w:val="Ttulo3"/>
       </w:pPr>
-      <w:bookmarkStart w:id="78" w:name="_Toc229503037"/>
+      <w:bookmarkStart w:id="79" w:name="_Toc229503037"/>
       <w:r>
         <w:t>Agent Framework: LangChain y LangGraph</w:t>
       </w:r>
-      <w:bookmarkEnd w:id="78"/>
+      <w:bookmarkEnd w:id="79"/>
     </w:p>
     <w:p>
       <w:r>
@@ -12611,44 +12622,44 @@
       <w:pPr>
         <w:pStyle w:val="Ttulo3"/>
       </w:pPr>
-      <w:bookmarkStart w:id="79" w:name="_Toc229503038"/>
+      <w:bookmarkStart w:id="80" w:name="_Toc229503038"/>
       <w:r>
         <w:t>Clean Architecture</w:t>
-      </w:r>
-      <w:bookmarkEnd w:id="79"/>
-    </w:p>
-    <w:p>
-      <w:r>
-        <w:t>Clean Architecture, propuesta por Martin (2017), es un estilo arquitectónico que organiza el software en capas concéntricas con dependencias unidireccionales hacia el núcleo de dominio. En el sistema desarrollado, esta arquitectura separa la lógica de negocio (agentes, grafos LangGraph) de los detalles de infraestructura (FastAPI, AWS), garantizando que los agentes de IA sean independientes del framework HTTP y del proveedor cloud. Los principios clave aplicados son: (i) la Regla de Dependencia, que establece que el código fuente solo puede apuntar hacia adentro; (ii) la separación en capas de Entidades, Casos de Uso, Adaptadores e Infraestructura; y (iii) la inversión de dependencias, que permite sustituir componentes de infraestructura sin afectar la lógica central del sistema.</w:t>
-      </w:r>
-    </w:p>
-    <w:p>
-      <w:pPr>
-        <w:pStyle w:val="Ttulo2"/>
-      </w:pPr>
-      <w:bookmarkStart w:id="80" w:name="_Toc229503039"/>
-      <w:r>
-        <w:t>Bases Legales y Marco Normativo</w:t>
       </w:r>
       <w:bookmarkEnd w:id="80"/>
     </w:p>
     <w:p>
-      <w:pPr>
-        <w:pStyle w:val="Ttulo3"/>
-      </w:pPr>
-      <w:bookmarkStart w:id="81" w:name="_Toc229503040"/>
-      <w:r>
-        <w:t>Ley de Protección de Datos Personales (Ley 29733 — Perú)</w:t>
+      <w:r>
+        <w:t>Clean Architecture, propuesta por Martin (2017), es un estilo arquitectónico que organiza el software en capas concéntricas con dependencias unidireccionales hacia el núcleo de dominio. En el sistema desarrollado, esta arquitectura separa la lógica de negocio (agentes, grafos LangGraph) de los detalles de infraestructura (FastAPI, AWS), garantizando que los agentes de IA sean independientes del framework HTTP y del proveedor cloud. Los principios clave aplicados son: (i) la Regla de Dependencia, que establece que el código fuente solo puede apuntar hacia adentro; (ii) la separación en capas de Entidades, Casos de Uso, Adaptadores e Infraestructura; y (iii) la inversión de dependencias, que permite sustituir componentes de infraestructura sin afectar la lógica central del sistema.</w:t>
+      </w:r>
+    </w:p>
+    <w:p>
+      <w:pPr>
+        <w:pStyle w:val="Ttulo2"/>
+      </w:pPr>
+      <w:bookmarkStart w:id="81" w:name="_Toc229503039"/>
+      <w:r>
+        <w:t>Bases Legales y Marco Normativo</w:t>
       </w:r>
       <w:bookmarkEnd w:id="81"/>
     </w:p>
     <w:p>
-      <w:r>
-        <w:t>La Ley N.° 29733, Ley de Protección de Datos Personales (2011), y su Reglamento aprobado mediante D.S. N.° 003-2013-JUS, constituyen el marco normativo vigente en el Perú para el tratamiento de datos de carácter personal. La norma establece los principios de legalidad, consentimiento informado, finalidad, proporcionalidad y seguridad como ejes rectores de todo procesamiento. Su autoridad de supervisión es la Autoridad Nacional de Protección de Datos Personales (ANPDP), adscrita al Ministerio de Justicia y Derechos Humanos, con facultad sancionadora ante infracciones.</w:t>
-      </w:r>
+      <w:pPr>
+        <w:pStyle w:val="Ttulo3"/>
+      </w:pPr>
+      <w:bookmarkStart w:id="82" w:name="_Toc229503040"/>
+      <w:r>
+        <w:t>Ley de Protección de Datos Personales (Ley 29733 — Perú)</w:t>
+      </w:r>
+      <w:bookmarkEnd w:id="82"/>
     </w:p>
     <w:p>
       <w:r>
+        <w:t>La Ley N.° 29733, Ley de Protección de Datos Personales (2011), y su Reglamento aprobado mediante D.S. N.° 003-2013-JUS, constituyen el marco normativo vigente en el Perú para el tratamiento de datos de carácter personal. La norma establece los principios de legalidad, consentimiento informado, finalidad, proporcionalidad y seguridad como ejes rectores de todo procesamiento. Su autoridad de supervisión es la Autoridad Nacional de Protección de Datos Personales (ANPDP), adscrita al Ministerio de Justicia y Derechos Humanos, con facultad sancionadora ante infracciones.</w:t>
+      </w:r>
+    </w:p>
+    <w:p>
+      <w:r>
         <w:t xml:space="preserve">En el contexto de la aplicación desarrollada, la normativa resulta aplicable dado que el proceso instruccional involucra documentos institucionales que pueden contener referencias a personas identificables, como docentes y coordinadores académicos. Por ello, el diseño del sistema contempla: (i) procesamiento en entornos controlados sin almacenamiento persistente de datos personales; (ii) tratamiento de los documentos de entrada como insumos transitorios que no son indexados ni cedidos a terceros; y (iii) alineación con el principio de </w:t>
       </w:r>
       <w:r>
@@ -12660,13 +12671,13 @@
       <w:pPr>
         <w:pStyle w:val="Ttulo1"/>
       </w:pPr>
-      <w:bookmarkStart w:id="82" w:name="_Toc229221041"/>
-      <w:bookmarkStart w:id="83" w:name="_Toc229503041"/>
+      <w:bookmarkStart w:id="83" w:name="_Toc229221041"/>
+      <w:bookmarkStart w:id="84" w:name="_Toc229503041"/>
       <w:r>
         <w:t>CAPÍTULO 3: DESARROLLO DEL PROYECTO</w:t>
       </w:r>
-      <w:bookmarkEnd w:id="82"/>
       <w:bookmarkEnd w:id="83"/>
+      <w:bookmarkEnd w:id="84"/>
     </w:p>
     <w:p>
       <w:pPr>
@@ -12676,101 +12687,101 @@
           <w:numId w:val="37"/>
         </w:numPr>
       </w:pPr>
-      <w:bookmarkStart w:id="84" w:name="_Toc229503042"/>
+      <w:bookmarkStart w:id="85" w:name="_Toc229503042"/>
       <w:r>
         <w:t>Diseño de la solución</w:t>
-      </w:r>
-      <w:bookmarkEnd w:id="84"/>
-    </w:p>
-    <w:p>
-      <w:r>
-        <w:t xml:space="preserve">Se tiene como objetivo analizar las principales tecnologías que se utilizarán para el desarrollo del proyecto. Estas incluyen un lenguaje de programación para el backend enfocado en el ecosistema de inteligencia artificial, </w:t>
-      </w:r>
-      <w:r>
-        <w:t>frameworks de orquestación LLM</w:t>
-      </w:r>
-      <w:r>
-        <w:t>, f</w:t>
-      </w:r>
-      <w:r>
-        <w:t xml:space="preserve">rameworks </w:t>
-      </w:r>
-      <w:r>
-        <w:t>m</w:t>
-      </w:r>
-      <w:r>
-        <w:t>ultiagente</w:t>
-      </w:r>
-      <w:r>
-        <w:t xml:space="preserve"> </w:t>
-      </w:r>
-      <w:r>
-        <w:t xml:space="preserve">y, por último, </w:t>
-      </w:r>
-      <w:r>
-        <w:t>modelos LLM</w:t>
-      </w:r>
-      <w:r>
-        <w:t xml:space="preserve">. Para ello, se evaluaron distintas alternativas para cada tecnología, considerando criterios como </w:t>
-      </w:r>
-      <w:r>
-        <w:rPr>
-          <w:rFonts w:cs="Times New Roman"/>
-        </w:rPr>
-        <w:t>c</w:t>
-      </w:r>
-      <w:r>
-        <w:rPr>
-          <w:rFonts w:cs="Times New Roman"/>
-        </w:rPr>
-        <w:t>oncisión</w:t>
-      </w:r>
-      <w:r>
-        <w:t xml:space="preserve">, </w:t>
-      </w:r>
-      <w:r>
-        <w:rPr>
-          <w:rFonts w:cs="Times New Roman"/>
-        </w:rPr>
-        <w:t>s</w:t>
-      </w:r>
-      <w:r>
-        <w:rPr>
-          <w:rFonts w:cs="Times New Roman"/>
-        </w:rPr>
-        <w:t>oporte</w:t>
-      </w:r>
-      <w:r>
-        <w:t xml:space="preserve"> </w:t>
-      </w:r>
-      <w:r>
-        <w:t xml:space="preserve">y </w:t>
-      </w:r>
-      <w:r>
-        <w:t>r</w:t>
-      </w:r>
-      <w:r>
-        <w:t>endimiento</w:t>
-      </w:r>
-      <w:r>
-        <w:t>, entre otros. Este análisis permite identificar la combinación de tecnologías más adecuada para la solución tecnológica.</w:t>
-      </w:r>
-    </w:p>
-    <w:p>
-      <w:pPr>
-        <w:pStyle w:val="Ttulo3"/>
-      </w:pPr>
-      <w:bookmarkStart w:id="85" w:name="_Toc229503043"/>
-      <w:r>
-        <w:t>Benchmark de lenguajes de programación</w:t>
-      </w:r>
-      <w:r>
-        <w:t xml:space="preserve"> para backend</w:t>
       </w:r>
       <w:bookmarkEnd w:id="85"/>
     </w:p>
     <w:p>
       <w:r>
+        <w:t xml:space="preserve">Se tiene como objetivo analizar las principales tecnologías que se utilizarán para el desarrollo del proyecto. Estas incluyen un lenguaje de programación para el backend enfocado en el ecosistema de inteligencia artificial, </w:t>
+      </w:r>
+      <w:r>
+        <w:t>frameworks de orquestación LLM</w:t>
+      </w:r>
+      <w:r>
+        <w:t>, f</w:t>
+      </w:r>
+      <w:r>
+        <w:t xml:space="preserve">rameworks </w:t>
+      </w:r>
+      <w:r>
+        <w:t>m</w:t>
+      </w:r>
+      <w:r>
+        <w:t>ultiagente</w:t>
+      </w:r>
+      <w:r>
+        <w:t xml:space="preserve"> </w:t>
+      </w:r>
+      <w:r>
+        <w:t xml:space="preserve">y, por último, </w:t>
+      </w:r>
+      <w:r>
+        <w:t>modelos LLM</w:t>
+      </w:r>
+      <w:r>
+        <w:t xml:space="preserve">. Para ello, se evaluaron distintas alternativas para cada tecnología, considerando criterios como </w:t>
+      </w:r>
+      <w:r>
+        <w:rPr>
+          <w:rFonts w:cs="Times New Roman"/>
+        </w:rPr>
+        <w:t>c</w:t>
+      </w:r>
+      <w:r>
+        <w:rPr>
+          <w:rFonts w:cs="Times New Roman"/>
+        </w:rPr>
+        <w:t>oncisión</w:t>
+      </w:r>
+      <w:r>
+        <w:t xml:space="preserve">, </w:t>
+      </w:r>
+      <w:r>
+        <w:rPr>
+          <w:rFonts w:cs="Times New Roman"/>
+        </w:rPr>
+        <w:t>s</w:t>
+      </w:r>
+      <w:r>
+        <w:rPr>
+          <w:rFonts w:cs="Times New Roman"/>
+        </w:rPr>
+        <w:t>oporte</w:t>
+      </w:r>
+      <w:r>
+        <w:t xml:space="preserve"> </w:t>
+      </w:r>
+      <w:r>
+        <w:t xml:space="preserve">y </w:t>
+      </w:r>
+      <w:r>
+        <w:t>r</w:t>
+      </w:r>
+      <w:r>
+        <w:t>endimiento</w:t>
+      </w:r>
+      <w:r>
+        <w:t>, entre otros. Este análisis permite identificar la combinación de tecnologías más adecuada para la solución tecnológica.</w:t>
+      </w:r>
+    </w:p>
+    <w:p>
+      <w:pPr>
+        <w:pStyle w:val="Ttulo3"/>
+      </w:pPr>
+      <w:bookmarkStart w:id="86" w:name="_Toc229503043"/>
+      <w:r>
+        <w:t>Benchmark de lenguajes de programación</w:t>
+      </w:r>
+      <w:r>
+        <w:t xml:space="preserve"> para backend</w:t>
+      </w:r>
+      <w:bookmarkEnd w:id="86"/>
+    </w:p>
+    <w:p>
+      <w:r>
         <w:rPr>
           <w:lang w:val="es-ES"/>
         </w:rPr>
@@ -12822,7 +12833,7 @@
           <w:iCs/>
         </w:rPr>
       </w:pPr>
-      <w:bookmarkStart w:id="86" w:name="_Toc150209242"/>
+      <w:bookmarkStart w:id="87" w:name="_Toc150209242"/>
       <w:r>
         <w:rPr>
           <w:rFonts w:cs="Times New Roman"/>
@@ -12853,7 +12864,7 @@
         <w:br/>
         <w:t xml:space="preserve">Puntuación utilizada para </w:t>
       </w:r>
-      <w:bookmarkEnd w:id="86"/>
+      <w:bookmarkEnd w:id="87"/>
       <w:r>
         <w:rPr>
           <w:rFonts w:cs="Times New Roman"/>
@@ -13199,7 +13210,7 @@
           <w:sz w:val="22"/>
         </w:rPr>
       </w:pPr>
-      <w:bookmarkStart w:id="87" w:name="_Toc150209243"/>
+      <w:bookmarkStart w:id="88" w:name="_Toc150209243"/>
       <w:r>
         <w:rPr>
           <w:rFonts w:eastAsia="Calibri" w:cs="Times New Roman"/>
@@ -13233,7 +13244,7 @@
         <w:br/>
         <w:t xml:space="preserve">Criterios del benchmarking para </w:t>
       </w:r>
-      <w:bookmarkEnd w:id="87"/>
+      <w:bookmarkEnd w:id="88"/>
       <w:r>
         <w:rPr>
           <w:rFonts w:eastAsia="Calibri" w:cs="Times New Roman"/>
@@ -13812,7 +13823,7 @@
           <w:iCs/>
         </w:rPr>
       </w:pPr>
-      <w:bookmarkStart w:id="88" w:name="_Toc150209244"/>
+      <w:bookmarkStart w:id="89" w:name="_Toc150209244"/>
       <w:r>
         <w:rPr>
           <w:rFonts w:cs="Times New Roman"/>
@@ -13842,7 +13853,7 @@
         <w:br/>
         <w:t xml:space="preserve">Priorización de criterios para </w:t>
       </w:r>
-      <w:bookmarkEnd w:id="88"/>
+      <w:bookmarkEnd w:id="89"/>
       <w:r>
         <w:rPr>
           <w:rFonts w:cs="Times New Roman"/>
@@ -16989,7 +17000,7 @@
       <w:pPr>
         <w:pStyle w:val="Ttulo3"/>
       </w:pPr>
-      <w:bookmarkStart w:id="89" w:name="_Toc229503044"/>
+      <w:bookmarkStart w:id="90" w:name="_Toc229503044"/>
       <w:r>
         <w:t>Benchmark de</w:t>
       </w:r>
@@ -17008,7 +17019,7 @@
       <w:r>
         <w:t>rquestación LLM</w:t>
       </w:r>
-      <w:bookmarkEnd w:id="89"/>
+      <w:bookmarkEnd w:id="90"/>
     </w:p>
     <w:p>
       <w:r>
@@ -21770,11 +21781,11 @@
       <w:pPr>
         <w:pStyle w:val="Ttulo3"/>
       </w:pPr>
-      <w:bookmarkStart w:id="90" w:name="_Toc229503045"/>
+      <w:bookmarkStart w:id="91" w:name="_Toc229503045"/>
       <w:r>
         <w:t>Benchmark de Frameworks Multiagente</w:t>
       </w:r>
-      <w:bookmarkEnd w:id="90"/>
+      <w:bookmarkEnd w:id="91"/>
     </w:p>
     <w:p>
       <w:r>
@@ -26785,14 +26796,14 @@
       <w:pPr>
         <w:pStyle w:val="Ttulo3"/>
       </w:pPr>
-      <w:bookmarkStart w:id="91" w:name="_Toc229503046"/>
+      <w:bookmarkStart w:id="92" w:name="_Toc229503046"/>
       <w:r>
         <w:t>Benchmark de</w:t>
       </w:r>
       <w:r>
         <w:t xml:space="preserve"> modelos LLM</w:t>
       </w:r>
-      <w:bookmarkEnd w:id="91"/>
+      <w:bookmarkEnd w:id="92"/>
     </w:p>
     <w:p>
       <w:r>
@@ -31840,11 +31851,11 @@
       <w:pPr>
         <w:pStyle w:val="Imagenes"/>
       </w:pPr>
-      <w:bookmarkStart w:id="92" w:name="_Toc149860603"/>
+      <w:bookmarkStart w:id="93" w:name="_Toc149860603"/>
       <w:r>
         <w:t xml:space="preserve">Figura </w:t>
       </w:r>
-      <w:bookmarkEnd w:id="92"/>
+      <w:bookmarkEnd w:id="93"/>
       <w:r>
         <w:t>N</w:t>
       </w:r>
@@ -31883,7 +31894,7 @@
           <w:lang w:eastAsia="es-PE"/>
         </w:rPr>
         <w:drawing>
-          <wp:inline distT="0" distB="0" distL="0" distR="0" wp14:anchorId="063FFEBF" wp14:editId="601CA047">
+          <wp:inline distT="0" distB="0" distL="0" distR="0" wp14:anchorId="0A3CEA06" wp14:editId="5DEA97FC">
             <wp:extent cx="5759532" cy="2802052"/>
             <wp:effectExtent l="0" t="0" r="0" b="0"/>
             <wp:docPr id="2" name="Imagen 2"/>
@@ -32046,7 +32057,7 @@
           <w:lang w:eastAsia="es-PE"/>
         </w:rPr>
         <w:drawing>
-          <wp:anchor distT="0" distB="0" distL="114300" distR="114300" simplePos="0" relativeHeight="251659264" behindDoc="0" locked="0" layoutInCell="1" allowOverlap="1" wp14:anchorId="453DBB27" wp14:editId="6C41AE91">
+          <wp:anchor distT="0" distB="0" distL="114300" distR="114300" simplePos="0" relativeHeight="251659264" behindDoc="0" locked="0" layoutInCell="1" allowOverlap="1" wp14:anchorId="0BD5740B" wp14:editId="16D18724">
             <wp:simplePos x="0" y="0"/>
             <wp:positionH relativeFrom="margin">
               <wp:align>left</wp:align>
@@ -32532,7 +32543,13 @@
         <w:rPr>
           <w:lang w:val="es-ES"/>
         </w:rPr>
-        <w:t>3.2.   Arquitectura Lógica</w:t>
+        <w:t xml:space="preserve">3.2.   Arquitectura </w:t>
+      </w:r>
+      <w:r>
+        <w:rPr>
+          <w:lang w:val="es-ES"/>
+        </w:rPr>
+        <w:t>Física</w:t>
       </w:r>
     </w:p>
     <w:p>
@@ -32672,6 +32689,7 @@
     <w:p>
       <w:pPr>
         <w:pStyle w:val="Imagenes"/>
+        <w:spacing w:line="360" w:lineRule="auto"/>
       </w:pPr>
       <w:r>
         <w:t xml:space="preserve">Figura </w:t>
@@ -32693,7 +32711,7 @@
           <w:lang w:val="es-ES"/>
         </w:rPr>
         <w:drawing>
-          <wp:anchor distT="0" distB="0" distL="114300" distR="114300" simplePos="0" relativeHeight="251658240" behindDoc="0" locked="0" layoutInCell="1" allowOverlap="1" wp14:anchorId="2ED2E3FE" wp14:editId="6B814FBA">
+          <wp:anchor distT="0" distB="0" distL="114300" distR="114300" simplePos="0" relativeHeight="251658240" behindDoc="0" locked="0" layoutInCell="1" allowOverlap="1" wp14:anchorId="7F3A2BF1" wp14:editId="75B4C1C5">
             <wp:simplePos x="0" y="0"/>
             <wp:positionH relativeFrom="page">
               <wp:align>center</wp:align>
@@ -32768,51 +32786,38 @@
     </w:p>
     <w:p>
       <w:pPr>
-        <w:rPr>
-          <w:lang w:val="es-ES"/>
+        <w:pStyle w:val="Imagenes"/>
+        <w:rPr>
+          <w:b w:val="0"/>
+          <w:bCs/>
+          <w:i/>
+          <w:iCs/>
         </w:rPr>
       </w:pPr>
     </w:p>
     <w:p>
       <w:pPr>
-        <w:pStyle w:val="Ttulo3"/>
-        <w:numPr>
-          <w:ilvl w:val="0"/>
-          <w:numId w:val="0"/>
-        </w:numPr>
-        <w:ind w:left="720" w:hanging="720"/>
-        <w:rPr>
-          <w:i w:val="0"/>
-          <w:iCs w:val="0"/>
-        </w:rPr>
-      </w:pPr>
-      <w:r>
-        <w:rPr>
-          <w:i w:val="0"/>
-          <w:iCs w:val="0"/>
-        </w:rPr>
-        <w:t>3.</w:t>
-      </w:r>
-      <w:r>
-        <w:rPr>
-          <w:i w:val="0"/>
-          <w:iCs w:val="0"/>
-        </w:rPr>
-        <w:t>3</w:t>
-      </w:r>
-      <w:r>
-        <w:rPr>
-          <w:i w:val="0"/>
-          <w:iCs w:val="0"/>
-        </w:rPr>
-        <w:t xml:space="preserve">    </w:t>
-      </w:r>
-      <w:r>
-        <w:rPr>
-          <w:i w:val="0"/>
-          <w:iCs w:val="0"/>
-        </w:rPr>
-        <w:t>Validación del proyecto</w:t>
+        <w:pStyle w:val="Imagenes"/>
+        <w:rPr>
+          <w:b w:val="0"/>
+          <w:bCs/>
+        </w:rPr>
+      </w:pPr>
+      <w:r>
+        <w:rPr>
+          <w:b w:val="0"/>
+          <w:bCs/>
+          <w:i/>
+          <w:iCs/>
+        </w:rPr>
+        <w:t xml:space="preserve">Nota. </w:t>
+      </w:r>
+      <w:r>
+        <w:rPr>
+          <w:b w:val="0"/>
+          <w:bCs/>
+        </w:rPr>
+        <w:t>Adaptado de fuente interna de la organización.</w:t>
       </w:r>
     </w:p>
     <w:p>
@@ -32824,10 +32829,15 @@
     </w:p>
     <w:p>
       <w:pPr>
-        <w:rPr>
-          <w:lang w:val="es-ES"/>
-        </w:rPr>
-      </w:pPr>
+        <w:pStyle w:val="Ttulo2"/>
+        <w:rPr>
+          <w:i/>
+          <w:iCs/>
+        </w:rPr>
+      </w:pPr>
+      <w:r>
+        <w:t>Validación del proyecto</w:t>
+      </w:r>
     </w:p>
     <w:p>
       <w:pPr>
@@ -32835,9 +32845,6 @@
           <w:lang w:val="es-ES"/>
         </w:rPr>
       </w:pPr>
-      <w:r>
-        <w:t xml:space="preserve">La validación del proyecto tuvo como objetivo verificar si el contenido generado por la aplicación Experto Temático alcanza una calidad equivalente a la del material producido por docentes humanos expertos en los cursos. Para ello, se diseñó un experimento de evaluación ciega que permitiera contrastar el material de IA con material elaborado por humanos, sin que los evaluadores supieran de antemano cuál era cuál. Este enfoque sigue la lógica de estudios de evaluación ciega en educación superior, en los cuales los evaluadores califican contenido sin conocer su origen para minimizar sesgos (Scarfe et al., 2024; Ullmann et al., 2024).</w:t>
-      </w:r>
     </w:p>
     <w:p>
       <w:pPr>
@@ -32846,7 +32853,16 @@
         </w:rPr>
       </w:pPr>
       <w:r>
-        <w:t xml:space="preserve">3.3.1    Objetivo de la validación</w:t>
+        <w:t>L</w:t>
+      </w:r>
+      <w:r>
+        <w:t>a validación del proyecto tuvo como objetivo verificar si el contenido generado por la aplicación Experto Temático alcanza una calidad equivalente a l</w:t>
+      </w:r>
+      <w:r>
+        <w:t xml:space="preserve">a del material producido por docentes humanos expertos en los cursos. Para ello, se diseñó un experimento de evaluación ciega que permitiera contrastar el material de IA con material elaborado por humanos, sin que los evaluadores supieran de antemano cuál </w:t>
+      </w:r>
+      <w:r>
+        <w:t>era cuál. Este enfoque sigue la lógica de estudios de evaluación ciega en educación superior, en los cuales los evaluadores califican contenido sin conocer su origen para minimizar sesgos (Scarfe et al., 2024; Ullmann et al., 2024).</w:t>
       </w:r>
     </w:p>
     <w:p>
@@ -32856,7 +32872,11 @@
         </w:rPr>
       </w:pPr>
       <w:r>
-        <w:t xml:space="preserve">El objetivo principal fue determinar si docentes expertos en los cursos son capaces de detectar diferencias significativas entre el material base generado por IA y el creado por humanos, y si el contenido de la IA cumple criterios de calidad comparables a los materiales elaborados por profesionales.</w:t>
+        <w:lastRenderedPageBreak/>
+        <w:t>3.3.1    Objetivo de la</w:t>
+      </w:r>
+      <w:r>
+        <w:t xml:space="preserve"> validación</w:t>
       </w:r>
     </w:p>
     <w:p>
@@ -32866,7 +32886,10 @@
         </w:rPr>
       </w:pPr>
       <w:r>
-        <w:t xml:space="preserve">Los objetivos secundarios fueron:</w:t>
+        <w:t>El objetivo principal fue determinar si docentes expertos en los cursos son capaces de detectar diferencias significativas entre el material base generado por IA y el creado por humanos, y si el contenido de la IA cumple criterios de calidad co</w:t>
+      </w:r>
+      <w:r>
+        <w:t>mparables a los materiales elaborados por profesionales.</w:t>
       </w:r>
     </w:p>
     <w:p>
@@ -32876,7 +32899,7 @@
         </w:rPr>
       </w:pPr>
       <w:r>
-        <w:t xml:space="preserve">-  Identificar las fortalezas y debilidades del contenido generado por Experto Temático.</w:t>
+        <w:t>Los objetivos secundarios fueron:</w:t>
       </w:r>
     </w:p>
     <w:p>
@@ -32886,7 +32909,7 @@
         </w:rPr>
       </w:pPr>
       <w:r>
-        <w:t xml:space="preserve">-  Detectar y comparar los patrones de error en cada tipo de contenido.</w:t>
+        <w:t>-  Identificar las fortalezas y debilidades del contenido generado por Experto Temático.</w:t>
       </w:r>
     </w:p>
     <w:p>
@@ -32896,7 +32919,7 @@
         </w:rPr>
       </w:pPr>
       <w:r>
-        <w:t xml:space="preserve">-  Evaluar si el contenido generado estaba listo para pasar a etapa de producción.</w:t>
+        <w:t>-  Detectar y comparar los patrones de error en cada tipo de contenido.</w:t>
       </w:r>
     </w:p>
     <w:p>
@@ -32906,7 +32929,10 @@
         </w:rPr>
       </w:pPr>
       <w:r>
-        <w:t xml:space="preserve">3.3.2    Diseño metodológico</w:t>
+        <w:t>-  E</w:t>
+      </w:r>
+      <w:r>
+        <w:t>valuar si el contenido generado estaba listo para pasar a etapa de producción.</w:t>
       </w:r>
     </w:p>
     <w:p>
@@ -32916,7 +32942,7 @@
         </w:rPr>
       </w:pPr>
       <w:r>
-        <w:t xml:space="preserve">Se diseñó una validación larga estructurada en tres fases secuenciales que combinan evaluación cuantitativa mediante rúbrica y exploración cualitativa mediante entrevista de diagnóstico.</w:t>
+        <w:t>3.3.2    Diseño metodológico</w:t>
       </w:r>
     </w:p>
     <w:p>
@@ -32926,17 +32952,15 @@
         </w:rPr>
       </w:pPr>
       <w:r>
-        <w:t xml:space="preserve">Fase 1 – Evaluación ciega: Cada docente recibió entre 6 y 8 piezas de material base (textos educativos) que incluían un mix de aproximadamente 50% generado por IA y 50% producido por humanos. El material se presentó en formato textual uniforme y sin marcas de origen, de modo que los evaluadores no pudieran distinguirlos visualmente. Los docentes calificaron cada pieza utilizando la rúbrica de validación.</w:t>
+        <w:t>Se diseñó una validación larga estructurada en tres fases secuenciales que combinan evaluación cuantitativa mediante rúbrica y exploración cualitativa mediante entrevista de diagnóstico.</w:t>
       </w:r>
     </w:p>
     <w:p>
-      <w:pPr>
-        <w:rPr>
-          <w:lang w:val="es-ES"/>
-        </w:rPr>
-      </w:pPr>
-      <w:r>
-        <w:t xml:space="preserve">Fase 2 – Revelación del ciego: Al concluir la evaluación, se reveló a los docentes cuáles piezas habían sido generadas por Experto Temático y cuáles por humanos, y se les invitó a reflexionar sobre sus calificaciones a la luz de esta información.</w:t>
+      <w:r>
+        <w:t>Fase 1 – Evaluación ciega: Cada docente recibió entre 6 y 8 piezas de material base (textos educativos) que incluían un mix de aproximadamente 50% generado por IA y 50% producido por humanos. El material se presentó en formato textual uniforme y sin marcas</w:t>
+      </w:r>
+      <w:r>
+        <w:t xml:space="preserve"> de origen, de modo que los evaluadores no pudieran distinguirlos visualmente. Los docentes calificaron cada pieza utilizando la rúbrica de validación.</w:t>
       </w:r>
     </w:p>
     <w:p>
@@ -32946,56 +32970,413 @@
         </w:rPr>
       </w:pPr>
       <w:r>
-        <w:t xml:space="preserve">Fase 3 – Entrevista de diagnóstico: Se aplicó una guía estructurada de preguntas diagnósticas para explorar los patrones de error observados, la calidad del material para producción y las diferencias percibidas entre ambos tipos de contenido.</w:t>
+        <w:t xml:space="preserve">Fase </w:t>
+      </w:r>
+      <w:r>
+        <w:t>2</w:t>
+      </w:r>
+      <w:r>
+        <w:t xml:space="preserve"> – Entrevista de diagnóstico: Se aplicó una guía estructurada de preguntas </w:t>
+      </w:r>
+      <w:r>
+        <w:t>sobre la rúbrica y la calidad para la producción, enfocándose en profundidad en los criterios de la rúbrica, sobre la calidad de los recursos, errores detectados, además de ahondar también sobre qué recursos consideraba el docente listo para ser llevados a producción y cuáles están lejos aún</w:t>
+      </w:r>
+      <w:r>
+        <w:t>.</w:t>
       </w:r>
     </w:p>
     <w:p>
-      <w:pPr>
-        <w:rPr>
-          <w:lang w:val="es-ES"/>
-        </w:rPr>
-      </w:pPr>
-      <w:r>
-        <w:t xml:space="preserve">Cada sesión tuvo una duración aproximada de 90 minutos y se realizó de forma remota a través de la plataforma Microsoft Teams. Las sesiones se llevaron a cabo entre el 23 de abril y el 6 de mayo de 2026, con grabación de video previa autorización de los participantes.</w:t>
+      <w:r>
+        <w:t xml:space="preserve">Fase </w:t>
+      </w:r>
+      <w:r>
+        <w:t>3</w:t>
+      </w:r>
+      <w:r>
+        <w:t xml:space="preserve"> – Revelación del ciego: Al concluir l</w:t>
+      </w:r>
+      <w:r>
+        <w:t>as preguntas iniciales, se revela a los docentes el experimento y la intervención de la IA en algunos recursos</w:t>
+      </w:r>
+      <w:r>
+        <w:t xml:space="preserve">, se </w:t>
+      </w:r>
+      <w:r>
+        <w:t xml:space="preserve">les informó a </w:t>
+      </w:r>
+      <w:r>
+        <w:t xml:space="preserve">los docentes cuáles piezas habían </w:t>
+      </w:r>
+      <w:r>
+        <w:t>sido generadas por</w:t>
+      </w:r>
+      <w:r>
+        <w:t xml:space="preserve"> IA</w:t>
+      </w:r>
+      <w:r>
+        <w:t xml:space="preserve"> y cuáles por humanos, y se les invitó a reflexionar sobre sus calificaciones a la luz de esta información</w:t>
+      </w:r>
+      <w:r>
+        <w:t xml:space="preserve"> </w:t>
+      </w:r>
+      <w:r>
+        <w:t>para explorar los patrones de error observados, la calidad del material para producción y las diferencias percibidas</w:t>
+      </w:r>
+      <w:r>
+        <w:t>.</w:t>
       </w:r>
     </w:p>
     <w:p>
       <w:pPr>
-        <w:pStyle w:val="Imagenes"/>
-      </w:pPr>
-      <w:r>
-        <w:t xml:space="preserve">Figura N</w:t>
+        <w:rPr>
+          <w:lang w:val="es-ES"/>
+        </w:rPr>
+      </w:pPr>
+      <w:r>
+        <w:lastRenderedPageBreak/>
+        <w:t>Cada sesión tuvo una duración aproximada de 90 minutos y se realizó de forma remota a través de la plataforma Microsoft Teams.</w:t>
+      </w:r>
+      <w:r>
+        <w:t xml:space="preserve"> Las sesiones se llevaron a cabo entre el 23 de abril y el 6 de mayo de 2026, con grabación de video previa autorización de los participantes.</w:t>
       </w:r>
     </w:p>
     <w:p>
       <w:pPr>
         <w:pStyle w:val="Imagenes"/>
-      </w:pPr>
-      <w:r>
-        <w:t xml:space="preserve">Capturas de sesiones de validación: docente revisando material, compartiendo referencias y calificando con la rúbrica</w:t>
+        <w:spacing w:line="360" w:lineRule="auto"/>
+      </w:pPr>
+      <w:r>
+        <w:t>Figura N</w:t>
       </w:r>
     </w:p>
     <w:p>
       <w:pPr>
         <w:pStyle w:val="Imagenes"/>
-      </w:pPr>
-      <w:r>
+        <w:spacing w:line="360" w:lineRule="auto"/>
+        <w:rPr>
+          <w:b w:val="0"/>
+          <w:bCs/>
+        </w:rPr>
+      </w:pPr>
+      <w:r>
+        <w:rPr>
+          <w:b w:val="0"/>
+          <w:bCs/>
+        </w:rPr>
+        <w:t>Flujo de entrevista a docentes</w:t>
+      </w:r>
+    </w:p>
+    <w:p>
+      <w:pPr>
+        <w:rPr>
+          <w:lang w:val="es-ES"/>
+        </w:rPr>
+      </w:pPr>
+      <w:r>
+        <w:rPr>
+          <w:noProof/>
+          <w:lang w:val="es-ES"/>
+        </w:rPr>
         <w:drawing>
-          <wp:inline xmlns:a="http://schemas.openxmlformats.org/drawingml/2006/main" xmlns:pic="http://schemas.openxmlformats.org/drawingml/2006/picture">
-            <wp:extent cx="5029200" cy="2771256"/>
-            <wp:docPr id="6" name="Picture 6"/>
+          <wp:inline distT="0" distB="0" distL="0" distR="0" wp14:anchorId="64EE2ABA" wp14:editId="6B21002F">
+            <wp:extent cx="5642119" cy="1478478"/>
+            <wp:effectExtent l="0" t="0" r="0" b="0"/>
+            <wp:docPr id="10" name="Imagen 10"/>
             <wp:cNvGraphicFramePr>
-              <a:graphicFrameLocks noChangeAspect="1"/>
+              <a:graphicFrameLocks xmlns:a="http://schemas.openxmlformats.org/drawingml/2006/main" noChangeAspect="1"/>
             </wp:cNvGraphicFramePr>
-            <a:graphic>
+            <a:graphic xmlns:a="http://schemas.openxmlformats.org/drawingml/2006/main">
               <a:graphicData uri="http://schemas.openxmlformats.org/drawingml/2006/picture">
-                <pic:pic>
+                <pic:pic xmlns:pic="http://schemas.openxmlformats.org/drawingml/2006/picture">
                   <pic:nvPicPr>
-                    <pic:cNvPr id="0" name="chart_sesiones.png"/>
+                    <pic:cNvPr id="0" name="Picture 2"/>
+                    <pic:cNvPicPr>
+                      <a:picLocks noChangeAspect="1" noChangeArrowheads="1"/>
+                    </pic:cNvPicPr>
+                  </pic:nvPicPr>
+                  <pic:blipFill>
+                    <a:blip r:embed="rId18" cstate="print">
+                      <a:extLst>
+                        <a:ext uri="{28A0092B-C50C-407E-A947-70E740481C1C}">
+                          <a14:useLocalDpi xmlns:a14="http://schemas.microsoft.com/office/drawing/2010/main" val="0"/>
+                        </a:ext>
+                      </a:extLst>
+                    </a:blip>
+                    <a:srcRect/>
+                    <a:stretch>
+                      <a:fillRect/>
+                    </a:stretch>
+                  </pic:blipFill>
+                  <pic:spPr bwMode="auto">
+                    <a:xfrm>
+                      <a:off x="0" y="0"/>
+                      <a:ext cx="5672263" cy="1486377"/>
+                    </a:xfrm>
+                    <a:prstGeom prst="rect">
+                      <a:avLst/>
+                    </a:prstGeom>
+                    <a:noFill/>
+                    <a:ln>
+                      <a:noFill/>
+                    </a:ln>
+                  </pic:spPr>
+                </pic:pic>
+              </a:graphicData>
+            </a:graphic>
+          </wp:inline>
+        </w:drawing>
+      </w:r>
+    </w:p>
+    <w:p>
+      <w:pPr>
+        <w:pStyle w:val="Imagenes"/>
+        <w:rPr>
+          <w:b w:val="0"/>
+          <w:bCs/>
+        </w:rPr>
+      </w:pPr>
+      <w:r>
+        <w:rPr>
+          <w:b w:val="0"/>
+          <w:bCs/>
+          <w:i/>
+          <w:iCs/>
+        </w:rPr>
+        <w:t xml:space="preserve">Nota. </w:t>
+      </w:r>
+      <w:r>
+        <w:rPr>
+          <w:b w:val="0"/>
+          <w:bCs/>
+        </w:rPr>
+        <w:t>Adaptado de fuente interna de la organización.</w:t>
+      </w:r>
+    </w:p>
+    <w:p>
+      <w:pPr>
+        <w:rPr>
+          <w:lang w:val="es-ES"/>
+        </w:rPr>
+      </w:pPr>
+    </w:p>
+    <w:p>
+      <w:pPr>
+        <w:rPr>
+          <w:lang w:val="es-ES"/>
+        </w:rPr>
+      </w:pPr>
+      <w:r>
+        <w:t>3.3.3    Participantes e instrumento de evaluación</w:t>
+      </w:r>
+    </w:p>
+    <w:p>
+      <w:pPr>
+        <w:rPr>
+          <w:lang w:val="es-ES"/>
+        </w:rPr>
+      </w:pPr>
+      <w:r>
+        <w:t>La selección de participantes se centró en docentes internos de la Universidad con</w:t>
+      </w:r>
+      <w:r>
+        <w:t xml:space="preserve"> experiencia comprobada en la enseñanza de los cursos evaluados, denominados docentes dictantes. Se optó por docentes propios de la institución —en lugar de evaluadores externos— dado que el acceso a docentes de planta facilitó la coordinación y aseguró qu</w:t>
+      </w:r>
+      <w:r>
+        <w:t>e los evaluadores contaran con el conocimiento tácito específico de los cursos, los estándares pedagógicos de la universidad y el perfil real de los estudiantes.</w:t>
+      </w:r>
+    </w:p>
+    <w:p>
+      <w:pPr>
+        <w:rPr>
+          <w:lang w:val="es-ES"/>
+        </w:rPr>
+      </w:pPr>
+      <w:r>
+        <w:t>Participaron 15 docentes distribuidos equitativamente en tres cursos:</w:t>
+      </w:r>
+    </w:p>
+    <w:p>
+      <w:pPr>
+        <w:rPr>
+          <w:lang w:val="es-ES"/>
+        </w:rPr>
+      </w:pPr>
+      <w:r>
+        <w:t xml:space="preserve">-  Cálculo para la toma </w:t>
+      </w:r>
+      <w:r>
+        <w:t>de decisiones: 5 docentes.</w:t>
+      </w:r>
+    </w:p>
+    <w:p>
+      <w:pPr>
+        <w:rPr>
+          <w:lang w:val="es-ES"/>
+        </w:rPr>
+      </w:pPr>
+      <w:r>
+        <w:t>-  Ciudadanía y Reflexión Ética: 5 docentes.</w:t>
+      </w:r>
+    </w:p>
+    <w:p>
+      <w:pPr>
+        <w:rPr>
+          <w:lang w:val="es-ES"/>
+        </w:rPr>
+      </w:pPr>
+      <w:r>
+        <w:t>-  Sistemas Operativos: 5 docentes.</w:t>
+      </w:r>
+    </w:p>
+    <w:p>
+      <w:pPr>
+        <w:rPr>
+          <w:lang w:val="es-ES"/>
+        </w:rPr>
+      </w:pPr>
+      <w:r>
+        <w:t>El reclutamiento se realizó por invitación directa vía correo electrónico institucional. La invitación especificó el objetivo del estudio, el compro</w:t>
+      </w:r>
+      <w:r>
+        <w:t>miso de tiempo requerido (aproximadamente 80 minutos en total, divididos en una fase de evaluación de 30 a 40 minutos y una entrevista de 30 a 40 minutos), y la compensación económica</w:t>
+      </w:r>
+      <w:r>
+        <w:t xml:space="preserve"> incorporada a la planilla mensual de cada participante. Las e</w:t>
+      </w:r>
+      <w:r>
+        <w:t>valuaciones se procesaron de forma anónima, sin vincular la identidad del docente a comentarios específicos.</w:t>
+      </w:r>
+    </w:p>
+    <w:p>
+      <w:pPr>
+        <w:rPr>
+          <w:lang w:val="es-ES"/>
+        </w:rPr>
+      </w:pPr>
+      <w:r>
+        <w:lastRenderedPageBreak/>
+        <w:t>Instrumento de evaluación</w:t>
+      </w:r>
+    </w:p>
+    <w:p>
+      <w:pPr>
+        <w:rPr>
+          <w:lang w:val="es-ES"/>
+        </w:rPr>
+      </w:pPr>
+      <w:r>
+        <w:t>Se utilizó una rúbrica de validación compuesta por seis criterios que cubrieron tanto las dimensiones pedagógicas como la</w:t>
+      </w:r>
+      <w:r>
+        <w:t>s de comunicación del material educativo:</w:t>
+      </w:r>
+    </w:p>
+    <w:p>
+      <w:pPr>
+        <w:rPr>
+          <w:lang w:val="es-ES"/>
+        </w:rPr>
+      </w:pPr>
+      <w:r>
+        <w:t>-  C01 – Alineación del contenido: Evalúa si el material se alinea con el logro de aprendizaje de la semana o unidad correspondiente.</w:t>
+      </w:r>
+    </w:p>
+    <w:p>
+      <w:pPr>
+        <w:rPr>
+          <w:lang w:val="es-ES"/>
+        </w:rPr>
+      </w:pPr>
+      <w:r>
+        <w:t>-  C02 – Exactitud del contenido: Verifica la precisión técnica y factual del co</w:t>
+      </w:r>
+      <w:r>
+        <w:t>ntenido presentado.</w:t>
+      </w:r>
+    </w:p>
+    <w:p>
+      <w:pPr>
+        <w:rPr>
+          <w:lang w:val="es-ES"/>
+        </w:rPr>
+      </w:pPr>
+      <w:r>
+        <w:t>-  C03 – Rigor académico: Evalúa el uso adecuado de citas, referencias bibliográficas y lenguaje académico.</w:t>
+      </w:r>
+    </w:p>
+    <w:p>
+      <w:pPr>
+        <w:rPr>
+          <w:lang w:val="es-ES"/>
+        </w:rPr>
+      </w:pPr>
+      <w:r>
+        <w:t>-  C04 – Propiedad para el nivel del alumno: Valora si el lenguaje, profundidad y ejemplos son adecuados para el ciclo académico</w:t>
+      </w:r>
+      <w:r>
+        <w:t xml:space="preserve"> del estudiante.</w:t>
+      </w:r>
+    </w:p>
+    <w:p>
+      <w:pPr>
+        <w:rPr>
+          <w:lang w:val="es-ES"/>
+        </w:rPr>
+      </w:pPr>
+      <w:r>
+        <w:t>-  C05 – Calidad de ejemplos: Evalúa la relevancia, claridad y diversidad de los ejemplos utilizados en el material.</w:t>
+      </w:r>
+    </w:p>
+    <w:p>
+      <w:r>
+        <w:t>-  C06 – Probabilidad de que el alumno complete el material: Estima el nivel de engagement y la legibilidad general del co</w:t>
+      </w:r>
+      <w:r>
+        <w:t>ntenido.</w:t>
+      </w:r>
+    </w:p>
+    <w:p>
+      <w:pPr>
+        <w:pStyle w:val="Imagenes"/>
+        <w:spacing w:line="360" w:lineRule="auto"/>
+      </w:pPr>
+      <w:r>
+        <w:t>Figura N</w:t>
+      </w:r>
+    </w:p>
+    <w:p>
+      <w:r>
+        <w:t>Rúbrica de evaluación de contenido</w:t>
+      </w:r>
+    </w:p>
+    <w:p>
+      <w:pPr>
+        <w:rPr>
+          <w:lang w:val="es-ES"/>
+        </w:rPr>
+      </w:pPr>
+      <w:r>
+        <w:rPr>
+          <w:lang w:val="es-ES"/>
+        </w:rPr>
+        <w:lastRenderedPageBreak/>
+        <w:drawing>
+          <wp:inline distT="0" distB="0" distL="0" distR="0" wp14:anchorId="22A39834" wp14:editId="5677DB9B">
+            <wp:extent cx="4645316" cy="3948545"/>
+            <wp:effectExtent l="0" t="0" r="3175" b="0"/>
+            <wp:docPr id="7" name="Imagen 7"/>
+            <wp:cNvGraphicFramePr>
+              <a:graphicFrameLocks xmlns:a="http://schemas.openxmlformats.org/drawingml/2006/main" noChangeAspect="1"/>
+            </wp:cNvGraphicFramePr>
+            <a:graphic xmlns:a="http://schemas.openxmlformats.org/drawingml/2006/main">
+              <a:graphicData uri="http://schemas.openxmlformats.org/drawingml/2006/picture">
+                <pic:pic xmlns:pic="http://schemas.openxmlformats.org/drawingml/2006/picture">
+                  <pic:nvPicPr>
+                    <pic:cNvPr id="1" name=""/>
                     <pic:cNvPicPr/>
                   </pic:nvPicPr>
                   <pic:blipFill>
-                    <a:blip r:embed="rId25"/>
+                    <a:blip r:embed="rId19"/>
                     <a:stretch>
                       <a:fillRect/>
                     </a:stretch>
@@ -33003,9 +33384,11 @@
                   <pic:spPr>
                     <a:xfrm>
                       <a:off x="0" y="0"/>
-                      <a:ext cx="5029200" cy="2771256"/>
+                      <a:ext cx="4678798" cy="3977005"/>
                     </a:xfrm>
-                    <a:prstGeom prst="rect"/>
+                    <a:prstGeom prst="rect">
+                      <a:avLst/>
+                    </a:prstGeom>
                   </pic:spPr>
                 </pic:pic>
               </a:graphicData>
@@ -33017,26 +33400,48 @@
     <w:p>
       <w:pPr>
         <w:pStyle w:val="Imagenes"/>
-      </w:pPr>
-      <w:r>
-        <w:t xml:space="preserve">Nota. Adaptado de Resultados de validación larga de Experto Temático [Documento interno]. Universidad Tecnológica del Perú.</w:t>
+        <w:rPr>
+          <w:b w:val="0"/>
+          <w:bCs/>
+        </w:rPr>
+      </w:pPr>
+      <w:r>
+        <w:rPr>
+          <w:b w:val="0"/>
+          <w:bCs/>
+          <w:i/>
+          <w:iCs/>
+        </w:rPr>
+        <w:t xml:space="preserve">Nota. </w:t>
+      </w:r>
+      <w:r>
+        <w:rPr>
+          <w:b w:val="0"/>
+          <w:bCs/>
+        </w:rPr>
+        <w:t>Adaptado de fuente interna de la organización.</w:t>
       </w:r>
     </w:p>
     <w:p>
       <w:pPr>
-        <w:rPr>
-          <w:lang w:val="es-ES"/>
+        <w:pStyle w:val="Imagenes"/>
+        <w:rPr>
+          <w:b w:val="0"/>
+          <w:bCs/>
         </w:rPr>
       </w:pPr>
     </w:p>
     <w:p>
       <w:pPr>
-        <w:rPr>
-          <w:lang w:val="es-ES"/>
-        </w:rPr>
-      </w:pPr>
-      <w:r>
-        <w:t xml:space="preserve">3.3.3    Participantes</w:t>
+        <w:pStyle w:val="Ttulo1"/>
+        <w:numPr>
+          <w:ilvl w:val="0"/>
+          <w:numId w:val="0"/>
+        </w:numPr>
+        <w:ind w:left="432" w:hanging="432"/>
+      </w:pPr>
+      <w:r>
+        <w:t>4. Resultados</w:t>
       </w:r>
     </w:p>
     <w:p>
@@ -33046,7 +33451,10 @@
         </w:rPr>
       </w:pPr>
       <w:r>
-        <w:t xml:space="preserve">La selección de participantes se centró en docentes internos de la Universidad Tecnológica del Perú (UTP) con experiencia comprobada en la enseñanza de los cursos evaluados, denominados docentes dictantes. Se optó por docentes propios de la institución —en lugar de evaluadores externos— dado que el acceso a docentes de planta facilitó la coordinación y aseguró que los evaluadores contaran con el conocimiento tácito específico de los cursos, los estándares pedagógicos de la universidad y el perfil real de los estudiantes.</w:t>
+        <w:rPr>
+          <w:b/>
+        </w:rPr>
+        <w:t>Resultados cuantitativos</w:t>
       </w:r>
     </w:p>
     <w:p>
@@ -33056,199 +33464,69 @@
         </w:rPr>
       </w:pPr>
       <w:r>
-        <w:t xml:space="preserve">Participaron 15 docentes distribuidos equitativamente en tres cursos:</w:t>
+        <w:t>El análisis de los puntajes obtenidos reveló que no existe una diferencia significativa entre el material generado por IA y el producido por humanos. El contenido humano obtuvo un puntaje promedio de 23</w:t>
+      </w:r>
+      <w:r>
+        <w:t>.6 puntos, mientras que el contenido generado por Experto Temático alcanzó 22.43 puntos. El puntaje máximo promedio fue de 27.2 para el material humano y de 27 para el material IA, lo que evidencia un rendimiento prácticamente equivalente en términos de ca</w:t>
+      </w:r>
+      <w:r>
+        <w:t>lidad percibida.</w:t>
       </w:r>
     </w:p>
     <w:p>
       <w:pPr>
-        <w:rPr>
-          <w:lang w:val="es-ES"/>
-        </w:rPr>
-      </w:pPr>
-      <w:r>
-        <w:t xml:space="preserve">-  Cálculo para la toma de decisiones: 5 docentes.</w:t>
+        <w:pStyle w:val="Imagenes"/>
+        <w:spacing w:line="360" w:lineRule="auto"/>
+      </w:pPr>
+      <w:r>
+        <w:t>Figura N</w:t>
       </w:r>
     </w:p>
     <w:p>
       <w:pPr>
-        <w:rPr>
-          <w:lang w:val="es-ES"/>
-        </w:rPr>
-      </w:pPr>
-      <w:r>
-        <w:t xml:space="preserve">-  Ciudadanía y Reflexión Ética: 5 docentes.</w:t>
+        <w:pStyle w:val="Imagenes"/>
+        <w:spacing w:line="360" w:lineRule="auto"/>
+        <w:rPr>
+          <w:b w:val="0"/>
+          <w:bCs/>
+        </w:rPr>
+      </w:pPr>
+      <w:r>
+        <w:rPr>
+          <w:b w:val="0"/>
+          <w:bCs/>
+        </w:rPr>
+        <w:t>Puntaje total obtenido por recurso evaluado: material humano (H) vs. Experto Temático (IA)</w:t>
       </w:r>
     </w:p>
     <w:p>
       <w:pPr>
-        <w:rPr>
-          <w:lang w:val="es-ES"/>
-        </w:rPr>
-      </w:pPr>
-      <w:r>
-        <w:t xml:space="preserve">-  Sistemas Operativos: 5 docentes.</w:t>
-      </w:r>
+        <w:pStyle w:val="Imagenes"/>
+      </w:pPr>
     </w:p>
     <w:p>
       <w:pPr>
-        <w:rPr>
-          <w:lang w:val="es-ES"/>
-        </w:rPr>
-      </w:pPr>
-      <w:r>
-        <w:t xml:space="preserve">El reclutamiento se realizó por invitación directa vía correo electrónico institucional. La invitación especificó el objetivo del estudio, el compromiso de tiempo requerido (aproximadamente 80 minutos en total, divididos en una fase de evaluación de 30 a 40 minutos y una entrevista de 30 a 40 minutos), y la compensación económica de S/ 150, incorporada a la planilla mensual de cada participante. Las evaluaciones se procesaron de forma anónima, sin vincular la identidad del docente a comentarios específicos.</w:t>
-      </w:r>
-    </w:p>
-    <w:p>
-      <w:pPr>
-        <w:rPr>
-          <w:lang w:val="es-ES"/>
-        </w:rPr>
-      </w:pPr>
-      <w:r>
-        <w:t xml:space="preserve">3.3.4    Instrumento de evaluación</w:t>
-      </w:r>
-    </w:p>
-    <w:p>
-      <w:pPr>
-        <w:rPr>
-          <w:lang w:val="es-ES"/>
-        </w:rPr>
-      </w:pPr>
-      <w:r>
-        <w:t xml:space="preserve">Se utilizó una rúbrica de validación compuesta por seis criterios que cubrieron tanto las dimensiones pedagógicas como las de comunicación del material educativo:</w:t>
-      </w:r>
-    </w:p>
-    <w:p>
-      <w:pPr>
-        <w:rPr>
-          <w:lang w:val="es-ES"/>
-        </w:rPr>
-      </w:pPr>
-      <w:r>
-        <w:t xml:space="preserve">-  C01 – Alineación del contenido: Evalúa si el material se alinea con el logro de aprendizaje de la semana o unidad correspondiente.</w:t>
-      </w:r>
-    </w:p>
-    <w:p>
-      <w:pPr>
-        <w:rPr>
-          <w:lang w:val="es-ES"/>
-        </w:rPr>
-      </w:pPr>
-      <w:r>
-        <w:t xml:space="preserve">-  C02 – Exactitud del contenido: Verifica la precisión técnica y factual del contenido presentado.</w:t>
-      </w:r>
-    </w:p>
-    <w:p>
-      <w:pPr>
-        <w:rPr>
-          <w:lang w:val="es-ES"/>
-        </w:rPr>
-      </w:pPr>
-      <w:r>
-        <w:t xml:space="preserve">-  C03 – Rigor académico: Evalúa el uso adecuado de citas, referencias bibliográficas y lenguaje académico.</w:t>
-      </w:r>
-    </w:p>
-    <w:p>
-      <w:pPr>
-        <w:rPr>
-          <w:lang w:val="es-ES"/>
-        </w:rPr>
-      </w:pPr>
-      <w:r>
-        <w:t xml:space="preserve">-  C04 – Propiedad para el nivel del alumno: Valora si el lenguaje, profundidad y ejemplos son adecuados para el ciclo académico del estudiante.</w:t>
-      </w:r>
-    </w:p>
-    <w:p>
-      <w:pPr>
-        <w:rPr>
-          <w:lang w:val="es-ES"/>
-        </w:rPr>
-      </w:pPr>
-      <w:r>
-        <w:t xml:space="preserve">-  C05 – Calidad de ejemplos: Evalúa la relevancia, claridad y diversidad de los ejemplos utilizados en el material.</w:t>
-      </w:r>
-    </w:p>
-    <w:p>
-      <w:pPr>
-        <w:rPr>
-          <w:lang w:val="es-ES"/>
-        </w:rPr>
-      </w:pPr>
-      <w:r>
-        <w:t xml:space="preserve">-  C06 – Probabilidad de que el alumno complete el material: Estima el nivel de engagement y la legibilidad general del contenido.</w:t>
-      </w:r>
-    </w:p>
-    <w:p>
-      <w:pPr>
-        <w:rPr>
-          <w:lang w:val="es-ES"/>
-        </w:rPr>
-      </w:pPr>
-      <w:r>
-        <w:t xml:space="preserve">3.3.5    Resultados</w:t>
-      </w:r>
-    </w:p>
-    <w:p>
-      <w:pPr>
-        <w:rPr>
-          <w:lang w:val="es-ES"/>
-        </w:rPr>
-      </w:pPr>
-      <w:r>
-        <w:rPr>
-          <w:b/>
-        </w:rPr>
-        <w:t xml:space="preserve">Resultados cuantitativos</w:t>
-      </w:r>
-    </w:p>
-    <w:p>
-      <w:pPr>
-        <w:rPr>
-          <w:lang w:val="es-ES"/>
-        </w:rPr>
-      </w:pPr>
-      <w:r>
-        <w:t xml:space="preserve">El análisis de los puntajes obtenidos reveló que no existe una diferencia significativa entre el material generado por IA y el producido por humanos. El contenido humano obtuvo un puntaje promedio de 23.6 puntos, mientras que el contenido generado por Experto Temático alcanzó 22.43 puntos. El puntaje máximo promedio fue de 27.2 para el material humano y de 27 para el material IA, lo que evidencia un rendimiento prácticamente equivalente en términos de calidad percibida.</w:t>
-      </w:r>
-    </w:p>
-    <w:p>
-      <w:pPr>
         <w:pStyle w:val="Imagenes"/>
       </w:pPr>
       <w:r>
-        <w:t xml:space="preserve">Figura N</w:t>
-      </w:r>
-    </w:p>
-    <w:p>
-      <w:pPr>
-        <w:pStyle w:val="Imagenes"/>
-      </w:pPr>
-      <w:r>
-        <w:t xml:space="preserve">Puntaje total obtenido por recurso evaluado: material humano (H) vs. Experto Temático (IA)</w:t>
-      </w:r>
-    </w:p>
-    <w:p>
-      <w:pPr>
-        <w:pStyle w:val="Imagenes"/>
-      </w:pPr>
-      <w:r>
+        <w:lastRenderedPageBreak/>
         <w:drawing>
-          <wp:inline xmlns:a="http://schemas.openxmlformats.org/drawingml/2006/main" xmlns:pic="http://schemas.openxmlformats.org/drawingml/2006/picture">
-            <wp:extent cx="5029200" cy="2771256"/>
-            <wp:docPr id="5" name="Picture 5"/>
+          <wp:inline distT="0" distB="0" distL="0" distR="0" wp14:anchorId="0C59ADAC" wp14:editId="02619676">
+            <wp:extent cx="5878340" cy="2196935"/>
+            <wp:effectExtent l="0" t="0" r="8255" b="0"/>
+            <wp:docPr id="8" name="Imagen 8"/>
             <wp:cNvGraphicFramePr>
-              <a:graphicFrameLocks noChangeAspect="1"/>
+              <a:graphicFrameLocks xmlns:a="http://schemas.openxmlformats.org/drawingml/2006/main" noChangeAspect="1"/>
             </wp:cNvGraphicFramePr>
-            <a:graphic>
+            <a:graphic xmlns:a="http://schemas.openxmlformats.org/drawingml/2006/main">
               <a:graphicData uri="http://schemas.openxmlformats.org/drawingml/2006/picture">
-                <pic:pic>
+                <pic:pic xmlns:pic="http://schemas.openxmlformats.org/drawingml/2006/picture">
                   <pic:nvPicPr>
-                    <pic:cNvPr id="0" name="chart_puntaje_recursos.png"/>
+                    <pic:cNvPr id="1" name=""/>
                     <pic:cNvPicPr/>
                   </pic:nvPicPr>
                   <pic:blipFill>
-                    <a:blip r:embed="rId24"/>
+                    <a:blip r:embed="rId20"/>
                     <a:stretch>
                       <a:fillRect/>
                     </a:stretch>
@@ -33256,9 +33534,11 @@
                   <pic:spPr>
                     <a:xfrm>
                       <a:off x="0" y="0"/>
-                      <a:ext cx="5029200" cy="2771256"/>
+                      <a:ext cx="5888820" cy="2200852"/>
                     </a:xfrm>
-                    <a:prstGeom prst="rect"/>
+                    <a:prstGeom prst="rect">
+                      <a:avLst/>
+                    </a:prstGeom>
                   </pic:spPr>
                 </pic:pic>
               </a:graphicData>
@@ -33270,17 +33550,37 @@
     <w:p>
       <w:pPr>
         <w:pStyle w:val="Imagenes"/>
-      </w:pPr>
-      <w:r>
-        <w:t xml:space="preserve">Nota. Adaptado de Resultados de validación larga de Experto Temático [Documento interno]. Universidad Tecnológica del Perú.</w:t>
-      </w:r>
+        <w:spacing w:line="360" w:lineRule="auto"/>
+      </w:pPr>
     </w:p>
     <w:p>
       <w:pPr>
-        <w:rPr>
-          <w:lang w:val="es-ES"/>
-        </w:rPr>
-      </w:pPr>
+        <w:pStyle w:val="Imagenes"/>
+        <w:spacing w:line="360" w:lineRule="auto"/>
+        <w:rPr>
+          <w:b w:val="0"/>
+          <w:bCs/>
+        </w:rPr>
+      </w:pPr>
+      <w:r>
+        <w:rPr>
+          <w:b w:val="0"/>
+          <w:bCs/>
+          <w:i/>
+          <w:iCs/>
+        </w:rPr>
+        <w:t>Nota</w:t>
+      </w:r>
+      <w:r>
+        <w:t xml:space="preserve">. </w:t>
+      </w:r>
+      <w:r>
+        <w:rPr>
+          <w:b w:val="0"/>
+          <w:bCs/>
+        </w:rPr>
+        <w:t>Adaptado de Resultados de validación larga de Experto Temático [Documento interno]. la Universidad.</w:t>
+      </w:r>
     </w:p>
     <w:p>
       <w:pPr>
@@ -33288,9 +33588,6 @@
           <w:lang w:val="es-ES"/>
         </w:rPr>
       </w:pPr>
-      <w:r>
-        <w:t xml:space="preserve">El puntaje más bajo registrado para el material de IA fue de 19.2 puntos, atribuido principalmente al desarrollo de un caso ficticio indicado en la consigna de la rúbrica y a la ausencia de citado de fuentes a lo largo del contenido; ambas situaciones son corregibles mediante ajustes en los inputs y en el diseño del pipeline de generación.</w:t>
-      </w:r>
     </w:p>
     <w:p>
       <w:pPr>
@@ -33299,7 +33596,10 @@
         </w:rPr>
       </w:pPr>
       <w:r>
-        <w:t xml:space="preserve">Un hallazgo particularmente relevante fue que ninguno de los 15 docentes modificó su evaluación tras conocer cuál material había sido generado por IA. Esto confirma que la calidad del contenido fue valorada de forma objetiva, sin influencia del origen de los materiales, resultado consistente con lo documentado en investigaciones previas sobre evaluación ciega en contextos de educación superior (Scarfe et al., 2024).</w:t>
+        <w:t xml:space="preserve">El puntaje más bajo registrado para el material de IA fue de 19.2 puntos, atribuido principalmente al desarrollo de un caso ficticio indicado en la consigna de la rúbrica y a la ausencia de citado de fuentes a lo largo del contenido; ambas situaciones son </w:t>
+      </w:r>
+      <w:r>
+        <w:t>corregibles mediante ajustes en los inputs y en el diseño del pipeline de generación.</w:t>
       </w:r>
     </w:p>
     <w:p>
@@ -33309,10 +33609,10 @@
         </w:rPr>
       </w:pPr>
       <w:r>
-        <w:rPr>
-          <w:b/>
-        </w:rPr>
-        <w:t xml:space="preserve">Resultados cualitativos</w:t>
+        <w:t>Un hallazgo particularmente relevante fue que ninguno de los 15 docentes modificó su evaluación tras conocer cuál material había sido generado por IA. Esto confirma que l</w:t>
+      </w:r>
+      <w:r>
+        <w:t>a calidad del contenido fue valorada de forma objetiva, sin influencia del origen de los materiales, resultado consistente con lo documentado en investigaciones previas sobre evaluación ciega en contextos de educación superior (Scarfe et al., 2024).</w:t>
       </w:r>
     </w:p>
     <w:p>
@@ -33322,7 +33622,16 @@
         </w:rPr>
       </w:pPr>
       <w:r>
-        <w:t xml:space="preserve">El análisis cualitativo derivado de las sesiones de validación permitió identificar atributos diferenciados para ambos tipos de contenido.</w:t>
+        <w:rPr>
+          <w:b/>
+        </w:rPr>
+        <w:t>Result</w:t>
+      </w:r>
+      <w:r>
+        <w:rPr>
+          <w:b/>
+        </w:rPr>
+        <w:t>ados cualitativos</w:t>
       </w:r>
     </w:p>
     <w:p>
@@ -33332,10 +33641,7 @@
         </w:rPr>
       </w:pPr>
       <w:r>
-        <w:rPr>
-          <w:b/>
-        </w:rPr>
-        <w:t xml:space="preserve">Fortalezas de Experto Temático:</w:t>
+        <w:t>El análisis cualitativo derivado de las sesiones de validación permitió identificar atributos diferenciados para ambos tipos de contenido.</w:t>
       </w:r>
     </w:p>
     <w:p>
@@ -33345,7 +33651,10 @@
         </w:rPr>
       </w:pPr>
       <w:r>
-        <w:t xml:space="preserve">-  Buena forma narrativa y fluidez en la redacción.</w:t>
+        <w:rPr>
+          <w:b/>
+        </w:rPr>
+        <w:t>Fortalezas de Experto Temático:</w:t>
       </w:r>
     </w:p>
     <w:p>
@@ -33355,7 +33664,7 @@
         </w:rPr>
       </w:pPr>
       <w:r>
-        <w:t xml:space="preserve">-  Mayor variedad y nivel de detalle en los ejemplos proporcionados, valorados especialmente en Ciudadanía y en Cálculo.</w:t>
+        <w:t>-  Buena forma narrativa y fluidez en la redacción.</w:t>
       </w:r>
     </w:p>
     <w:p>
@@ -33365,7 +33674,10 @@
         </w:rPr>
       </w:pPr>
       <w:r>
-        <w:t xml:space="preserve">-  Estructuras que facilitan la lectura y la comprensión de los elementos conceptuales.</w:t>
+        <w:t>-  Mayor varied</w:t>
+      </w:r>
+      <w:r>
+        <w:t>ad y nivel de detalle en los ejemplos proporcionados, valorados especialmente en Ciudadanía y en Cálculo.</w:t>
       </w:r>
     </w:p>
     <w:p>
@@ -33375,7 +33687,7 @@
         </w:rPr>
       </w:pPr>
       <w:r>
-        <w:t xml:space="preserve">-  El contenido generado requirió únicamente correcciones menores o medianas, sin necesidad de reescritura completa.</w:t>
+        <w:t>-  Estructuras que facilitan la lectura y la comprensión de los elementos conceptuales.</w:t>
       </w:r>
     </w:p>
     <w:p>
@@ -33385,10 +33697,11 @@
         </w:rPr>
       </w:pPr>
       <w:r>
-        <w:rPr>
-          <w:b/>
-        </w:rPr>
-        <w:t xml:space="preserve">Debilidades de Experto Temático:</w:t>
+        <w:lastRenderedPageBreak/>
+        <w:t>-  El contenido generado requirió únicamente correcciones meno</w:t>
+      </w:r>
+      <w:r>
+        <w:t>res o medianas, sin necesidad de reescritura completa.</w:t>
       </w:r>
     </w:p>
     <w:p>
@@ -33398,7 +33711,10 @@
         </w:rPr>
       </w:pPr>
       <w:r>
-        <w:t xml:space="preserve">-  Mayor necesidad de contexto explícito: la herramienta genera mejor contenido cuando los inputs incluyen información tácita específica del curso (dificultades comunes de los alumnos, carreras, metodología de enseñanza).</w:t>
+        <w:rPr>
+          <w:b/>
+        </w:rPr>
+        <w:t>Debilidades de Experto Temático:</w:t>
       </w:r>
     </w:p>
     <w:p>
@@ -33408,7 +33724,10 @@
         </w:rPr>
       </w:pPr>
       <w:r>
-        <w:t xml:space="preserve">-  Incumplimiento sistemático de las normas APA 7 al generar las citas dentro del material.</w:t>
+        <w:t>-  Mayor necesidad de contexto explícito: la herramienta genera mejor contenido cuando los inputs incluyen información tácita específica del curso (dificultades comunes</w:t>
+      </w:r>
+      <w:r>
+        <w:t xml:space="preserve"> de los alumnos, carreras, metodología de enseñanza).</w:t>
       </w:r>
     </w:p>
     <w:p>
@@ -33418,7 +33737,7 @@
         </w:rPr>
       </w:pPr>
       <w:r>
-        <w:t xml:space="preserve">-  Errores menores en las citas generadas: ausencia de número de página, fechas faltantes o nombres con imprecisiones.</w:t>
+        <w:t>-  Incumplimiento sistemático de las normas APA 7 al generar las citas dentro del material.</w:t>
       </w:r>
     </w:p>
     <w:p>
@@ -33428,7 +33747,10 @@
         </w:rPr>
       </w:pPr>
       <w:r>
-        <w:t xml:space="preserve">-  Puntaje ligeramente inferior en el criterio C01 (Alineación del contenido), cuya causa exacta no se determinó, pero podría estar relacionada con la cobertura de los temas de la semana.</w:t>
+        <w:t>-  Errores menores en las citas generadas: ausencia de número de página, fechas faltantes o nombres con imprec</w:t>
+      </w:r>
+      <w:r>
+        <w:t>isiones.</w:t>
       </w:r>
     </w:p>
     <w:p>
@@ -33438,10 +33760,7 @@
         </w:rPr>
       </w:pPr>
       <w:r>
-        <w:rPr>
-          <w:b/>
-        </w:rPr>
-        <w:t xml:space="preserve">Fortalezas del material humano:</w:t>
+        <w:t>-  Puntaje ligeramente inferior en el criterio C01 (Alineación del contenido), cuya causa exacta no se determinó, pero podría estar relacionada con la cobertura de los temas de la semana.</w:t>
       </w:r>
     </w:p>
     <w:p>
@@ -33451,7 +33770,10 @@
         </w:rPr>
       </w:pPr>
       <w:r>
-        <w:t xml:space="preserve">-  Refleja conocimiento tácito sobre las habilidades y comportamientos de los alumnos, especialmente en el contexto de exámenes y actividades.</w:t>
+        <w:rPr>
+          <w:b/>
+        </w:rPr>
+        <w:t>Fortalezas del material humano:</w:t>
       </w:r>
     </w:p>
     <w:p>
@@ -33461,7 +33783,7 @@
         </w:rPr>
       </w:pPr>
       <w:r>
-        <w:t xml:space="preserve">-  Vocabulario y terminología más ajustados al consenso de la industria o área disciplinar.</w:t>
+        <w:t>-  Refleja conocimiento tácito sobre las habilidades y comportamientos de los alumnos, especialmente en el contexto de exámenes y actividades.</w:t>
       </w:r>
     </w:p>
     <w:p>
@@ -33471,7 +33793,7 @@
         </w:rPr>
       </w:pPr>
       <w:r>
-        <w:t xml:space="preserve">-  Sin errores en la resolución de ejercicios (C02), cumpliendo correctamente con los criterios de exactitud.</w:t>
+        <w:t>-  Vocabulario y terminología más ajustados al consenso de la industria o área disciplinar.</w:t>
       </w:r>
     </w:p>
     <w:p>
@@ -33481,10 +33803,10 @@
         </w:rPr>
       </w:pPr>
       <w:r>
-        <w:rPr>
-          <w:b/>
-        </w:rPr>
-        <w:t xml:space="preserve">Debilidades del material humano:</w:t>
+        <w:t xml:space="preserve">-  Sin errores en la </w:t>
+      </w:r>
+      <w:r>
+        <w:t>resolución de ejercicios (C02), cumpliendo correctamente con los criterios de exactitud.</w:t>
       </w:r>
     </w:p>
     <w:p>
@@ -33494,7 +33816,10 @@
         </w:rPr>
       </w:pPr>
       <w:r>
-        <w:t xml:space="preserve">-  Carencia de citas bibliográficas: en promedio, el material humano obtuvo 17 puntos menos que el de IA en el criterio de rigor académico (C03).</w:t>
+        <w:rPr>
+          <w:b/>
+        </w:rPr>
+        <w:t>Debilidades del material humano:</w:t>
       </w:r>
     </w:p>
     <w:p>
@@ -33504,7 +33829,10 @@
         </w:rPr>
       </w:pPr>
       <w:r>
-        <w:t xml:space="preserve">-  Errores ortográficos, palabras incorrectas e incongruencias gramaticales.</w:t>
+        <w:t>-  Carencia de citas bibliográficas: en promedio, el material humano obtuvo 17 puntos menos que el de IA en el criterio de rigor acadé</w:t>
+      </w:r>
+      <w:r>
+        <w:t>mico (C03).</w:t>
       </w:r>
     </w:p>
     <w:p>
@@ -33514,7 +33842,7 @@
         </w:rPr>
       </w:pPr>
       <w:r>
-        <w:t xml:space="preserve">-  Ausencia de normas APA 7 en la redacción del contenido.</w:t>
+        <w:t>-  Errores ortográficos, palabras incorrectas e incongruencias gramaticales.</w:t>
       </w:r>
     </w:p>
     <w:p>
@@ -33524,46 +33852,87 @@
         </w:rPr>
       </w:pPr>
       <w:r>
-        <w:t xml:space="preserve">El criterio con el menor puntaje en ambos tipos de contenido fue C05 (Calidad de ejemplos), lo que indica que la mejora en los ejemplos es una oportunidad transversal, independientemente del origen del material (Lee et al., 2024). Las observaciones específicas por curso incluyeron: para Cálculo para la toma de decisiones, la necesidad de estandarizar la notación matemática y utilizar ecuaciones de Microsoft Word en lugar de LaTeX; para Ciudadanía y Reflexión Ética, el uso de casos reales y actuales vinculados con la realidad nacional en lugar de ficticios; y para Sistemas Operativos, la actualización de referencias tecnológicas desfasadas, como menciones a discos mecánicos como estándar cuando actualmente predominan los SSD.</w:t>
+        <w:t>-  Ausencia de normas APA 7 en la redacción del contenido.</w:t>
       </w:r>
     </w:p>
     <w:p>
       <w:pPr>
-        <w:pStyle w:val="Imagenes"/>
-      </w:pPr>
-      <w:r>
-        <w:t xml:space="preserve">Figura N</w:t>
+        <w:rPr>
+          <w:lang w:val="es-ES"/>
+        </w:rPr>
+      </w:pPr>
+      <w:r>
+        <w:t>El criterio con el menor puntaje en ambos tipos de contenido fue C05 (Calidad de ejemplos), lo que indica qu</w:t>
+      </w:r>
+      <w:r>
+        <w:t>e la mejora en los ejemplos es una oportunidad transversal, independientemente del origen del material (Lee et al., 2024). Las observaciones específicas por curso incluyeron: para Cálculo para la toma de decisiones, la necesidad de estandarizar la notación</w:t>
+      </w:r>
+      <w:r>
+        <w:t xml:space="preserve"> matemática y utilizar ecuaciones de Microsoft Word en lugar de LaTeX; para </w:t>
+      </w:r>
+      <w:r>
+        <w:lastRenderedPageBreak/>
+        <w:t>Ciudadanía y Reflexión Ética, el uso de casos reales y actuales vinculados con la realidad nacional en lugar de ficticios; y para Sistemas Operativos, la actualización de referenci</w:t>
+      </w:r>
+      <w:r>
+        <w:t>as tecnológicas desfasadas, como menciones a discos mecánicos como estándar cuando actualmente predominan los SSD.</w:t>
       </w:r>
     </w:p>
     <w:p>
       <w:pPr>
         <w:pStyle w:val="Imagenes"/>
-      </w:pPr>
-      <w:r>
-        <w:t xml:space="preserve">Puntaje total por criterio de evaluación: material humano (H) vs. Experto Temático (IA)</w:t>
+        <w:spacing w:line="360" w:lineRule="auto"/>
+      </w:pPr>
+      <w:r>
+        <w:t>Figura N</w:t>
       </w:r>
     </w:p>
     <w:p>
       <w:pPr>
         <w:pStyle w:val="Imagenes"/>
+        <w:spacing w:line="360" w:lineRule="auto"/>
+        <w:rPr>
+          <w:b w:val="0"/>
+          <w:bCs/>
+        </w:rPr>
+      </w:pPr>
+      <w:r>
+        <w:rPr>
+          <w:b w:val="0"/>
+          <w:bCs/>
+        </w:rPr>
+        <w:t xml:space="preserve">Puntaje total por criterio de evaluación: material humano (H) vs. </w:t>
+      </w:r>
+      <w:r>
+        <w:rPr>
+          <w:b w:val="0"/>
+          <w:bCs/>
+        </w:rPr>
+        <w:t>(IA)</w:t>
+      </w:r>
+    </w:p>
+    <w:p>
+      <w:pPr>
+        <w:pStyle w:val="Imagenes"/>
       </w:pPr>
       <w:r>
         <w:drawing>
-          <wp:inline xmlns:a="http://schemas.openxmlformats.org/drawingml/2006/main" xmlns:pic="http://schemas.openxmlformats.org/drawingml/2006/picture">
-            <wp:extent cx="5029200" cy="4018321"/>
-            <wp:docPr id="4" name="Picture 4"/>
+          <wp:inline distT="0" distB="0" distL="0" distR="0" wp14:anchorId="1A2002F0" wp14:editId="0EED1C0C">
+            <wp:extent cx="5579745" cy="3408045"/>
+            <wp:effectExtent l="0" t="0" r="1905" b="1905"/>
+            <wp:docPr id="9" name="Imagen 9"/>
             <wp:cNvGraphicFramePr>
-              <a:graphicFrameLocks noChangeAspect="1"/>
+              <a:graphicFrameLocks xmlns:a="http://schemas.openxmlformats.org/drawingml/2006/main" noChangeAspect="1"/>
             </wp:cNvGraphicFramePr>
-            <a:graphic>
+            <a:graphic xmlns:a="http://schemas.openxmlformats.org/drawingml/2006/main">
               <a:graphicData uri="http://schemas.openxmlformats.org/drawingml/2006/picture">
-                <pic:pic>
+                <pic:pic xmlns:pic="http://schemas.openxmlformats.org/drawingml/2006/picture">
                   <pic:nvPicPr>
-                    <pic:cNvPr id="0" name="chart_criterios.png"/>
+                    <pic:cNvPr id="1" name=""/>
                     <pic:cNvPicPr/>
                   </pic:nvPicPr>
                   <pic:blipFill>
-                    <a:blip r:embed="rId23"/>
+                    <a:blip r:embed="rId21"/>
                     <a:stretch>
                       <a:fillRect/>
                     </a:stretch>
@@ -33571,9 +33940,11 @@
                   <pic:spPr>
                     <a:xfrm>
                       <a:off x="0" y="0"/>
-                      <a:ext cx="5029200" cy="4018321"/>
+                      <a:ext cx="5579745" cy="3408045"/>
                     </a:xfrm>
-                    <a:prstGeom prst="rect"/>
+                    <a:prstGeom prst="rect">
+                      <a:avLst/>
+                    </a:prstGeom>
                   </pic:spPr>
                 </pic:pic>
               </a:graphicData>
@@ -33585,9 +33956,33 @@
     <w:p>
       <w:pPr>
         <w:pStyle w:val="Imagenes"/>
-      </w:pPr>
-      <w:r>
-        <w:t xml:space="preserve">Nota. Adaptado de Resultados de validación larga de Experto Temático [Documento interno]. Universidad Tecnológica del Perú.</w:t>
+        <w:spacing w:line="360" w:lineRule="auto"/>
+      </w:pPr>
+      <w:r>
+        <w:rPr>
+          <w:b w:val="0"/>
+          <w:bCs/>
+          <w:i/>
+          <w:iCs/>
+        </w:rPr>
+        <w:t>Nota</w:t>
+      </w:r>
+      <w:r>
+        <w:t xml:space="preserve">. </w:t>
+      </w:r>
+      <w:r>
+        <w:rPr>
+          <w:b w:val="0"/>
+          <w:bCs/>
+        </w:rPr>
+        <w:t xml:space="preserve">Adaptado de Resultados de </w:t>
+      </w:r>
+      <w:r>
+        <w:rPr>
+          <w:b w:val="0"/>
+          <w:bCs/>
+        </w:rPr>
+        <w:t>validación larga de Experto Temático [Documento interno]. la Universidad.</w:t>
       </w:r>
     </w:p>
     <w:p>
@@ -33604,7 +33999,7 @@
         </w:rPr>
       </w:pPr>
       <w:r>
-        <w:t xml:space="preserve">3.3.6    Conclusiones de la validación</w:t>
+        <w:t>3.3.5    Conclusiones de la validación</w:t>
       </w:r>
     </w:p>
     <w:p>
@@ -33614,7 +34009,13 @@
         </w:rPr>
       </w:pPr>
       <w:r>
-        <w:t xml:space="preserve">Los resultados de la validación demuestran que la aplicación Experto Temático genera material educativo de calidad comparable al producido por docentes humanos expertos, lo que respalda la viabilidad del proyecto para su integración en el proceso de producción de cursos virtuales en UTP. Este hallazgo es coherente con la literatura reciente que señala que el contenido generado por IA, cuando se integra en flujos de trabajo instruccionales estructurados, puede alcanzar estándares de calidad aceptables según criterios académicos (Ullmann et al., 2024; Lee et al., 2024).</w:t>
+        <w:t>Los resultados de la validación demuestran que la aplicación Experto Temático genera material educativo de calidad comparable al producido por</w:t>
+      </w:r>
+      <w:r>
+        <w:t xml:space="preserve"> docentes humanos expertos, lo que respalda la viabilidad del proyecto para su integración en el proceso de producción de cursos virtuales en la Universidad. Este hallazgo es coherente con la literatura reciente que señala que el contenido generado por IA,</w:t>
+      </w:r>
+      <w:r>
+        <w:t xml:space="preserve"> cuando se integra en flujos de trabajo instruccionales estructurados, puede alcanzar estándares de calidad aceptables según criterios académicos (Ullmann et al., 2024; Lee et al., 2024).</w:t>
       </w:r>
     </w:p>
     <w:p>
@@ -33624,7 +34025,14 @@
         </w:rPr>
       </w:pPr>
       <w:r>
-        <w:t xml:space="preserve">La incapacidad de los docentes para distinguir entre el material IA y el humano sugiere que la principal barrera para la adopción exitosa de la herramienta no radica en la calidad del contenido en sí, sino en la necesidad de establecer lineamientos institucionales claros sobre estándares de citación, personalización del contenido por carrera y criterios de alineación con los logros de aprendizaje de cada unidad.</w:t>
+        <w:lastRenderedPageBreak/>
+        <w:t xml:space="preserve">La incapacidad de los docentes para distinguir entre el material IA </w:t>
+      </w:r>
+      <w:r>
+        <w:t>y el humano sugiere que la principal barrera para la adopción exitosa de la herramienta no radica en la calidad del contenido en sí, sino en la necesidad de establecer lineamientos institucionales claros sobre estándares de citación, personalización del co</w:t>
+      </w:r>
+      <w:r>
+        <w:t>ntenido por carrera y criterios de alineación con los logros de aprendizaje de cada unidad.</w:t>
       </w:r>
     </w:p>
     <w:p>
@@ -33634,25 +34042,47 @@
         </w:rPr>
       </w:pPr>
       <w:r>
-        <w:t xml:space="preserve">La validación confirmó asimismo que el flujo de producción deberá incorporar una revisión experta antes de la publicación definitiva del material, para corregir las debilidades identificadas, principalmente en materia de rigor académico (citación APA 7) y pertinencia de los ejemplos. Estos hallazgos retroalimentan directamente el diseño de los inputs del pipeline y apuntan hacia ajustes concretos para futuras iteraciones de la aplicación.</w:t>
+        <w:t>La validación confirmó asimismo que el flujo de producción deberá incorporar una revisión experta antes de la publicación definitiva del material, para corregir las</w:t>
+      </w:r>
+      <w:r>
+        <w:t xml:space="preserve"> debilidades identificadas, principalmente en materia de rigor académico (citación APA 7) y pertinencia de los ejemplos. Estos hallazgos retroalimentan directamente el diseño de los inputs del pipeline y apuntan hacia ajustes concretos para futuras iteraci</w:t>
+      </w:r>
+      <w:r>
+        <w:t>ones de la aplicación.</w:t>
       </w:r>
     </w:p>
     <w:p>
       <w:pPr>
         <w:pStyle w:val="Ttulo1"/>
-      </w:pPr>
-      <w:bookmarkStart w:id="93" w:name="_Toc229503047"/>
+        <w:numPr>
+          <w:ilvl w:val="0"/>
+          <w:numId w:val="0"/>
+        </w:numPr>
+        <w:ind w:left="432" w:hanging="432"/>
+      </w:pPr>
+      <w:bookmarkStart w:id="94" w:name="_Toc229503047"/>
+      <w:r>
+        <w:t xml:space="preserve">5. </w:t>
+      </w:r>
       <w:r>
         <w:t>Referencias del Capítulo</w:t>
       </w:r>
-      <w:bookmarkEnd w:id="93"/>
+      <w:bookmarkEnd w:id="94"/>
     </w:p>
     <w:p>
       <w:pPr>
         <w:ind w:left="720" w:hanging="720"/>
       </w:pPr>
       <w:r>
-        <w:t xml:space="preserve">Amazon Web Services. (2024). </w:t>
+        <w:t xml:space="preserve">Amazon Web </w:t>
+      </w:r>
+      <w:proofErr w:type="spellStart"/>
+      <w:r>
+        <w:t>Services</w:t>
+      </w:r>
+      <w:proofErr w:type="spellEnd"/>
+      <w:r>
+        <w:t xml:space="preserve">. (2024). </w:t>
       </w:r>
       <w:r>
         <w:rPr>
@@ -33688,7 +34118,6 @@
         <w:ind w:left="720" w:hanging="720"/>
       </w:pPr>
       <w:r>
-        <w:lastRenderedPageBreak/>
         <w:t xml:space="preserve">Bloom, B. S., Engelhart, M. D., Furst, E. J., Hill, W. H., &amp; Krathwohl, D. R. (1956). </w:t>
       </w:r>
       <w:r>
@@ -33779,6 +34208,7 @@
         <w:ind w:left="720" w:hanging="720"/>
       </w:pPr>
       <w:r>
+        <w:lastRenderedPageBreak/>
         <w:t>Joshi, S. (2025). Review of autonomous systems and collaborative AI agent frameworks. International Journal of Science and Research Archive, 14(2), 961–972. https://doi.org/10.30574/ijsra.2025.14.2.0439</w:t>
       </w:r>
     </w:p>
@@ -33787,10 +34217,7 @@
         <w:ind w:left="720" w:hanging="720"/>
       </w:pPr>
       <w:r>
-        <w:t>Kasneci, E., Sessler, K., Küchemann, S., Bannert, M., Dementieva, D., Fischer, F., Gasser, U., Groh, G., Günnemann, S., Hüllermeier, E., Krusche, S., Kutyniok, G., Michaeli, T., Nerdel, C., Pfeffer, J., Poquet, O., Sailer, M., Schmidt, A., Seidel, T., &amp; Ka</w:t>
-      </w:r>
-      <w:r>
-        <w:t>sneci, G. (2023). ChatGPT for good? On opportunities and challenges of large language models for education. Learning and Individual Differences, 103, Artículo 102274. https://doi.org/10.1016/j.lindif.2023.102274</w:t>
+        <w:t>Kasneci, E., Sessler, K., Küchemann, S., Bannert, M., Dementieva, D., Fischer, F., Gasser, U., Groh, G., Günnemann, S., Hüllermeier, E., Krusche, S., Kutyniok, G., Michaeli, T., Nerdel, C., Pfeffer, J., Poquet, O., Sailer, M., Schmidt, A., Seidel, T., &amp; Kasneci, G. (2023). ChatGPT for good? On opportunities and challenges of large language models for education. Learning and Individual Differences, 103, Artículo 102274. https://doi.org/10.1016/j.lindif.2023.102274</w:t>
       </w:r>
     </w:p>
     <w:p>
@@ -33824,11 +34251,7 @@
         <w:ind w:left="720" w:hanging="720"/>
       </w:pPr>
       <w:r>
-        <w:t xml:space="preserve">Lee, D., Arnold, M., Srivastava, A., Plastow, K., Strelan, P., Ploeckl, F., Lekkas, D., &amp; Palmer, E. (2024). The impact of generative AI on higher education learning and </w:t>
-      </w:r>
-      <w:r>
-        <w:lastRenderedPageBreak/>
-        <w:t xml:space="preserve">teaching: A study of educators' perspectives. </w:t>
+        <w:t xml:space="preserve">Lee, D., Arnold, M., Srivastava, A., Plastow, K., Strelan, P., Ploeckl, F., Lekkas, D., &amp; Palmer, E. (2024). The impact of generative AI on higher education learning and teaching: A study of educators' perspectives. </w:t>
       </w:r>
       <w:r>
         <w:rPr>
@@ -33896,6 +34319,7 @@
         <w:ind w:left="720" w:hanging="720"/>
       </w:pPr>
       <w:r>
+        <w:lastRenderedPageBreak/>
         <w:t xml:space="preserve">Martin, R. C. (2017). </w:t>
       </w:r>
       <w:r>
@@ -33985,7 +34409,6 @@
         <w:ind w:left="720" w:hanging="720"/>
       </w:pPr>
       <w:r>
-        <w:lastRenderedPageBreak/>
         <w:t>Rigby, D. K., Sutherland, J., &amp; Takeuchi, H. (2016). Embracing agile. Harvard Business Review, 94(5), 40–50. https://hbr.org/2016/05/embracing-agile</w:t>
       </w:r>
     </w:p>
@@ -34002,7 +34425,7 @@
         <w:ind w:left="720" w:hanging="720"/>
       </w:pPr>
       <w:r>
-        <w:t xml:space="preserve">Scarfe, P., Watcham, K., Clarke, A., &amp; Roesch, E. (2024). A real-world test of artificial intelligence infiltration of a university examinations system: A "Turing Test" case study. PLOS ONE, 19(6), e0305354. https://doi.org/10.1371/journal.pone.0305354</w:t>
+        <w:t>Scarfe, P., Watcham, K., Clarke, A., &amp; Roesch, E. (2024). A real-world test of artificial intelligence infiltration of a university examinations system: A "Turing Test" case study. PLOS ONE, 19(6), e0305354. https://doi.org/10.1371/journal.pone.0305354</w:t>
       </w:r>
     </w:p>
     <w:p>
@@ -34028,10 +34451,7 @@
         <w:ind w:left="720" w:hanging="720"/>
       </w:pPr>
       <w:r>
-        <w:t>Tlili, A., Shehata, B., Adarkwah, M. A., Bozkurt, A., Hickey, D. T., Huang, R., &amp; Agyemang, B. (2023). What if the devil is my guardian angel: ChatGPT as a case study of using chatbots in education. Smart Learning Environments, 10(1), Artículo 15</w:t>
-      </w:r>
-      <w:r>
-        <w:t>. https://doi.org/10.1186/s40561-023-00237-x</w:t>
+        <w:t>Tlili, A., Shehata, B., Adarkwah, M. A., Bozkurt, A., Hickey, D. T., Huang, R., &amp; Agyemang, B. (2023). What if the devil is my guardian angel: ChatGPT as a case study of using chatbots in education. Smart Learning Environments, 10(1), Artículo 15. https://doi.org/10.1186/s40561-023-00237-x</w:t>
       </w:r>
     </w:p>
     <w:p>
@@ -34039,7 +34459,11 @@
         <w:ind w:left="720" w:hanging="720"/>
       </w:pPr>
       <w:r>
-        <w:t xml:space="preserve">Ullmann, T. D., Edwards, C., Bektik, D., Herodotou, C., &amp; Whitelock, D. (2024). Towards generative AI for course content production: Expert reflections. European Journal of Open, Distance and E-Learning, 27(1). https://doi.org/10.2478/eurodl-2024-0013</w:t>
+        <w:lastRenderedPageBreak/>
+        <w:t>Ullmann, T. D., Edwards, C., Bektik, D., Herodotou, C., &amp; Whitelock, D. (2024). Towards generative AI for course co</w:t>
+      </w:r>
+      <w:r>
+        <w:t>ntent production: Expert reflections. European Journal of Open, Distance and E-Learning, 27(1). https://doi.org/10.2478/eurodl-2024-0013</w:t>
       </w:r>
     </w:p>
     <w:p>
@@ -34106,7 +34530,7 @@
     </w:p>
     <w:p/>
     <w:sectPr>
-      <w:footerReference w:type="default" r:id="rId18"/>
+      <w:footerReference w:type="default" r:id="rId22"/>
       <w:pgSz w:w="11906" w:h="16838"/>
       <w:pgMar w:top="1418" w:right="1418" w:bottom="1701" w:left="1701" w:header="709" w:footer="709" w:gutter="0"/>
       <w:pgNumType w:start="1"/>
@@ -49254,6 +49678,7 @@
     <w:rsid w:val="00232F60"/>
     <w:rsid w:val="002369D2"/>
     <w:rsid w:val="00280625"/>
+    <w:rsid w:val="002F7C99"/>
     <w:rsid w:val="00347575"/>
     <w:rsid w:val="00364623"/>
     <w:rsid w:val="00372B88"/>
@@ -49291,6 +49716,7 @@
     <w:rsid w:val="0098076A"/>
     <w:rsid w:val="00A754A8"/>
     <w:rsid w:val="00AA7CA8"/>
+    <w:rsid w:val="00AD1900"/>
     <w:rsid w:val="00AD3F06"/>
     <w:rsid w:val="00B82D84"/>
     <w:rsid w:val="00BC1BD3"/>
@@ -50110,6 +50536,35 @@
 </file>
 
 <file path=customXml/item1.xml><?xml version="1.0" encoding="utf-8"?>
+<?mso-contentType ?>
+<FormTemplates xmlns="http://schemas.microsoft.com/sharepoint/v3/contenttype/forms">
+  <Display>DocumentLibraryForm</Display>
+  <Edit>DocumentLibraryForm</Edit>
+  <New>DocumentLibraryForm</New>
+</FormTemplates>
+</file>
+
+<file path=customXml/item2.xml><?xml version="1.0" encoding="utf-8"?>
+<b:Sources xmlns:b="http://schemas.openxmlformats.org/officeDocument/2006/bibliography" xmlns="http://schemas.openxmlformats.org/officeDocument/2006/bibliography" SelectedStyle="\APASixthEditionOfficeOnline.xsl" StyleName="APA" Version="6"/>
+</file>
+
+<file path=customXml/item3.xml><?xml version="1.0" encoding="utf-8"?>
+<p:properties xmlns:p="http://schemas.microsoft.com/office/2006/metadata/properties" xmlns:xsi="http://www.w3.org/2001/XMLSchema-instance" xmlns:pc="http://schemas.microsoft.com/office/infopath/2007/PartnerControls">
+  <documentManagement>
+    <MigrationWizId xmlns="d46416e7-6d2c-4f4a-a0c5-4be57ee88241" xsi:nil="true"/>
+    <MigrationWizIdDocumentLibraryPermissions xmlns="d46416e7-6d2c-4f4a-a0c5-4be57ee88241" xsi:nil="true"/>
+    <MigrationWizIdSecurityGroups xmlns="d46416e7-6d2c-4f4a-a0c5-4be57ee88241" xsi:nil="true"/>
+    <MigrationWizIdPermissionLevels xmlns="d46416e7-6d2c-4f4a-a0c5-4be57ee88241" xsi:nil="true"/>
+    <lcf76f155ced4ddcb4097134ff3c332f xmlns="d46416e7-6d2c-4f4a-a0c5-4be57ee88241">
+      <Terms xmlns="http://schemas.microsoft.com/office/infopath/2007/PartnerControls"/>
+    </lcf76f155ced4ddcb4097134ff3c332f>
+    <MigrationWizIdPermissions xmlns="d46416e7-6d2c-4f4a-a0c5-4be57ee88241" xsi:nil="true"/>
+    <TaxCatchAll xmlns="14756a95-b37b-4efb-8433-c7c61bd362cb" xsi:nil="true"/>
+  </documentManagement>
+</p:properties>
+</file>
+
+<file path=customXml/item4.xml><?xml version="1.0" encoding="utf-8"?>
 <ct:contentTypeSchema xmlns:ct="http://schemas.microsoft.com/office/2006/metadata/contentType" xmlns:ma="http://schemas.microsoft.com/office/2006/metadata/properties/metaAttributes" ct:_="" ma:_="" ma:contentTypeName="Documento" ma:contentTypeID="0x010100AA800A0632DE254DA2317B4367B6018B" ma:contentTypeVersion="20" ma:contentTypeDescription="Crear nuevo documento." ma:contentTypeScope="" ma:versionID="0aa06a1bb3d45c1749f3c7b56b50ab45">
   <xsd:schema xmlns:xsd="http://www.w3.org/2001/XMLSchema" xmlns:xs="http://www.w3.org/2001/XMLSchema" xmlns:p="http://schemas.microsoft.com/office/2006/metadata/properties" xmlns:ns2="d46416e7-6d2c-4f4a-a0c5-4be57ee88241" xmlns:ns3="14756a95-b37b-4efb-8433-c7c61bd362cb" targetNamespace="http://schemas.microsoft.com/office/2006/metadata/properties" ma:root="true" ma:fieldsID="d9674b9f5a8de70e4f04c0b8a889fe03" ns2:_="" ns3:_="">
     <xsd:import namespace="d46416e7-6d2c-4f4a-a0c5-4be57ee88241"/>
@@ -50376,36 +50831,34 @@
 </ct:contentTypeSchema>
 </file>
 
-<file path=customXml/item2.xml><?xml version="1.0" encoding="utf-8"?>
-<p:properties xmlns:p="http://schemas.microsoft.com/office/2006/metadata/properties" xmlns:xsi="http://www.w3.org/2001/XMLSchema-instance" xmlns:pc="http://schemas.microsoft.com/office/infopath/2007/PartnerControls">
-  <documentManagement>
-    <MigrationWizId xmlns="d46416e7-6d2c-4f4a-a0c5-4be57ee88241" xsi:nil="true"/>
-    <MigrationWizIdDocumentLibraryPermissions xmlns="d46416e7-6d2c-4f4a-a0c5-4be57ee88241" xsi:nil="true"/>
-    <MigrationWizIdSecurityGroups xmlns="d46416e7-6d2c-4f4a-a0c5-4be57ee88241" xsi:nil="true"/>
-    <MigrationWizIdPermissionLevels xmlns="d46416e7-6d2c-4f4a-a0c5-4be57ee88241" xsi:nil="true"/>
-    <lcf76f155ced4ddcb4097134ff3c332f xmlns="d46416e7-6d2c-4f4a-a0c5-4be57ee88241">
-      <Terms xmlns="http://schemas.microsoft.com/office/infopath/2007/PartnerControls"/>
-    </lcf76f155ced4ddcb4097134ff3c332f>
-    <MigrationWizIdPermissions xmlns="d46416e7-6d2c-4f4a-a0c5-4be57ee88241" xsi:nil="true"/>
-    <TaxCatchAll xmlns="14756a95-b37b-4efb-8433-c7c61bd362cb" xsi:nil="true"/>
-  </documentManagement>
-</p:properties>
+<file path=customXml/itemProps1.xml><?xml version="1.0" encoding="utf-8"?>
+<ds:datastoreItem xmlns:ds="http://schemas.openxmlformats.org/officeDocument/2006/customXml" ds:itemID="{DD53D5E1-A9E6-4974-A55D-57904EA87C5E}">
+  <ds:schemaRefs>
+    <ds:schemaRef ds:uri="http://schemas.microsoft.com/sharepoint/v3/contenttype/forms"/>
+  </ds:schemaRefs>
+</ds:datastoreItem>
 </file>
 
-<file path=customXml/item3.xml><?xml version="1.0" encoding="utf-8"?>
-<b:Sources xmlns:b="http://schemas.openxmlformats.org/officeDocument/2006/bibliography" xmlns="http://schemas.openxmlformats.org/officeDocument/2006/bibliography" SelectedStyle="\APASixthEditionOfficeOnline.xsl" StyleName="APA" Version="6"/>
+<file path=customXml/itemProps2.xml><?xml version="1.0" encoding="utf-8"?>
+<ds:datastoreItem xmlns:ds="http://schemas.openxmlformats.org/officeDocument/2006/customXml" ds:itemID="{3097DD69-CA88-45EF-991D-66FF90578E16}">
+  <ds:schemaRefs>
+    <ds:schemaRef ds:uri="http://schemas.openxmlformats.org/officeDocument/2006/bibliography"/>
+  </ds:schemaRefs>
+</ds:datastoreItem>
 </file>
 
-<file path=customXml/item4.xml><?xml version="1.0" encoding="utf-8"?>
-<?mso-contentType ?>
-<FormTemplates xmlns="http://schemas.microsoft.com/sharepoint/v3/contenttype/forms">
-  <Display>DocumentLibraryForm</Display>
-  <Edit>DocumentLibraryForm</Edit>
-  <New>DocumentLibraryForm</New>
-</FormTemplates>
+<file path=customXml/itemProps3.xml><?xml version="1.0" encoding="utf-8"?>
+<ds:datastoreItem xmlns:ds="http://schemas.openxmlformats.org/officeDocument/2006/customXml" ds:itemID="{C8D5FA6B-9919-4CF7-992B-01E47542701B}">
+  <ds:schemaRefs>
+    <ds:schemaRef ds:uri="http://schemas.microsoft.com/office/2006/metadata/properties"/>
+    <ds:schemaRef ds:uri="http://schemas.microsoft.com/office/infopath/2007/PartnerControls"/>
+    <ds:schemaRef ds:uri="d46416e7-6d2c-4f4a-a0c5-4be57ee88241"/>
+    <ds:schemaRef ds:uri="14756a95-b37b-4efb-8433-c7c61bd362cb"/>
+  </ds:schemaRefs>
+</ds:datastoreItem>
 </file>
 
-<file path=customXml/itemProps1.xml><?xml version="1.0" encoding="utf-8"?>
+<file path=customXml/itemProps4.xml><?xml version="1.0" encoding="utf-8"?>
 <ds:datastoreItem xmlns:ds="http://schemas.openxmlformats.org/officeDocument/2006/customXml" ds:itemID="{BE5EAF9A-E65E-4020-BBFF-316AF046608A}">
   <ds:schemaRefs>
     <ds:schemaRef ds:uri="http://schemas.microsoft.com/office/2006/metadata/contentType"/>
@@ -50422,31 +50875,4 @@
     <ds:schemaRef ds:uri="http://schemas.microsoft.com/internal/obd"/>
   </ds:schemaRefs>
 </ds:datastoreItem>
-</file>
-
-<file path=customXml/itemProps2.xml><?xml version="1.0" encoding="utf-8"?>
-<ds:datastoreItem xmlns:ds="http://schemas.openxmlformats.org/officeDocument/2006/customXml" ds:itemID="{C8D5FA6B-9919-4CF7-992B-01E47542701B}">
-  <ds:schemaRefs>
-    <ds:schemaRef ds:uri="http://schemas.microsoft.com/office/2006/metadata/properties"/>
-    <ds:schemaRef ds:uri="http://schemas.microsoft.com/office/infopath/2007/PartnerControls"/>
-    <ds:schemaRef ds:uri="d46416e7-6d2c-4f4a-a0c5-4be57ee88241"/>
-    <ds:schemaRef ds:uri="14756a95-b37b-4efb-8433-c7c61bd362cb"/>
-  </ds:schemaRefs>
-</ds:datastoreItem>
-</file>
-
-<file path=customXml/itemProps3.xml><?xml version="1.0" encoding="utf-8"?>
-<ds:datastoreItem xmlns:ds="http://schemas.openxmlformats.org/officeDocument/2006/customXml" ds:itemID="{3097DD69-CA88-45EF-991D-66FF90578E16}">
-  <ds:schemaRefs>
-    <ds:schemaRef ds:uri="http://schemas.openxmlformats.org/officeDocument/2006/bibliography"/>
-  </ds:schemaRefs>
-</ds:datastoreItem>
-</file>
-
-<file path=customXml/itemProps4.xml><?xml version="1.0" encoding="utf-8"?>
-<ds:datastoreItem xmlns:ds="http://schemas.openxmlformats.org/officeDocument/2006/customXml" ds:itemID="{DD53D5E1-A9E6-4974-A55D-57904EA87C5E}">
-  <ds:schemaRefs>
-    <ds:schemaRef ds:uri="http://schemas.microsoft.com/sharepoint/v3/contenttype/forms"/>
-  </ds:schemaRefs>
-</ds:datastoreItem>
 </file>
</xml_diff>